<commit_message>
added updated figure 1
</commit_message>
<xml_diff>
--- a/Docs/FIGURES Machine learning applied to otolith timeseries data to discriminate river of origin for Western Alaska Salmon.docx
+++ b/Docs/FIGURES Machine learning applied to otolith timeseries data to discriminate river of origin for Western Alaska Salmon.docx
@@ -22,6 +22,159 @@
       <w:r>
         <w:t xml:space="preserve"> Western Alaska Salmon. </w:t>
       </w:r>
+    </w:p>
+    <w:p/>
+    <w:p>
+      <w:r>
+        <w:rPr>
+          <w:noProof/>
+        </w:rPr>
+        <w:drawing>
+          <wp:inline distT="0" distB="0" distL="0" distR="0" wp14:anchorId="54CB86F5" wp14:editId="2F1D46E4">
+            <wp:extent cx="2944928" cy="1766957"/>
+            <wp:effectExtent l="0" t="0" r="1905" b="0"/>
+            <wp:docPr id="1251230627" name="Picture 1"/>
+            <wp:cNvGraphicFramePr>
+              <a:graphicFrameLocks xmlns:a="http://schemas.openxmlformats.org/drawingml/2006/main" noChangeAspect="1"/>
+            </wp:cNvGraphicFramePr>
+            <a:graphic xmlns:a="http://schemas.openxmlformats.org/drawingml/2006/main">
+              <a:graphicData uri="http://schemas.openxmlformats.org/drawingml/2006/picture">
+                <pic:pic xmlns:pic="http://schemas.openxmlformats.org/drawingml/2006/picture">
+                  <pic:nvPicPr>
+                    <pic:cNvPr id="1251230627" name="Picture 1251230627"/>
+                    <pic:cNvPicPr/>
+                  </pic:nvPicPr>
+                  <pic:blipFill>
+                    <a:blip r:embed="rId4"/>
+                    <a:stretch>
+                      <a:fillRect/>
+                    </a:stretch>
+                  </pic:blipFill>
+                  <pic:spPr>
+                    <a:xfrm>
+                      <a:off x="0" y="0"/>
+                      <a:ext cx="2994457" cy="1796675"/>
+                    </a:xfrm>
+                    <a:prstGeom prst="rect">
+                      <a:avLst/>
+                    </a:prstGeom>
+                  </pic:spPr>
+                </pic:pic>
+              </a:graphicData>
+            </a:graphic>
+          </wp:inline>
+        </w:drawing>
+      </w:r>
+      <w:r>
+        <w:rPr>
+          <w:noProof/>
+        </w:rPr>
+        <w:drawing>
+          <wp:inline distT="0" distB="0" distL="0" distR="0" wp14:anchorId="0B1AA0D7" wp14:editId="3BBBA734">
+            <wp:extent cx="2946907" cy="1768144"/>
+            <wp:effectExtent l="0" t="0" r="0" b="0"/>
+            <wp:docPr id="747855129" name="Picture 2"/>
+            <wp:cNvGraphicFramePr>
+              <a:graphicFrameLocks xmlns:a="http://schemas.openxmlformats.org/drawingml/2006/main" noChangeAspect="1"/>
+            </wp:cNvGraphicFramePr>
+            <a:graphic xmlns:a="http://schemas.openxmlformats.org/drawingml/2006/main">
+              <a:graphicData uri="http://schemas.openxmlformats.org/drawingml/2006/picture">
+                <pic:pic xmlns:pic="http://schemas.openxmlformats.org/drawingml/2006/picture">
+                  <pic:nvPicPr>
+                    <pic:cNvPr id="747855129" name="Picture 747855129"/>
+                    <pic:cNvPicPr/>
+                  </pic:nvPicPr>
+                  <pic:blipFill>
+                    <a:blip r:embed="rId5"/>
+                    <a:stretch>
+                      <a:fillRect/>
+                    </a:stretch>
+                  </pic:blipFill>
+                  <pic:spPr>
+                    <a:xfrm>
+                      <a:off x="0" y="0"/>
+                      <a:ext cx="3072503" cy="1843501"/>
+                    </a:xfrm>
+                    <a:prstGeom prst="rect">
+                      <a:avLst/>
+                    </a:prstGeom>
+                  </pic:spPr>
+                </pic:pic>
+              </a:graphicData>
+            </a:graphic>
+          </wp:inline>
+        </w:drawing>
+      </w:r>
+    </w:p>
+    <w:p>
+      <w:pPr>
+        <w:rPr>
+          <w:rFonts w:ascii="Garamond" w:hAnsi="Garamond"/>
+          <w:sz w:val="16"/>
+          <w:szCs w:val="16"/>
+        </w:rPr>
+      </w:pPr>
+      <w:r>
+        <w:rPr>
+          <w:rFonts w:ascii="Garamond" w:hAnsi="Garamond"/>
+          <w:b/>
+          <w:bCs/>
+          <w:sz w:val="16"/>
+          <w:szCs w:val="16"/>
+        </w:rPr>
+        <w:t>Figure 1:</w:t>
+      </w:r>
+      <w:r>
+        <w:rPr>
+          <w:rFonts w:ascii="Garamond" w:hAnsi="Garamond"/>
+          <w:sz w:val="16"/>
+          <w:szCs w:val="16"/>
+        </w:rPr>
+        <w:t xml:space="preserve"> </w:t>
+      </w:r>
+      <w:r>
+        <w:rPr>
+          <w:rFonts w:ascii="Garamond" w:hAnsi="Garamond"/>
+          <w:sz w:val="16"/>
+          <w:szCs w:val="16"/>
+        </w:rPr>
+        <w:t>Model Performance comparison among data sources and model types. Accuracy indicates the proportion of each class correctly classified. F1-Score is the harmonic mean of precision and recall, providing a balanced performance measure across all watershed classes. Results compare three Sr87/86 isotope preprocessing methods (RAW, GAM, MA) and three machine learning algorithms (Random Forest, SVM, KNN) using either all test data (Total) or only overlapping isotope ranges (Overlapping). Color scale: blue = lower performance, red = higher performance</w:t>
+      </w:r>
+      <w:r>
+        <w:rPr>
+          <w:rFonts w:ascii="Garamond" w:hAnsi="Garamond"/>
+          <w:sz w:val="16"/>
+          <w:szCs w:val="16"/>
+        </w:rPr>
+        <w:t xml:space="preserve">. </w:t>
+      </w:r>
+    </w:p>
+    <w:p>
+      <w:pPr>
+        <w:rPr>
+          <w:rFonts w:ascii="Garamond" w:hAnsi="Garamond"/>
+          <w:sz w:val="16"/>
+          <w:szCs w:val="16"/>
+        </w:rPr>
+      </w:pPr>
+    </w:p>
+    <w:p>
+      <w:pPr>
+        <w:rPr>
+          <w:rFonts w:ascii="Garamond" w:hAnsi="Garamond"/>
+          <w:sz w:val="16"/>
+          <w:szCs w:val="16"/>
+        </w:rPr>
+      </w:pPr>
+    </w:p>
+    <w:p>
+      <w:pPr>
+        <w:rPr>
+          <w:rFonts w:ascii="Garamond" w:hAnsi="Garamond"/>
+          <w:sz w:val="16"/>
+          <w:szCs w:val="16"/>
+        </w:rPr>
+      </w:pPr>
     </w:p>
     <w:sectPr>
       <w:pgSz w:w="12240" w:h="15840"/>

</xml_diff>

<commit_message>
added some citations and am working on flow
</commit_message>
<xml_diff>
--- a/Docs/FIGURES Machine learning applied to otolith timeseries data to discriminate river of origin for Western Alaska Salmon.docx
+++ b/Docs/FIGURES Machine learning applied to otolith timeseries data to discriminate river of origin for Western Alaska Salmon.docx
@@ -25,14 +25,57 @@
     </w:p>
     <w:p/>
     <w:p>
+      <w:pPr>
+        <w:rPr>
+          <w:rFonts w:ascii="Garamond" w:hAnsi="Garamond"/>
+        </w:rPr>
+      </w:pPr>
+    </w:p>
+    <w:p>
+      <w:pPr>
+        <w:rPr>
+          <w:rFonts w:ascii="Garamond" w:hAnsi="Garamond"/>
+          <w:sz w:val="22"/>
+          <w:szCs w:val="22"/>
+        </w:rPr>
+      </w:pPr>
+    </w:p>
+    <w:p>
+      <w:pPr>
+        <w:rPr>
+          <w:rFonts w:ascii="Garamond" w:hAnsi="Garamond"/>
+          <w:sz w:val="22"/>
+          <w:szCs w:val="22"/>
+        </w:rPr>
+      </w:pPr>
+    </w:p>
+    <w:p>
+      <w:pPr>
+        <w:rPr>
+          <w:rFonts w:ascii="Garamond" w:hAnsi="Garamond"/>
+          <w:sz w:val="22"/>
+          <w:szCs w:val="22"/>
+        </w:rPr>
+      </w:pPr>
+      <w:r>
+        <w:rPr>
+          <w:rFonts w:ascii="Garamond" w:hAnsi="Garamond"/>
+          <w:sz w:val="22"/>
+          <w:szCs w:val="22"/>
+        </w:rPr>
+        <w:t xml:space="preserve">Alternative option for Figure 1: Map of the three watersheds and sample site locations? </w:t>
+      </w:r>
+    </w:p>
+    <w:p/>
+    <w:p>
       <w:r>
         <w:rPr>
           <w:noProof/>
         </w:rPr>
         <w:drawing>
-          <wp:inline distT="0" distB="0" distL="0" distR="0" wp14:anchorId="54CB86F5" wp14:editId="2F1D46E4">
-            <wp:extent cx="2944928" cy="1766957"/>
-            <wp:effectExtent l="0" t="0" r="1905" b="0"/>
+          <wp:inline distT="0" distB="0" distL="0" distR="0" wp14:anchorId="54CB86F5" wp14:editId="3C8F2FD8">
+            <wp:extent cx="2944282" cy="1766570"/>
+            <wp:effectExtent l="0" t="0" r="2540" b="0"/>
             <wp:docPr id="1251230627" name="Picture 1"/>
             <wp:cNvGraphicFramePr>
               <a:graphicFrameLocks xmlns:a="http://schemas.openxmlformats.org/drawingml/2006/main" noChangeAspect="1"/>
@@ -53,7 +96,7 @@
                   <pic:spPr>
                     <a:xfrm>
                       <a:off x="0" y="0"/>
-                      <a:ext cx="2994457" cy="1796675"/>
+                      <a:ext cx="3048546" cy="1829128"/>
                     </a:xfrm>
                     <a:prstGeom prst="rect">
                       <a:avLst/>
@@ -70,9 +113,9 @@
           <w:noProof/>
         </w:rPr>
         <w:drawing>
-          <wp:inline distT="0" distB="0" distL="0" distR="0" wp14:anchorId="0B1AA0D7" wp14:editId="3BBBA734">
-            <wp:extent cx="2946907" cy="1768144"/>
-            <wp:effectExtent l="0" t="0" r="0" b="0"/>
+          <wp:inline distT="0" distB="0" distL="0" distR="0" wp14:anchorId="0B1AA0D7" wp14:editId="721B4F56">
+            <wp:extent cx="2944285" cy="1766570"/>
+            <wp:effectExtent l="0" t="0" r="2540" b="0"/>
             <wp:docPr id="747855129" name="Picture 2"/>
             <wp:cNvGraphicFramePr>
               <a:graphicFrameLocks xmlns:a="http://schemas.openxmlformats.org/drawingml/2006/main" noChangeAspect="1"/>
@@ -93,7 +136,7 @@
                   <pic:spPr>
                     <a:xfrm>
                       <a:off x="0" y="0"/>
-                      <a:ext cx="3072503" cy="1843501"/>
+                      <a:ext cx="3116747" cy="1870047"/>
                     </a:xfrm>
                     <a:prstGeom prst="rect">
                       <a:avLst/>
@@ -130,23 +173,7 @@
           <w:sz w:val="16"/>
           <w:szCs w:val="16"/>
         </w:rPr>
-        <w:t xml:space="preserve"> </w:t>
-      </w:r>
-      <w:r>
-        <w:rPr>
-          <w:rFonts w:ascii="Garamond" w:hAnsi="Garamond"/>
-          <w:sz w:val="16"/>
-          <w:szCs w:val="16"/>
-        </w:rPr>
-        <w:t>Model Performance comparison among data sources and model types. Accuracy indicates the proportion of each class correctly classified. F1-Score is the harmonic mean of precision and recall, providing a balanced performance measure across all watershed classes. Results compare three Sr87/86 isotope preprocessing methods (RAW, GAM, MA) and three machine learning algorithms (Random Forest, SVM, KNN) using either all test data (Total) or only overlapping isotope ranges (Overlapping). Color scale: blue = lower performance, red = higher performance</w:t>
-      </w:r>
-      <w:r>
-        <w:rPr>
-          <w:rFonts w:ascii="Garamond" w:hAnsi="Garamond"/>
-          <w:sz w:val="16"/>
-          <w:szCs w:val="16"/>
-        </w:rPr>
-        <w:t xml:space="preserve">. </w:t>
+        <w:t xml:space="preserve"> Model Performance comparison among data sources and model types. Accuracy indicates the proportion of each class correctly classified. F1-Score is the harmonic mean of precision and recall, providing a balanced performance measure across all watershed classes. Results compare three Sr87/86 isotope preprocessing methods (RAW, GAM, MA) and three machine learning algorithms (Random Forest, SVM, KNN) using either all test data (Total) or only overlapping isotope ranges (Overlapping). Color scale: blue = lower performance, red = higher performance. </w:t>
       </w:r>
     </w:p>
     <w:p>
@@ -174,10 +201,10 @@
           <w:szCs w:val="16"/>
         </w:rPr>
         <w:drawing>
-          <wp:inline distT="0" distB="0" distL="0" distR="0" wp14:anchorId="5475E609" wp14:editId="02510A55">
-            <wp:extent cx="5733774" cy="2866887"/>
-            <wp:effectExtent l="0" t="0" r="0" b="3810"/>
-            <wp:docPr id="1392389250" name="Picture 3"/>
+          <wp:inline distT="0" distB="0" distL="0" distR="0" wp14:anchorId="16679699" wp14:editId="06016901">
+            <wp:extent cx="5429250" cy="2714625"/>
+            <wp:effectExtent l="0" t="0" r="6350" b="3175"/>
+            <wp:docPr id="1789130704" name="Picture 6"/>
             <wp:cNvGraphicFramePr>
               <a:graphicFrameLocks xmlns:a="http://schemas.openxmlformats.org/drawingml/2006/main" noChangeAspect="1"/>
             </wp:cNvGraphicFramePr>
@@ -185,7 +212,7 @@
               <a:graphicData uri="http://schemas.openxmlformats.org/drawingml/2006/picture">
                 <pic:pic xmlns:pic="http://schemas.openxmlformats.org/drawingml/2006/picture">
                   <pic:nvPicPr>
-                    <pic:cNvPr id="1392389250" name="Picture 1392389250"/>
+                    <pic:cNvPr id="1789130704" name="Picture 1789130704"/>
                     <pic:cNvPicPr/>
                   </pic:nvPicPr>
                   <pic:blipFill>
@@ -197,7 +224,7 @@
                   <pic:spPr>
                     <a:xfrm>
                       <a:off x="0" y="0"/>
-                      <a:ext cx="5746402" cy="2873201"/>
+                      <a:ext cx="5429250" cy="2714625"/>
                     </a:xfrm>
                     <a:prstGeom prst="rect">
                       <a:avLst/>
@@ -223,25 +250,7 @@
           <w:sz w:val="16"/>
           <w:szCs w:val="16"/>
         </w:rPr>
-        <w:t xml:space="preserve">Confusion matrix from the highest preforming model (Random Forest on GAM Smoothed data) for both total </w:t>
-      </w:r>
-      <w:proofErr w:type="gramStart"/>
-      <w:r>
-        <w:rPr>
-          <w:rFonts w:ascii="Garamond" w:hAnsi="Garamond"/>
-          <w:sz w:val="16"/>
-          <w:szCs w:val="16"/>
-        </w:rPr>
-        <w:t>test</w:t>
-      </w:r>
-      <w:proofErr w:type="gramEnd"/>
-      <w:r>
-        <w:rPr>
-          <w:rFonts w:ascii="Garamond" w:hAnsi="Garamond"/>
-          <w:sz w:val="16"/>
-          <w:szCs w:val="16"/>
-        </w:rPr>
-        <w:t xml:space="preserve"> set and overlapping subset. Boxes along the horizontal axis indicate correctly classified individuals.  </w:t>
+        <w:t xml:space="preserve">Confusion matrix from the highest preforming model (Random Forest on GAM Smoothed data) for both total test set and overlapping subset. Boxes along the horizontal axis indicate correctly classified individuals.  </w:t>
       </w:r>
     </w:p>
     <w:p>
@@ -255,8 +264,377 @@
     </w:p>
     <w:p>
       <w:pPr>
-        <w:rPr>
-          <w:rFonts w:ascii="Garamond" w:hAnsi="Garamond"/>
+        <w:jc w:val="center"/>
+        <w:rPr>
+          <w:rFonts w:ascii="Garamond" w:hAnsi="Garamond"/>
+          <w:sz w:val="16"/>
+          <w:szCs w:val="16"/>
+        </w:rPr>
+      </w:pPr>
+      <w:r>
+        <w:rPr>
+          <w:rFonts w:ascii="Garamond" w:hAnsi="Garamond"/>
+          <w:noProof/>
+          <w:sz w:val="16"/>
+          <w:szCs w:val="16"/>
+        </w:rPr>
+        <w:drawing>
+          <wp:inline distT="0" distB="0" distL="0" distR="0" wp14:anchorId="4608D8C9" wp14:editId="12B0A98C">
+            <wp:extent cx="5966548" cy="4972124"/>
+            <wp:effectExtent l="0" t="0" r="2540" b="6350"/>
+            <wp:docPr id="2003545803" name="Picture 1" descr="A diagram of a diagram&#10;&#10;AI-generated content may be incorrect."/>
+            <wp:cNvGraphicFramePr>
+              <a:graphicFrameLocks xmlns:a="http://schemas.openxmlformats.org/drawingml/2006/main" noChangeAspect="1"/>
+            </wp:cNvGraphicFramePr>
+            <a:graphic xmlns:a="http://schemas.openxmlformats.org/drawingml/2006/main">
+              <a:graphicData uri="http://schemas.openxmlformats.org/drawingml/2006/picture">
+                <pic:pic xmlns:pic="http://schemas.openxmlformats.org/drawingml/2006/picture">
+                  <pic:nvPicPr>
+                    <pic:cNvPr id="2003545803" name="Picture 1" descr="A diagram of a diagram&#10;&#10;AI-generated content may be incorrect."/>
+                    <pic:cNvPicPr/>
+                  </pic:nvPicPr>
+                  <pic:blipFill>
+                    <a:blip r:embed="rId7" cstate="print">
+                      <a:extLst>
+                        <a:ext uri="{28A0092B-C50C-407E-A947-70E740481C1C}">
+                          <a14:useLocalDpi xmlns:a14="http://schemas.microsoft.com/office/drawing/2010/main" val="0"/>
+                        </a:ext>
+                      </a:extLst>
+                    </a:blip>
+                    <a:stretch>
+                      <a:fillRect/>
+                    </a:stretch>
+                  </pic:blipFill>
+                  <pic:spPr>
+                    <a:xfrm>
+                      <a:off x="0" y="0"/>
+                      <a:ext cx="6040339" cy="5033617"/>
+                    </a:xfrm>
+                    <a:prstGeom prst="rect">
+                      <a:avLst/>
+                    </a:prstGeom>
+                  </pic:spPr>
+                </pic:pic>
+              </a:graphicData>
+            </a:graphic>
+          </wp:inline>
+        </w:drawing>
+      </w:r>
+    </w:p>
+    <w:p>
+      <w:pPr>
+        <w:rPr>
+          <w:rFonts w:ascii="Garamond" w:hAnsi="Garamond"/>
+          <w:sz w:val="16"/>
+          <w:szCs w:val="16"/>
+        </w:rPr>
+      </w:pPr>
+      <w:r>
+        <w:rPr>
+          <w:rFonts w:ascii="Garamond" w:hAnsi="Garamond"/>
+          <w:b/>
+          <w:bCs/>
+          <w:sz w:val="16"/>
+          <w:szCs w:val="16"/>
+        </w:rPr>
+        <w:t>Figure 3:</w:t>
+      </w:r>
+      <w:r>
+        <w:rPr>
+          <w:rFonts w:ascii="Garamond" w:hAnsi="Garamond"/>
+          <w:sz w:val="16"/>
+          <w:szCs w:val="16"/>
+        </w:rPr>
+        <w:t xml:space="preserve"> Principal Component analysis of timeseries matrix. Each point indicated a full timeseries, colored by watershed. Red points indicate Kuskokwim, Green are </w:t>
+      </w:r>
+      <w:proofErr w:type="spellStart"/>
+      <w:r>
+        <w:rPr>
+          <w:rFonts w:ascii="Garamond" w:hAnsi="Garamond"/>
+          <w:sz w:val="16"/>
+          <w:szCs w:val="16"/>
+        </w:rPr>
+        <w:t>Nushagak</w:t>
+      </w:r>
+      <w:proofErr w:type="spellEnd"/>
+      <w:r>
+        <w:rPr>
+          <w:rFonts w:ascii="Garamond" w:hAnsi="Garamond"/>
+          <w:sz w:val="16"/>
+          <w:szCs w:val="16"/>
+        </w:rPr>
+        <w:t xml:space="preserve">, and Blue </w:t>
+      </w:r>
+      <w:proofErr w:type="gramStart"/>
+      <w:r>
+        <w:rPr>
+          <w:rFonts w:ascii="Garamond" w:hAnsi="Garamond"/>
+          <w:sz w:val="16"/>
+          <w:szCs w:val="16"/>
+        </w:rPr>
+        <w:t>are</w:t>
+      </w:r>
+      <w:proofErr w:type="gramEnd"/>
+      <w:r>
+        <w:rPr>
+          <w:rFonts w:ascii="Garamond" w:hAnsi="Garamond"/>
+          <w:sz w:val="16"/>
+          <w:szCs w:val="16"/>
+        </w:rPr>
+        <w:t xml:space="preserve"> Yukon. </w:t>
+      </w:r>
+    </w:p>
+    <w:p>
+      <w:pPr>
+        <w:rPr>
+          <w:rFonts w:ascii="Garamond" w:hAnsi="Garamond"/>
+          <w:sz w:val="16"/>
+          <w:szCs w:val="16"/>
+        </w:rPr>
+      </w:pPr>
+    </w:p>
+    <w:p>
+      <w:pPr>
+        <w:rPr>
+          <w:rFonts w:ascii="Garamond" w:hAnsi="Garamond"/>
+          <w:sz w:val="16"/>
+          <w:szCs w:val="16"/>
+        </w:rPr>
+      </w:pPr>
+    </w:p>
+    <w:p>
+      <w:pPr>
+        <w:rPr>
+          <w:rFonts w:ascii="Garamond" w:hAnsi="Garamond"/>
+          <w:sz w:val="16"/>
+          <w:szCs w:val="16"/>
+        </w:rPr>
+      </w:pPr>
+    </w:p>
+    <w:p>
+      <w:pPr>
+        <w:rPr>
+          <w:rFonts w:ascii="Garamond" w:hAnsi="Garamond"/>
+          <w:sz w:val="16"/>
+          <w:szCs w:val="16"/>
+        </w:rPr>
+      </w:pPr>
+      <w:r>
+        <w:rPr>
+          <w:rFonts w:ascii="Garamond" w:hAnsi="Garamond"/>
+          <w:noProof/>
+          <w:sz w:val="16"/>
+          <w:szCs w:val="16"/>
+        </w:rPr>
+        <w:lastRenderedPageBreak/>
+        <w:drawing>
+          <wp:inline distT="0" distB="0" distL="0" distR="0" wp14:anchorId="4A1B09DB" wp14:editId="4CC68D50">
+            <wp:extent cx="2259330" cy="3614926"/>
+            <wp:effectExtent l="0" t="0" r="1270" b="5080"/>
+            <wp:docPr id="603413073" name="Picture 5"/>
+            <wp:cNvGraphicFramePr>
+              <a:graphicFrameLocks xmlns:a="http://schemas.openxmlformats.org/drawingml/2006/main" noChangeAspect="1"/>
+            </wp:cNvGraphicFramePr>
+            <a:graphic xmlns:a="http://schemas.openxmlformats.org/drawingml/2006/main">
+              <a:graphicData uri="http://schemas.openxmlformats.org/drawingml/2006/picture">
+                <pic:pic xmlns:pic="http://schemas.openxmlformats.org/drawingml/2006/picture">
+                  <pic:nvPicPr>
+                    <pic:cNvPr id="603413073" name="Picture 603413073"/>
+                    <pic:cNvPicPr/>
+                  </pic:nvPicPr>
+                  <pic:blipFill>
+                    <a:blip r:embed="rId8"/>
+                    <a:stretch>
+                      <a:fillRect/>
+                    </a:stretch>
+                  </pic:blipFill>
+                  <pic:spPr>
+                    <a:xfrm>
+                      <a:off x="0" y="0"/>
+                      <a:ext cx="2333787" cy="3734057"/>
+                    </a:xfrm>
+                    <a:prstGeom prst="rect">
+                      <a:avLst/>
+                    </a:prstGeom>
+                  </pic:spPr>
+                </pic:pic>
+              </a:graphicData>
+            </a:graphic>
+          </wp:inline>
+        </w:drawing>
+      </w:r>
+      <w:r>
+        <w:rPr>
+          <w:rFonts w:ascii="Garamond" w:hAnsi="Garamond"/>
+          <w:noProof/>
+          <w:sz w:val="16"/>
+          <w:szCs w:val="16"/>
+        </w:rPr>
+        <w:drawing>
+          <wp:inline distT="0" distB="0" distL="0" distR="0" wp14:anchorId="7320D619" wp14:editId="5260B2CA">
+            <wp:extent cx="3677478" cy="3677478"/>
+            <wp:effectExtent l="0" t="0" r="5715" b="5715"/>
+            <wp:docPr id="1405313982" name="Picture 4"/>
+            <wp:cNvGraphicFramePr>
+              <a:graphicFrameLocks xmlns:a="http://schemas.openxmlformats.org/drawingml/2006/main" noChangeAspect="1"/>
+            </wp:cNvGraphicFramePr>
+            <a:graphic xmlns:a="http://schemas.openxmlformats.org/drawingml/2006/main">
+              <a:graphicData uri="http://schemas.openxmlformats.org/drawingml/2006/picture">
+                <pic:pic xmlns:pic="http://schemas.openxmlformats.org/drawingml/2006/picture">
+                  <pic:nvPicPr>
+                    <pic:cNvPr id="1405313982" name="Picture 1405313982"/>
+                    <pic:cNvPicPr/>
+                  </pic:nvPicPr>
+                  <pic:blipFill>
+                    <a:blip r:embed="rId9"/>
+                    <a:stretch>
+                      <a:fillRect/>
+                    </a:stretch>
+                  </pic:blipFill>
+                  <pic:spPr>
+                    <a:xfrm>
+                      <a:off x="0" y="0"/>
+                      <a:ext cx="3731855" cy="3731855"/>
+                    </a:xfrm>
+                    <a:prstGeom prst="rect">
+                      <a:avLst/>
+                    </a:prstGeom>
+                  </pic:spPr>
+                </pic:pic>
+              </a:graphicData>
+            </a:graphic>
+          </wp:inline>
+        </w:drawing>
+      </w:r>
+    </w:p>
+    <w:p>
+      <w:pPr>
+        <w:rPr>
+          <w:rFonts w:ascii="Garamond" w:hAnsi="Garamond"/>
+          <w:b/>
+          <w:bCs/>
+          <w:sz w:val="16"/>
+          <w:szCs w:val="16"/>
+        </w:rPr>
+      </w:pPr>
+      <w:r>
+        <w:rPr>
+          <w:rFonts w:ascii="Garamond" w:hAnsi="Garamond"/>
+          <w:b/>
+          <w:bCs/>
+          <w:sz w:val="16"/>
+          <w:szCs w:val="16"/>
+        </w:rPr>
+        <w:t>Figure 4:</w:t>
+      </w:r>
+      <w:r>
+        <w:rPr>
+          <w:rFonts w:ascii="Garamond" w:hAnsi="Garamond"/>
+          <w:b/>
+          <w:bCs/>
+          <w:sz w:val="16"/>
+          <w:szCs w:val="16"/>
+        </w:rPr>
+        <w:t xml:space="preserve"> </w:t>
+      </w:r>
+      <w:r>
+        <w:rPr>
+          <w:rFonts w:ascii="Garamond" w:hAnsi="Garamond"/>
+          <w:sz w:val="16"/>
+          <w:szCs w:val="16"/>
+        </w:rPr>
+        <w:t>A)</w:t>
+      </w:r>
+      <w:r>
+        <w:rPr>
+          <w:rFonts w:ascii="Garamond" w:hAnsi="Garamond"/>
+          <w:sz w:val="16"/>
+          <w:szCs w:val="16"/>
+        </w:rPr>
+        <w:t xml:space="preserve"> Principal component analysis of all samples with a natal origin Sr8786 of 0.708- 0.</w:t>
+      </w:r>
+      <w:r>
+        <w:rPr>
+          <w:rFonts w:ascii="Garamond" w:hAnsi="Garamond"/>
+          <w:sz w:val="16"/>
+          <w:szCs w:val="16"/>
+        </w:rPr>
+        <w:t>7085. Clustering among watersheds is evident between principal components 1 and 2 (X% of variance</w:t>
+      </w:r>
+      <w:proofErr w:type="gramStart"/>
+      <w:r>
+        <w:rPr>
+          <w:rFonts w:ascii="Garamond" w:hAnsi="Garamond"/>
+          <w:sz w:val="16"/>
+          <w:szCs w:val="16"/>
+        </w:rPr>
+        <w:t>) ,</w:t>
+      </w:r>
+      <w:proofErr w:type="gramEnd"/>
+      <w:r>
+        <w:rPr>
+          <w:rFonts w:ascii="Garamond" w:hAnsi="Garamond"/>
+          <w:sz w:val="16"/>
+          <w:szCs w:val="16"/>
+        </w:rPr>
+        <w:t xml:space="preserve"> as well as between principal components 2 and 3 (X percent variance). There </w:t>
+      </w:r>
+      <w:proofErr w:type="gramStart"/>
+      <w:r>
+        <w:rPr>
+          <w:rFonts w:ascii="Garamond" w:hAnsi="Garamond"/>
+          <w:sz w:val="16"/>
+          <w:szCs w:val="16"/>
+        </w:rPr>
+        <w:t xml:space="preserve">is </w:t>
+      </w:r>
+      <w:proofErr w:type="spellStart"/>
+      <w:r>
+        <w:rPr>
+          <w:rFonts w:ascii="Garamond" w:hAnsi="Garamond"/>
+          <w:sz w:val="16"/>
+          <w:szCs w:val="16"/>
+        </w:rPr>
+        <w:t>come</w:t>
+      </w:r>
+      <w:proofErr w:type="spellEnd"/>
+      <w:proofErr w:type="gramEnd"/>
+      <w:r>
+        <w:rPr>
+          <w:rFonts w:ascii="Garamond" w:hAnsi="Garamond"/>
+          <w:sz w:val="16"/>
+          <w:szCs w:val="16"/>
+        </w:rPr>
+        <w:t xml:space="preserve"> overlap between all three watersheds in both cases. B) Sample otolith LA timeseries colored by the absolute value of the PCA loadings at associated indices. PC1 (top row) shows high loading on the middle section of the timeseries after the natal origin region. Variance in PC2 is driven by the region of the timeseries towards the marine entry. PC3 (X variance) is driven by the very beginning of the timeseries, which is the region associated with the natal origin.</w:t>
+      </w:r>
+      <w:r>
+        <w:rPr>
+          <w:rFonts w:ascii="Garamond" w:hAnsi="Garamond"/>
+          <w:b/>
+          <w:bCs/>
+          <w:sz w:val="16"/>
+          <w:szCs w:val="16"/>
+        </w:rPr>
+        <w:t xml:space="preserve"> </w:t>
+      </w:r>
+    </w:p>
+    <w:p>
+      <w:pPr>
+        <w:rPr>
+          <w:rFonts w:ascii="Garamond" w:hAnsi="Garamond"/>
+          <w:b/>
+          <w:bCs/>
+          <w:sz w:val="16"/>
+          <w:szCs w:val="16"/>
+        </w:rPr>
+      </w:pPr>
+    </w:p>
+    <w:p>
+      <w:pPr>
+        <w:rPr>
+          <w:rFonts w:ascii="Garamond" w:hAnsi="Garamond"/>
+          <w:b/>
+          <w:bCs/>
           <w:sz w:val="16"/>
           <w:szCs w:val="16"/>
         </w:rPr>

</xml_diff>

<commit_message>
citations and another go-through of intro
</commit_message>
<xml_diff>
--- a/Docs/FIGURES Machine learning applied to otolith timeseries data to discriminate river of origin for Western Alaska Salmon.docx
+++ b/Docs/FIGURES Machine learning applied to otolith timeseries data to discriminate river of origin for Western Alaska Salmon.docx
@@ -4,26 +4,17 @@
   <w:body>
     <w:p>
       <w:r>
-        <w:t xml:space="preserve">** Figures for MS ML applied to otolith </w:t>
+        <w:t xml:space="preserve">Figure 1: Map of full AYK </w:t>
       </w:r>
       <w:proofErr w:type="spellStart"/>
       <w:r>
-        <w:t>ts</w:t>
+        <w:t>isoscape</w:t>
       </w:r>
       <w:proofErr w:type="spellEnd"/>
       <w:r>
-        <w:t xml:space="preserve"> data to discriminate river of origin </w:t>
-      </w:r>
-      <w:proofErr w:type="spellStart"/>
-      <w:r>
-        <w:t>ifor</w:t>
-      </w:r>
-      <w:proofErr w:type="spellEnd"/>
-      <w:r>
-        <w:t xml:space="preserve"> Western Alaska Salmon. </w:t>
+        <w:t xml:space="preserve">, Coastal Western Alaska Region, and sampling site locations. </w:t>
       </w:r>
     </w:p>
-    <w:p/>
     <w:p>
       <w:pPr>
         <w:rPr>
@@ -48,23 +39,6 @@
           <w:szCs w:val="22"/>
         </w:rPr>
       </w:pPr>
-    </w:p>
-    <w:p>
-      <w:pPr>
-        <w:rPr>
-          <w:rFonts w:ascii="Garamond" w:hAnsi="Garamond"/>
-          <w:sz w:val="22"/>
-          <w:szCs w:val="22"/>
-        </w:rPr>
-      </w:pPr>
-      <w:r>
-        <w:rPr>
-          <w:rFonts w:ascii="Garamond" w:hAnsi="Garamond"/>
-          <w:sz w:val="22"/>
-          <w:szCs w:val="22"/>
-        </w:rPr>
-        <w:t xml:space="preserve">Alternative option for Figure 1: Map of the three watersheds and sample site locations? </w:t>
-      </w:r>
     </w:p>
     <w:p/>
     <w:p>
@@ -165,7 +139,27 @@
           <w:sz w:val="16"/>
           <w:szCs w:val="16"/>
         </w:rPr>
-        <w:t>Figure 1:</w:t>
+        <w:t xml:space="preserve">Figure </w:t>
+      </w:r>
+      <w:r>
+        <w:rPr>
+          <w:rFonts w:ascii="Garamond" w:hAnsi="Garamond"/>
+          <w:b/>
+          <w:bCs/>
+          <w:sz w:val="16"/>
+          <w:szCs w:val="16"/>
+        </w:rPr>
+        <w:t>2</w:t>
+      </w:r>
+      <w:r>
+        <w:rPr>
+          <w:rFonts w:ascii="Garamond" w:hAnsi="Garamond"/>
+          <w:b/>
+          <w:bCs/>
+          <w:sz w:val="16"/>
+          <w:szCs w:val="16"/>
+        </w:rPr>
+        <w:t>:</w:t>
       </w:r>
       <w:r>
         <w:rPr>
@@ -278,6 +272,7 @@
           <w:sz w:val="16"/>
           <w:szCs w:val="16"/>
         </w:rPr>
+        <w:lastRenderedPageBreak/>
         <w:drawing>
           <wp:inline distT="0" distB="0" distL="0" distR="0" wp14:anchorId="4608D8C9" wp14:editId="12B0A98C">
             <wp:extent cx="5966548" cy="4972124"/>
@@ -428,7 +423,7 @@
         </w:rPr>
         <w:lastRenderedPageBreak/>
         <w:drawing>
-          <wp:inline distT="0" distB="0" distL="0" distR="0" wp14:anchorId="4A1B09DB" wp14:editId="4CC68D50">
+          <wp:inline distT="0" distB="0" distL="0" distR="0" wp14:anchorId="4A1B09DB" wp14:editId="37F47D6C">
             <wp:extent cx="2259330" cy="3614926"/>
             <wp:effectExtent l="0" t="0" r="1270" b="5080"/>
             <wp:docPr id="603413073" name="Picture 5"/>
@@ -451,7 +446,7 @@
                   <pic:spPr>
                     <a:xfrm>
                       <a:off x="0" y="0"/>
-                      <a:ext cx="2333787" cy="3734057"/>
+                      <a:ext cx="2336647" cy="3738633"/>
                     </a:xfrm>
                     <a:prstGeom prst="rect">
                       <a:avLst/>

</xml_diff>

<commit_message>
done with methods and onto results
</commit_message>
<xml_diff>
--- a/Docs/FIGURES Machine learning applied to otolith timeseries data to discriminate river of origin for Western Alaska Salmon.docx
+++ b/Docs/FIGURES Machine learning applied to otolith timeseries data to discriminate river of origin for Western Alaska Salmon.docx
@@ -237,6 +237,14 @@
           <w:szCs w:val="16"/>
         </w:rPr>
         <w:t xml:space="preserve">Figure 2: </w:t>
+      </w:r>
+      <w:r>
+        <w:rPr>
+          <w:rFonts w:ascii="Garamond" w:hAnsi="Garamond"/>
+          <w:sz w:val="16"/>
+          <w:szCs w:val="16"/>
+        </w:rPr>
+        <w:t xml:space="preserve">Figure 3: </w:t>
       </w:r>
       <w:r>
         <w:rPr>
@@ -332,7 +340,27 @@
           <w:sz w:val="16"/>
           <w:szCs w:val="16"/>
         </w:rPr>
-        <w:t>Figure 3:</w:t>
+        <w:t xml:space="preserve">Figure </w:t>
+      </w:r>
+      <w:r>
+        <w:rPr>
+          <w:rFonts w:ascii="Garamond" w:hAnsi="Garamond"/>
+          <w:b/>
+          <w:bCs/>
+          <w:sz w:val="16"/>
+          <w:szCs w:val="16"/>
+        </w:rPr>
+        <w:t>4</w:t>
+      </w:r>
+      <w:r>
+        <w:rPr>
+          <w:rFonts w:ascii="Garamond" w:hAnsi="Garamond"/>
+          <w:b/>
+          <w:bCs/>
+          <w:sz w:val="16"/>
+          <w:szCs w:val="16"/>
+        </w:rPr>
+        <w:t>:</w:t>
       </w:r>
       <w:r>
         <w:rPr>
@@ -520,7 +548,27 @@
           <w:sz w:val="16"/>
           <w:szCs w:val="16"/>
         </w:rPr>
-        <w:t>Figure 4:</w:t>
+        <w:t xml:space="preserve">Figure </w:t>
+      </w:r>
+      <w:r>
+        <w:rPr>
+          <w:rFonts w:ascii="Garamond" w:hAnsi="Garamond"/>
+          <w:b/>
+          <w:bCs/>
+          <w:sz w:val="16"/>
+          <w:szCs w:val="16"/>
+        </w:rPr>
+        <w:t>5</w:t>
+      </w:r>
+      <w:r>
+        <w:rPr>
+          <w:rFonts w:ascii="Garamond" w:hAnsi="Garamond"/>
+          <w:b/>
+          <w:bCs/>
+          <w:sz w:val="16"/>
+          <w:szCs w:val="16"/>
+        </w:rPr>
+        <w:t>:</w:t>
       </w:r>
       <w:r>
         <w:rPr>

</xml_diff>

<commit_message>
full draft go through (without discussion) and updated figures
</commit_message>
<xml_diff>
--- a/Docs/FIGURES Machine learning applied to otolith timeseries data to discriminate river of origin for Western Alaska Salmon.docx
+++ b/Docs/FIGURES Machine learning applied to otolith timeseries data to discriminate river of origin for Western Alaska Salmon.docx
@@ -3,15 +3,54 @@
 <w:document xmlns:wpc="http://schemas.microsoft.com/office/word/2010/wordprocessingCanvas" xmlns:cx="http://schemas.microsoft.com/office/drawing/2014/chartex" xmlns:cx1="http://schemas.microsoft.com/office/drawing/2015/9/8/chartex" xmlns:cx2="http://schemas.microsoft.com/office/drawing/2015/10/21/chartex" xmlns:cx3="http://schemas.microsoft.com/office/drawing/2016/5/9/chartex" xmlns:cx4="http://schemas.microsoft.com/office/drawing/2016/5/10/chartex" xmlns:cx5="http://schemas.microsoft.com/office/drawing/2016/5/11/chartex" xmlns:cx6="http://schemas.microsoft.com/office/drawing/2016/5/12/chartex" xmlns:cx7="http://schemas.microsoft.com/office/drawing/2016/5/13/chartex" xmlns:cx8="http://schemas.microsoft.com/office/drawing/2016/5/14/chartex" xmlns:mc="http://schemas.openxmlformats.org/markup-compatibility/2006" xmlns:aink="http://schemas.microsoft.com/office/drawing/2016/ink" xmlns:am3d="http://schemas.microsoft.com/office/drawing/2017/model3d" xmlns:o="urn:schemas-microsoft-com:office:office" xmlns:oel="http://schemas.microsoft.com/office/2019/extlst" xmlns:r="http://schemas.openxmlformats.org/officeDocument/2006/relationships" xmlns:m="http://schemas.openxmlformats.org/officeDocument/2006/math" xmlns:v="urn:schemas-microsoft-com:vml" xmlns:wp14="http://schemas.microsoft.com/office/word/2010/wordprocessingDrawing" xmlns:wp="http://schemas.openxmlformats.org/drawingml/2006/wordprocessingDrawing" xmlns:w10="urn:schemas-microsoft-com:office:word" xmlns:w="http://schemas.openxmlformats.org/wordprocessingml/2006/main" xmlns:w14="http://schemas.microsoft.com/office/word/2010/wordml" xmlns:w15="http://schemas.microsoft.com/office/word/2012/wordml" xmlns:w16cex="http://schemas.microsoft.com/office/word/2018/wordml/cex" xmlns:w16cid="http://schemas.microsoft.com/office/word/2016/wordml/cid" xmlns:w16="http://schemas.microsoft.com/office/word/2018/wordml" xmlns:w16du="http://schemas.microsoft.com/office/word/2023/wordml/word16du" xmlns:w16sdtdh="http://schemas.microsoft.com/office/word/2020/wordml/sdtdatahash" xmlns:w16sdtfl="http://schemas.microsoft.com/office/word/2024/wordml/sdtformatlock" xmlns:w16se="http://schemas.microsoft.com/office/word/2015/wordml/symex" xmlns:wpg="http://schemas.microsoft.com/office/word/2010/wordprocessingGroup" xmlns:wpi="http://schemas.microsoft.com/office/word/2010/wordprocessingInk" xmlns:wne="http://schemas.microsoft.com/office/word/2006/wordml" xmlns:wps="http://schemas.microsoft.com/office/word/2010/wordprocessingShape" mc:Ignorable="w14 w15 w16se w16cid w16 w16cex w16sdtdh w16sdtfl w16du wp14">
   <w:body>
     <w:p>
-      <w:r>
+      <w:pPr>
+        <w:rPr>
+          <w:rFonts w:ascii="Garamond" w:hAnsi="Garamond"/>
+          <w:sz w:val="16"/>
+          <w:szCs w:val="16"/>
+        </w:rPr>
+      </w:pPr>
+      <w:r>
+        <w:rPr>
+          <w:rFonts w:ascii="Garamond" w:hAnsi="Garamond"/>
+          <w:sz w:val="16"/>
+          <w:szCs w:val="16"/>
+        </w:rPr>
+        <w:t xml:space="preserve">** in progress*** </w:t>
+      </w:r>
+    </w:p>
+    <w:p>
+      <w:pPr>
+        <w:rPr>
+          <w:rFonts w:ascii="Garamond" w:hAnsi="Garamond"/>
+          <w:sz w:val="16"/>
+          <w:szCs w:val="16"/>
+        </w:rPr>
+      </w:pPr>
+      <w:r>
+        <w:rPr>
+          <w:rFonts w:ascii="Garamond" w:hAnsi="Garamond"/>
+          <w:sz w:val="16"/>
+          <w:szCs w:val="16"/>
+        </w:rPr>
         <w:t xml:space="preserve">Figure 1: Map of full AYK </w:t>
       </w:r>
       <w:proofErr w:type="spellStart"/>
       <w:r>
+        <w:rPr>
+          <w:rFonts w:ascii="Garamond" w:hAnsi="Garamond"/>
+          <w:sz w:val="16"/>
+          <w:szCs w:val="16"/>
+        </w:rPr>
         <w:t>isoscape</w:t>
       </w:r>
       <w:proofErr w:type="spellEnd"/>
       <w:r>
+        <w:rPr>
+          <w:rFonts w:ascii="Garamond" w:hAnsi="Garamond"/>
+          <w:sz w:val="16"/>
+          <w:szCs w:val="16"/>
+        </w:rPr>
         <w:t xml:space="preserve">, Coastal Western Alaska Region, and sampling site locations. </w:t>
       </w:r>
     </w:p>
@@ -19,24 +58,6 @@
       <w:pPr>
         <w:rPr>
           <w:rFonts w:ascii="Garamond" w:hAnsi="Garamond"/>
-        </w:rPr>
-      </w:pPr>
-    </w:p>
-    <w:p>
-      <w:pPr>
-        <w:rPr>
-          <w:rFonts w:ascii="Garamond" w:hAnsi="Garamond"/>
-          <w:sz w:val="22"/>
-          <w:szCs w:val="22"/>
-        </w:rPr>
-      </w:pPr>
-    </w:p>
-    <w:p>
-      <w:pPr>
-        <w:rPr>
-          <w:rFonts w:ascii="Garamond" w:hAnsi="Garamond"/>
-          <w:sz w:val="22"/>
-          <w:szCs w:val="22"/>
         </w:rPr>
       </w:pPr>
     </w:p>
@@ -167,8 +188,25 @@
           <w:sz w:val="16"/>
           <w:szCs w:val="16"/>
         </w:rPr>
-        <w:t xml:space="preserve"> Model Performance comparison among data sources and model types. Accuracy indicates the proportion of each class correctly classified. F1-Score is the harmonic mean of precision and recall, providing a balanced performance measure across all watershed classes. Results compare three Sr87/86 isotope preprocessing methods (RAW, GAM, MA) and three machine learning algorithms (Random Forest, SVM, KNN) using either all test data (Total) or only overlapping isotope ranges (Overlapping). Color scale: blue = lower performance, red = higher performance. </w:t>
-      </w:r>
+        <w:t xml:space="preserve"> Model Performance comparison among data sources and model types. Accuracy indicates the proportion of each class correctly classified. F1-Score is the harmonic mean of precision and recall, providing a balanced performance measure across all watershed classes. Results compare three Sr87/86 isotope preprocessing methods (RAW, GAM, MA) and three machine learning algorithms (Random Forest, SVM, KNN) using either all test data (Total) or only overlapping isotope ranges (Overlapping). </w:t>
+      </w:r>
+      <w:r>
+        <w:rPr>
+          <w:rFonts w:ascii="Garamond" w:hAnsi="Garamond"/>
+          <w:sz w:val="16"/>
+          <w:szCs w:val="16"/>
+        </w:rPr>
+        <w:t xml:space="preserve">Cooler colors represent lower values whereas warmer colors represent relatively higher values. </w:t>
+      </w:r>
+    </w:p>
+    <w:p>
+      <w:pPr>
+        <w:rPr>
+          <w:rFonts w:ascii="Garamond" w:hAnsi="Garamond"/>
+          <w:sz w:val="16"/>
+          <w:szCs w:val="16"/>
+        </w:rPr>
+      </w:pPr>
     </w:p>
     <w:p>
       <w:pPr>
@@ -252,7 +290,23 @@
           <w:sz w:val="16"/>
           <w:szCs w:val="16"/>
         </w:rPr>
-        <w:t xml:space="preserve">Confusion matrix from the highest preforming model (Random Forest on GAM Smoothed data) for both total test set and overlapping subset. Boxes along the horizontal axis indicate correctly classified individuals.  </w:t>
+        <w:t>Confusion matrix from the highest preforming model (Random Forest on GAM Smoothed data) for both total test set and overlapping subset. Boxes along the horizontal axis indicate correctly classified individuals</w:t>
+      </w:r>
+      <w:r>
+        <w:rPr>
+          <w:rFonts w:ascii="Garamond" w:hAnsi="Garamond"/>
+          <w:sz w:val="16"/>
+          <w:szCs w:val="16"/>
+        </w:rPr>
+        <w:t xml:space="preserve"> (red). Vertical axis labels are the actual watershed labels whereas horizontal labels are the predicted class from the model. Percentages are the percent of the actual class identified as the predicted class. </w:t>
+      </w:r>
+      <w:r>
+        <w:rPr>
+          <w:rFonts w:ascii="Garamond" w:hAnsi="Garamond"/>
+          <w:sz w:val="16"/>
+          <w:szCs w:val="16"/>
+        </w:rPr>
+        <w:t xml:space="preserve">  </w:t>
       </w:r>
     </w:p>
     <w:p>
@@ -282,9 +336,9 @@
         </w:rPr>
         <w:lastRenderedPageBreak/>
         <w:drawing>
-          <wp:inline distT="0" distB="0" distL="0" distR="0" wp14:anchorId="4608D8C9" wp14:editId="12B0A98C">
-            <wp:extent cx="5966548" cy="4972124"/>
-            <wp:effectExtent l="0" t="0" r="2540" b="6350"/>
+          <wp:inline distT="0" distB="0" distL="0" distR="0" wp14:anchorId="4608D8C9" wp14:editId="5F6E48C6">
+            <wp:extent cx="6342434" cy="5285363"/>
+            <wp:effectExtent l="0" t="0" r="0" b="0"/>
             <wp:docPr id="2003545803" name="Picture 1" descr="A diagram of a diagram&#10;&#10;AI-generated content may be incorrect."/>
             <wp:cNvGraphicFramePr>
               <a:graphicFrameLocks xmlns:a="http://schemas.openxmlformats.org/drawingml/2006/main" noChangeAspect="1"/>
@@ -311,7 +365,7 @@
                   <pic:spPr>
                     <a:xfrm>
                       <a:off x="0" y="0"/>
-                      <a:ext cx="6040339" cy="5033617"/>
+                      <a:ext cx="6430743" cy="5358954"/>
                     </a:xfrm>
                     <a:prstGeom prst="rect">
                       <a:avLst/>
@@ -368,7 +422,23 @@
           <w:sz w:val="16"/>
           <w:szCs w:val="16"/>
         </w:rPr>
-        <w:t xml:space="preserve"> Principal Component analysis of timeseries matrix. Each point indicated a full timeseries, colored by watershed. Red points indicate Kuskokwim, Green are </w:t>
+        <w:t xml:space="preserve"> Principal Component analysis of </w:t>
+      </w:r>
+      <w:r>
+        <w:rPr>
+          <w:rFonts w:ascii="Garamond" w:hAnsi="Garamond"/>
+          <w:sz w:val="16"/>
+          <w:szCs w:val="16"/>
+        </w:rPr>
+        <w:t>gam smoothed timeseries data (n = 2,531). Significant clustering is evident for all three watersheds, but with overlap between all watersheds. Yukon (Blue points) contain a much larger range of values</w:t>
+      </w:r>
+      <w:r>
+        <w:rPr>
+          <w:rFonts w:ascii="Garamond" w:hAnsi="Garamond"/>
+          <w:sz w:val="16"/>
+          <w:szCs w:val="16"/>
+        </w:rPr>
+        <w:t xml:space="preserve">, indicative of the large range in natal Sr87/86 values in the basin. Kuskokwim (Red points) overlap between both </w:t>
       </w:r>
       <w:proofErr w:type="spellStart"/>
       <w:r>
@@ -386,25 +456,7 @@
           <w:sz w:val="16"/>
           <w:szCs w:val="16"/>
         </w:rPr>
-        <w:t xml:space="preserve">, and Blue </w:t>
-      </w:r>
-      <w:proofErr w:type="gramStart"/>
-      <w:r>
-        <w:rPr>
-          <w:rFonts w:ascii="Garamond" w:hAnsi="Garamond"/>
-          <w:sz w:val="16"/>
-          <w:szCs w:val="16"/>
-        </w:rPr>
-        <w:t>are</w:t>
-      </w:r>
-      <w:proofErr w:type="gramEnd"/>
-      <w:r>
-        <w:rPr>
-          <w:rFonts w:ascii="Garamond" w:hAnsi="Garamond"/>
-          <w:sz w:val="16"/>
-          <w:szCs w:val="16"/>
-        </w:rPr>
-        <w:t xml:space="preserve"> Yukon. </w:t>
+        <w:t xml:space="preserve"> and Yukon fish, likely due to its position in the region between both watersheds. </w:t>
       </w:r>
     </w:p>
     <w:p>
@@ -620,35 +672,23 @@
           <w:sz w:val="16"/>
           <w:szCs w:val="16"/>
         </w:rPr>
-        <w:t xml:space="preserve"> as well as between principal components 2 and 3 (X percent variance). There </w:t>
-      </w:r>
-      <w:proofErr w:type="gramStart"/>
-      <w:r>
-        <w:rPr>
-          <w:rFonts w:ascii="Garamond" w:hAnsi="Garamond"/>
-          <w:sz w:val="16"/>
-          <w:szCs w:val="16"/>
-        </w:rPr>
-        <w:t xml:space="preserve">is </w:t>
-      </w:r>
-      <w:proofErr w:type="spellStart"/>
-      <w:r>
-        <w:rPr>
-          <w:rFonts w:ascii="Garamond" w:hAnsi="Garamond"/>
-          <w:sz w:val="16"/>
-          <w:szCs w:val="16"/>
-        </w:rPr>
-        <w:t>come</w:t>
-      </w:r>
-      <w:proofErr w:type="spellEnd"/>
-      <w:proofErr w:type="gramEnd"/>
-      <w:r>
-        <w:rPr>
-          <w:rFonts w:ascii="Garamond" w:hAnsi="Garamond"/>
-          <w:sz w:val="16"/>
-          <w:szCs w:val="16"/>
-        </w:rPr>
-        <w:t xml:space="preserve"> overlap between all three watersheds in both cases. B) Sample otolith LA timeseries colored by the absolute value of the PCA loadings at associated indices. PC1 (top row) shows high loading on the middle section of the timeseries after the natal origin region. Variance in PC2 is driven by the region of the timeseries towards the marine entry. PC3 (X variance) is driven by the very beginning of the timeseries, which is the region associated with the natal origin.</w:t>
+        <w:t xml:space="preserve"> as well as between principal components 2 and 3 (X percent variance). There is </w:t>
+      </w:r>
+      <w:r>
+        <w:rPr>
+          <w:rFonts w:ascii="Garamond" w:hAnsi="Garamond"/>
+          <w:sz w:val="16"/>
+          <w:szCs w:val="16"/>
+        </w:rPr>
+        <w:t>s</w:t>
+      </w:r>
+      <w:r>
+        <w:rPr>
+          <w:rFonts w:ascii="Garamond" w:hAnsi="Garamond"/>
+          <w:sz w:val="16"/>
+          <w:szCs w:val="16"/>
+        </w:rPr>
+        <w:t>ome overlap between all three watersheds in both cases. B) Sample otolith LA timeseries colored by the absolute value of the PCA loadings at associated indices. PC1 (top row) shows high loading on the middle section of the timeseries after the natal origin region. Variance in PC2 is driven by the region of the timeseries towards the marine entry. PC3 is driven by the very beginning of the timeseries, which is the region associated with the natal origin.</w:t>
       </w:r>
       <w:r>
         <w:rPr>
@@ -671,6 +711,131 @@
           <w:szCs w:val="16"/>
         </w:rPr>
       </w:pPr>
+    </w:p>
+    <w:p>
+      <w:pPr>
+        <w:rPr>
+          <w:rFonts w:ascii="Garamond" w:hAnsi="Garamond"/>
+          <w:b/>
+          <w:bCs/>
+          <w:sz w:val="16"/>
+          <w:szCs w:val="16"/>
+        </w:rPr>
+      </w:pPr>
+    </w:p>
+    <w:p>
+      <w:pPr>
+        <w:rPr>
+          <w:rFonts w:ascii="Garamond" w:hAnsi="Garamond"/>
+          <w:b/>
+          <w:bCs/>
+          <w:sz w:val="16"/>
+          <w:szCs w:val="16"/>
+        </w:rPr>
+      </w:pPr>
+    </w:p>
+    <w:p>
+      <w:pPr>
+        <w:rPr>
+          <w:rFonts w:ascii="Garamond" w:hAnsi="Garamond"/>
+          <w:b/>
+          <w:bCs/>
+          <w:sz w:val="16"/>
+          <w:szCs w:val="16"/>
+        </w:rPr>
+      </w:pPr>
+      <w:r>
+        <w:rPr>
+          <w:rFonts w:ascii="Garamond" w:hAnsi="Garamond"/>
+          <w:b/>
+          <w:bCs/>
+          <w:noProof/>
+          <w:sz w:val="16"/>
+          <w:szCs w:val="16"/>
+        </w:rPr>
+        <w:lastRenderedPageBreak/>
+        <w:drawing>
+          <wp:inline distT="0" distB="0" distL="0" distR="0" wp14:anchorId="7BDAA027" wp14:editId="281C6EF2">
+            <wp:extent cx="6236340" cy="3118170"/>
+            <wp:effectExtent l="0" t="0" r="0" b="6350"/>
+            <wp:docPr id="1586501588" name="Picture 1" descr="A graph of different colored lines&#10;&#10;AI-generated content may be incorrect."/>
+            <wp:cNvGraphicFramePr>
+              <a:graphicFrameLocks xmlns:a="http://schemas.openxmlformats.org/drawingml/2006/main" noChangeAspect="1"/>
+            </wp:cNvGraphicFramePr>
+            <a:graphic xmlns:a="http://schemas.openxmlformats.org/drawingml/2006/main">
+              <a:graphicData uri="http://schemas.openxmlformats.org/drawingml/2006/picture">
+                <pic:pic xmlns:pic="http://schemas.openxmlformats.org/drawingml/2006/picture">
+                  <pic:nvPicPr>
+                    <pic:cNvPr id="1586501588" name="Picture 1" descr="A graph of different colored lines&#10;&#10;AI-generated content may be incorrect."/>
+                    <pic:cNvPicPr/>
+                  </pic:nvPicPr>
+                  <pic:blipFill>
+                    <a:blip r:embed="rId10" cstate="print">
+                      <a:extLst>
+                        <a:ext uri="{28A0092B-C50C-407E-A947-70E740481C1C}">
+                          <a14:useLocalDpi xmlns:a14="http://schemas.microsoft.com/office/drawing/2010/main" val="0"/>
+                        </a:ext>
+                      </a:extLst>
+                    </a:blip>
+                    <a:stretch>
+                      <a:fillRect/>
+                    </a:stretch>
+                  </pic:blipFill>
+                  <pic:spPr>
+                    <a:xfrm>
+                      <a:off x="0" y="0"/>
+                      <a:ext cx="6247047" cy="3123524"/>
+                    </a:xfrm>
+                    <a:prstGeom prst="rect">
+                      <a:avLst/>
+                    </a:prstGeom>
+                  </pic:spPr>
+                </pic:pic>
+              </a:graphicData>
+            </a:graphic>
+          </wp:inline>
+        </w:drawing>
+      </w:r>
+    </w:p>
+    <w:p>
+      <w:pPr>
+        <w:rPr>
+          <w:rFonts w:ascii="Garamond" w:hAnsi="Garamond"/>
+          <w:b/>
+          <w:bCs/>
+          <w:sz w:val="16"/>
+          <w:szCs w:val="16"/>
+        </w:rPr>
+      </w:pPr>
+    </w:p>
+    <w:p>
+      <w:pPr>
+        <w:rPr>
+          <w:rFonts w:ascii="Garamond" w:hAnsi="Garamond"/>
+          <w:b/>
+          <w:bCs/>
+          <w:sz w:val="16"/>
+          <w:szCs w:val="16"/>
+        </w:rPr>
+      </w:pPr>
+      <w:r>
+        <w:rPr>
+          <w:rFonts w:ascii="Garamond" w:hAnsi="Garamond"/>
+          <w:b/>
+          <w:bCs/>
+          <w:sz w:val="16"/>
+          <w:szCs w:val="16"/>
+        </w:rPr>
+        <w:t xml:space="preserve">Figure 6: </w:t>
+      </w:r>
+      <w:r>
+        <w:rPr>
+          <w:rFonts w:ascii="Garamond" w:hAnsi="Garamond"/>
+          <w:sz w:val="16"/>
+          <w:szCs w:val="16"/>
+        </w:rPr>
+        <w:t xml:space="preserve">Classification accuracy with an imposed probability threshold (60-90%). Grey dashed lines represent the overall accuracy above the threshold at each point. Colored lines illustrate the class-specific probability at that threshold </w:t>
+      </w:r>
     </w:p>
     <w:p>
       <w:pPr>

</xml_diff>

<commit_message>
yet another workthrough of the introduction
</commit_message>
<xml_diff>
--- a/Docs/FIGURES Machine learning applied to otolith timeseries data to discriminate river of origin for Western Alaska Salmon.docx
+++ b/Docs/FIGURES Machine learning applied to otolith timeseries data to discriminate river of origin for Western Alaska Salmon.docx
@@ -58,20 +58,172 @@
       <w:pPr>
         <w:rPr>
           <w:rFonts w:ascii="Garamond" w:hAnsi="Garamond"/>
-        </w:rPr>
-      </w:pPr>
-    </w:p>
-    <w:p/>
+          <w:sz w:val="16"/>
+          <w:szCs w:val="16"/>
+        </w:rPr>
+      </w:pPr>
+    </w:p>
+    <w:p>
+      <w:pPr>
+        <w:rPr>
+          <w:rFonts w:ascii="Garamond" w:hAnsi="Garamond"/>
+          <w:sz w:val="16"/>
+          <w:szCs w:val="16"/>
+        </w:rPr>
+      </w:pPr>
+    </w:p>
+    <w:p>
+      <w:pPr>
+        <w:rPr>
+          <w:rFonts w:ascii="Garamond" w:hAnsi="Garamond"/>
+          <w:sz w:val="16"/>
+          <w:szCs w:val="16"/>
+        </w:rPr>
+      </w:pPr>
+    </w:p>
+    <w:p>
+      <w:pPr>
+        <w:rPr>
+          <w:rFonts w:ascii="Garamond" w:hAnsi="Garamond"/>
+          <w:sz w:val="16"/>
+          <w:szCs w:val="16"/>
+        </w:rPr>
+      </w:pPr>
+    </w:p>
+    <w:p>
+      <w:pPr>
+        <w:rPr>
+          <w:rFonts w:ascii="Garamond" w:hAnsi="Garamond"/>
+          <w:sz w:val="16"/>
+          <w:szCs w:val="16"/>
+        </w:rPr>
+      </w:pPr>
+    </w:p>
+    <w:p>
+      <w:pPr>
+        <w:rPr>
+          <w:rFonts w:ascii="Garamond" w:hAnsi="Garamond"/>
+          <w:sz w:val="16"/>
+          <w:szCs w:val="16"/>
+        </w:rPr>
+      </w:pPr>
+    </w:p>
+    <w:p>
+      <w:pPr>
+        <w:rPr>
+          <w:rFonts w:ascii="Garamond" w:hAnsi="Garamond"/>
+          <w:sz w:val="16"/>
+          <w:szCs w:val="16"/>
+        </w:rPr>
+      </w:pPr>
+    </w:p>
+    <w:p>
+      <w:pPr>
+        <w:rPr>
+          <w:rFonts w:ascii="Garamond" w:hAnsi="Garamond"/>
+          <w:sz w:val="16"/>
+          <w:szCs w:val="16"/>
+        </w:rPr>
+      </w:pPr>
+    </w:p>
+    <w:p>
+      <w:pPr>
+        <w:rPr>
+          <w:rFonts w:ascii="Garamond" w:hAnsi="Garamond"/>
+          <w:sz w:val="16"/>
+          <w:szCs w:val="16"/>
+        </w:rPr>
+      </w:pPr>
+    </w:p>
+    <w:p>
+      <w:pPr>
+        <w:rPr>
+          <w:rFonts w:ascii="Garamond" w:hAnsi="Garamond"/>
+          <w:sz w:val="16"/>
+          <w:szCs w:val="16"/>
+        </w:rPr>
+      </w:pPr>
+    </w:p>
+    <w:p>
+      <w:pPr>
+        <w:rPr>
+          <w:rFonts w:ascii="Garamond" w:hAnsi="Garamond"/>
+          <w:sz w:val="16"/>
+          <w:szCs w:val="16"/>
+        </w:rPr>
+      </w:pPr>
+    </w:p>
+    <w:p>
+      <w:pPr>
+        <w:rPr>
+          <w:rFonts w:ascii="Garamond" w:hAnsi="Garamond"/>
+          <w:sz w:val="16"/>
+          <w:szCs w:val="16"/>
+        </w:rPr>
+      </w:pPr>
+    </w:p>
+    <w:p>
+      <w:pPr>
+        <w:rPr>
+          <w:rFonts w:ascii="Garamond" w:hAnsi="Garamond"/>
+          <w:sz w:val="16"/>
+          <w:szCs w:val="16"/>
+        </w:rPr>
+      </w:pPr>
+    </w:p>
+    <w:p>
+      <w:pPr>
+        <w:rPr>
+          <w:rFonts w:ascii="Garamond" w:hAnsi="Garamond"/>
+          <w:sz w:val="16"/>
+          <w:szCs w:val="16"/>
+        </w:rPr>
+      </w:pPr>
+    </w:p>
+    <w:p>
+      <w:pPr>
+        <w:rPr>
+          <w:rFonts w:ascii="Garamond" w:hAnsi="Garamond"/>
+          <w:sz w:val="16"/>
+          <w:szCs w:val="16"/>
+        </w:rPr>
+      </w:pPr>
+    </w:p>
+    <w:p>
+      <w:pPr>
+        <w:rPr>
+          <w:rFonts w:ascii="Garamond" w:hAnsi="Garamond"/>
+          <w:sz w:val="16"/>
+          <w:szCs w:val="16"/>
+        </w:rPr>
+      </w:pPr>
+    </w:p>
+    <w:p>
+      <w:pPr>
+        <w:rPr>
+          <w:rFonts w:ascii="Garamond" w:hAnsi="Garamond"/>
+          <w:sz w:val="16"/>
+          <w:szCs w:val="16"/>
+        </w:rPr>
+      </w:pPr>
+    </w:p>
+    <w:p>
+      <w:pPr>
+        <w:rPr>
+          <w:rFonts w:ascii="Garamond" w:hAnsi="Garamond"/>
+        </w:rPr>
+      </w:pPr>
+    </w:p>
     <w:p>
       <w:r>
         <w:rPr>
           <w:noProof/>
         </w:rPr>
         <w:drawing>
-          <wp:inline distT="0" distB="0" distL="0" distR="0" wp14:anchorId="54CB86F5" wp14:editId="3C8F2FD8">
-            <wp:extent cx="2944282" cy="1766570"/>
-            <wp:effectExtent l="0" t="0" r="2540" b="0"/>
-            <wp:docPr id="1251230627" name="Picture 1"/>
+          <wp:inline distT="0" distB="0" distL="0" distR="0" wp14:anchorId="4355DA06" wp14:editId="04D713A8">
+            <wp:extent cx="2896473" cy="1737884"/>
+            <wp:effectExtent l="0" t="0" r="0" b="2540"/>
+            <wp:docPr id="1267323198" name="Picture 3"/>
             <wp:cNvGraphicFramePr>
               <a:graphicFrameLocks xmlns:a="http://schemas.openxmlformats.org/drawingml/2006/main" noChangeAspect="1"/>
             </wp:cNvGraphicFramePr>
@@ -79,7 +231,7 @@
               <a:graphicData uri="http://schemas.openxmlformats.org/drawingml/2006/picture">
                 <pic:pic xmlns:pic="http://schemas.openxmlformats.org/drawingml/2006/picture">
                   <pic:nvPicPr>
-                    <pic:cNvPr id="1251230627" name="Picture 1251230627"/>
+                    <pic:cNvPr id="1267323198" name="Picture 1267323198"/>
                     <pic:cNvPicPr/>
                   </pic:nvPicPr>
                   <pic:blipFill>
@@ -91,7 +243,7 @@
                   <pic:spPr>
                     <a:xfrm>
                       <a:off x="0" y="0"/>
-                      <a:ext cx="3048546" cy="1829128"/>
+                      <a:ext cx="3006459" cy="1803876"/>
                     </a:xfrm>
                     <a:prstGeom prst="rect">
                       <a:avLst/>
@@ -108,10 +260,10 @@
           <w:noProof/>
         </w:rPr>
         <w:drawing>
-          <wp:inline distT="0" distB="0" distL="0" distR="0" wp14:anchorId="0B1AA0D7" wp14:editId="721B4F56">
-            <wp:extent cx="2944285" cy="1766570"/>
-            <wp:effectExtent l="0" t="0" r="2540" b="0"/>
-            <wp:docPr id="747855129" name="Picture 2"/>
+          <wp:inline distT="0" distB="0" distL="0" distR="0" wp14:anchorId="14BA03D8" wp14:editId="01DBB5AF">
+            <wp:extent cx="2985025" cy="1791014"/>
+            <wp:effectExtent l="0" t="0" r="0" b="0"/>
+            <wp:docPr id="1111418691" name="Picture 4"/>
             <wp:cNvGraphicFramePr>
               <a:graphicFrameLocks xmlns:a="http://schemas.openxmlformats.org/drawingml/2006/main" noChangeAspect="1"/>
             </wp:cNvGraphicFramePr>
@@ -119,7 +271,7 @@
               <a:graphicData uri="http://schemas.openxmlformats.org/drawingml/2006/picture">
                 <pic:pic xmlns:pic="http://schemas.openxmlformats.org/drawingml/2006/picture">
                   <pic:nvPicPr>
-                    <pic:cNvPr id="747855129" name="Picture 747855129"/>
+                    <pic:cNvPr id="1111418691" name="Picture 1111418691"/>
                     <pic:cNvPicPr/>
                   </pic:nvPicPr>
                   <pic:blipFill>
@@ -131,7 +283,7 @@
                   <pic:spPr>
                     <a:xfrm>
                       <a:off x="0" y="0"/>
-                      <a:ext cx="3116747" cy="1870047"/>
+                      <a:ext cx="3081379" cy="1848826"/>
                     </a:xfrm>
                     <a:prstGeom prst="rect">
                       <a:avLst/>
@@ -144,6 +296,7 @@
         </w:drawing>
       </w:r>
     </w:p>
+    <w:p/>
     <w:p>
       <w:pPr>
         <w:rPr>
@@ -232,6 +385,7 @@
           <w:sz w:val="16"/>
           <w:szCs w:val="16"/>
         </w:rPr>
+        <w:lastRenderedPageBreak/>
         <w:drawing>
           <wp:inline distT="0" distB="0" distL="0" distR="0" wp14:anchorId="16679699" wp14:editId="06016901">
             <wp:extent cx="5429250" cy="2714625"/>
@@ -336,9 +490,17 @@
         </w:rPr>
         <w:lastRenderedPageBreak/>
         <w:drawing>
-          <wp:inline distT="0" distB="0" distL="0" distR="0" wp14:anchorId="4608D8C9" wp14:editId="5F6E48C6">
-            <wp:extent cx="6342434" cy="5285363"/>
+          <wp:anchor distT="0" distB="0" distL="114300" distR="114300" simplePos="0" relativeHeight="251658240" behindDoc="0" locked="0" layoutInCell="1" allowOverlap="1" wp14:anchorId="4608D8C9" wp14:editId="3C5456FD">
+            <wp:simplePos x="0" y="0"/>
+            <wp:positionH relativeFrom="column">
+              <wp:posOffset>-349250</wp:posOffset>
+            </wp:positionH>
+            <wp:positionV relativeFrom="paragraph">
+              <wp:posOffset>0</wp:posOffset>
+            </wp:positionV>
+            <wp:extent cx="6948805" cy="5791200"/>
             <wp:effectExtent l="0" t="0" r="0" b="0"/>
+            <wp:wrapSquare wrapText="bothSides"/>
             <wp:docPr id="2003545803" name="Picture 1" descr="A diagram of a diagram&#10;&#10;AI-generated content may be incorrect."/>
             <wp:cNvGraphicFramePr>
               <a:graphicFrameLocks xmlns:a="http://schemas.openxmlformats.org/drawingml/2006/main" noChangeAspect="1"/>
@@ -365,7 +527,7 @@
                   <pic:spPr>
                     <a:xfrm>
                       <a:off x="0" y="0"/>
-                      <a:ext cx="6430743" cy="5358954"/>
+                      <a:ext cx="6948805" cy="5791200"/>
                     </a:xfrm>
                     <a:prstGeom prst="rect">
                       <a:avLst/>
@@ -374,7 +536,13 @@
                 </pic:pic>
               </a:graphicData>
             </a:graphic>
-          </wp:inline>
+            <wp14:sizeRelH relativeFrom="page">
+              <wp14:pctWidth>0</wp14:pctWidth>
+            </wp14:sizeRelH>
+            <wp14:sizeRelV relativeFrom="page">
+              <wp14:pctHeight>0</wp14:pctHeight>
+            </wp14:sizeRelV>
+          </wp:anchor>
         </w:drawing>
       </w:r>
     </w:p>
@@ -503,10 +671,10 @@
         </w:rPr>
         <w:lastRenderedPageBreak/>
         <w:drawing>
-          <wp:inline distT="0" distB="0" distL="0" distR="0" wp14:anchorId="4A1B09DB" wp14:editId="37F47D6C">
-            <wp:extent cx="2259330" cy="3614926"/>
-            <wp:effectExtent l="0" t="0" r="1270" b="5080"/>
-            <wp:docPr id="603413073" name="Picture 5"/>
+          <wp:inline distT="0" distB="0" distL="0" distR="0" wp14:anchorId="3106B05A" wp14:editId="05CA7CC2">
+            <wp:extent cx="1648239" cy="2637183"/>
+            <wp:effectExtent l="0" t="0" r="3175" b="4445"/>
+            <wp:docPr id="1148715510" name="Picture 2"/>
             <wp:cNvGraphicFramePr>
               <a:graphicFrameLocks xmlns:a="http://schemas.openxmlformats.org/drawingml/2006/main" noChangeAspect="1"/>
             </wp:cNvGraphicFramePr>
@@ -514,7 +682,7 @@
               <a:graphicData uri="http://schemas.openxmlformats.org/drawingml/2006/picture">
                 <pic:pic xmlns:pic="http://schemas.openxmlformats.org/drawingml/2006/picture">
                   <pic:nvPicPr>
-                    <pic:cNvPr id="603413073" name="Picture 603413073"/>
+                    <pic:cNvPr id="1148715510" name="Picture 1148715510"/>
                     <pic:cNvPicPr/>
                   </pic:nvPicPr>
                   <pic:blipFill>
@@ -526,7 +694,7 @@
                   <pic:spPr>
                     <a:xfrm>
                       <a:off x="0" y="0"/>
-                      <a:ext cx="2336647" cy="3738633"/>
+                      <a:ext cx="1699026" cy="2718442"/>
                     </a:xfrm>
                     <a:prstGeom prst="rect">
                       <a:avLst/>
@@ -546,10 +714,10 @@
           <w:szCs w:val="16"/>
         </w:rPr>
         <w:drawing>
-          <wp:inline distT="0" distB="0" distL="0" distR="0" wp14:anchorId="7320D619" wp14:editId="5260B2CA">
-            <wp:extent cx="3677478" cy="3677478"/>
-            <wp:effectExtent l="0" t="0" r="5715" b="5715"/>
-            <wp:docPr id="1405313982" name="Picture 4"/>
+          <wp:inline distT="0" distB="0" distL="0" distR="0" wp14:anchorId="25743AE2" wp14:editId="681FE07A">
+            <wp:extent cx="3611217" cy="2708412"/>
+            <wp:effectExtent l="0" t="0" r="0" b="0"/>
+            <wp:docPr id="1146811189" name="Picture 1"/>
             <wp:cNvGraphicFramePr>
               <a:graphicFrameLocks xmlns:a="http://schemas.openxmlformats.org/drawingml/2006/main" noChangeAspect="1"/>
             </wp:cNvGraphicFramePr>
@@ -557,7 +725,7 @@
               <a:graphicData uri="http://schemas.openxmlformats.org/drawingml/2006/picture">
                 <pic:pic xmlns:pic="http://schemas.openxmlformats.org/drawingml/2006/picture">
                   <pic:nvPicPr>
-                    <pic:cNvPr id="1405313982" name="Picture 1405313982"/>
+                    <pic:cNvPr id="1146811189" name="Picture 1146811189"/>
                     <pic:cNvPicPr/>
                   </pic:nvPicPr>
                   <pic:blipFill>
@@ -569,7 +737,7 @@
                   <pic:spPr>
                     <a:xfrm>
                       <a:off x="0" y="0"/>
-                      <a:ext cx="3731855" cy="3731855"/>
+                      <a:ext cx="3658438" cy="2743828"/>
                     </a:xfrm>
                     <a:prstGeom prst="rect">
                       <a:avLst/>
@@ -753,7 +921,6 @@
           <w:sz w:val="16"/>
           <w:szCs w:val="16"/>
         </w:rPr>
-        <w:lastRenderedPageBreak/>
         <w:drawing>
           <wp:inline distT="0" distB="0" distL="0" distR="0" wp14:anchorId="7BDAA027" wp14:editId="281C6EF2">
             <wp:extent cx="6236340" cy="3118170"/>

</xml_diff>

<commit_message>
updated figures and docs
</commit_message>
<xml_diff>
--- a/Docs/FIGURES Machine learning applied to otolith timeseries data to discriminate river of origin for Western Alaska Salmon.docx
+++ b/Docs/FIGURES Machine learning applied to otolith timeseries data to discriminate river of origin for Western Alaska Salmon.docx
@@ -211,6 +211,87 @@
       <w:pPr>
         <w:rPr>
           <w:rFonts w:ascii="Garamond" w:hAnsi="Garamond"/>
+          <w:sz w:val="16"/>
+          <w:szCs w:val="16"/>
+        </w:rPr>
+      </w:pPr>
+    </w:p>
+    <w:p>
+      <w:pPr>
+        <w:rPr>
+          <w:rFonts w:ascii="Garamond" w:hAnsi="Garamond"/>
+          <w:sz w:val="16"/>
+          <w:szCs w:val="16"/>
+        </w:rPr>
+      </w:pPr>
+    </w:p>
+    <w:p>
+      <w:pPr>
+        <w:rPr>
+          <w:rFonts w:ascii="Garamond" w:hAnsi="Garamond"/>
+          <w:sz w:val="16"/>
+          <w:szCs w:val="16"/>
+        </w:rPr>
+      </w:pPr>
+    </w:p>
+    <w:p>
+      <w:pPr>
+        <w:rPr>
+          <w:rFonts w:ascii="Garamond" w:hAnsi="Garamond"/>
+          <w:sz w:val="16"/>
+          <w:szCs w:val="16"/>
+        </w:rPr>
+      </w:pPr>
+    </w:p>
+    <w:p>
+      <w:pPr>
+        <w:rPr>
+          <w:rFonts w:ascii="Garamond" w:hAnsi="Garamond"/>
+          <w:sz w:val="16"/>
+          <w:szCs w:val="16"/>
+        </w:rPr>
+      </w:pPr>
+    </w:p>
+    <w:p>
+      <w:pPr>
+        <w:rPr>
+          <w:rFonts w:ascii="Garamond" w:hAnsi="Garamond"/>
+          <w:sz w:val="16"/>
+          <w:szCs w:val="16"/>
+        </w:rPr>
+      </w:pPr>
+    </w:p>
+    <w:p>
+      <w:pPr>
+        <w:rPr>
+          <w:rFonts w:ascii="Garamond" w:hAnsi="Garamond"/>
+          <w:sz w:val="16"/>
+          <w:szCs w:val="16"/>
+        </w:rPr>
+      </w:pPr>
+    </w:p>
+    <w:p>
+      <w:pPr>
+        <w:rPr>
+          <w:rFonts w:ascii="Garamond" w:hAnsi="Garamond"/>
+          <w:sz w:val="16"/>
+          <w:szCs w:val="16"/>
+        </w:rPr>
+      </w:pPr>
+    </w:p>
+    <w:p>
+      <w:pPr>
+        <w:rPr>
+          <w:rFonts w:ascii="Garamond" w:hAnsi="Garamond"/>
+          <w:sz w:val="16"/>
+          <w:szCs w:val="16"/>
+        </w:rPr>
+      </w:pPr>
+    </w:p>
+    <w:p>
+      <w:pPr>
+        <w:rPr>
+          <w:rFonts w:ascii="Garamond" w:hAnsi="Garamond"/>
         </w:rPr>
       </w:pPr>
     </w:p>
@@ -219,6 +300,7 @@
         <w:rPr>
           <w:noProof/>
         </w:rPr>
+        <w:lastRenderedPageBreak/>
         <w:drawing>
           <wp:inline distT="0" distB="0" distL="0" distR="0" wp14:anchorId="4355DA06" wp14:editId="04D713A8">
             <wp:extent cx="2896473" cy="1737884"/>
@@ -378,6 +460,33 @@
           <w:szCs w:val="16"/>
         </w:rPr>
       </w:pPr>
+    </w:p>
+    <w:p>
+      <w:pPr>
+        <w:rPr>
+          <w:rFonts w:ascii="Garamond" w:hAnsi="Garamond"/>
+          <w:sz w:val="16"/>
+          <w:szCs w:val="16"/>
+        </w:rPr>
+      </w:pPr>
+    </w:p>
+    <w:p>
+      <w:pPr>
+        <w:rPr>
+          <w:rFonts w:ascii="Garamond" w:hAnsi="Garamond"/>
+          <w:sz w:val="16"/>
+          <w:szCs w:val="16"/>
+        </w:rPr>
+      </w:pPr>
+    </w:p>
+    <w:p>
+      <w:pPr>
+        <w:rPr>
+          <w:rFonts w:ascii="Garamond" w:hAnsi="Garamond"/>
+          <w:sz w:val="16"/>
+          <w:szCs w:val="16"/>
+        </w:rPr>
+      </w:pPr>
       <w:r>
         <w:rPr>
           <w:rFonts w:ascii="Garamond" w:hAnsi="Garamond"/>
@@ -385,7 +494,6 @@
           <w:sz w:val="16"/>
           <w:szCs w:val="16"/>
         </w:rPr>
-        <w:lastRenderedPageBreak/>
         <w:drawing>
           <wp:inline distT="0" distB="0" distL="0" distR="0" wp14:anchorId="16679699" wp14:editId="06016901">
             <wp:extent cx="5429250" cy="2714625"/>
@@ -490,16 +598,16 @@
         </w:rPr>
         <w:lastRenderedPageBreak/>
         <w:drawing>
-          <wp:anchor distT="0" distB="0" distL="114300" distR="114300" simplePos="0" relativeHeight="251658240" behindDoc="0" locked="0" layoutInCell="1" allowOverlap="1" wp14:anchorId="4608D8C9" wp14:editId="3C5456FD">
+          <wp:anchor distT="0" distB="0" distL="114300" distR="114300" simplePos="0" relativeHeight="251658240" behindDoc="0" locked="0" layoutInCell="1" allowOverlap="1" wp14:anchorId="4608D8C9" wp14:editId="010ABC14">
             <wp:simplePos x="0" y="0"/>
             <wp:positionH relativeFrom="column">
-              <wp:posOffset>-349250</wp:posOffset>
+              <wp:posOffset>-345440</wp:posOffset>
             </wp:positionH>
             <wp:positionV relativeFrom="paragraph">
               <wp:posOffset>0</wp:posOffset>
             </wp:positionV>
-            <wp:extent cx="6948805" cy="5791200"/>
-            <wp:effectExtent l="0" t="0" r="0" b="0"/>
+            <wp:extent cx="6288405" cy="5240655"/>
+            <wp:effectExtent l="0" t="0" r="0" b="4445"/>
             <wp:wrapSquare wrapText="bothSides"/>
             <wp:docPr id="2003545803" name="Picture 1" descr="A diagram of a diagram&#10;&#10;AI-generated content may be incorrect."/>
             <wp:cNvGraphicFramePr>
@@ -527,7 +635,7 @@
                   <pic:spPr>
                     <a:xfrm>
                       <a:off x="0" y="0"/>
-                      <a:ext cx="6948805" cy="5791200"/>
+                      <a:ext cx="6288405" cy="5240655"/>
                     </a:xfrm>
                     <a:prstGeom prst="rect">
                       <a:avLst/>
@@ -671,9 +779,9 @@
         </w:rPr>
         <w:lastRenderedPageBreak/>
         <w:drawing>
-          <wp:inline distT="0" distB="0" distL="0" distR="0" wp14:anchorId="3106B05A" wp14:editId="05CA7CC2">
-            <wp:extent cx="1648239" cy="2637183"/>
-            <wp:effectExtent l="0" t="0" r="3175" b="4445"/>
+          <wp:inline distT="0" distB="0" distL="0" distR="0" wp14:anchorId="3106B05A" wp14:editId="6D19F2B2">
+            <wp:extent cx="1865515" cy="2984825"/>
+            <wp:effectExtent l="0" t="0" r="1905" b="0"/>
             <wp:docPr id="1148715510" name="Picture 2"/>
             <wp:cNvGraphicFramePr>
               <a:graphicFrameLocks xmlns:a="http://schemas.openxmlformats.org/drawingml/2006/main" noChangeAspect="1"/>
@@ -694,7 +802,7 @@
                   <pic:spPr>
                     <a:xfrm>
                       <a:off x="0" y="0"/>
-                      <a:ext cx="1699026" cy="2718442"/>
+                      <a:ext cx="1930585" cy="3088937"/>
                     </a:xfrm>
                     <a:prstGeom prst="rect">
                       <a:avLst/>
@@ -714,8 +822,8 @@
           <w:szCs w:val="16"/>
         </w:rPr>
         <w:drawing>
-          <wp:inline distT="0" distB="0" distL="0" distR="0" wp14:anchorId="25743AE2" wp14:editId="681FE07A">
-            <wp:extent cx="3611217" cy="2708412"/>
+          <wp:inline distT="0" distB="0" distL="0" distR="0" wp14:anchorId="25743AE2" wp14:editId="68E07C99">
+            <wp:extent cx="3980873" cy="2985654"/>
             <wp:effectExtent l="0" t="0" r="0" b="0"/>
             <wp:docPr id="1146811189" name="Picture 1"/>
             <wp:cNvGraphicFramePr>
@@ -737,7 +845,7 @@
                   <pic:spPr>
                     <a:xfrm>
                       <a:off x="0" y="0"/>
-                      <a:ext cx="3658438" cy="2743828"/>
+                      <a:ext cx="4051417" cy="3038562"/>
                     </a:xfrm>
                     <a:prstGeom prst="rect">
                       <a:avLst/>
@@ -912,6 +1020,17 @@
           <w:szCs w:val="16"/>
         </w:rPr>
       </w:pPr>
+    </w:p>
+    <w:p>
+      <w:pPr>
+        <w:rPr>
+          <w:rFonts w:ascii="Garamond" w:hAnsi="Garamond"/>
+          <w:b/>
+          <w:bCs/>
+          <w:sz w:val="16"/>
+          <w:szCs w:val="16"/>
+        </w:rPr>
+      </w:pPr>
       <w:r>
         <w:rPr>
           <w:rFonts w:ascii="Garamond" w:hAnsi="Garamond"/>
@@ -922,9 +1041,9 @@
           <w:szCs w:val="16"/>
         </w:rPr>
         <w:drawing>
-          <wp:inline distT="0" distB="0" distL="0" distR="0" wp14:anchorId="7BDAA027" wp14:editId="281C6EF2">
-            <wp:extent cx="6236340" cy="3118170"/>
-            <wp:effectExtent l="0" t="0" r="0" b="6350"/>
+          <wp:inline distT="0" distB="0" distL="0" distR="0" wp14:anchorId="7BDAA027" wp14:editId="4DF83638">
+            <wp:extent cx="5526505" cy="2763253"/>
+            <wp:effectExtent l="0" t="0" r="0" b="5715"/>
             <wp:docPr id="1586501588" name="Picture 1" descr="A graph of different colored lines&#10;&#10;AI-generated content may be incorrect."/>
             <wp:cNvGraphicFramePr>
               <a:graphicFrameLocks xmlns:a="http://schemas.openxmlformats.org/drawingml/2006/main" noChangeAspect="1"/>
@@ -951,7 +1070,7 @@
                   <pic:spPr>
                     <a:xfrm>
                       <a:off x="0" y="0"/>
-                      <a:ext cx="6247047" cy="3123524"/>
+                      <a:ext cx="5627204" cy="2813603"/>
                     </a:xfrm>
                     <a:prstGeom prst="rect">
                       <a:avLst/>

</xml_diff>

<commit_message>
added maps figure 1
</commit_message>
<xml_diff>
--- a/Docs/FIGURES Machine learning applied to otolith timeseries data to discriminate river of origin for Western Alaska Salmon.docx
+++ b/Docs/FIGURES Machine learning applied to otolith timeseries data to discriminate river of origin for Western Alaska Salmon.docx
@@ -10,297 +10,167 @@
           <w:szCs w:val="16"/>
         </w:rPr>
       </w:pPr>
-      <w:r>
-        <w:rPr>
-          <w:rFonts w:ascii="Garamond" w:hAnsi="Garamond"/>
-          <w:sz w:val="16"/>
-          <w:szCs w:val="16"/>
-        </w:rPr>
-        <w:t xml:space="preserve">** in progress*** </w:t>
-      </w:r>
-    </w:p>
-    <w:p>
-      <w:pPr>
-        <w:rPr>
-          <w:rFonts w:ascii="Garamond" w:hAnsi="Garamond"/>
-          <w:sz w:val="16"/>
-          <w:szCs w:val="16"/>
-        </w:rPr>
-      </w:pPr>
-      <w:r>
-        <w:rPr>
-          <w:rFonts w:ascii="Garamond" w:hAnsi="Garamond"/>
-          <w:sz w:val="16"/>
-          <w:szCs w:val="16"/>
-        </w:rPr>
-        <w:t xml:space="preserve">Figure 1: Map of full AYK </w:t>
-      </w:r>
-      <w:proofErr w:type="spellStart"/>
-      <w:r>
-        <w:rPr>
-          <w:rFonts w:ascii="Garamond" w:hAnsi="Garamond"/>
-          <w:sz w:val="16"/>
-          <w:szCs w:val="16"/>
-        </w:rPr>
-        <w:t>isoscape</w:t>
-      </w:r>
-      <w:proofErr w:type="spellEnd"/>
-      <w:r>
-        <w:rPr>
-          <w:rFonts w:ascii="Garamond" w:hAnsi="Garamond"/>
-          <w:sz w:val="16"/>
-          <w:szCs w:val="16"/>
-        </w:rPr>
-        <w:t xml:space="preserve">, Coastal Western Alaska Region, and sampling site locations. </w:t>
-      </w:r>
-    </w:p>
-    <w:p>
-      <w:pPr>
-        <w:rPr>
-          <w:rFonts w:ascii="Garamond" w:hAnsi="Garamond"/>
-          <w:sz w:val="16"/>
-          <w:szCs w:val="16"/>
-        </w:rPr>
-      </w:pPr>
-    </w:p>
-    <w:p>
-      <w:pPr>
-        <w:rPr>
-          <w:rFonts w:ascii="Garamond" w:hAnsi="Garamond"/>
-          <w:sz w:val="16"/>
-          <w:szCs w:val="16"/>
-        </w:rPr>
-      </w:pPr>
-    </w:p>
-    <w:p>
-      <w:pPr>
-        <w:rPr>
-          <w:rFonts w:ascii="Garamond" w:hAnsi="Garamond"/>
-          <w:sz w:val="16"/>
-          <w:szCs w:val="16"/>
-        </w:rPr>
-      </w:pPr>
-    </w:p>
-    <w:p>
-      <w:pPr>
-        <w:rPr>
-          <w:rFonts w:ascii="Garamond" w:hAnsi="Garamond"/>
-          <w:sz w:val="16"/>
-          <w:szCs w:val="16"/>
-        </w:rPr>
-      </w:pPr>
-    </w:p>
-    <w:p>
-      <w:pPr>
-        <w:rPr>
-          <w:rFonts w:ascii="Garamond" w:hAnsi="Garamond"/>
-          <w:sz w:val="16"/>
-          <w:szCs w:val="16"/>
-        </w:rPr>
-      </w:pPr>
-    </w:p>
-    <w:p>
-      <w:pPr>
-        <w:rPr>
-          <w:rFonts w:ascii="Garamond" w:hAnsi="Garamond"/>
-          <w:sz w:val="16"/>
-          <w:szCs w:val="16"/>
-        </w:rPr>
-      </w:pPr>
-    </w:p>
-    <w:p>
-      <w:pPr>
-        <w:rPr>
-          <w:rFonts w:ascii="Garamond" w:hAnsi="Garamond"/>
-          <w:sz w:val="16"/>
-          <w:szCs w:val="16"/>
-        </w:rPr>
-      </w:pPr>
-    </w:p>
-    <w:p>
-      <w:pPr>
-        <w:rPr>
-          <w:rFonts w:ascii="Garamond" w:hAnsi="Garamond"/>
-          <w:sz w:val="16"/>
-          <w:szCs w:val="16"/>
-        </w:rPr>
-      </w:pPr>
-    </w:p>
-    <w:p>
-      <w:pPr>
-        <w:rPr>
-          <w:rFonts w:ascii="Garamond" w:hAnsi="Garamond"/>
-          <w:sz w:val="16"/>
-          <w:szCs w:val="16"/>
-        </w:rPr>
-      </w:pPr>
-    </w:p>
-    <w:p>
-      <w:pPr>
-        <w:rPr>
-          <w:rFonts w:ascii="Garamond" w:hAnsi="Garamond"/>
-          <w:sz w:val="16"/>
-          <w:szCs w:val="16"/>
-        </w:rPr>
-      </w:pPr>
-    </w:p>
-    <w:p>
-      <w:pPr>
-        <w:rPr>
-          <w:rFonts w:ascii="Garamond" w:hAnsi="Garamond"/>
-          <w:sz w:val="16"/>
-          <w:szCs w:val="16"/>
-        </w:rPr>
-      </w:pPr>
-    </w:p>
-    <w:p>
-      <w:pPr>
-        <w:rPr>
-          <w:rFonts w:ascii="Garamond" w:hAnsi="Garamond"/>
-          <w:sz w:val="16"/>
-          <w:szCs w:val="16"/>
-        </w:rPr>
-      </w:pPr>
-    </w:p>
-    <w:p>
-      <w:pPr>
-        <w:rPr>
-          <w:rFonts w:ascii="Garamond" w:hAnsi="Garamond"/>
-          <w:sz w:val="16"/>
-          <w:szCs w:val="16"/>
-        </w:rPr>
-      </w:pPr>
-    </w:p>
-    <w:p>
-      <w:pPr>
-        <w:rPr>
-          <w:rFonts w:ascii="Garamond" w:hAnsi="Garamond"/>
-          <w:sz w:val="16"/>
-          <w:szCs w:val="16"/>
-        </w:rPr>
-      </w:pPr>
-    </w:p>
-    <w:p>
-      <w:pPr>
-        <w:rPr>
-          <w:rFonts w:ascii="Garamond" w:hAnsi="Garamond"/>
-          <w:sz w:val="16"/>
-          <w:szCs w:val="16"/>
-        </w:rPr>
-      </w:pPr>
-    </w:p>
-    <w:p>
-      <w:pPr>
-        <w:rPr>
-          <w:rFonts w:ascii="Garamond" w:hAnsi="Garamond"/>
-          <w:sz w:val="16"/>
-          <w:szCs w:val="16"/>
-        </w:rPr>
-      </w:pPr>
-    </w:p>
-    <w:p>
-      <w:pPr>
-        <w:rPr>
-          <w:rFonts w:ascii="Garamond" w:hAnsi="Garamond"/>
-          <w:sz w:val="16"/>
-          <w:szCs w:val="16"/>
-        </w:rPr>
-      </w:pPr>
-    </w:p>
-    <w:p>
-      <w:pPr>
-        <w:rPr>
-          <w:rFonts w:ascii="Garamond" w:hAnsi="Garamond"/>
-          <w:sz w:val="16"/>
-          <w:szCs w:val="16"/>
-        </w:rPr>
-      </w:pPr>
-    </w:p>
-    <w:p>
-      <w:pPr>
-        <w:rPr>
-          <w:rFonts w:ascii="Garamond" w:hAnsi="Garamond"/>
-          <w:sz w:val="16"/>
-          <w:szCs w:val="16"/>
-        </w:rPr>
-      </w:pPr>
-    </w:p>
-    <w:p>
-      <w:pPr>
-        <w:rPr>
-          <w:rFonts w:ascii="Garamond" w:hAnsi="Garamond"/>
-          <w:sz w:val="16"/>
-          <w:szCs w:val="16"/>
-        </w:rPr>
-      </w:pPr>
-    </w:p>
-    <w:p>
-      <w:pPr>
-        <w:rPr>
-          <w:rFonts w:ascii="Garamond" w:hAnsi="Garamond"/>
-          <w:sz w:val="16"/>
-          <w:szCs w:val="16"/>
-        </w:rPr>
-      </w:pPr>
-    </w:p>
-    <w:p>
-      <w:pPr>
-        <w:rPr>
-          <w:rFonts w:ascii="Garamond" w:hAnsi="Garamond"/>
-          <w:sz w:val="16"/>
-          <w:szCs w:val="16"/>
-        </w:rPr>
-      </w:pPr>
-    </w:p>
-    <w:p>
-      <w:pPr>
-        <w:rPr>
-          <w:rFonts w:ascii="Garamond" w:hAnsi="Garamond"/>
-          <w:sz w:val="16"/>
-          <w:szCs w:val="16"/>
-        </w:rPr>
-      </w:pPr>
-    </w:p>
-    <w:p>
-      <w:pPr>
-        <w:rPr>
-          <w:rFonts w:ascii="Garamond" w:hAnsi="Garamond"/>
-          <w:sz w:val="16"/>
-          <w:szCs w:val="16"/>
-        </w:rPr>
-      </w:pPr>
-    </w:p>
-    <w:p>
-      <w:pPr>
-        <w:rPr>
-          <w:rFonts w:ascii="Garamond" w:hAnsi="Garamond"/>
-          <w:sz w:val="16"/>
-          <w:szCs w:val="16"/>
-        </w:rPr>
-      </w:pPr>
-    </w:p>
-    <w:p>
-      <w:pPr>
-        <w:rPr>
-          <w:rFonts w:ascii="Garamond" w:hAnsi="Garamond"/>
-          <w:sz w:val="16"/>
-          <w:szCs w:val="16"/>
-        </w:rPr>
-      </w:pPr>
-    </w:p>
-    <w:p>
-      <w:pPr>
-        <w:rPr>
-          <w:rFonts w:ascii="Garamond" w:hAnsi="Garamond"/>
-        </w:rPr>
-      </w:pPr>
-    </w:p>
-    <w:p>
-      <w:r>
-        <w:rPr>
+    </w:p>
+    <w:p>
+      <w:pPr>
+        <w:rPr>
+          <w:rFonts w:ascii="Garamond" w:hAnsi="Garamond"/>
+          <w:sz w:val="16"/>
+          <w:szCs w:val="16"/>
+        </w:rPr>
+      </w:pPr>
+      <w:r>
+        <w:rPr>
+          <w:rFonts w:ascii="Garamond" w:hAnsi="Garamond"/>
           <w:noProof/>
-        </w:rPr>
-        <w:lastRenderedPageBreak/>
+          <w:sz w:val="16"/>
+          <w:szCs w:val="16"/>
+        </w:rPr>
+        <w:drawing>
+          <wp:inline distT="0" distB="0" distL="0" distR="0" wp14:anchorId="16BCAFDC" wp14:editId="1C26859F">
+            <wp:extent cx="4279392" cy="3306927"/>
+            <wp:effectExtent l="0" t="0" r="635" b="0"/>
+            <wp:docPr id="1728529224" name="Picture 3"/>
+            <wp:cNvGraphicFramePr>
+              <a:graphicFrameLocks xmlns:a="http://schemas.openxmlformats.org/drawingml/2006/main" noChangeAspect="1"/>
+            </wp:cNvGraphicFramePr>
+            <a:graphic xmlns:a="http://schemas.openxmlformats.org/drawingml/2006/main">
+              <a:graphicData uri="http://schemas.openxmlformats.org/drawingml/2006/picture">
+                <pic:pic xmlns:pic="http://schemas.openxmlformats.org/drawingml/2006/picture">
+                  <pic:nvPicPr>
+                    <pic:cNvPr id="1728529224" name="Picture 1728529224"/>
+                    <pic:cNvPicPr/>
+                  </pic:nvPicPr>
+                  <pic:blipFill>
+                    <a:blip r:embed="rId4"/>
+                    <a:stretch>
+                      <a:fillRect/>
+                    </a:stretch>
+                  </pic:blipFill>
+                  <pic:spPr>
+                    <a:xfrm>
+                      <a:off x="0" y="0"/>
+                      <a:ext cx="4312588" cy="3332580"/>
+                    </a:xfrm>
+                    <a:prstGeom prst="rect">
+                      <a:avLst/>
+                    </a:prstGeom>
+                  </pic:spPr>
+                </pic:pic>
+              </a:graphicData>
+            </a:graphic>
+          </wp:inline>
+        </w:drawing>
+      </w:r>
+      <w:r>
+        <w:rPr>
+          <w:rFonts w:ascii="Garamond" w:hAnsi="Garamond"/>
+          <w:noProof/>
+          <w:sz w:val="16"/>
+          <w:szCs w:val="16"/>
+        </w:rPr>
+        <w:drawing>
+          <wp:inline distT="0" distB="0" distL="0" distR="0" wp14:anchorId="58F41200" wp14:editId="23CD41E6">
+            <wp:extent cx="4279265" cy="3306830"/>
+            <wp:effectExtent l="0" t="0" r="635" b="0"/>
+            <wp:docPr id="1119687362" name="Picture 4"/>
+            <wp:cNvGraphicFramePr>
+              <a:graphicFrameLocks xmlns:a="http://schemas.openxmlformats.org/drawingml/2006/main" noChangeAspect="1"/>
+            </wp:cNvGraphicFramePr>
+            <a:graphic xmlns:a="http://schemas.openxmlformats.org/drawingml/2006/main">
+              <a:graphicData uri="http://schemas.openxmlformats.org/drawingml/2006/picture">
+                <pic:pic xmlns:pic="http://schemas.openxmlformats.org/drawingml/2006/picture">
+                  <pic:nvPicPr>
+                    <pic:cNvPr id="1119687362" name="Picture 1119687362"/>
+                    <pic:cNvPicPr/>
+                  </pic:nvPicPr>
+                  <pic:blipFill>
+                    <a:blip r:embed="rId5"/>
+                    <a:stretch>
+                      <a:fillRect/>
+                    </a:stretch>
+                  </pic:blipFill>
+                  <pic:spPr>
+                    <a:xfrm>
+                      <a:off x="0" y="0"/>
+                      <a:ext cx="4312182" cy="3332267"/>
+                    </a:xfrm>
+                    <a:prstGeom prst="rect">
+                      <a:avLst/>
+                    </a:prstGeom>
+                  </pic:spPr>
+                </pic:pic>
+              </a:graphicData>
+            </a:graphic>
+          </wp:inline>
+        </w:drawing>
+      </w:r>
+    </w:p>
+    <w:p>
+      <w:pPr>
+        <w:rPr>
+          <w:rFonts w:ascii="Garamond" w:hAnsi="Garamond"/>
+          <w:sz w:val="16"/>
+          <w:szCs w:val="16"/>
+        </w:rPr>
+      </w:pPr>
+      <w:r>
+        <w:rPr>
+          <w:rFonts w:ascii="Garamond" w:hAnsi="Garamond"/>
+          <w:sz w:val="16"/>
+          <w:szCs w:val="16"/>
+        </w:rPr>
+        <w:t xml:space="preserve">{Work in progress) Figure 1: </w:t>
+      </w:r>
+    </w:p>
+    <w:p>
+      <w:pPr>
+        <w:rPr>
+          <w:rFonts w:ascii="Garamond" w:hAnsi="Garamond"/>
+          <w:sz w:val="16"/>
+          <w:szCs w:val="16"/>
+        </w:rPr>
+      </w:pPr>
+    </w:p>
+    <w:p>
+      <w:pPr>
+        <w:rPr>
+          <w:rFonts w:ascii="Garamond" w:hAnsi="Garamond"/>
+          <w:sz w:val="16"/>
+          <w:szCs w:val="16"/>
+        </w:rPr>
+      </w:pPr>
+    </w:p>
+    <w:p>
+      <w:pPr>
+        <w:rPr>
+          <w:rFonts w:ascii="Garamond" w:hAnsi="Garamond"/>
+          <w:sz w:val="16"/>
+          <w:szCs w:val="16"/>
+        </w:rPr>
+      </w:pPr>
+    </w:p>
+    <w:p>
+      <w:pPr>
+        <w:rPr>
+          <w:rFonts w:ascii="Garamond" w:hAnsi="Garamond"/>
+          <w:sz w:val="16"/>
+          <w:szCs w:val="16"/>
+        </w:rPr>
+      </w:pPr>
+    </w:p>
+    <w:p>
+      <w:pPr>
+        <w:rPr>
+          <w:rFonts w:ascii="Garamond" w:hAnsi="Garamond"/>
+        </w:rPr>
+      </w:pPr>
+    </w:p>
+    <w:p>
+      <w:r>
+        <w:rPr>
+          <w:noProof/>
+        </w:rPr>
         <w:drawing>
           <wp:inline distT="0" distB="0" distL="0" distR="0" wp14:anchorId="4355DA06" wp14:editId="04D713A8">
             <wp:extent cx="2896473" cy="1737884"/>
@@ -317,7 +187,7 @@
                     <pic:cNvPicPr/>
                   </pic:nvPicPr>
                   <pic:blipFill>
-                    <a:blip r:embed="rId4"/>
+                    <a:blip r:embed="rId6"/>
                     <a:stretch>
                       <a:fillRect/>
                     </a:stretch>
@@ -357,7 +227,7 @@
                     <pic:cNvPicPr/>
                   </pic:nvPicPr>
                   <pic:blipFill>
-                    <a:blip r:embed="rId5"/>
+                    <a:blip r:embed="rId7"/>
                     <a:stretch>
                       <a:fillRect/>
                     </a:stretch>
@@ -510,7 +380,7 @@
                     <pic:cNvPicPr/>
                   </pic:nvPicPr>
                   <pic:blipFill>
-                    <a:blip r:embed="rId6"/>
+                    <a:blip r:embed="rId8"/>
                     <a:stretch>
                       <a:fillRect/>
                     </a:stretch>
@@ -621,7 +491,7 @@
                     <pic:cNvPicPr/>
                   </pic:nvPicPr>
                   <pic:blipFill>
-                    <a:blip r:embed="rId7" cstate="print">
+                    <a:blip r:embed="rId9" cstate="print">
                       <a:extLst>
                         <a:ext uri="{28A0092B-C50C-407E-A947-70E740481C1C}">
                           <a14:useLocalDpi xmlns:a14="http://schemas.microsoft.com/office/drawing/2010/main" val="0"/>
@@ -794,7 +664,7 @@
                     <pic:cNvPicPr/>
                   </pic:nvPicPr>
                   <pic:blipFill>
-                    <a:blip r:embed="rId8"/>
+                    <a:blip r:embed="rId10"/>
                     <a:stretch>
                       <a:fillRect/>
                     </a:stretch>
@@ -837,7 +707,7 @@
                     <pic:cNvPicPr/>
                   </pic:nvPicPr>
                   <pic:blipFill>
-                    <a:blip r:embed="rId9"/>
+                    <a:blip r:embed="rId11"/>
                     <a:stretch>
                       <a:fillRect/>
                     </a:stretch>
@@ -1056,7 +926,7 @@
                     <pic:cNvPicPr/>
                   </pic:nvPicPr>
                   <pic:blipFill>
-                    <a:blip r:embed="rId10" cstate="print">
+                    <a:blip r:embed="rId12" cstate="print">
                       <a:extLst>
                         <a:ext uri="{28A0092B-C50C-407E-A947-70E740481C1C}">
                           <a14:useLocalDpi xmlns:a14="http://schemas.microsoft.com/office/drawing/2010/main" val="0"/>
@@ -1122,17 +992,6 @@
         </w:rPr>
         <w:t xml:space="preserve">Classification accuracy with an imposed probability threshold (60-90%). Grey dashed lines represent the overall accuracy above the threshold at each point. Colored lines illustrate the class-specific probability at that threshold </w:t>
       </w:r>
-    </w:p>
-    <w:p>
-      <w:pPr>
-        <w:rPr>
-          <w:rFonts w:ascii="Garamond" w:hAnsi="Garamond"/>
-          <w:b/>
-          <w:bCs/>
-          <w:sz w:val="16"/>
-          <w:szCs w:val="16"/>
-        </w:rPr>
-      </w:pPr>
     </w:p>
     <w:sectPr>
       <w:pgSz w:w="12240" w:h="15840"/>

</xml_diff>

<commit_message>
replaced the correct figures with updated , larger texts
</commit_message>
<xml_diff>
--- a/Docs/FIGURES Machine learning applied to otolith timeseries data to discriminate river of origin for Western Alaska Salmon.docx
+++ b/Docs/FIGURES Machine learning applied to otolith timeseries data to discriminate river of origin for Western Alaska Salmon.docx
@@ -10,27 +10,25 @@
           <w:szCs w:val="16"/>
         </w:rPr>
       </w:pPr>
-    </w:p>
-    <w:p>
-      <w:pPr>
-        <w:rPr>
-          <w:rFonts w:ascii="Garamond" w:hAnsi="Garamond"/>
-          <w:sz w:val="16"/>
-          <w:szCs w:val="16"/>
-        </w:rPr>
-      </w:pPr>
-      <w:r>
-        <w:rPr>
-          <w:rFonts w:ascii="Garamond" w:hAnsi="Garamond"/>
+      <w:r>
+        <w:rPr>
           <w:noProof/>
           <w:sz w:val="16"/>
           <w:szCs w:val="16"/>
         </w:rPr>
         <w:drawing>
-          <wp:inline distT="0" distB="0" distL="0" distR="0" wp14:anchorId="16BCAFDC" wp14:editId="1C26859F">
-            <wp:extent cx="4279392" cy="3306927"/>
-            <wp:effectExtent l="0" t="0" r="635" b="0"/>
-            <wp:docPr id="1728529224" name="Picture 3"/>
+          <wp:anchor distT="0" distB="0" distL="114300" distR="114300" simplePos="0" relativeHeight="251661312" behindDoc="0" locked="0" layoutInCell="1" allowOverlap="1" wp14:anchorId="4E9C1264" wp14:editId="79A8489E">
+            <wp:simplePos x="0" y="0"/>
+            <wp:positionH relativeFrom="column">
+              <wp:posOffset>0</wp:posOffset>
+            </wp:positionH>
+            <wp:positionV relativeFrom="paragraph">
+              <wp:posOffset>164465</wp:posOffset>
+            </wp:positionV>
+            <wp:extent cx="4107180" cy="3173730"/>
+            <wp:effectExtent l="0" t="0" r="0" b="1270"/>
+            <wp:wrapSquare wrapText="bothSides"/>
+            <wp:docPr id="1440452750" name="Picture 4"/>
             <wp:cNvGraphicFramePr>
               <a:graphicFrameLocks xmlns:a="http://schemas.openxmlformats.org/drawingml/2006/main" noChangeAspect="1"/>
             </wp:cNvGraphicFramePr>
@@ -38,7 +36,7 @@
               <a:graphicData uri="http://schemas.openxmlformats.org/drawingml/2006/picture">
                 <pic:pic xmlns:pic="http://schemas.openxmlformats.org/drawingml/2006/picture">
                   <pic:nvPicPr>
-                    <pic:cNvPr id="1728529224" name="Picture 1728529224"/>
+                    <pic:cNvPr id="1440452750" name="Picture 1440452750"/>
                     <pic:cNvPicPr/>
                   </pic:nvPicPr>
                   <pic:blipFill>
@@ -50,7 +48,73 @@
                   <pic:spPr>
                     <a:xfrm>
                       <a:off x="0" y="0"/>
-                      <a:ext cx="4312588" cy="3332580"/>
+                      <a:ext cx="4107180" cy="3173730"/>
+                    </a:xfrm>
+                    <a:prstGeom prst="rect">
+                      <a:avLst/>
+                    </a:prstGeom>
+                  </pic:spPr>
+                </pic:pic>
+              </a:graphicData>
+            </a:graphic>
+            <wp14:sizeRelH relativeFrom="page">
+              <wp14:pctWidth>0</wp14:pctWidth>
+            </wp14:sizeRelH>
+            <wp14:sizeRelV relativeFrom="page">
+              <wp14:pctHeight>0</wp14:pctHeight>
+            </wp14:sizeRelV>
+          </wp:anchor>
+        </w:drawing>
+      </w:r>
+    </w:p>
+    <w:p>
+      <w:pPr>
+        <w:rPr>
+          <w:rFonts w:ascii="Garamond" w:hAnsi="Garamond"/>
+          <w:sz w:val="16"/>
+          <w:szCs w:val="16"/>
+        </w:rPr>
+      </w:pPr>
+      <w:commentRangeStart w:id="0"/>
+      <w:commentRangeEnd w:id="0"/>
+      <w:r>
+        <w:rPr>
+          <w:rStyle w:val="CommentReference"/>
+        </w:rPr>
+        <w:commentReference w:id="0"/>
+      </w:r>
+      <w:r>
+        <w:rPr>
+          <w:rFonts w:ascii="Garamond" w:hAnsi="Garamond"/>
+          <w:noProof/>
+          <w:sz w:val="16"/>
+          <w:szCs w:val="16"/>
+        </w:rPr>
+        <w:drawing>
+          <wp:inline distT="0" distB="0" distL="0" distR="0" wp14:anchorId="5B93EE56" wp14:editId="197CC831">
+            <wp:extent cx="4107180" cy="3173850"/>
+            <wp:effectExtent l="0" t="0" r="0" b="1270"/>
+            <wp:docPr id="1994492973" name="Picture 5"/>
+            <wp:cNvGraphicFramePr>
+              <a:graphicFrameLocks xmlns:a="http://schemas.openxmlformats.org/drawingml/2006/main" noChangeAspect="1"/>
+            </wp:cNvGraphicFramePr>
+            <a:graphic xmlns:a="http://schemas.openxmlformats.org/drawingml/2006/main">
+              <a:graphicData uri="http://schemas.openxmlformats.org/drawingml/2006/picture">
+                <pic:pic xmlns:pic="http://schemas.openxmlformats.org/drawingml/2006/picture">
+                  <pic:nvPicPr>
+                    <pic:cNvPr id="1994492973" name="Picture 1994492973"/>
+                    <pic:cNvPicPr/>
+                  </pic:nvPicPr>
+                  <pic:blipFill>
+                    <a:blip r:embed="rId9"/>
+                    <a:stretch>
+                      <a:fillRect/>
+                    </a:stretch>
+                  </pic:blipFill>
+                  <pic:spPr>
+                    <a:xfrm>
+                      <a:off x="0" y="0"/>
+                      <a:ext cx="4139463" cy="3198797"/>
                     </a:xfrm>
                     <a:prstGeom prst="rect">
                       <a:avLst/>
@@ -62,212 +126,144 @@
           </wp:inline>
         </w:drawing>
       </w:r>
-      <w:r>
-        <w:rPr>
-          <w:rFonts w:ascii="Garamond" w:hAnsi="Garamond"/>
+    </w:p>
+    <w:p>
+      <w:pPr>
+        <w:rPr>
+          <w:rFonts w:ascii="Garamond" w:hAnsi="Garamond"/>
+          <w:sz w:val="16"/>
+          <w:szCs w:val="16"/>
+        </w:rPr>
+      </w:pPr>
+      <w:commentRangeStart w:id="1"/>
+      <w:r>
+        <w:rPr>
+          <w:rFonts w:ascii="Garamond" w:hAnsi="Garamond"/>
+          <w:sz w:val="16"/>
+          <w:szCs w:val="16"/>
+        </w:rPr>
+        <w:t xml:space="preserve">[In </w:t>
+      </w:r>
+      <w:proofErr w:type="gramStart"/>
+      <w:r>
+        <w:rPr>
+          <w:rFonts w:ascii="Garamond" w:hAnsi="Garamond"/>
+          <w:sz w:val="16"/>
+          <w:szCs w:val="16"/>
+        </w:rPr>
+        <w:t>Progress]  Figure</w:t>
+      </w:r>
+      <w:proofErr w:type="gramEnd"/>
+      <w:r>
+        <w:rPr>
+          <w:rFonts w:ascii="Garamond" w:hAnsi="Garamond"/>
+          <w:sz w:val="16"/>
+          <w:szCs w:val="16"/>
+        </w:rPr>
+        <w:t xml:space="preserve"> 1: A) Three major river systems in Western Alaska, the Yukon (Blue), Kuskokwim (Red), and Nushagak (Green) river-basins. Icons (will change color, location) indicate sampling locations for samples on each river. B) Sr8786 </w:t>
+      </w:r>
+      <w:proofErr w:type="spellStart"/>
+      <w:r>
+        <w:rPr>
+          <w:rFonts w:ascii="Garamond" w:hAnsi="Garamond"/>
+          <w:sz w:val="16"/>
+          <w:szCs w:val="16"/>
+        </w:rPr>
+        <w:t>Isoscape</w:t>
+      </w:r>
+      <w:proofErr w:type="spellEnd"/>
+      <w:r>
+        <w:rPr>
+          <w:rFonts w:ascii="Garamond" w:hAnsi="Garamond"/>
+          <w:sz w:val="16"/>
+          <w:szCs w:val="16"/>
+        </w:rPr>
+        <w:t xml:space="preserve"> of all three river-basins. Darker Colors indicate more enriched values </w:t>
+      </w:r>
+      <w:proofErr w:type="gramStart"/>
+      <w:r>
+        <w:rPr>
+          <w:rFonts w:ascii="Garamond" w:hAnsi="Garamond"/>
+          <w:sz w:val="16"/>
+          <w:szCs w:val="16"/>
+        </w:rPr>
+        <w:t>( close</w:t>
+      </w:r>
+      <w:proofErr w:type="gramEnd"/>
+      <w:r>
+        <w:rPr>
+          <w:rFonts w:ascii="Garamond" w:hAnsi="Garamond"/>
+          <w:sz w:val="16"/>
+          <w:szCs w:val="16"/>
+        </w:rPr>
+        <w:t xml:space="preserve"> to .740) whereas lighter values indicate less enriched </w:t>
+      </w:r>
+      <w:proofErr w:type="gramStart"/>
+      <w:r>
+        <w:rPr>
+          <w:rFonts w:ascii="Garamond" w:hAnsi="Garamond"/>
+          <w:sz w:val="16"/>
+          <w:szCs w:val="16"/>
+        </w:rPr>
+        <w:t>( closer</w:t>
+      </w:r>
+      <w:proofErr w:type="gramEnd"/>
+      <w:r>
+        <w:rPr>
+          <w:rFonts w:ascii="Garamond" w:hAnsi="Garamond"/>
+          <w:sz w:val="16"/>
+          <w:szCs w:val="16"/>
+        </w:rPr>
+        <w:t xml:space="preserve"> to .702). </w:t>
+      </w:r>
+      <w:commentRangeEnd w:id="1"/>
+      <w:r>
+        <w:rPr>
+          <w:rStyle w:val="CommentReference"/>
+        </w:rPr>
+        <w:commentReference w:id="1"/>
+      </w:r>
+    </w:p>
+    <w:p>
+      <w:pPr>
+        <w:rPr>
+          <w:rFonts w:ascii="Garamond" w:hAnsi="Garamond"/>
+          <w:sz w:val="16"/>
+          <w:szCs w:val="16"/>
+        </w:rPr>
+      </w:pPr>
+    </w:p>
+    <w:p>
+      <w:pPr>
+        <w:rPr>
+          <w:rFonts w:ascii="Garamond" w:hAnsi="Garamond"/>
+          <w:sz w:val="16"/>
+          <w:szCs w:val="16"/>
+        </w:rPr>
+      </w:pPr>
+    </w:p>
+    <w:p>
+      <w:pPr>
+        <w:rPr>
+          <w:rFonts w:ascii="Garamond" w:hAnsi="Garamond"/>
+          <w:sz w:val="16"/>
+          <w:szCs w:val="16"/>
+        </w:rPr>
+      </w:pPr>
+    </w:p>
+    <w:p>
+      <w:pPr>
+        <w:rPr>
+          <w:rFonts w:ascii="Garamond" w:hAnsi="Garamond"/>
+        </w:rPr>
+      </w:pPr>
+    </w:p>
+    <w:p>
+      <w:r>
+        <w:rPr>
           <w:noProof/>
-          <w:sz w:val="16"/>
-          <w:szCs w:val="16"/>
-        </w:rPr>
-        <w:drawing>
-          <wp:inline distT="0" distB="0" distL="0" distR="0" wp14:anchorId="58F41200" wp14:editId="23CD41E6">
-            <wp:extent cx="4279265" cy="3306830"/>
-            <wp:effectExtent l="0" t="0" r="635" b="0"/>
-            <wp:docPr id="1119687362" name="Picture 4"/>
-            <wp:cNvGraphicFramePr>
-              <a:graphicFrameLocks xmlns:a="http://schemas.openxmlformats.org/drawingml/2006/main" noChangeAspect="1"/>
-            </wp:cNvGraphicFramePr>
-            <a:graphic xmlns:a="http://schemas.openxmlformats.org/drawingml/2006/main">
-              <a:graphicData uri="http://schemas.openxmlformats.org/drawingml/2006/picture">
-                <pic:pic xmlns:pic="http://schemas.openxmlformats.org/drawingml/2006/picture">
-                  <pic:nvPicPr>
-                    <pic:cNvPr id="1119687362" name="Picture 1119687362"/>
-                    <pic:cNvPicPr/>
-                  </pic:nvPicPr>
-                  <pic:blipFill>
-                    <a:blip r:embed="rId5"/>
-                    <a:stretch>
-                      <a:fillRect/>
-                    </a:stretch>
-                  </pic:blipFill>
-                  <pic:spPr>
-                    <a:xfrm>
-                      <a:off x="0" y="0"/>
-                      <a:ext cx="4312182" cy="3332267"/>
-                    </a:xfrm>
-                    <a:prstGeom prst="rect">
-                      <a:avLst/>
-                    </a:prstGeom>
-                  </pic:spPr>
-                </pic:pic>
-              </a:graphicData>
-            </a:graphic>
-          </wp:inline>
-        </w:drawing>
-      </w:r>
-    </w:p>
-    <w:p>
-      <w:pPr>
-        <w:rPr>
-          <w:rFonts w:ascii="Garamond" w:hAnsi="Garamond"/>
-          <w:sz w:val="16"/>
-          <w:szCs w:val="16"/>
-        </w:rPr>
-      </w:pPr>
-      <w:commentRangeStart w:id="0"/>
-      <w:r>
-        <w:rPr>
-          <w:rFonts w:ascii="Garamond" w:hAnsi="Garamond"/>
-          <w:sz w:val="16"/>
-          <w:szCs w:val="16"/>
-        </w:rPr>
-        <w:t xml:space="preserve">[In </w:t>
-      </w:r>
-      <w:proofErr w:type="gramStart"/>
-      <w:r>
-        <w:rPr>
-          <w:rFonts w:ascii="Garamond" w:hAnsi="Garamond"/>
-          <w:sz w:val="16"/>
-          <w:szCs w:val="16"/>
-        </w:rPr>
-        <w:t xml:space="preserve">Progress] </w:t>
-      </w:r>
-      <w:r>
-        <w:rPr>
-          <w:rFonts w:ascii="Garamond" w:hAnsi="Garamond"/>
-          <w:sz w:val="16"/>
-          <w:szCs w:val="16"/>
-        </w:rPr>
-        <w:t xml:space="preserve"> Figure</w:t>
-      </w:r>
-      <w:proofErr w:type="gramEnd"/>
-      <w:r>
-        <w:rPr>
-          <w:rFonts w:ascii="Garamond" w:hAnsi="Garamond"/>
-          <w:sz w:val="16"/>
-          <w:szCs w:val="16"/>
-        </w:rPr>
-        <w:t xml:space="preserve"> 1: A) Three major river systems in Western Alaska, the Yukon (Blue), Kuskokwim (Red), and </w:t>
-      </w:r>
-      <w:proofErr w:type="spellStart"/>
-      <w:r>
-        <w:rPr>
-          <w:rFonts w:ascii="Garamond" w:hAnsi="Garamond"/>
-          <w:sz w:val="16"/>
-          <w:szCs w:val="16"/>
-        </w:rPr>
-        <w:t>Nushagak</w:t>
-      </w:r>
-      <w:proofErr w:type="spellEnd"/>
-      <w:r>
-        <w:rPr>
-          <w:rFonts w:ascii="Garamond" w:hAnsi="Garamond"/>
-          <w:sz w:val="16"/>
-          <w:szCs w:val="16"/>
-        </w:rPr>
-        <w:t xml:space="preserve"> (Green) river-basins. Icons (will change color, location) indicate sampling locations for samples on each river. B) Sr8786 </w:t>
-      </w:r>
-      <w:proofErr w:type="spellStart"/>
-      <w:r>
-        <w:rPr>
-          <w:rFonts w:ascii="Garamond" w:hAnsi="Garamond"/>
-          <w:sz w:val="16"/>
-          <w:szCs w:val="16"/>
-        </w:rPr>
-        <w:t>Isoscape</w:t>
-      </w:r>
-      <w:proofErr w:type="spellEnd"/>
-      <w:r>
-        <w:rPr>
-          <w:rFonts w:ascii="Garamond" w:hAnsi="Garamond"/>
-          <w:sz w:val="16"/>
-          <w:szCs w:val="16"/>
-        </w:rPr>
-        <w:t xml:space="preserve"> of all three river-basins. Darker Colors indicate more enriched values </w:t>
-      </w:r>
-      <w:proofErr w:type="gramStart"/>
-      <w:r>
-        <w:rPr>
-          <w:rFonts w:ascii="Garamond" w:hAnsi="Garamond"/>
-          <w:sz w:val="16"/>
-          <w:szCs w:val="16"/>
-        </w:rPr>
-        <w:t>( close</w:t>
-      </w:r>
-      <w:proofErr w:type="gramEnd"/>
-      <w:r>
-        <w:rPr>
-          <w:rFonts w:ascii="Garamond" w:hAnsi="Garamond"/>
-          <w:sz w:val="16"/>
-          <w:szCs w:val="16"/>
-        </w:rPr>
-        <w:t xml:space="preserve"> to .740) whereas lighter values indicate less enriched </w:t>
-      </w:r>
-      <w:proofErr w:type="gramStart"/>
-      <w:r>
-        <w:rPr>
-          <w:rFonts w:ascii="Garamond" w:hAnsi="Garamond"/>
-          <w:sz w:val="16"/>
-          <w:szCs w:val="16"/>
-        </w:rPr>
-        <w:t>( closer</w:t>
-      </w:r>
-      <w:proofErr w:type="gramEnd"/>
-      <w:r>
-        <w:rPr>
-          <w:rFonts w:ascii="Garamond" w:hAnsi="Garamond"/>
-          <w:sz w:val="16"/>
-          <w:szCs w:val="16"/>
-        </w:rPr>
-        <w:t xml:space="preserve"> to .702). </w:t>
-      </w:r>
-      <w:commentRangeEnd w:id="0"/>
-      <w:r>
-        <w:rPr>
-          <w:rStyle w:val="CommentReference"/>
-        </w:rPr>
-        <w:commentReference w:id="0"/>
-      </w:r>
-    </w:p>
-    <w:p>
-      <w:pPr>
-        <w:rPr>
-          <w:rFonts w:ascii="Garamond" w:hAnsi="Garamond"/>
-          <w:sz w:val="16"/>
-          <w:szCs w:val="16"/>
-        </w:rPr>
-      </w:pPr>
-    </w:p>
-    <w:p>
-      <w:pPr>
-        <w:rPr>
-          <w:rFonts w:ascii="Garamond" w:hAnsi="Garamond"/>
-          <w:sz w:val="16"/>
-          <w:szCs w:val="16"/>
-        </w:rPr>
-      </w:pPr>
-    </w:p>
-    <w:p>
-      <w:pPr>
-        <w:rPr>
-          <w:rFonts w:ascii="Garamond" w:hAnsi="Garamond"/>
-          <w:sz w:val="16"/>
-          <w:szCs w:val="16"/>
-        </w:rPr>
-      </w:pPr>
-    </w:p>
-    <w:p>
-      <w:pPr>
-        <w:rPr>
-          <w:rFonts w:ascii="Garamond" w:hAnsi="Garamond"/>
-        </w:rPr>
-      </w:pPr>
-    </w:p>
-    <w:p>
-      <w:r>
-        <w:rPr>
-          <w:noProof/>
-        </w:rPr>
+        </w:rPr>
+        <w:lastRenderedPageBreak/>
         <w:drawing>
           <wp:inline distT="0" distB="0" distL="0" distR="0" wp14:anchorId="4355DA06" wp14:editId="04D713A8">
             <wp:extent cx="2896473" cy="1737884"/>
@@ -389,7 +385,23 @@
           <w:sz w:val="16"/>
           <w:szCs w:val="16"/>
         </w:rPr>
-        <w:t xml:space="preserve"> Model Performance comparison among data sources and model types. Accuracy indicates the proportion of each class correctly classified. F1-Score is the harmonic mean of precision and recall, providing a balanced performance measure across all watershed classes. Results compare </w:t>
+        <w:t xml:space="preserve"> Model Performance comparison among data </w:t>
+      </w:r>
+      <w:r>
+        <w:rPr>
+          <w:rFonts w:ascii="Garamond" w:hAnsi="Garamond"/>
+          <w:sz w:val="16"/>
+          <w:szCs w:val="16"/>
+        </w:rPr>
+        <w:t xml:space="preserve">preprocessing steps </w:t>
+      </w:r>
+      <w:r>
+        <w:rPr>
+          <w:rFonts w:ascii="Garamond" w:hAnsi="Garamond"/>
+          <w:sz w:val="16"/>
+          <w:szCs w:val="16"/>
+        </w:rPr>
+        <w:t xml:space="preserve">and model types. Accuracy indicates the proportion of each class correctly classified. F1-Score is the harmonic mean of precision and recall, providing a balanced performance measure across all watershed classes. Results compare </w:t>
       </w:r>
       <w:r>
         <w:rPr>
@@ -447,6 +459,24 @@
         </w:rPr>
         <w:t>Darker green colors indicate higher scores.</w:t>
       </w:r>
+    </w:p>
+    <w:p>
+      <w:pPr>
+        <w:rPr>
+          <w:rFonts w:ascii="Garamond" w:hAnsi="Garamond"/>
+          <w:sz w:val="16"/>
+          <w:szCs w:val="16"/>
+        </w:rPr>
+      </w:pPr>
+    </w:p>
+    <w:p>
+      <w:pPr>
+        <w:rPr>
+          <w:rFonts w:ascii="Garamond" w:hAnsi="Garamond"/>
+          <w:sz w:val="16"/>
+          <w:szCs w:val="16"/>
+        </w:rPr>
+      </w:pPr>
     </w:p>
     <w:p>
       <w:pPr>
@@ -557,7 +587,41 @@
           <w:sz w:val="16"/>
           <w:szCs w:val="16"/>
         </w:rPr>
-        <w:t>Confusion matrix from the highest preforming model (Random Forest on GAM Smoothed data) for both total test set and overlapping subset. Boxes along the horizontal axis indicate correctly classified individuals</w:t>
+        <w:t>Confusion matrix from the highest p</w:t>
+      </w:r>
+      <w:r>
+        <w:rPr>
+          <w:rFonts w:ascii="Garamond" w:hAnsi="Garamond"/>
+          <w:sz w:val="16"/>
+          <w:szCs w:val="16"/>
+        </w:rPr>
+        <w:t>er</w:t>
+      </w:r>
+      <w:r>
+        <w:rPr>
+          <w:rFonts w:ascii="Garamond" w:hAnsi="Garamond"/>
+          <w:sz w:val="16"/>
+          <w:szCs w:val="16"/>
+        </w:rPr>
+        <w:t xml:space="preserve">forming model (Random Forest on GAM Smoothed data) for both total </w:t>
+      </w:r>
+      <w:proofErr w:type="gramStart"/>
+      <w:r>
+        <w:rPr>
+          <w:rFonts w:ascii="Garamond" w:hAnsi="Garamond"/>
+          <w:sz w:val="16"/>
+          <w:szCs w:val="16"/>
+        </w:rPr>
+        <w:t>test</w:t>
+      </w:r>
+      <w:proofErr w:type="gramEnd"/>
+      <w:r>
+        <w:rPr>
+          <w:rFonts w:ascii="Garamond" w:hAnsi="Garamond"/>
+          <w:sz w:val="16"/>
+          <w:szCs w:val="16"/>
+        </w:rPr>
+        <w:t xml:space="preserve"> set and overlapping subset. Boxes along the horizontal axis indicate correctly classified individuals</w:t>
       </w:r>
       <w:r>
         <w:rPr>
@@ -596,142 +660,42 @@
       <w:pPr>
         <w:rPr>
           <w:rFonts w:ascii="Garamond" w:hAnsi="Garamond"/>
-          <w:sz w:val="16"/>
-          <w:szCs w:val="16"/>
-        </w:rPr>
-      </w:pPr>
-    </w:p>
-    <w:p/>
-    <w:p>
-      <w:commentRangeStart w:id="1"/>
-      <w:r>
+          <w:b/>
+          <w:bCs/>
+          <w:sz w:val="16"/>
+          <w:szCs w:val="16"/>
+        </w:rPr>
+      </w:pPr>
+    </w:p>
+    <w:p>
+      <w:pPr>
+        <w:rPr>
+          <w:rFonts w:ascii="Garamond" w:hAnsi="Garamond"/>
+          <w:b/>
+          <w:bCs/>
+          <w:sz w:val="16"/>
+          <w:szCs w:val="16"/>
+        </w:rPr>
+      </w:pPr>
+      <w:r>
+        <w:rPr>
+          <w:rFonts w:ascii="Garamond" w:hAnsi="Garamond"/>
+          <w:noProof/>
+          <w:sz w:val="16"/>
+          <w:szCs w:val="16"/>
+        </w:rPr>
         <w:lastRenderedPageBreak/>
         <w:drawing>
-          <wp:inline distT="0" distB="0" distL="0" distR="0" wp14:anchorId="3CC31619" wp14:editId="11D0F073">
-            <wp:extent cx="2586182" cy="2159297"/>
-            <wp:effectExtent l="0" t="0" r="5080" b="0"/>
-            <wp:docPr id="555171451" name="Picture 1" descr="A graph of a number of individuals&#10;&#10;AI-generated content may be incorrect."/>
-            <wp:cNvGraphicFramePr>
-              <a:graphicFrameLocks xmlns:a="http://schemas.openxmlformats.org/drawingml/2006/main" noChangeAspect="1"/>
-            </wp:cNvGraphicFramePr>
-            <a:graphic xmlns:a="http://schemas.openxmlformats.org/drawingml/2006/main">
-              <a:graphicData uri="http://schemas.openxmlformats.org/drawingml/2006/picture">
-                <pic:pic xmlns:pic="http://schemas.openxmlformats.org/drawingml/2006/picture">
-                  <pic:nvPicPr>
-                    <pic:cNvPr id="555171451" name="Picture 1" descr="A graph of a number of individuals&#10;&#10;AI-generated content may be incorrect."/>
-                    <pic:cNvPicPr/>
-                  </pic:nvPicPr>
-                  <pic:blipFill>
-                    <a:blip r:embed="rId13"/>
-                    <a:stretch>
-                      <a:fillRect/>
-                    </a:stretch>
-                  </pic:blipFill>
-                  <pic:spPr>
-                    <a:xfrm>
-                      <a:off x="0" y="0"/>
-                      <a:ext cx="2616291" cy="2184436"/>
-                    </a:xfrm>
-                    <a:prstGeom prst="rect">
-                      <a:avLst/>
-                    </a:prstGeom>
-                  </pic:spPr>
-                </pic:pic>
-              </a:graphicData>
-            </a:graphic>
-          </wp:inline>
-        </w:drawing>
-      </w:r>
-      <w:commentRangeEnd w:id="1"/>
-      <w:r>
-        <w:rPr>
-          <w:rStyle w:val="CommentReference"/>
-        </w:rPr>
-        <w:commentReference w:id="1"/>
-      </w:r>
-    </w:p>
-    <w:p>
-      <w:pPr>
-        <w:jc w:val="center"/>
-        <w:rPr>
-          <w:rFonts w:ascii="Garamond" w:hAnsi="Garamond"/>
-          <w:sz w:val="16"/>
-          <w:szCs w:val="16"/>
-        </w:rPr>
-      </w:pPr>
-    </w:p>
-    <w:p>
-      <w:pPr>
-        <w:rPr>
-          <w:rFonts w:ascii="Garamond" w:hAnsi="Garamond"/>
-          <w:b/>
-          <w:bCs/>
-          <w:sz w:val="16"/>
-          <w:szCs w:val="16"/>
-        </w:rPr>
-      </w:pPr>
-    </w:p>
-    <w:p>
-      <w:pPr>
-        <w:rPr>
-          <w:rFonts w:ascii="Garamond" w:hAnsi="Garamond"/>
-          <w:b/>
-          <w:bCs/>
-          <w:sz w:val="16"/>
-          <w:szCs w:val="16"/>
-        </w:rPr>
-      </w:pPr>
-    </w:p>
-    <w:p>
-      <w:pPr>
-        <w:rPr>
-          <w:rFonts w:ascii="Garamond" w:hAnsi="Garamond"/>
-          <w:b/>
-          <w:bCs/>
-          <w:sz w:val="16"/>
-          <w:szCs w:val="16"/>
-        </w:rPr>
-      </w:pPr>
-    </w:p>
-    <w:p>
-      <w:pPr>
-        <w:rPr>
-          <w:rFonts w:ascii="Garamond" w:hAnsi="Garamond"/>
-          <w:b/>
-          <w:bCs/>
-          <w:sz w:val="16"/>
-          <w:szCs w:val="16"/>
-        </w:rPr>
-      </w:pPr>
-    </w:p>
-    <w:p>
-      <w:pPr>
-        <w:rPr>
-          <w:rFonts w:ascii="Garamond" w:hAnsi="Garamond"/>
-          <w:b/>
-          <w:bCs/>
-          <w:sz w:val="16"/>
-          <w:szCs w:val="16"/>
-        </w:rPr>
-      </w:pPr>
-      <w:r>
-        <w:rPr>
-          <w:rFonts w:ascii="Garamond" w:hAnsi="Garamond"/>
-          <w:noProof/>
-          <w:sz w:val="16"/>
-          <w:szCs w:val="16"/>
-        </w:rPr>
-        <w:drawing>
-          <wp:anchor distT="0" distB="0" distL="114300" distR="114300" simplePos="0" relativeHeight="251658240" behindDoc="0" locked="0" layoutInCell="1" allowOverlap="1" wp14:anchorId="4608D8C9" wp14:editId="571A06E9">
+          <wp:anchor distT="0" distB="0" distL="114300" distR="114300" simplePos="0" relativeHeight="251658240" behindDoc="0" locked="0" layoutInCell="1" allowOverlap="1" wp14:anchorId="4608D8C9" wp14:editId="070FAB63">
             <wp:simplePos x="0" y="0"/>
             <wp:positionH relativeFrom="column">
-              <wp:posOffset>-222250</wp:posOffset>
+              <wp:posOffset>-225425</wp:posOffset>
             </wp:positionH>
             <wp:positionV relativeFrom="paragraph">
-              <wp:posOffset>271145</wp:posOffset>
+              <wp:posOffset>267335</wp:posOffset>
             </wp:positionV>
-            <wp:extent cx="4349750" cy="3625215"/>
-            <wp:effectExtent l="0" t="0" r="6350" b="0"/>
+            <wp:extent cx="4324350" cy="3603625"/>
+            <wp:effectExtent l="0" t="0" r="6350" b="3175"/>
             <wp:wrapSquare wrapText="bothSides"/>
             <wp:docPr id="2003545803" name="Picture 1" descr="A diagram of a diagram&#10;&#10;AI-generated content may be incorrect."/>
             <wp:cNvGraphicFramePr>
@@ -745,7 +709,7 @@
                     <pic:cNvPicPr/>
                   </pic:nvPicPr>
                   <pic:blipFill>
-                    <a:blip r:embed="rId14" cstate="print">
+                    <a:blip r:embed="rId13" cstate="print">
                       <a:extLst>
                         <a:ext uri="{28A0092B-C50C-407E-A947-70E740481C1C}">
                           <a14:useLocalDpi xmlns:a14="http://schemas.microsoft.com/office/drawing/2010/main" val="0"/>
@@ -759,7 +723,7 @@
                   <pic:spPr>
                     <a:xfrm>
                       <a:off x="0" y="0"/>
-                      <a:ext cx="4349750" cy="3625215"/>
+                      <a:ext cx="4324350" cy="3603625"/>
                     </a:xfrm>
                     <a:prstGeom prst="rect">
                       <a:avLst/>
@@ -838,26 +802,125 @@
           <w:sz w:val="16"/>
           <w:szCs w:val="16"/>
         </w:rPr>
-        <w:t xml:space="preserve">, indicative of the large range in natal Sr87/86 values in the basin. Kuskokwim (Red points) overlap between both </w:t>
-      </w:r>
-      <w:proofErr w:type="spellStart"/>
-      <w:r>
-        <w:rPr>
-          <w:rFonts w:ascii="Garamond" w:hAnsi="Garamond"/>
-          <w:sz w:val="16"/>
-          <w:szCs w:val="16"/>
-        </w:rPr>
-        <w:t>Nushagak</w:t>
-      </w:r>
-      <w:proofErr w:type="spellEnd"/>
-      <w:r>
-        <w:rPr>
-          <w:rFonts w:ascii="Garamond" w:hAnsi="Garamond"/>
-          <w:sz w:val="16"/>
-          <w:szCs w:val="16"/>
-        </w:rPr>
-        <w:t xml:space="preserve"> and Yukon fish, likely due to its position in the region between both watersheds. </w:t>
-      </w:r>
+        <w:t xml:space="preserve">, indicative of the large range in natal Sr87/86 values in the basin. Kuskokwim (Red points) overlap between both Nushagak and Yukon fish, likely due to its position in the region between both watersheds. </w:t>
+      </w:r>
+    </w:p>
+    <w:p>
+      <w:pPr>
+        <w:rPr>
+          <w:rFonts w:ascii="Garamond" w:hAnsi="Garamond"/>
+          <w:sz w:val="16"/>
+          <w:szCs w:val="16"/>
+        </w:rPr>
+      </w:pPr>
+    </w:p>
+    <w:p>
+      <w:pPr>
+        <w:rPr>
+          <w:rFonts w:ascii="Garamond" w:hAnsi="Garamond"/>
+          <w:sz w:val="16"/>
+          <w:szCs w:val="16"/>
+        </w:rPr>
+      </w:pPr>
+    </w:p>
+    <w:p>
+      <w:pPr>
+        <w:rPr>
+          <w:rFonts w:ascii="Garamond" w:hAnsi="Garamond"/>
+          <w:sz w:val="16"/>
+          <w:szCs w:val="16"/>
+        </w:rPr>
+      </w:pPr>
+    </w:p>
+    <w:p>
+      <w:pPr>
+        <w:rPr>
+          <w:rFonts w:ascii="Garamond" w:hAnsi="Garamond"/>
+          <w:sz w:val="16"/>
+          <w:szCs w:val="16"/>
+        </w:rPr>
+      </w:pPr>
+    </w:p>
+    <w:p>
+      <w:pPr>
+        <w:rPr>
+          <w:rFonts w:ascii="Garamond" w:hAnsi="Garamond"/>
+          <w:sz w:val="16"/>
+          <w:szCs w:val="16"/>
+        </w:rPr>
+      </w:pPr>
+    </w:p>
+    <w:p>
+      <w:pPr>
+        <w:rPr>
+          <w:rFonts w:ascii="Garamond" w:hAnsi="Garamond"/>
+          <w:sz w:val="16"/>
+          <w:szCs w:val="16"/>
+        </w:rPr>
+      </w:pPr>
+    </w:p>
+    <w:p>
+      <w:pPr>
+        <w:rPr>
+          <w:rFonts w:ascii="Garamond" w:hAnsi="Garamond"/>
+          <w:sz w:val="16"/>
+          <w:szCs w:val="16"/>
+        </w:rPr>
+      </w:pPr>
+    </w:p>
+    <w:p>
+      <w:pPr>
+        <w:rPr>
+          <w:rFonts w:ascii="Garamond" w:hAnsi="Garamond"/>
+          <w:sz w:val="16"/>
+          <w:szCs w:val="16"/>
+        </w:rPr>
+      </w:pPr>
+    </w:p>
+    <w:p>
+      <w:pPr>
+        <w:rPr>
+          <w:rFonts w:ascii="Garamond" w:hAnsi="Garamond"/>
+          <w:sz w:val="16"/>
+          <w:szCs w:val="16"/>
+        </w:rPr>
+      </w:pPr>
+    </w:p>
+    <w:p>
+      <w:pPr>
+        <w:rPr>
+          <w:rFonts w:ascii="Garamond" w:hAnsi="Garamond"/>
+          <w:sz w:val="16"/>
+          <w:szCs w:val="16"/>
+        </w:rPr>
+      </w:pPr>
+    </w:p>
+    <w:p>
+      <w:pPr>
+        <w:rPr>
+          <w:rFonts w:ascii="Garamond" w:hAnsi="Garamond"/>
+          <w:sz w:val="16"/>
+          <w:szCs w:val="16"/>
+        </w:rPr>
+      </w:pPr>
+    </w:p>
+    <w:p>
+      <w:pPr>
+        <w:rPr>
+          <w:rFonts w:ascii="Garamond" w:hAnsi="Garamond"/>
+          <w:sz w:val="16"/>
+          <w:szCs w:val="16"/>
+        </w:rPr>
+      </w:pPr>
+    </w:p>
+    <w:p>
+      <w:pPr>
+        <w:rPr>
+          <w:rFonts w:ascii="Garamond" w:hAnsi="Garamond"/>
+          <w:sz w:val="16"/>
+          <w:szCs w:val="16"/>
+        </w:rPr>
+      </w:pPr>
     </w:p>
     <w:p>
       <w:pPr>
@@ -903,10 +966,18 @@
         </w:rPr>
         <w:lastRenderedPageBreak/>
         <w:drawing>
-          <wp:inline distT="0" distB="0" distL="0" distR="0" wp14:anchorId="3106B05A" wp14:editId="6D19F2B2">
-            <wp:extent cx="1865515" cy="2984825"/>
-            <wp:effectExtent l="0" t="0" r="1905" b="0"/>
-            <wp:docPr id="1148715510" name="Picture 2"/>
+          <wp:anchor distT="0" distB="0" distL="114300" distR="114300" simplePos="0" relativeHeight="251659264" behindDoc="0" locked="0" layoutInCell="1" allowOverlap="1" wp14:anchorId="30DF671A" wp14:editId="47E36F8F">
+            <wp:simplePos x="0" y="0"/>
+            <wp:positionH relativeFrom="column">
+              <wp:posOffset>1741170</wp:posOffset>
+            </wp:positionH>
+            <wp:positionV relativeFrom="paragraph">
+              <wp:posOffset>46299</wp:posOffset>
+            </wp:positionV>
+            <wp:extent cx="4656455" cy="3492500"/>
+            <wp:effectExtent l="0" t="0" r="4445" b="0"/>
+            <wp:wrapSquare wrapText="bothSides"/>
+            <wp:docPr id="1678162362" name="Picture 3"/>
             <wp:cNvGraphicFramePr>
               <a:graphicFrameLocks xmlns:a="http://schemas.openxmlformats.org/drawingml/2006/main" noChangeAspect="1"/>
             </wp:cNvGraphicFramePr>
@@ -914,7 +985,64 @@
               <a:graphicData uri="http://schemas.openxmlformats.org/drawingml/2006/picture">
                 <pic:pic xmlns:pic="http://schemas.openxmlformats.org/drawingml/2006/picture">
                   <pic:nvPicPr>
-                    <pic:cNvPr id="1148715510" name="Picture 1148715510"/>
+                    <pic:cNvPr id="1678162362" name="Picture 1678162362"/>
+                    <pic:cNvPicPr/>
+                  </pic:nvPicPr>
+                  <pic:blipFill>
+                    <a:blip r:embed="rId14"/>
+                    <a:stretch>
+                      <a:fillRect/>
+                    </a:stretch>
+                  </pic:blipFill>
+                  <pic:spPr>
+                    <a:xfrm>
+                      <a:off x="0" y="0"/>
+                      <a:ext cx="4656455" cy="3492500"/>
+                    </a:xfrm>
+                    <a:prstGeom prst="rect">
+                      <a:avLst/>
+                    </a:prstGeom>
+                  </pic:spPr>
+                </pic:pic>
+              </a:graphicData>
+            </a:graphic>
+            <wp14:sizeRelH relativeFrom="page">
+              <wp14:pctWidth>0</wp14:pctWidth>
+            </wp14:sizeRelH>
+            <wp14:sizeRelV relativeFrom="page">
+              <wp14:pctHeight>0</wp14:pctHeight>
+            </wp14:sizeRelV>
+          </wp:anchor>
+        </w:drawing>
+      </w:r>
+      <w:r>
+        <w:rPr>
+          <w:rFonts w:ascii="Garamond" w:hAnsi="Garamond"/>
+          <w:noProof/>
+          <w:sz w:val="16"/>
+          <w:szCs w:val="16"/>
+        </w:rPr>
+        <w:drawing>
+          <wp:anchor distT="0" distB="0" distL="114300" distR="114300" simplePos="0" relativeHeight="251660288" behindDoc="0" locked="0" layoutInCell="1" allowOverlap="1" wp14:anchorId="2AA4B8A8" wp14:editId="68D94DA9">
+            <wp:simplePos x="0" y="0"/>
+            <wp:positionH relativeFrom="column">
+              <wp:posOffset>-187325</wp:posOffset>
+            </wp:positionH>
+            <wp:positionV relativeFrom="paragraph">
+              <wp:posOffset>185</wp:posOffset>
+            </wp:positionV>
+            <wp:extent cx="2068830" cy="3394710"/>
+            <wp:effectExtent l="0" t="0" r="1270" b="0"/>
+            <wp:wrapSquare wrapText="bothSides"/>
+            <wp:docPr id="661460792" name="Picture 2"/>
+            <wp:cNvGraphicFramePr>
+              <a:graphicFrameLocks xmlns:a="http://schemas.openxmlformats.org/drawingml/2006/main" noChangeAspect="1"/>
+            </wp:cNvGraphicFramePr>
+            <a:graphic xmlns:a="http://schemas.openxmlformats.org/drawingml/2006/main">
+              <a:graphicData uri="http://schemas.openxmlformats.org/drawingml/2006/picture">
+                <pic:pic xmlns:pic="http://schemas.openxmlformats.org/drawingml/2006/picture">
+                  <pic:nvPicPr>
+                    <pic:cNvPr id="661460792" name="Picture 661460792"/>
                     <pic:cNvPicPr/>
                   </pic:nvPicPr>
                   <pic:blipFill>
@@ -926,7 +1054,7 @@
                   <pic:spPr>
                     <a:xfrm>
                       <a:off x="0" y="0"/>
-                      <a:ext cx="1930585" cy="3088937"/>
+                      <a:ext cx="2068830" cy="3394710"/>
                     </a:xfrm>
                     <a:prstGeom prst="rect">
                       <a:avLst/>
@@ -935,50 +1063,13 @@
                 </pic:pic>
               </a:graphicData>
             </a:graphic>
-          </wp:inline>
-        </w:drawing>
-      </w:r>
-      <w:r>
-        <w:rPr>
-          <w:rFonts w:ascii="Garamond" w:hAnsi="Garamond"/>
-          <w:noProof/>
-          <w:sz w:val="16"/>
-          <w:szCs w:val="16"/>
-        </w:rPr>
-        <w:drawing>
-          <wp:inline distT="0" distB="0" distL="0" distR="0" wp14:anchorId="25743AE2" wp14:editId="68E07C99">
-            <wp:extent cx="3980873" cy="2985654"/>
-            <wp:effectExtent l="0" t="0" r="0" b="0"/>
-            <wp:docPr id="1146811189" name="Picture 1"/>
-            <wp:cNvGraphicFramePr>
-              <a:graphicFrameLocks xmlns:a="http://schemas.openxmlformats.org/drawingml/2006/main" noChangeAspect="1"/>
-            </wp:cNvGraphicFramePr>
-            <a:graphic xmlns:a="http://schemas.openxmlformats.org/drawingml/2006/main">
-              <a:graphicData uri="http://schemas.openxmlformats.org/drawingml/2006/picture">
-                <pic:pic xmlns:pic="http://schemas.openxmlformats.org/drawingml/2006/picture">
-                  <pic:nvPicPr>
-                    <pic:cNvPr id="1146811189" name="Picture 1146811189"/>
-                    <pic:cNvPicPr/>
-                  </pic:nvPicPr>
-                  <pic:blipFill>
-                    <a:blip r:embed="rId16"/>
-                    <a:stretch>
-                      <a:fillRect/>
-                    </a:stretch>
-                  </pic:blipFill>
-                  <pic:spPr>
-                    <a:xfrm>
-                      <a:off x="0" y="0"/>
-                      <a:ext cx="4051417" cy="3038562"/>
-                    </a:xfrm>
-                    <a:prstGeom prst="rect">
-                      <a:avLst/>
-                    </a:prstGeom>
-                  </pic:spPr>
-                </pic:pic>
-              </a:graphicData>
-            </a:graphic>
-          </wp:inline>
+            <wp14:sizeRelH relativeFrom="page">
+              <wp14:pctWidth>0</wp14:pctWidth>
+            </wp14:sizeRelH>
+            <wp14:sizeRelV relativeFrom="page">
+              <wp14:pctHeight>0</wp14:pctHeight>
+            </wp14:sizeRelV>
+          </wp:anchor>
         </w:drawing>
       </w:r>
     </w:p>
@@ -1052,7 +1143,39 @@
           <w:sz w:val="16"/>
           <w:szCs w:val="16"/>
         </w:rPr>
-        <w:t>7085. Clustering among watersheds is evident between principal components 1 and 2 (</w:t>
+        <w:t xml:space="preserve">7085. Clustering among watersheds is evident between principal </w:t>
+      </w:r>
+      <w:commentRangeStart w:id="2"/>
+      <w:commentRangeStart w:id="3"/>
+      <w:r>
+        <w:rPr>
+          <w:rFonts w:ascii="Garamond" w:hAnsi="Garamond"/>
+          <w:sz w:val="16"/>
+          <w:szCs w:val="16"/>
+        </w:rPr>
+        <w:t>components</w:t>
+      </w:r>
+      <w:commentRangeEnd w:id="2"/>
+      <w:r>
+        <w:rPr>
+          <w:rStyle w:val="CommentReference"/>
+        </w:rPr>
+        <w:commentReference w:id="2"/>
+      </w:r>
+      <w:commentRangeEnd w:id="3"/>
+      <w:r>
+        <w:rPr>
+          <w:rStyle w:val="CommentReference"/>
+        </w:rPr>
+        <w:commentReference w:id="3"/>
+      </w:r>
+      <w:r>
+        <w:rPr>
+          <w:rFonts w:ascii="Garamond" w:hAnsi="Garamond"/>
+          <w:sz w:val="16"/>
+          <w:szCs w:val="16"/>
+        </w:rPr>
+        <w:t xml:space="preserve"> 1 and 2 (</w:t>
       </w:r>
       <w:r>
         <w:rPr>
@@ -1256,9 +1379,9 @@
         </w:rPr>
         <w:lastRenderedPageBreak/>
         <w:drawing>
-          <wp:inline distT="0" distB="0" distL="0" distR="0" wp14:anchorId="2F467EF6" wp14:editId="3E009DBF">
-            <wp:extent cx="5943600" cy="2971800"/>
-            <wp:effectExtent l="0" t="0" r="0" b="0"/>
+          <wp:inline distT="0" distB="0" distL="0" distR="0" wp14:anchorId="2F467EF6" wp14:editId="50F178E6">
+            <wp:extent cx="6310860" cy="3155430"/>
+            <wp:effectExtent l="0" t="0" r="1270" b="0"/>
             <wp:docPr id="1963404633" name="Picture 4" descr="A graph of a number of data&#10;&#10;AI-generated content may be incorrect."/>
             <wp:cNvGraphicFramePr>
               <a:graphicFrameLocks xmlns:a="http://schemas.openxmlformats.org/drawingml/2006/main" noChangeAspect="1"/>
@@ -1271,7 +1394,7 @@
                     <pic:cNvPicPr/>
                   </pic:nvPicPr>
                   <pic:blipFill>
-                    <a:blip r:embed="rId17" cstate="print">
+                    <a:blip r:embed="rId16" cstate="print">
                       <a:extLst>
                         <a:ext uri="{28A0092B-C50C-407E-A947-70E740481C1C}">
                           <a14:useLocalDpi xmlns:a14="http://schemas.microsoft.com/office/drawing/2010/main" val="0"/>
@@ -1285,7 +1408,7 @@
                   <pic:spPr>
                     <a:xfrm>
                       <a:off x="0" y="0"/>
-                      <a:ext cx="5943600" cy="2971800"/>
+                      <a:ext cx="6328522" cy="3164261"/>
                     </a:xfrm>
                     <a:prstGeom prst="rect">
                       <a:avLst/>
@@ -1339,7 +1462,23 @@
 
 <file path=word/comments.xml><?xml version="1.0" encoding="utf-8"?>
 <w:comments xmlns:wpc="http://schemas.microsoft.com/office/word/2010/wordprocessingCanvas" xmlns:cx="http://schemas.microsoft.com/office/drawing/2014/chartex" xmlns:cx1="http://schemas.microsoft.com/office/drawing/2015/9/8/chartex" xmlns:cx2="http://schemas.microsoft.com/office/drawing/2015/10/21/chartex" xmlns:cx3="http://schemas.microsoft.com/office/drawing/2016/5/9/chartex" xmlns:cx4="http://schemas.microsoft.com/office/drawing/2016/5/10/chartex" xmlns:cx5="http://schemas.microsoft.com/office/drawing/2016/5/11/chartex" xmlns:cx6="http://schemas.microsoft.com/office/drawing/2016/5/12/chartex" xmlns:cx7="http://schemas.microsoft.com/office/drawing/2016/5/13/chartex" xmlns:cx8="http://schemas.microsoft.com/office/drawing/2016/5/14/chartex" xmlns:mc="http://schemas.openxmlformats.org/markup-compatibility/2006" xmlns:aink="http://schemas.microsoft.com/office/drawing/2016/ink" xmlns:am3d="http://schemas.microsoft.com/office/drawing/2017/model3d" xmlns:o="urn:schemas-microsoft-com:office:office" xmlns:oel="http://schemas.microsoft.com/office/2019/extlst" xmlns:r="http://schemas.openxmlformats.org/officeDocument/2006/relationships" xmlns:m="http://schemas.openxmlformats.org/officeDocument/2006/math" xmlns:v="urn:schemas-microsoft-com:vml" xmlns:wp14="http://schemas.microsoft.com/office/word/2010/wordprocessingDrawing" xmlns:wp="http://schemas.openxmlformats.org/drawingml/2006/wordprocessingDrawing" xmlns:w10="urn:schemas-microsoft-com:office:word" xmlns:w="http://schemas.openxmlformats.org/wordprocessingml/2006/main" xmlns:w14="http://schemas.microsoft.com/office/word/2010/wordml" xmlns:w15="http://schemas.microsoft.com/office/word/2012/wordml" xmlns:w16cex="http://schemas.microsoft.com/office/word/2018/wordml/cex" xmlns:w16cid="http://schemas.microsoft.com/office/word/2016/wordml/cid" xmlns:w16="http://schemas.microsoft.com/office/word/2018/wordml" xmlns:w16du="http://schemas.microsoft.com/office/word/2023/wordml/word16du" xmlns:w16sdtdh="http://schemas.microsoft.com/office/word/2020/wordml/sdtdatahash" xmlns:w16sdtfl="http://schemas.microsoft.com/office/word/2024/wordml/sdtformatlock" xmlns:w16se="http://schemas.microsoft.com/office/word/2015/wordml/symex" xmlns:wpg="http://schemas.microsoft.com/office/word/2010/wordprocessingGroup" xmlns:wpi="http://schemas.microsoft.com/office/word/2010/wordprocessingInk" xmlns:wne="http://schemas.microsoft.com/office/word/2006/wordml" xmlns:wps="http://schemas.microsoft.com/office/word/2010/wordprocessingShape" mc:Ignorable="w14 w15 w16se w16cid w16 w16cex w16sdtdh w16sdtfl w16du wp14">
-  <w:comment w:id="0" w:author="Benjamin J. Makhlouf" w:date="2025-09-07T14:23:00Z" w:initials="b">
+  <w:comment w:id="0" w:author="Daniel Schindler" w:date="2025-10-06T11:08:00Z" w:initials="DS">
+    <w:p>
+      <w:pPr>
+        <w:pStyle w:val="CommentText"/>
+      </w:pPr>
+      <w:r>
+        <w:rPr>
+          <w:rStyle w:val="CommentReference"/>
+        </w:rPr>
+        <w:annotationRef/>
+      </w:r>
+      <w:r>
+        <w:t>Beautiful, but fonts are pretty small</w:t>
+      </w:r>
+    </w:p>
+  </w:comment>
+  <w:comment w:id="1" w:author="Benjamin J. Makhlouf" w:date="2025-09-07T14:23:00Z" w:initials="b">
     <w:p>
       <w:r>
         <w:rPr>
@@ -1356,8 +1495,11 @@
       </w:r>
     </w:p>
   </w:comment>
-  <w:comment w:id="1" w:author="bmak29" w:date="2025-09-07T15:55:00Z" w:initials="b">
-    <w:p>
+  <w:comment w:id="2" w:author="Daniel Schindler" w:date="2025-10-06T11:10:00Z" w:initials="DS">
+    <w:p>
+      <w:pPr>
+        <w:pStyle w:val="CommentText"/>
+      </w:pPr>
       <w:r>
         <w:rPr>
           <w:rStyle w:val="CommentReference"/>
@@ -1365,11 +1507,23 @@
         <w:annotationRef/>
       </w:r>
       <w:r>
-        <w:rPr>
-          <w:sz w:val="20"/>
-          <w:szCs w:val="20"/>
-        </w:rPr>
-        <w:t>Thoughts on adding this to the above figure. This is ONLY the CWAK individuals. The only real difference is removing Middle+ Upper Yukon individuals leading to a pretty small sample size for Yukon</w:t>
+        <w:t>This is a cool result which is not particularly well highlighted in the Discussion. Might want to think about how to highlight these results more.</w:t>
+      </w:r>
+    </w:p>
+  </w:comment>
+  <w:comment w:id="3" w:author="Daniel Schindler" w:date="2025-10-06T11:10:00Z" w:initials="DS">
+    <w:p>
+      <w:pPr>
+        <w:pStyle w:val="CommentText"/>
+      </w:pPr>
+      <w:r>
+        <w:rPr>
+          <w:rStyle w:val="CommentReference"/>
+        </w:rPr>
+        <w:annotationRef/>
+      </w:r>
+      <w:r>
+        <w:t>Fonts are very small</w:t>
       </w:r>
     </w:p>
   </w:comment>
@@ -1378,31 +1532,37 @@
 
 <file path=word/commentsExtended.xml><?xml version="1.0" encoding="utf-8"?>
 <w15:commentsEx xmlns:wpc="http://schemas.microsoft.com/office/word/2010/wordprocessingCanvas" xmlns:cx="http://schemas.microsoft.com/office/drawing/2014/chartex" xmlns:cx1="http://schemas.microsoft.com/office/drawing/2015/9/8/chartex" xmlns:cx2="http://schemas.microsoft.com/office/drawing/2015/10/21/chartex" xmlns:cx3="http://schemas.microsoft.com/office/drawing/2016/5/9/chartex" xmlns:cx4="http://schemas.microsoft.com/office/drawing/2016/5/10/chartex" xmlns:cx5="http://schemas.microsoft.com/office/drawing/2016/5/11/chartex" xmlns:cx6="http://schemas.microsoft.com/office/drawing/2016/5/12/chartex" xmlns:cx7="http://schemas.microsoft.com/office/drawing/2016/5/13/chartex" xmlns:cx8="http://schemas.microsoft.com/office/drawing/2016/5/14/chartex" xmlns:mc="http://schemas.openxmlformats.org/markup-compatibility/2006" xmlns:aink="http://schemas.microsoft.com/office/drawing/2016/ink" xmlns:am3d="http://schemas.microsoft.com/office/drawing/2017/model3d" xmlns:o="urn:schemas-microsoft-com:office:office" xmlns:oel="http://schemas.microsoft.com/office/2019/extlst" xmlns:r="http://schemas.openxmlformats.org/officeDocument/2006/relationships" xmlns:m="http://schemas.openxmlformats.org/officeDocument/2006/math" xmlns:v="urn:schemas-microsoft-com:vml" xmlns:wp14="http://schemas.microsoft.com/office/word/2010/wordprocessingDrawing" xmlns:wp="http://schemas.openxmlformats.org/drawingml/2006/wordprocessingDrawing" xmlns:w10="urn:schemas-microsoft-com:office:word" xmlns:w="http://schemas.openxmlformats.org/wordprocessingml/2006/main" xmlns:w14="http://schemas.microsoft.com/office/word/2010/wordml" xmlns:w15="http://schemas.microsoft.com/office/word/2012/wordml" xmlns:w16cex="http://schemas.microsoft.com/office/word/2018/wordml/cex" xmlns:w16cid="http://schemas.microsoft.com/office/word/2016/wordml/cid" xmlns:w16="http://schemas.microsoft.com/office/word/2018/wordml" xmlns:w16du="http://schemas.microsoft.com/office/word/2023/wordml/word16du" xmlns:w16sdtdh="http://schemas.microsoft.com/office/word/2020/wordml/sdtdatahash" xmlns:w16sdtfl="http://schemas.microsoft.com/office/word/2024/wordml/sdtformatlock" xmlns:w16se="http://schemas.microsoft.com/office/word/2015/wordml/symex" xmlns:wpg="http://schemas.microsoft.com/office/word/2010/wordprocessingGroup" xmlns:wpi="http://schemas.microsoft.com/office/word/2010/wordprocessingInk" xmlns:wne="http://schemas.microsoft.com/office/word/2006/wordml" xmlns:wps="http://schemas.microsoft.com/office/word/2010/wordprocessingShape" mc:Ignorable="w14 w15 w16se w16cid w16 w16cex w16sdtdh w16sdtfl w16du wp14">
-  <w15:commentEx w15:paraId="215C4347" w15:done="0"/>
-  <w15:commentEx w15:paraId="78A346C0" w15:done="0"/>
+  <w15:commentEx w15:paraId="384C15B7" w15:done="0"/>
+  <w15:commentEx w15:paraId="215C4347" w15:done="1"/>
+  <w15:commentEx w15:paraId="0DD29C92" w15:done="0"/>
+  <w15:commentEx w15:paraId="40117E77" w15:paraIdParent="0DD29C92" w15:done="0"/>
 </w15:commentsEx>
 </file>
 
 <file path=word/commentsExtensible.xml><?xml version="1.0" encoding="utf-8"?>
 <w16cex:commentsExtensible xmlns:wpc="http://schemas.microsoft.com/office/word/2010/wordprocessingCanvas" xmlns:cx="http://schemas.microsoft.com/office/drawing/2014/chartex" xmlns:cx1="http://schemas.microsoft.com/office/drawing/2015/9/8/chartex" xmlns:cx2="http://schemas.microsoft.com/office/drawing/2015/10/21/chartex" xmlns:cx3="http://schemas.microsoft.com/office/drawing/2016/5/9/chartex" xmlns:cx4="http://schemas.microsoft.com/office/drawing/2016/5/10/chartex" xmlns:cx5="http://schemas.microsoft.com/office/drawing/2016/5/11/chartex" xmlns:cx6="http://schemas.microsoft.com/office/drawing/2016/5/12/chartex" xmlns:cx7="http://schemas.microsoft.com/office/drawing/2016/5/13/chartex" xmlns:cx8="http://schemas.microsoft.com/office/drawing/2016/5/14/chartex" xmlns:cr="http://schemas.microsoft.com/office/comments/2020/reactions" xmlns:mc="http://schemas.openxmlformats.org/markup-compatibility/2006" xmlns:aink="http://schemas.microsoft.com/office/drawing/2016/ink" xmlns:am3d="http://schemas.microsoft.com/office/drawing/2017/model3d" xmlns:o="urn:schemas-microsoft-com:office:office" xmlns:oel="http://schemas.microsoft.com/office/2019/extlst" xmlns:r="http://schemas.openxmlformats.org/officeDocument/2006/relationships" xmlns:m="http://schemas.openxmlformats.org/officeDocument/2006/math" xmlns:v="urn:schemas-microsoft-com:vml" xmlns:wp14="http://schemas.microsoft.com/office/word/2010/wordprocessingDrawing" xmlns:wp="http://schemas.openxmlformats.org/drawingml/2006/wordprocessingDrawing" xmlns:w10="urn:schemas-microsoft-com:office:word" xmlns:w="http://schemas.openxmlformats.org/wordprocessingml/2006/main" xmlns:w14="http://schemas.microsoft.com/office/word/2010/wordml" xmlns:w15="http://schemas.microsoft.com/office/word/2012/wordml" xmlns:w16cex="http://schemas.microsoft.com/office/word/2018/wordml/cex" xmlns:w16cid="http://schemas.microsoft.com/office/word/2016/wordml/cid" xmlns:w16="http://schemas.microsoft.com/office/word/2018/wordml" xmlns:w16du="http://schemas.microsoft.com/office/word/2023/wordml/word16du" xmlns:w16sdtdh="http://schemas.microsoft.com/office/word/2020/wordml/sdtdatahash" xmlns:w16sdtfl="http://schemas.microsoft.com/office/word/2024/wordml/sdtformatlock" xmlns:w16se="http://schemas.microsoft.com/office/word/2015/wordml/symex" xmlns:wpg="http://schemas.microsoft.com/office/word/2010/wordprocessingGroup" xmlns:wpi="http://schemas.microsoft.com/office/word/2010/wordprocessingInk" xmlns:wne="http://schemas.microsoft.com/office/word/2006/wordml" xmlns:wps="http://schemas.microsoft.com/office/word/2010/wordprocessingShape" mc:Ignorable="w14 w15 w16se w16cid w16 w16cex w16sdtdh w16sdtfl cr w16du wp14">
+  <w16cex:commentExtensible w16cex:durableId="5B790A68" w16cex:dateUtc="2025-10-06T18:08:00Z"/>
   <w16cex:commentExtensible w16cex:durableId="282C9BDF" w16cex:dateUtc="2025-09-07T21:23:00Z"/>
-  <w16cex:commentExtensible w16cex:durableId="52D97608" w16cex:dateUtc="2025-09-07T22:55:00Z"/>
+  <w16cex:commentExtensible w16cex:durableId="11D61FD6" w16cex:dateUtc="2025-10-06T18:10:00Z"/>
+  <w16cex:commentExtensible w16cex:durableId="7531CF4E" w16cex:dateUtc="2025-10-06T18:10:00Z"/>
 </w16cex:commentsExtensible>
 </file>
 
 <file path=word/commentsIds.xml><?xml version="1.0" encoding="utf-8"?>
 <w16cid:commentsIds xmlns:wpc="http://schemas.microsoft.com/office/word/2010/wordprocessingCanvas" xmlns:cx="http://schemas.microsoft.com/office/drawing/2014/chartex" xmlns:cx1="http://schemas.microsoft.com/office/drawing/2015/9/8/chartex" xmlns:cx2="http://schemas.microsoft.com/office/drawing/2015/10/21/chartex" xmlns:cx3="http://schemas.microsoft.com/office/drawing/2016/5/9/chartex" xmlns:cx4="http://schemas.microsoft.com/office/drawing/2016/5/10/chartex" xmlns:cx5="http://schemas.microsoft.com/office/drawing/2016/5/11/chartex" xmlns:cx6="http://schemas.microsoft.com/office/drawing/2016/5/12/chartex" xmlns:cx7="http://schemas.microsoft.com/office/drawing/2016/5/13/chartex" xmlns:cx8="http://schemas.microsoft.com/office/drawing/2016/5/14/chartex" xmlns:mc="http://schemas.openxmlformats.org/markup-compatibility/2006" xmlns:aink="http://schemas.microsoft.com/office/drawing/2016/ink" xmlns:am3d="http://schemas.microsoft.com/office/drawing/2017/model3d" xmlns:o="urn:schemas-microsoft-com:office:office" xmlns:oel="http://schemas.microsoft.com/office/2019/extlst" xmlns:r="http://schemas.openxmlformats.org/officeDocument/2006/relationships" xmlns:m="http://schemas.openxmlformats.org/officeDocument/2006/math" xmlns:v="urn:schemas-microsoft-com:vml" xmlns:wp14="http://schemas.microsoft.com/office/word/2010/wordprocessingDrawing" xmlns:wp="http://schemas.openxmlformats.org/drawingml/2006/wordprocessingDrawing" xmlns:w10="urn:schemas-microsoft-com:office:word" xmlns:w="http://schemas.openxmlformats.org/wordprocessingml/2006/main" xmlns:w14="http://schemas.microsoft.com/office/word/2010/wordml" xmlns:w15="http://schemas.microsoft.com/office/word/2012/wordml" xmlns:w16cex="http://schemas.microsoft.com/office/word/2018/wordml/cex" xmlns:w16cid="http://schemas.microsoft.com/office/word/2016/wordml/cid" xmlns:w16="http://schemas.microsoft.com/office/word/2018/wordml" xmlns:w16du="http://schemas.microsoft.com/office/word/2023/wordml/word16du" xmlns:w16sdtdh="http://schemas.microsoft.com/office/word/2020/wordml/sdtdatahash" xmlns:w16sdtfl="http://schemas.microsoft.com/office/word/2024/wordml/sdtformatlock" xmlns:w16se="http://schemas.microsoft.com/office/word/2015/wordml/symex" xmlns:wpg="http://schemas.microsoft.com/office/word/2010/wordprocessingGroup" xmlns:wpi="http://schemas.microsoft.com/office/word/2010/wordprocessingInk" xmlns:wne="http://schemas.microsoft.com/office/word/2006/wordml" xmlns:wps="http://schemas.microsoft.com/office/word/2010/wordprocessingShape" mc:Ignorable="w14 w15 w16se w16cid w16 w16cex w16sdtdh w16sdtfl w16du wp14">
+  <w16cid:commentId w16cid:paraId="384C15B7" w16cid:durableId="5B790A68"/>
   <w16cid:commentId w16cid:paraId="215C4347" w16cid:durableId="282C9BDF"/>
-  <w16cid:commentId w16cid:paraId="78A346C0" w16cid:durableId="52D97608"/>
+  <w16cid:commentId w16cid:paraId="0DD29C92" w16cid:durableId="11D61FD6"/>
+  <w16cid:commentId w16cid:paraId="40117E77" w16cid:durableId="7531CF4E"/>
 </w16cid:commentsIds>
 </file>
 
 <file path=word/people.xml><?xml version="1.0" encoding="utf-8"?>
 <w15:people xmlns:wpc="http://schemas.microsoft.com/office/word/2010/wordprocessingCanvas" xmlns:cx="http://schemas.microsoft.com/office/drawing/2014/chartex" xmlns:cx1="http://schemas.microsoft.com/office/drawing/2015/9/8/chartex" xmlns:cx2="http://schemas.microsoft.com/office/drawing/2015/10/21/chartex" xmlns:cx3="http://schemas.microsoft.com/office/drawing/2016/5/9/chartex" xmlns:cx4="http://schemas.microsoft.com/office/drawing/2016/5/10/chartex" xmlns:cx5="http://schemas.microsoft.com/office/drawing/2016/5/11/chartex" xmlns:cx6="http://schemas.microsoft.com/office/drawing/2016/5/12/chartex" xmlns:cx7="http://schemas.microsoft.com/office/drawing/2016/5/13/chartex" xmlns:cx8="http://schemas.microsoft.com/office/drawing/2016/5/14/chartex" xmlns:mc="http://schemas.openxmlformats.org/markup-compatibility/2006" xmlns:aink="http://schemas.microsoft.com/office/drawing/2016/ink" xmlns:am3d="http://schemas.microsoft.com/office/drawing/2017/model3d" xmlns:o="urn:schemas-microsoft-com:office:office" xmlns:oel="http://schemas.microsoft.com/office/2019/extlst" xmlns:r="http://schemas.openxmlformats.org/officeDocument/2006/relationships" xmlns:m="http://schemas.openxmlformats.org/officeDocument/2006/math" xmlns:v="urn:schemas-microsoft-com:vml" xmlns:wp14="http://schemas.microsoft.com/office/word/2010/wordprocessingDrawing" xmlns:wp="http://schemas.openxmlformats.org/drawingml/2006/wordprocessingDrawing" xmlns:w10="urn:schemas-microsoft-com:office:word" xmlns:w="http://schemas.openxmlformats.org/wordprocessingml/2006/main" xmlns:w14="http://schemas.microsoft.com/office/word/2010/wordml" xmlns:w15="http://schemas.microsoft.com/office/word/2012/wordml" xmlns:w16cex="http://schemas.microsoft.com/office/word/2018/wordml/cex" xmlns:w16cid="http://schemas.microsoft.com/office/word/2016/wordml/cid" xmlns:w16="http://schemas.microsoft.com/office/word/2018/wordml" xmlns:w16du="http://schemas.microsoft.com/office/word/2023/wordml/word16du" xmlns:w16sdtdh="http://schemas.microsoft.com/office/word/2020/wordml/sdtdatahash" xmlns:w16sdtfl="http://schemas.microsoft.com/office/word/2024/wordml/sdtformatlock" xmlns:w16se="http://schemas.microsoft.com/office/word/2015/wordml/symex" xmlns:wpg="http://schemas.microsoft.com/office/word/2010/wordprocessingGroup" xmlns:wpi="http://schemas.microsoft.com/office/word/2010/wordprocessingInk" xmlns:wne="http://schemas.microsoft.com/office/word/2006/wordml" xmlns:wps="http://schemas.microsoft.com/office/word/2010/wordprocessingShape" mc:Ignorable="w14 w15 w16se w16cid w16 w16cex w16sdtdh w16sdtfl w16du wp14">
+  <w15:person w15:author="Daniel Schindler">
+    <w15:presenceInfo w15:providerId="AD" w15:userId="S::deschind@uw.edu::638f7977-a89c-40df-b85e-dc804ddb30d9"/>
+  </w15:person>
   <w15:person w15:author="Benjamin J. Makhlouf">
-    <w15:presenceInfo w15:providerId="AD" w15:userId="S::bmak29@uw.edu::e2d819b1-db99-41fc-888c-ad60b4d561ad"/>
-  </w15:person>
-  <w15:person w15:author="bmak29">
     <w15:presenceInfo w15:providerId="AD" w15:userId="S::bmak29@uw.edu::e2d819b1-db99-41fc-888c-ad60b4d561ad"/>
   </w15:person>
 </w15:people>
@@ -2342,7 +2502,6 @@
     <w:basedOn w:val="Normal"/>
     <w:link w:val="CommentTextChar"/>
     <w:uiPriority w:val="99"/>
-    <w:semiHidden/>
     <w:unhideWhenUsed/>
     <w:rsid w:val="00ED1482"/>
     <w:pPr>
@@ -2358,7 +2517,6 @@
     <w:basedOn w:val="DefaultParagraphFont"/>
     <w:link w:val="CommentText"/>
     <w:uiPriority w:val="99"/>
-    <w:semiHidden/>
     <w:rsid w:val="00ED1482"/>
     <w:rPr>
       <w:sz w:val="20"/>

</xml_diff>

<commit_message>
added combined isoscape but still needs work
</commit_message>
<xml_diff>
--- a/Docs/FIGURES Machine learning applied to otolith timeseries data to discriminate river of origin for Western Alaska Salmon.docx
+++ b/Docs/FIGURES Machine learning applied to otolith timeseries data to discriminate river of origin for Western Alaska Salmon.docx
@@ -5,9 +5,7 @@
     <w:p>
       <w:pPr>
         <w:rPr>
-          <w:rFonts w:ascii="Garamond" w:hAnsi="Garamond"/>
-          <w:sz w:val="16"/>
-          <w:szCs w:val="16"/>
+          <w:rStyle w:val="CommentReference"/>
         </w:rPr>
       </w:pPr>
       <w:r>
@@ -17,18 +15,10 @@
           <w:szCs w:val="16"/>
         </w:rPr>
         <w:drawing>
-          <wp:anchor distT="0" distB="0" distL="114300" distR="114300" simplePos="0" relativeHeight="251661312" behindDoc="0" locked="0" layoutInCell="1" allowOverlap="1" wp14:anchorId="4E9C1264" wp14:editId="79A8489E">
-            <wp:simplePos x="0" y="0"/>
-            <wp:positionH relativeFrom="column">
-              <wp:posOffset>0</wp:posOffset>
-            </wp:positionH>
-            <wp:positionV relativeFrom="paragraph">
-              <wp:posOffset>164465</wp:posOffset>
-            </wp:positionV>
-            <wp:extent cx="4107180" cy="3173730"/>
-            <wp:effectExtent l="0" t="0" r="0" b="1270"/>
-            <wp:wrapSquare wrapText="bothSides"/>
-            <wp:docPr id="1440452750" name="Picture 4"/>
+          <wp:inline distT="0" distB="0" distL="0" distR="0" wp14:anchorId="0A90718B" wp14:editId="22C78535">
+            <wp:extent cx="4106948" cy="6347012"/>
+            <wp:effectExtent l="0" t="0" r="0" b="3175"/>
+            <wp:docPr id="1571264764" name="Picture 1" descr="A screenshot of a map&#10;&#10;AI-generated content may be incorrect."/>
             <wp:cNvGraphicFramePr>
               <a:graphicFrameLocks xmlns:a="http://schemas.openxmlformats.org/drawingml/2006/main" noChangeAspect="1"/>
             </wp:cNvGraphicFramePr>
@@ -36,11 +26,17 @@
               <a:graphicData uri="http://schemas.openxmlformats.org/drawingml/2006/picture">
                 <pic:pic xmlns:pic="http://schemas.openxmlformats.org/drawingml/2006/picture">
                   <pic:nvPicPr>
-                    <pic:cNvPr id="1440452750" name="Picture 1440452750"/>
+                    <pic:cNvPr id="1571264764" name="Picture 1" descr="A screenshot of a map&#10;&#10;AI-generated content may be incorrect."/>
                     <pic:cNvPicPr/>
                   </pic:nvPicPr>
                   <pic:blipFill>
-                    <a:blip r:embed="rId4"/>
+                    <a:blip r:embed="rId4" cstate="print">
+                      <a:extLst>
+                        <a:ext uri="{28A0092B-C50C-407E-A947-70E740481C1C}">
+                          <a14:useLocalDpi xmlns:a14="http://schemas.microsoft.com/office/drawing/2010/main" val="0"/>
+                        </a:ext>
+                      </a:extLst>
+                    </a:blip>
                     <a:stretch>
                       <a:fillRect/>
                     </a:stretch>
@@ -48,73 +44,7 @@
                   <pic:spPr>
                     <a:xfrm>
                       <a:off x="0" y="0"/>
-                      <a:ext cx="4107180" cy="3173730"/>
-                    </a:xfrm>
-                    <a:prstGeom prst="rect">
-                      <a:avLst/>
-                    </a:prstGeom>
-                  </pic:spPr>
-                </pic:pic>
-              </a:graphicData>
-            </a:graphic>
-            <wp14:sizeRelH relativeFrom="page">
-              <wp14:pctWidth>0</wp14:pctWidth>
-            </wp14:sizeRelH>
-            <wp14:sizeRelV relativeFrom="page">
-              <wp14:pctHeight>0</wp14:pctHeight>
-            </wp14:sizeRelV>
-          </wp:anchor>
-        </w:drawing>
-      </w:r>
-    </w:p>
-    <w:p>
-      <w:pPr>
-        <w:rPr>
-          <w:rFonts w:ascii="Garamond" w:hAnsi="Garamond"/>
-          <w:sz w:val="16"/>
-          <w:szCs w:val="16"/>
-        </w:rPr>
-      </w:pPr>
-      <w:commentRangeStart w:id="0"/>
-      <w:commentRangeEnd w:id="0"/>
-      <w:r>
-        <w:rPr>
-          <w:rStyle w:val="CommentReference"/>
-        </w:rPr>
-        <w:commentReference w:id="0"/>
-      </w:r>
-      <w:r>
-        <w:rPr>
-          <w:rFonts w:ascii="Garamond" w:hAnsi="Garamond"/>
-          <w:noProof/>
-          <w:sz w:val="16"/>
-          <w:szCs w:val="16"/>
-        </w:rPr>
-        <w:drawing>
-          <wp:inline distT="0" distB="0" distL="0" distR="0" wp14:anchorId="5B93EE56" wp14:editId="197CC831">
-            <wp:extent cx="4107180" cy="3173850"/>
-            <wp:effectExtent l="0" t="0" r="0" b="1270"/>
-            <wp:docPr id="1994492973" name="Picture 5"/>
-            <wp:cNvGraphicFramePr>
-              <a:graphicFrameLocks xmlns:a="http://schemas.openxmlformats.org/drawingml/2006/main" noChangeAspect="1"/>
-            </wp:cNvGraphicFramePr>
-            <a:graphic xmlns:a="http://schemas.openxmlformats.org/drawingml/2006/main">
-              <a:graphicData uri="http://schemas.openxmlformats.org/drawingml/2006/picture">
-                <pic:pic xmlns:pic="http://schemas.openxmlformats.org/drawingml/2006/picture">
-                  <pic:nvPicPr>
-                    <pic:cNvPr id="1994492973" name="Picture 1994492973"/>
-                    <pic:cNvPicPr/>
-                  </pic:nvPicPr>
-                  <pic:blipFill>
-                    <a:blip r:embed="rId9"/>
-                    <a:stretch>
-                      <a:fillRect/>
-                    </a:stretch>
-                  </pic:blipFill>
-                  <pic:spPr>
-                    <a:xfrm>
-                      <a:off x="0" y="0"/>
-                      <a:ext cx="4139463" cy="3198797"/>
+                      <a:ext cx="4120734" cy="6368318"/>
                     </a:xfrm>
                     <a:prstGeom prst="rect">
                       <a:avLst/>
@@ -135,7 +65,7 @@
           <w:szCs w:val="16"/>
         </w:rPr>
       </w:pPr>
-      <w:commentRangeStart w:id="1"/>
+      <w:commentRangeStart w:id="0"/>
       <w:r>
         <w:rPr>
           <w:rFonts w:ascii="Garamond" w:hAnsi="Garamond"/>
@@ -216,12 +146,12 @@
         </w:rPr>
         <w:t xml:space="preserve"> to .702). </w:t>
       </w:r>
-      <w:commentRangeEnd w:id="1"/>
+      <w:commentRangeEnd w:id="0"/>
       <w:r>
         <w:rPr>
           <w:rStyle w:val="CommentReference"/>
         </w:rPr>
-        <w:commentReference w:id="1"/>
+        <w:commentReference w:id="0"/>
       </w:r>
     </w:p>
     <w:p>
@@ -280,7 +210,7 @@
                     <pic:cNvPicPr/>
                   </pic:nvPicPr>
                   <pic:blipFill>
-                    <a:blip r:embed="rId10"/>
+                    <a:blip r:embed="rId9"/>
                     <a:stretch>
                       <a:fillRect/>
                     </a:stretch>
@@ -320,7 +250,7 @@
                     <pic:cNvPicPr/>
                   </pic:nvPicPr>
                   <pic:blipFill>
-                    <a:blip r:embed="rId11"/>
+                    <a:blip r:embed="rId10"/>
                     <a:stretch>
                       <a:fillRect/>
                     </a:stretch>
@@ -536,7 +466,7 @@
                     <pic:cNvPicPr/>
                   </pic:nvPicPr>
                   <pic:blipFill>
-                    <a:blip r:embed="rId12"/>
+                    <a:blip r:embed="rId11"/>
                     <a:stretch>
                       <a:fillRect/>
                     </a:stretch>
@@ -686,7 +616,7 @@
         </w:rPr>
         <w:lastRenderedPageBreak/>
         <w:drawing>
-          <wp:anchor distT="0" distB="0" distL="114300" distR="114300" simplePos="0" relativeHeight="251658240" behindDoc="0" locked="0" layoutInCell="1" allowOverlap="1" wp14:anchorId="4608D8C9" wp14:editId="070FAB63">
+          <wp:anchor distT="0" distB="0" distL="114300" distR="114300" simplePos="0" relativeHeight="251658240" behindDoc="0" locked="0" layoutInCell="1" allowOverlap="1" wp14:anchorId="4608D8C9" wp14:editId="158ECFD3">
             <wp:simplePos x="0" y="0"/>
             <wp:positionH relativeFrom="column">
               <wp:posOffset>-225425</wp:posOffset>
@@ -709,7 +639,7 @@
                     <pic:cNvPicPr/>
                   </pic:nvPicPr>
                   <pic:blipFill>
-                    <a:blip r:embed="rId13" cstate="print">
+                    <a:blip r:embed="rId12" cstate="print">
                       <a:extLst>
                         <a:ext uri="{28A0092B-C50C-407E-A947-70E740481C1C}">
                           <a14:useLocalDpi xmlns:a14="http://schemas.microsoft.com/office/drawing/2010/main" val="0"/>
@@ -989,7 +919,7 @@
                     <pic:cNvPicPr/>
                   </pic:nvPicPr>
                   <pic:blipFill>
-                    <a:blip r:embed="rId14"/>
+                    <a:blip r:embed="rId13"/>
                     <a:stretch>
                       <a:fillRect/>
                     </a:stretch>
@@ -1046,7 +976,7 @@
                     <pic:cNvPicPr/>
                   </pic:nvPicPr>
                   <pic:blipFill>
-                    <a:blip r:embed="rId15"/>
+                    <a:blip r:embed="rId14"/>
                     <a:stretch>
                       <a:fillRect/>
                     </a:stretch>
@@ -1145,8 +1075,8 @@
         </w:rPr>
         <w:t xml:space="preserve">7085. Clustering among watersheds is evident between principal </w:t>
       </w:r>
+      <w:commentRangeStart w:id="1"/>
       <w:commentRangeStart w:id="2"/>
-      <w:commentRangeStart w:id="3"/>
       <w:r>
         <w:rPr>
           <w:rFonts w:ascii="Garamond" w:hAnsi="Garamond"/>
@@ -1155,19 +1085,19 @@
         </w:rPr>
         <w:t>components</w:t>
       </w:r>
+      <w:commentRangeEnd w:id="1"/>
+      <w:r>
+        <w:rPr>
+          <w:rStyle w:val="CommentReference"/>
+        </w:rPr>
+        <w:commentReference w:id="1"/>
+      </w:r>
       <w:commentRangeEnd w:id="2"/>
       <w:r>
         <w:rPr>
           <w:rStyle w:val="CommentReference"/>
         </w:rPr>
         <w:commentReference w:id="2"/>
-      </w:r>
-      <w:commentRangeEnd w:id="3"/>
-      <w:r>
-        <w:rPr>
-          <w:rStyle w:val="CommentReference"/>
-        </w:rPr>
-        <w:commentReference w:id="3"/>
       </w:r>
       <w:r>
         <w:rPr>
@@ -1394,7 +1324,7 @@
                     <pic:cNvPicPr/>
                   </pic:nvPicPr>
                   <pic:blipFill>
-                    <a:blip r:embed="rId16" cstate="print">
+                    <a:blip r:embed="rId15" cstate="print">
                       <a:extLst>
                         <a:ext uri="{28A0092B-C50C-407E-A947-70E740481C1C}">
                           <a14:useLocalDpi xmlns:a14="http://schemas.microsoft.com/office/drawing/2010/main" val="0"/>
@@ -1462,23 +1392,7 @@
 
 <file path=word/comments.xml><?xml version="1.0" encoding="utf-8"?>
 <w:comments xmlns:wpc="http://schemas.microsoft.com/office/word/2010/wordprocessingCanvas" xmlns:cx="http://schemas.microsoft.com/office/drawing/2014/chartex" xmlns:cx1="http://schemas.microsoft.com/office/drawing/2015/9/8/chartex" xmlns:cx2="http://schemas.microsoft.com/office/drawing/2015/10/21/chartex" xmlns:cx3="http://schemas.microsoft.com/office/drawing/2016/5/9/chartex" xmlns:cx4="http://schemas.microsoft.com/office/drawing/2016/5/10/chartex" xmlns:cx5="http://schemas.microsoft.com/office/drawing/2016/5/11/chartex" xmlns:cx6="http://schemas.microsoft.com/office/drawing/2016/5/12/chartex" xmlns:cx7="http://schemas.microsoft.com/office/drawing/2016/5/13/chartex" xmlns:cx8="http://schemas.microsoft.com/office/drawing/2016/5/14/chartex" xmlns:mc="http://schemas.openxmlformats.org/markup-compatibility/2006" xmlns:aink="http://schemas.microsoft.com/office/drawing/2016/ink" xmlns:am3d="http://schemas.microsoft.com/office/drawing/2017/model3d" xmlns:o="urn:schemas-microsoft-com:office:office" xmlns:oel="http://schemas.microsoft.com/office/2019/extlst" xmlns:r="http://schemas.openxmlformats.org/officeDocument/2006/relationships" xmlns:m="http://schemas.openxmlformats.org/officeDocument/2006/math" xmlns:v="urn:schemas-microsoft-com:vml" xmlns:wp14="http://schemas.microsoft.com/office/word/2010/wordprocessingDrawing" xmlns:wp="http://schemas.openxmlformats.org/drawingml/2006/wordprocessingDrawing" xmlns:w10="urn:schemas-microsoft-com:office:word" xmlns:w="http://schemas.openxmlformats.org/wordprocessingml/2006/main" xmlns:w14="http://schemas.microsoft.com/office/word/2010/wordml" xmlns:w15="http://schemas.microsoft.com/office/word/2012/wordml" xmlns:w16cex="http://schemas.microsoft.com/office/word/2018/wordml/cex" xmlns:w16cid="http://schemas.microsoft.com/office/word/2016/wordml/cid" xmlns:w16="http://schemas.microsoft.com/office/word/2018/wordml" xmlns:w16du="http://schemas.microsoft.com/office/word/2023/wordml/word16du" xmlns:w16sdtdh="http://schemas.microsoft.com/office/word/2020/wordml/sdtdatahash" xmlns:w16sdtfl="http://schemas.microsoft.com/office/word/2024/wordml/sdtformatlock" xmlns:w16se="http://schemas.microsoft.com/office/word/2015/wordml/symex" xmlns:wpg="http://schemas.microsoft.com/office/word/2010/wordprocessingGroup" xmlns:wpi="http://schemas.microsoft.com/office/word/2010/wordprocessingInk" xmlns:wne="http://schemas.microsoft.com/office/word/2006/wordml" xmlns:wps="http://schemas.microsoft.com/office/word/2010/wordprocessingShape" mc:Ignorable="w14 w15 w16se w16cid w16 w16cex w16sdtdh w16sdtfl w16du wp14">
-  <w:comment w:id="0" w:author="Daniel Schindler" w:date="2025-10-06T11:08:00Z" w:initials="DS">
-    <w:p>
-      <w:pPr>
-        <w:pStyle w:val="CommentText"/>
-      </w:pPr>
-      <w:r>
-        <w:rPr>
-          <w:rStyle w:val="CommentReference"/>
-        </w:rPr>
-        <w:annotationRef/>
-      </w:r>
-      <w:r>
-        <w:t>Beautiful, but fonts are pretty small</w:t>
-      </w:r>
-    </w:p>
-  </w:comment>
-  <w:comment w:id="1" w:author="Benjamin J. Makhlouf" w:date="2025-09-07T14:23:00Z" w:initials="b">
+  <w:comment w:id="0" w:author="Benjamin J. Makhlouf" w:date="2025-09-07T14:23:00Z" w:initials="b">
     <w:p>
       <w:r>
         <w:rPr>
@@ -1495,23 +1409,23 @@
       </w:r>
     </w:p>
   </w:comment>
+  <w:comment w:id="1" w:author="Daniel Schindler" w:date="2025-10-06T11:10:00Z" w:initials="DS">
+    <w:p>
+      <w:pPr>
+        <w:pStyle w:val="CommentText"/>
+      </w:pPr>
+      <w:r>
+        <w:rPr>
+          <w:rStyle w:val="CommentReference"/>
+        </w:rPr>
+        <w:annotationRef/>
+      </w:r>
+      <w:r>
+        <w:t>This is a cool result which is not particularly well highlighted in the Discussion. Might want to think about how to highlight these results more.</w:t>
+      </w:r>
+    </w:p>
+  </w:comment>
   <w:comment w:id="2" w:author="Daniel Schindler" w:date="2025-10-06T11:10:00Z" w:initials="DS">
-    <w:p>
-      <w:pPr>
-        <w:pStyle w:val="CommentText"/>
-      </w:pPr>
-      <w:r>
-        <w:rPr>
-          <w:rStyle w:val="CommentReference"/>
-        </w:rPr>
-        <w:annotationRef/>
-      </w:r>
-      <w:r>
-        <w:t>This is a cool result which is not particularly well highlighted in the Discussion. Might want to think about how to highlight these results more.</w:t>
-      </w:r>
-    </w:p>
-  </w:comment>
-  <w:comment w:id="3" w:author="Daniel Schindler" w:date="2025-10-06T11:10:00Z" w:initials="DS">
     <w:p>
       <w:pPr>
         <w:pStyle w:val="CommentText"/>
@@ -1532,7 +1446,6 @@
 
 <file path=word/commentsExtended.xml><?xml version="1.0" encoding="utf-8"?>
 <w15:commentsEx xmlns:wpc="http://schemas.microsoft.com/office/word/2010/wordprocessingCanvas" xmlns:cx="http://schemas.microsoft.com/office/drawing/2014/chartex" xmlns:cx1="http://schemas.microsoft.com/office/drawing/2015/9/8/chartex" xmlns:cx2="http://schemas.microsoft.com/office/drawing/2015/10/21/chartex" xmlns:cx3="http://schemas.microsoft.com/office/drawing/2016/5/9/chartex" xmlns:cx4="http://schemas.microsoft.com/office/drawing/2016/5/10/chartex" xmlns:cx5="http://schemas.microsoft.com/office/drawing/2016/5/11/chartex" xmlns:cx6="http://schemas.microsoft.com/office/drawing/2016/5/12/chartex" xmlns:cx7="http://schemas.microsoft.com/office/drawing/2016/5/13/chartex" xmlns:cx8="http://schemas.microsoft.com/office/drawing/2016/5/14/chartex" xmlns:mc="http://schemas.openxmlformats.org/markup-compatibility/2006" xmlns:aink="http://schemas.microsoft.com/office/drawing/2016/ink" xmlns:am3d="http://schemas.microsoft.com/office/drawing/2017/model3d" xmlns:o="urn:schemas-microsoft-com:office:office" xmlns:oel="http://schemas.microsoft.com/office/2019/extlst" xmlns:r="http://schemas.openxmlformats.org/officeDocument/2006/relationships" xmlns:m="http://schemas.openxmlformats.org/officeDocument/2006/math" xmlns:v="urn:schemas-microsoft-com:vml" xmlns:wp14="http://schemas.microsoft.com/office/word/2010/wordprocessingDrawing" xmlns:wp="http://schemas.openxmlformats.org/drawingml/2006/wordprocessingDrawing" xmlns:w10="urn:schemas-microsoft-com:office:word" xmlns:w="http://schemas.openxmlformats.org/wordprocessingml/2006/main" xmlns:w14="http://schemas.microsoft.com/office/word/2010/wordml" xmlns:w15="http://schemas.microsoft.com/office/word/2012/wordml" xmlns:w16cex="http://schemas.microsoft.com/office/word/2018/wordml/cex" xmlns:w16cid="http://schemas.microsoft.com/office/word/2016/wordml/cid" xmlns:w16="http://schemas.microsoft.com/office/word/2018/wordml" xmlns:w16du="http://schemas.microsoft.com/office/word/2023/wordml/word16du" xmlns:w16sdtdh="http://schemas.microsoft.com/office/word/2020/wordml/sdtdatahash" xmlns:w16sdtfl="http://schemas.microsoft.com/office/word/2024/wordml/sdtformatlock" xmlns:w16se="http://schemas.microsoft.com/office/word/2015/wordml/symex" xmlns:wpg="http://schemas.microsoft.com/office/word/2010/wordprocessingGroup" xmlns:wpi="http://schemas.microsoft.com/office/word/2010/wordprocessingInk" xmlns:wne="http://schemas.microsoft.com/office/word/2006/wordml" xmlns:wps="http://schemas.microsoft.com/office/word/2010/wordprocessingShape" mc:Ignorable="w14 w15 w16se w16cid w16 w16cex w16sdtdh w16sdtfl w16du wp14">
-  <w15:commentEx w15:paraId="384C15B7" w15:done="0"/>
   <w15:commentEx w15:paraId="215C4347" w15:done="1"/>
   <w15:commentEx w15:paraId="0DD29C92" w15:done="0"/>
   <w15:commentEx w15:paraId="40117E77" w15:paraIdParent="0DD29C92" w15:done="0"/>
@@ -1541,7 +1454,6 @@
 
 <file path=word/commentsExtensible.xml><?xml version="1.0" encoding="utf-8"?>
 <w16cex:commentsExtensible xmlns:wpc="http://schemas.microsoft.com/office/word/2010/wordprocessingCanvas" xmlns:cx="http://schemas.microsoft.com/office/drawing/2014/chartex" xmlns:cx1="http://schemas.microsoft.com/office/drawing/2015/9/8/chartex" xmlns:cx2="http://schemas.microsoft.com/office/drawing/2015/10/21/chartex" xmlns:cx3="http://schemas.microsoft.com/office/drawing/2016/5/9/chartex" xmlns:cx4="http://schemas.microsoft.com/office/drawing/2016/5/10/chartex" xmlns:cx5="http://schemas.microsoft.com/office/drawing/2016/5/11/chartex" xmlns:cx6="http://schemas.microsoft.com/office/drawing/2016/5/12/chartex" xmlns:cx7="http://schemas.microsoft.com/office/drawing/2016/5/13/chartex" xmlns:cx8="http://schemas.microsoft.com/office/drawing/2016/5/14/chartex" xmlns:cr="http://schemas.microsoft.com/office/comments/2020/reactions" xmlns:mc="http://schemas.openxmlformats.org/markup-compatibility/2006" xmlns:aink="http://schemas.microsoft.com/office/drawing/2016/ink" xmlns:am3d="http://schemas.microsoft.com/office/drawing/2017/model3d" xmlns:o="urn:schemas-microsoft-com:office:office" xmlns:oel="http://schemas.microsoft.com/office/2019/extlst" xmlns:r="http://schemas.openxmlformats.org/officeDocument/2006/relationships" xmlns:m="http://schemas.openxmlformats.org/officeDocument/2006/math" xmlns:v="urn:schemas-microsoft-com:vml" xmlns:wp14="http://schemas.microsoft.com/office/word/2010/wordprocessingDrawing" xmlns:wp="http://schemas.openxmlformats.org/drawingml/2006/wordprocessingDrawing" xmlns:w10="urn:schemas-microsoft-com:office:word" xmlns:w="http://schemas.openxmlformats.org/wordprocessingml/2006/main" xmlns:w14="http://schemas.microsoft.com/office/word/2010/wordml" xmlns:w15="http://schemas.microsoft.com/office/word/2012/wordml" xmlns:w16cex="http://schemas.microsoft.com/office/word/2018/wordml/cex" xmlns:w16cid="http://schemas.microsoft.com/office/word/2016/wordml/cid" xmlns:w16="http://schemas.microsoft.com/office/word/2018/wordml" xmlns:w16du="http://schemas.microsoft.com/office/word/2023/wordml/word16du" xmlns:w16sdtdh="http://schemas.microsoft.com/office/word/2020/wordml/sdtdatahash" xmlns:w16sdtfl="http://schemas.microsoft.com/office/word/2024/wordml/sdtformatlock" xmlns:w16se="http://schemas.microsoft.com/office/word/2015/wordml/symex" xmlns:wpg="http://schemas.microsoft.com/office/word/2010/wordprocessingGroup" xmlns:wpi="http://schemas.microsoft.com/office/word/2010/wordprocessingInk" xmlns:wne="http://schemas.microsoft.com/office/word/2006/wordml" xmlns:wps="http://schemas.microsoft.com/office/word/2010/wordprocessingShape" mc:Ignorable="w14 w15 w16se w16cid w16 w16cex w16sdtdh w16sdtfl cr w16du wp14">
-  <w16cex:commentExtensible w16cex:durableId="5B790A68" w16cex:dateUtc="2025-10-06T18:08:00Z"/>
   <w16cex:commentExtensible w16cex:durableId="282C9BDF" w16cex:dateUtc="2025-09-07T21:23:00Z"/>
   <w16cex:commentExtensible w16cex:durableId="11D61FD6" w16cex:dateUtc="2025-10-06T18:10:00Z"/>
   <w16cex:commentExtensible w16cex:durableId="7531CF4E" w16cex:dateUtc="2025-10-06T18:10:00Z"/>
@@ -1550,7 +1462,6 @@
 
 <file path=word/commentsIds.xml><?xml version="1.0" encoding="utf-8"?>
 <w16cid:commentsIds xmlns:wpc="http://schemas.microsoft.com/office/word/2010/wordprocessingCanvas" xmlns:cx="http://schemas.microsoft.com/office/drawing/2014/chartex" xmlns:cx1="http://schemas.microsoft.com/office/drawing/2015/9/8/chartex" xmlns:cx2="http://schemas.microsoft.com/office/drawing/2015/10/21/chartex" xmlns:cx3="http://schemas.microsoft.com/office/drawing/2016/5/9/chartex" xmlns:cx4="http://schemas.microsoft.com/office/drawing/2016/5/10/chartex" xmlns:cx5="http://schemas.microsoft.com/office/drawing/2016/5/11/chartex" xmlns:cx6="http://schemas.microsoft.com/office/drawing/2016/5/12/chartex" xmlns:cx7="http://schemas.microsoft.com/office/drawing/2016/5/13/chartex" xmlns:cx8="http://schemas.microsoft.com/office/drawing/2016/5/14/chartex" xmlns:mc="http://schemas.openxmlformats.org/markup-compatibility/2006" xmlns:aink="http://schemas.microsoft.com/office/drawing/2016/ink" xmlns:am3d="http://schemas.microsoft.com/office/drawing/2017/model3d" xmlns:o="urn:schemas-microsoft-com:office:office" xmlns:oel="http://schemas.microsoft.com/office/2019/extlst" xmlns:r="http://schemas.openxmlformats.org/officeDocument/2006/relationships" xmlns:m="http://schemas.openxmlformats.org/officeDocument/2006/math" xmlns:v="urn:schemas-microsoft-com:vml" xmlns:wp14="http://schemas.microsoft.com/office/word/2010/wordprocessingDrawing" xmlns:wp="http://schemas.openxmlformats.org/drawingml/2006/wordprocessingDrawing" xmlns:w10="urn:schemas-microsoft-com:office:word" xmlns:w="http://schemas.openxmlformats.org/wordprocessingml/2006/main" xmlns:w14="http://schemas.microsoft.com/office/word/2010/wordml" xmlns:w15="http://schemas.microsoft.com/office/word/2012/wordml" xmlns:w16cex="http://schemas.microsoft.com/office/word/2018/wordml/cex" xmlns:w16cid="http://schemas.microsoft.com/office/word/2016/wordml/cid" xmlns:w16="http://schemas.microsoft.com/office/word/2018/wordml" xmlns:w16du="http://schemas.microsoft.com/office/word/2023/wordml/word16du" xmlns:w16sdtdh="http://schemas.microsoft.com/office/word/2020/wordml/sdtdatahash" xmlns:w16sdtfl="http://schemas.microsoft.com/office/word/2024/wordml/sdtformatlock" xmlns:w16se="http://schemas.microsoft.com/office/word/2015/wordml/symex" xmlns:wpg="http://schemas.microsoft.com/office/word/2010/wordprocessingGroup" xmlns:wpi="http://schemas.microsoft.com/office/word/2010/wordprocessingInk" xmlns:wne="http://schemas.microsoft.com/office/word/2006/wordml" xmlns:wps="http://schemas.microsoft.com/office/word/2010/wordprocessingShape" mc:Ignorable="w14 w15 w16se w16cid w16 w16cex w16sdtdh w16sdtfl w16du wp14">
-  <w16cid:commentId w16cid:paraId="384C15B7" w16cid:durableId="5B790A68"/>
   <w16cid:commentId w16cid:paraId="215C4347" w16cid:durableId="282C9BDF"/>
   <w16cid:commentId w16cid:paraId="0DD29C92" w16cid:durableId="11D61FD6"/>
   <w16cid:commentId w16cid:paraId="40117E77" w16cid:durableId="7531CF4E"/>
@@ -1559,11 +1470,11 @@
 
 <file path=word/people.xml><?xml version="1.0" encoding="utf-8"?>
 <w15:people xmlns:wpc="http://schemas.microsoft.com/office/word/2010/wordprocessingCanvas" xmlns:cx="http://schemas.microsoft.com/office/drawing/2014/chartex" xmlns:cx1="http://schemas.microsoft.com/office/drawing/2015/9/8/chartex" xmlns:cx2="http://schemas.microsoft.com/office/drawing/2015/10/21/chartex" xmlns:cx3="http://schemas.microsoft.com/office/drawing/2016/5/9/chartex" xmlns:cx4="http://schemas.microsoft.com/office/drawing/2016/5/10/chartex" xmlns:cx5="http://schemas.microsoft.com/office/drawing/2016/5/11/chartex" xmlns:cx6="http://schemas.microsoft.com/office/drawing/2016/5/12/chartex" xmlns:cx7="http://schemas.microsoft.com/office/drawing/2016/5/13/chartex" xmlns:cx8="http://schemas.microsoft.com/office/drawing/2016/5/14/chartex" xmlns:mc="http://schemas.openxmlformats.org/markup-compatibility/2006" xmlns:aink="http://schemas.microsoft.com/office/drawing/2016/ink" xmlns:am3d="http://schemas.microsoft.com/office/drawing/2017/model3d" xmlns:o="urn:schemas-microsoft-com:office:office" xmlns:oel="http://schemas.microsoft.com/office/2019/extlst" xmlns:r="http://schemas.openxmlformats.org/officeDocument/2006/relationships" xmlns:m="http://schemas.openxmlformats.org/officeDocument/2006/math" xmlns:v="urn:schemas-microsoft-com:vml" xmlns:wp14="http://schemas.microsoft.com/office/word/2010/wordprocessingDrawing" xmlns:wp="http://schemas.openxmlformats.org/drawingml/2006/wordprocessingDrawing" xmlns:w10="urn:schemas-microsoft-com:office:word" xmlns:w="http://schemas.openxmlformats.org/wordprocessingml/2006/main" xmlns:w14="http://schemas.microsoft.com/office/word/2010/wordml" xmlns:w15="http://schemas.microsoft.com/office/word/2012/wordml" xmlns:w16cex="http://schemas.microsoft.com/office/word/2018/wordml/cex" xmlns:w16cid="http://schemas.microsoft.com/office/word/2016/wordml/cid" xmlns:w16="http://schemas.microsoft.com/office/word/2018/wordml" xmlns:w16du="http://schemas.microsoft.com/office/word/2023/wordml/word16du" xmlns:w16sdtdh="http://schemas.microsoft.com/office/word/2020/wordml/sdtdatahash" xmlns:w16sdtfl="http://schemas.microsoft.com/office/word/2024/wordml/sdtformatlock" xmlns:w16se="http://schemas.microsoft.com/office/word/2015/wordml/symex" xmlns:wpg="http://schemas.microsoft.com/office/word/2010/wordprocessingGroup" xmlns:wpi="http://schemas.microsoft.com/office/word/2010/wordprocessingInk" xmlns:wne="http://schemas.microsoft.com/office/word/2006/wordml" xmlns:wps="http://schemas.microsoft.com/office/word/2010/wordprocessingShape" mc:Ignorable="w14 w15 w16se w16cid w16 w16cex w16sdtdh w16sdtfl w16du wp14">
+  <w15:person w15:author="Benjamin J. Makhlouf">
+    <w15:presenceInfo w15:providerId="AD" w15:userId="S::bmak29@uw.edu::e2d819b1-db99-41fc-888c-ad60b4d561ad"/>
+  </w15:person>
   <w15:person w15:author="Daniel Schindler">
     <w15:presenceInfo w15:providerId="AD" w15:userId="S::deschind@uw.edu::638f7977-a89c-40df-b85e-dc804ddb30d9"/>
-  </w15:person>
-  <w15:person w15:author="Benjamin J. Makhlouf">
-    <w15:presenceInfo w15:providerId="AD" w15:userId="S::bmak29@uw.edu::e2d819b1-db99-41fc-888c-ad60b4d561ad"/>
   </w15:person>
 </w15:people>
 </file>

</xml_diff>

<commit_message>
added a bunch of figures but need to address the text size problem again
</commit_message>
<xml_diff>
--- a/Docs/FIGURES Machine learning applied to otolith timeseries data to discriminate river of origin for Western Alaska Salmon.docx
+++ b/Docs/FIGURES Machine learning applied to otolith timeseries data to discriminate river of origin for Western Alaska Salmon.docx
@@ -188,17 +188,52 @@
         </w:rPr>
       </w:pPr>
     </w:p>
-    <w:p>
-      <w:r>
-        <w:rPr>
-          <w:noProof/>
-        </w:rPr>
-        <w:lastRenderedPageBreak/>
+    <w:p/>
+    <w:p>
+      <w:pPr>
+        <w:rPr>
+          <w:rFonts w:ascii="Garamond" w:hAnsi="Garamond"/>
+          <w:b/>
+          <w:bCs/>
+          <w:sz w:val="16"/>
+          <w:szCs w:val="16"/>
+        </w:rPr>
+      </w:pPr>
+    </w:p>
+    <w:p>
+      <w:pPr>
+        <w:rPr>
+          <w:rFonts w:ascii="Garamond" w:hAnsi="Garamond"/>
+          <w:b/>
+          <w:bCs/>
+          <w:sz w:val="16"/>
+          <w:szCs w:val="16"/>
+        </w:rPr>
+      </w:pPr>
+    </w:p>
+    <w:p>
+      <w:pPr>
+        <w:rPr>
+          <w:rFonts w:ascii="Garamond" w:hAnsi="Garamond"/>
+          <w:b/>
+          <w:bCs/>
+          <w:sz w:val="16"/>
+          <w:szCs w:val="16"/>
+        </w:rPr>
+      </w:pPr>
+      <w:r>
+        <w:rPr>
+          <w:rFonts w:ascii="Garamond" w:hAnsi="Garamond"/>
+          <w:b/>
+          <w:bCs/>
+          <w:sz w:val="16"/>
+          <w:szCs w:val="16"/>
+        </w:rPr>
         <w:drawing>
-          <wp:inline distT="0" distB="0" distL="0" distR="0" wp14:anchorId="4355DA06" wp14:editId="04D713A8">
-            <wp:extent cx="2896473" cy="1737884"/>
-            <wp:effectExtent l="0" t="0" r="0" b="2540"/>
-            <wp:docPr id="1267323198" name="Picture 3"/>
+          <wp:inline distT="0" distB="0" distL="0" distR="0" wp14:anchorId="0EE2AE9C" wp14:editId="060AFD3D">
+            <wp:extent cx="5943600" cy="2054225"/>
+            <wp:effectExtent l="0" t="0" r="0" b="3175"/>
+            <wp:docPr id="887724946" name="Picture 1" descr="A close-up of a graph&#10;&#10;AI-generated content may be incorrect."/>
             <wp:cNvGraphicFramePr>
               <a:graphicFrameLocks xmlns:a="http://schemas.openxmlformats.org/drawingml/2006/main" noChangeAspect="1"/>
             </wp:cNvGraphicFramePr>
@@ -206,7 +241,7 @@
               <a:graphicData uri="http://schemas.openxmlformats.org/drawingml/2006/picture">
                 <pic:pic xmlns:pic="http://schemas.openxmlformats.org/drawingml/2006/picture">
                   <pic:nvPicPr>
-                    <pic:cNvPr id="1267323198" name="Picture 1267323198"/>
+                    <pic:cNvPr id="887724946" name="Picture 1" descr="A close-up of a graph&#10;&#10;AI-generated content may be incorrect."/>
                     <pic:cNvPicPr/>
                   </pic:nvPicPr>
                   <pic:blipFill>
@@ -218,47 +253,7 @@
                   <pic:spPr>
                     <a:xfrm>
                       <a:off x="0" y="0"/>
-                      <a:ext cx="3006459" cy="1803876"/>
-                    </a:xfrm>
-                    <a:prstGeom prst="rect">
-                      <a:avLst/>
-                    </a:prstGeom>
-                  </pic:spPr>
-                </pic:pic>
-              </a:graphicData>
-            </a:graphic>
-          </wp:inline>
-        </w:drawing>
-      </w:r>
-      <w:r>
-        <w:rPr>
-          <w:noProof/>
-        </w:rPr>
-        <w:drawing>
-          <wp:inline distT="0" distB="0" distL="0" distR="0" wp14:anchorId="14BA03D8" wp14:editId="01DBB5AF">
-            <wp:extent cx="2985025" cy="1791014"/>
-            <wp:effectExtent l="0" t="0" r="0" b="0"/>
-            <wp:docPr id="1111418691" name="Picture 4"/>
-            <wp:cNvGraphicFramePr>
-              <a:graphicFrameLocks xmlns:a="http://schemas.openxmlformats.org/drawingml/2006/main" noChangeAspect="1"/>
-            </wp:cNvGraphicFramePr>
-            <a:graphic xmlns:a="http://schemas.openxmlformats.org/drawingml/2006/main">
-              <a:graphicData uri="http://schemas.openxmlformats.org/drawingml/2006/picture">
-                <pic:pic xmlns:pic="http://schemas.openxmlformats.org/drawingml/2006/picture">
-                  <pic:nvPicPr>
-                    <pic:cNvPr id="1111418691" name="Picture 1111418691"/>
-                    <pic:cNvPicPr/>
-                  </pic:nvPicPr>
-                  <pic:blipFill>
-                    <a:blip r:embed="rId10"/>
-                    <a:stretch>
-                      <a:fillRect/>
-                    </a:stretch>
-                  </pic:blipFill>
-                  <pic:spPr>
-                    <a:xfrm>
-                      <a:off x="0" y="0"/>
-                      <a:ext cx="3081379" cy="1848826"/>
+                      <a:ext cx="5943600" cy="2054225"/>
                     </a:xfrm>
                     <a:prstGeom prst="rect">
                       <a:avLst/>
@@ -466,7 +461,7 @@
                     <pic:cNvPicPr/>
                   </pic:nvPicPr>
                   <pic:blipFill>
-                    <a:blip r:embed="rId11"/>
+                    <a:blip r:embed="rId10"/>
                     <a:stretch>
                       <a:fillRect/>
                     </a:stretch>
@@ -639,7 +634,7 @@
                     <pic:cNvPicPr/>
                   </pic:nvPicPr>
                   <pic:blipFill>
-                    <a:blip r:embed="rId12" cstate="print">
+                    <a:blip r:embed="rId11" cstate="print">
                       <a:extLst>
                         <a:ext uri="{28A0092B-C50C-407E-A947-70E740481C1C}">
                           <a14:useLocalDpi xmlns:a14="http://schemas.microsoft.com/office/drawing/2010/main" val="0"/>
@@ -896,18 +891,10 @@
         </w:rPr>
         <w:lastRenderedPageBreak/>
         <w:drawing>
-          <wp:anchor distT="0" distB="0" distL="114300" distR="114300" simplePos="0" relativeHeight="251659264" behindDoc="0" locked="0" layoutInCell="1" allowOverlap="1" wp14:anchorId="30DF671A" wp14:editId="47E36F8F">
-            <wp:simplePos x="0" y="0"/>
-            <wp:positionH relativeFrom="column">
-              <wp:posOffset>1741170</wp:posOffset>
-            </wp:positionH>
-            <wp:positionV relativeFrom="paragraph">
-              <wp:posOffset>46299</wp:posOffset>
-            </wp:positionV>
-            <wp:extent cx="4656455" cy="3492500"/>
-            <wp:effectExtent l="0" t="0" r="4445" b="0"/>
-            <wp:wrapSquare wrapText="bothSides"/>
-            <wp:docPr id="1678162362" name="Picture 3"/>
+          <wp:inline distT="0" distB="0" distL="0" distR="0" wp14:anchorId="554AA946" wp14:editId="2CB59143">
+            <wp:extent cx="5943600" cy="3035300"/>
+            <wp:effectExtent l="0" t="0" r="0" b="0"/>
+            <wp:docPr id="219536095" name="Picture 2" descr="A group of graphs showing different types of data&#10;&#10;AI-generated content may be incorrect."/>
             <wp:cNvGraphicFramePr>
               <a:graphicFrameLocks xmlns:a="http://schemas.openxmlformats.org/drawingml/2006/main" noChangeAspect="1"/>
             </wp:cNvGraphicFramePr>
@@ -915,11 +902,17 @@
               <a:graphicData uri="http://schemas.openxmlformats.org/drawingml/2006/picture">
                 <pic:pic xmlns:pic="http://schemas.openxmlformats.org/drawingml/2006/picture">
                   <pic:nvPicPr>
-                    <pic:cNvPr id="1678162362" name="Picture 1678162362"/>
+                    <pic:cNvPr id="219536095" name="Picture 2" descr="A group of graphs showing different types of data&#10;&#10;AI-generated content may be incorrect."/>
                     <pic:cNvPicPr/>
                   </pic:nvPicPr>
                   <pic:blipFill>
-                    <a:blip r:embed="rId13"/>
+                    <a:blip r:embed="rId12" cstate="print">
+                      <a:extLst>
+                        <a:ext uri="{28A0092B-C50C-407E-A947-70E740481C1C}">
+                          <a14:useLocalDpi xmlns:a14="http://schemas.microsoft.com/office/drawing/2010/main" val="0"/>
+                        </a:ext>
+                      </a:extLst>
+                    </a:blip>
                     <a:stretch>
                       <a:fillRect/>
                     </a:stretch>
@@ -927,7 +920,7 @@
                   <pic:spPr>
                     <a:xfrm>
                       <a:off x="0" y="0"/>
-                      <a:ext cx="4656455" cy="3492500"/>
+                      <a:ext cx="5943600" cy="3035300"/>
                     </a:xfrm>
                     <a:prstGeom prst="rect">
                       <a:avLst/>
@@ -936,70 +929,7 @@
                 </pic:pic>
               </a:graphicData>
             </a:graphic>
-            <wp14:sizeRelH relativeFrom="page">
-              <wp14:pctWidth>0</wp14:pctWidth>
-            </wp14:sizeRelH>
-            <wp14:sizeRelV relativeFrom="page">
-              <wp14:pctHeight>0</wp14:pctHeight>
-            </wp14:sizeRelV>
-          </wp:anchor>
-        </w:drawing>
-      </w:r>
-      <w:r>
-        <w:rPr>
-          <w:rFonts w:ascii="Garamond" w:hAnsi="Garamond"/>
-          <w:noProof/>
-          <w:sz w:val="16"/>
-          <w:szCs w:val="16"/>
-        </w:rPr>
-        <w:drawing>
-          <wp:anchor distT="0" distB="0" distL="114300" distR="114300" simplePos="0" relativeHeight="251660288" behindDoc="0" locked="0" layoutInCell="1" allowOverlap="1" wp14:anchorId="2AA4B8A8" wp14:editId="68D94DA9">
-            <wp:simplePos x="0" y="0"/>
-            <wp:positionH relativeFrom="column">
-              <wp:posOffset>-187325</wp:posOffset>
-            </wp:positionH>
-            <wp:positionV relativeFrom="paragraph">
-              <wp:posOffset>185</wp:posOffset>
-            </wp:positionV>
-            <wp:extent cx="2068830" cy="3394710"/>
-            <wp:effectExtent l="0" t="0" r="1270" b="0"/>
-            <wp:wrapSquare wrapText="bothSides"/>
-            <wp:docPr id="661460792" name="Picture 2"/>
-            <wp:cNvGraphicFramePr>
-              <a:graphicFrameLocks xmlns:a="http://schemas.openxmlformats.org/drawingml/2006/main" noChangeAspect="1"/>
-            </wp:cNvGraphicFramePr>
-            <a:graphic xmlns:a="http://schemas.openxmlformats.org/drawingml/2006/main">
-              <a:graphicData uri="http://schemas.openxmlformats.org/drawingml/2006/picture">
-                <pic:pic xmlns:pic="http://schemas.openxmlformats.org/drawingml/2006/picture">
-                  <pic:nvPicPr>
-                    <pic:cNvPr id="661460792" name="Picture 661460792"/>
-                    <pic:cNvPicPr/>
-                  </pic:nvPicPr>
-                  <pic:blipFill>
-                    <a:blip r:embed="rId14"/>
-                    <a:stretch>
-                      <a:fillRect/>
-                    </a:stretch>
-                  </pic:blipFill>
-                  <pic:spPr>
-                    <a:xfrm>
-                      <a:off x="0" y="0"/>
-                      <a:ext cx="2068830" cy="3394710"/>
-                    </a:xfrm>
-                    <a:prstGeom prst="rect">
-                      <a:avLst/>
-                    </a:prstGeom>
-                  </pic:spPr>
-                </pic:pic>
-              </a:graphicData>
-            </a:graphic>
-            <wp14:sizeRelH relativeFrom="page">
-              <wp14:pctWidth>0</wp14:pctWidth>
-            </wp14:sizeRelH>
-            <wp14:sizeRelV relativeFrom="page">
-              <wp14:pctHeight>0</wp14:pctHeight>
-            </wp14:sizeRelV>
-          </wp:anchor>
+          </wp:inline>
         </w:drawing>
       </w:r>
     </w:p>
@@ -1324,7 +1254,7 @@
                     <pic:cNvPicPr/>
                   </pic:nvPicPr>
                   <pic:blipFill>
-                    <a:blip r:embed="rId15" cstate="print">
+                    <a:blip r:embed="rId13" cstate="print">
                       <a:extLst>
                         <a:ext uri="{28A0092B-C50C-407E-A947-70E740481C1C}">
                           <a14:useLocalDpi xmlns:a14="http://schemas.microsoft.com/office/drawing/2010/main" val="0"/>

</xml_diff>

<commit_message>
updated figures, full go through of the draft, sending back to Daniel
</commit_message>
<xml_diff>
--- a/Docs/FIGURES Machine learning applied to otolith timeseries data to discriminate river of origin for Western Alaska Salmon.docx
+++ b/Docs/FIGURES Machine learning applied to otolith timeseries data to discriminate river of origin for Western Alaska Salmon.docx
@@ -61,164 +61,118 @@
       <w:pPr>
         <w:rPr>
           <w:rFonts w:ascii="Garamond" w:hAnsi="Garamond"/>
-          <w:sz w:val="16"/>
-          <w:szCs w:val="16"/>
-        </w:rPr>
-      </w:pPr>
-      <w:commentRangeStart w:id="0"/>
-      <w:r>
-        <w:rPr>
-          <w:rFonts w:ascii="Garamond" w:hAnsi="Garamond"/>
-          <w:sz w:val="16"/>
-          <w:szCs w:val="16"/>
-        </w:rPr>
-        <w:t xml:space="preserve">[In </w:t>
-      </w:r>
-      <w:proofErr w:type="gramStart"/>
-      <w:r>
-        <w:rPr>
-          <w:rFonts w:ascii="Garamond" w:hAnsi="Garamond"/>
-          <w:sz w:val="16"/>
-          <w:szCs w:val="16"/>
-        </w:rPr>
-        <w:t>Progress]  Figure</w:t>
-      </w:r>
-      <w:proofErr w:type="gramEnd"/>
-      <w:r>
-        <w:rPr>
-          <w:rFonts w:ascii="Garamond" w:hAnsi="Garamond"/>
-          <w:sz w:val="16"/>
-          <w:szCs w:val="16"/>
-        </w:rPr>
-        <w:t xml:space="preserve"> 1: A) Three major river systems in Western Alaska, the Yukon (Blue), Kuskokwim (Red), and Nushagak (Green) river-basins. Icons (will change color, location) indicate sampling locations for samples on each river. B) Sr8786 </w:t>
-      </w:r>
-      <w:proofErr w:type="spellStart"/>
-      <w:r>
-        <w:rPr>
-          <w:rFonts w:ascii="Garamond" w:hAnsi="Garamond"/>
-          <w:sz w:val="16"/>
-          <w:szCs w:val="16"/>
-        </w:rPr>
-        <w:t>Isoscape</w:t>
-      </w:r>
-      <w:proofErr w:type="spellEnd"/>
-      <w:r>
-        <w:rPr>
-          <w:rFonts w:ascii="Garamond" w:hAnsi="Garamond"/>
-          <w:sz w:val="16"/>
-          <w:szCs w:val="16"/>
-        </w:rPr>
-        <w:t xml:space="preserve"> of all three river-basins. Darker Colors indicate more enriched values </w:t>
-      </w:r>
-      <w:proofErr w:type="gramStart"/>
-      <w:r>
-        <w:rPr>
-          <w:rFonts w:ascii="Garamond" w:hAnsi="Garamond"/>
-          <w:sz w:val="16"/>
-          <w:szCs w:val="16"/>
-        </w:rPr>
-        <w:t>( close</w:t>
-      </w:r>
-      <w:proofErr w:type="gramEnd"/>
-      <w:r>
-        <w:rPr>
-          <w:rFonts w:ascii="Garamond" w:hAnsi="Garamond"/>
-          <w:sz w:val="16"/>
-          <w:szCs w:val="16"/>
-        </w:rPr>
-        <w:t xml:space="preserve"> to .740) whereas lighter values indicate less enriched </w:t>
-      </w:r>
-      <w:proofErr w:type="gramStart"/>
-      <w:r>
-        <w:rPr>
-          <w:rFonts w:ascii="Garamond" w:hAnsi="Garamond"/>
-          <w:sz w:val="16"/>
-          <w:szCs w:val="16"/>
-        </w:rPr>
-        <w:t>( closer</w:t>
-      </w:r>
-      <w:proofErr w:type="gramEnd"/>
-      <w:r>
-        <w:rPr>
-          <w:rFonts w:ascii="Garamond" w:hAnsi="Garamond"/>
-          <w:sz w:val="16"/>
-          <w:szCs w:val="16"/>
-        </w:rPr>
-        <w:t xml:space="preserve"> to .702). </w:t>
-      </w:r>
-      <w:commentRangeEnd w:id="0"/>
-      <w:r>
-        <w:rPr>
-          <w:rStyle w:val="CommentReference"/>
-        </w:rPr>
-        <w:commentReference w:id="0"/>
-      </w:r>
-    </w:p>
-    <w:p>
-      <w:pPr>
-        <w:rPr>
-          <w:rFonts w:ascii="Garamond" w:hAnsi="Garamond"/>
-          <w:sz w:val="16"/>
-          <w:szCs w:val="16"/>
-        </w:rPr>
-      </w:pPr>
-    </w:p>
-    <w:p>
-      <w:pPr>
-        <w:rPr>
-          <w:rFonts w:ascii="Garamond" w:hAnsi="Garamond"/>
-          <w:sz w:val="16"/>
-          <w:szCs w:val="16"/>
-        </w:rPr>
-      </w:pPr>
-    </w:p>
-    <w:p>
-      <w:pPr>
-        <w:rPr>
-          <w:rFonts w:ascii="Garamond" w:hAnsi="Garamond"/>
-          <w:sz w:val="16"/>
-          <w:szCs w:val="16"/>
-        </w:rPr>
-      </w:pPr>
-    </w:p>
-    <w:p>
-      <w:pPr>
-        <w:rPr>
-          <w:rFonts w:ascii="Garamond" w:hAnsi="Garamond"/>
-        </w:rPr>
-      </w:pPr>
-    </w:p>
-    <w:p/>
-    <w:p>
-      <w:pPr>
-        <w:rPr>
-          <w:rFonts w:ascii="Garamond" w:hAnsi="Garamond"/>
           <w:b/>
           <w:bCs/>
-          <w:sz w:val="16"/>
-          <w:szCs w:val="16"/>
-        </w:rPr>
-      </w:pPr>
-    </w:p>
-    <w:p>
-      <w:pPr>
+        </w:rPr>
+      </w:pPr>
+      <w:r>
         <w:rPr>
           <w:rFonts w:ascii="Garamond" w:hAnsi="Garamond"/>
           <w:b/>
           <w:bCs/>
-          <w:sz w:val="16"/>
-          <w:szCs w:val="16"/>
-        </w:rPr>
-      </w:pPr>
-    </w:p>
-    <w:p>
-      <w:pPr>
+        </w:rPr>
+        <w:t xml:space="preserve">Figure 1: </w:t>
+      </w:r>
+    </w:p>
+    <w:p>
+      <w:pPr>
+        <w:rPr>
+          <w:rFonts w:ascii="Garamond" w:hAnsi="Garamond"/>
+          <w:sz w:val="22"/>
+          <w:szCs w:val="22"/>
+        </w:rPr>
+      </w:pPr>
+      <w:r>
         <w:rPr>
           <w:rFonts w:ascii="Garamond" w:hAnsi="Garamond"/>
           <w:b/>
           <w:bCs/>
-          <w:sz w:val="16"/>
-          <w:szCs w:val="16"/>
+          <w:sz w:val="22"/>
+          <w:szCs w:val="22"/>
+        </w:rPr>
+        <w:t>A)</w:t>
+      </w:r>
+      <w:r>
+        <w:rPr>
+          <w:rFonts w:ascii="Garamond" w:hAnsi="Garamond"/>
+          <w:sz w:val="22"/>
+          <w:szCs w:val="22"/>
+        </w:rPr>
+        <w:t xml:space="preserve"> Three major river systems in Western Alaska, the Yukon (Blue), Kuskokwim (Red), and </w:t>
+      </w:r>
+      <w:proofErr w:type="spellStart"/>
+      <w:r>
+        <w:rPr>
+          <w:rFonts w:ascii="Garamond" w:hAnsi="Garamond"/>
+          <w:sz w:val="22"/>
+          <w:szCs w:val="22"/>
+        </w:rPr>
+        <w:t>Nushagak</w:t>
+      </w:r>
+      <w:proofErr w:type="spellEnd"/>
+      <w:r>
+        <w:rPr>
+          <w:rFonts w:ascii="Garamond" w:hAnsi="Garamond"/>
+          <w:sz w:val="22"/>
+          <w:szCs w:val="22"/>
+        </w:rPr>
+        <w:t xml:space="preserve"> (Green)</w:t>
+      </w:r>
+      <w:r>
+        <w:rPr>
+          <w:rFonts w:ascii="Garamond" w:hAnsi="Garamond"/>
+          <w:sz w:val="22"/>
+          <w:szCs w:val="22"/>
+        </w:rPr>
+        <w:t xml:space="preserve"> watersheds</w:t>
+      </w:r>
+      <w:r>
+        <w:rPr>
+          <w:rFonts w:ascii="Garamond" w:hAnsi="Garamond"/>
+          <w:sz w:val="22"/>
+          <w:szCs w:val="22"/>
+        </w:rPr>
+        <w:t xml:space="preserve">. </w:t>
+      </w:r>
+      <w:r>
+        <w:rPr>
+          <w:rFonts w:ascii="Garamond" w:hAnsi="Garamond"/>
+          <w:sz w:val="22"/>
+          <w:szCs w:val="22"/>
+        </w:rPr>
+        <w:t xml:space="preserve">Black circles </w:t>
+      </w:r>
+      <w:r>
+        <w:rPr>
+          <w:rFonts w:ascii="Garamond" w:hAnsi="Garamond"/>
+          <w:sz w:val="22"/>
+          <w:szCs w:val="22"/>
+        </w:rPr>
+        <w:t xml:space="preserve">indicate sampling locations for </w:t>
+      </w:r>
+      <w:r>
+        <w:rPr>
+          <w:rFonts w:ascii="Garamond" w:hAnsi="Garamond"/>
+          <w:sz w:val="22"/>
+          <w:szCs w:val="22"/>
+        </w:rPr>
+        <w:t xml:space="preserve">otolith collection (and genetic collection in the Yukon) </w:t>
+      </w:r>
+      <w:r>
+        <w:rPr>
+          <w:rFonts w:ascii="Garamond" w:hAnsi="Garamond"/>
+          <w:sz w:val="22"/>
+          <w:szCs w:val="22"/>
+        </w:rPr>
+        <w:t xml:space="preserve">on each river. </w:t>
+      </w:r>
+    </w:p>
+    <w:p>
+      <w:pPr>
+        <w:rPr>
+          <w:rFonts w:ascii="Garamond" w:hAnsi="Garamond"/>
+          <w:sz w:val="22"/>
+          <w:szCs w:val="22"/>
         </w:rPr>
       </w:pPr>
       <w:r>
@@ -226,6 +180,188 @@
           <w:rFonts w:ascii="Garamond" w:hAnsi="Garamond"/>
           <w:b/>
           <w:bCs/>
+          <w:sz w:val="22"/>
+          <w:szCs w:val="22"/>
+        </w:rPr>
+        <w:t>B)</w:t>
+      </w:r>
+      <w:r>
+        <w:rPr>
+          <w:rFonts w:ascii="Garamond" w:hAnsi="Garamond"/>
+          <w:sz w:val="22"/>
+          <w:szCs w:val="22"/>
+        </w:rPr>
+        <w:t xml:space="preserve"> </w:t>
+      </w:r>
+      <w:r>
+        <w:rPr>
+          <w:rFonts w:ascii="Cambria Math" w:hAnsi="Cambria Math" w:cs="Cambria Math"/>
+          <w:sz w:val="22"/>
+          <w:szCs w:val="22"/>
+        </w:rPr>
+        <w:t>⁸⁷</w:t>
+      </w:r>
+      <w:r>
+        <w:rPr>
+          <w:rFonts w:ascii="Garamond" w:hAnsi="Garamond"/>
+          <w:sz w:val="22"/>
+          <w:szCs w:val="22"/>
+        </w:rPr>
+        <w:t>Sr/</w:t>
+      </w:r>
+      <w:r>
+        <w:rPr>
+          <w:rFonts w:ascii="Cambria Math" w:hAnsi="Cambria Math" w:cs="Cambria Math"/>
+          <w:sz w:val="22"/>
+          <w:szCs w:val="22"/>
+        </w:rPr>
+        <w:t>⁸⁶</w:t>
+      </w:r>
+      <w:r>
+        <w:rPr>
+          <w:rFonts w:ascii="Garamond" w:hAnsi="Garamond"/>
+          <w:sz w:val="22"/>
+          <w:szCs w:val="22"/>
+        </w:rPr>
+        <w:t>Sr</w:t>
+      </w:r>
+      <w:r>
+        <w:rPr>
+          <w:rFonts w:ascii="Garamond" w:hAnsi="Garamond"/>
+          <w:sz w:val="22"/>
+          <w:szCs w:val="22"/>
+        </w:rPr>
+        <w:t xml:space="preserve"> </w:t>
+      </w:r>
+      <w:proofErr w:type="spellStart"/>
+      <w:r>
+        <w:rPr>
+          <w:rFonts w:ascii="Garamond" w:hAnsi="Garamond"/>
+          <w:sz w:val="22"/>
+          <w:szCs w:val="22"/>
+        </w:rPr>
+        <w:t>Isoscape</w:t>
+      </w:r>
+      <w:proofErr w:type="spellEnd"/>
+      <w:r>
+        <w:rPr>
+          <w:rFonts w:ascii="Garamond" w:hAnsi="Garamond"/>
+          <w:sz w:val="22"/>
+          <w:szCs w:val="22"/>
+        </w:rPr>
+        <w:t xml:space="preserve"> of all three river-basins. </w:t>
+      </w:r>
+      <w:r>
+        <w:rPr>
+          <w:rFonts w:ascii="Garamond" w:hAnsi="Garamond"/>
+          <w:sz w:val="22"/>
+          <w:szCs w:val="22"/>
+        </w:rPr>
+        <w:t>Values range from 0.702 to 0.740, with d</w:t>
+      </w:r>
+      <w:r>
+        <w:rPr>
+          <w:rFonts w:ascii="Garamond" w:hAnsi="Garamond"/>
+          <w:sz w:val="22"/>
+          <w:szCs w:val="22"/>
+        </w:rPr>
+        <w:t xml:space="preserve">arker </w:t>
+      </w:r>
+      <w:r>
+        <w:rPr>
+          <w:rFonts w:ascii="Garamond" w:hAnsi="Garamond"/>
+          <w:sz w:val="22"/>
+          <w:szCs w:val="22"/>
+        </w:rPr>
+        <w:t>c</w:t>
+      </w:r>
+      <w:r>
+        <w:rPr>
+          <w:rFonts w:ascii="Garamond" w:hAnsi="Garamond"/>
+          <w:sz w:val="22"/>
+          <w:szCs w:val="22"/>
+        </w:rPr>
+        <w:t xml:space="preserve">olors indicate more enriched values whereas lighter </w:t>
+      </w:r>
+      <w:r>
+        <w:rPr>
+          <w:rFonts w:ascii="Garamond" w:hAnsi="Garamond"/>
+          <w:sz w:val="22"/>
+          <w:szCs w:val="22"/>
+        </w:rPr>
+        <w:t xml:space="preserve">colors </w:t>
+      </w:r>
+      <w:r>
+        <w:rPr>
+          <w:rFonts w:ascii="Garamond" w:hAnsi="Garamond"/>
+          <w:sz w:val="22"/>
+          <w:szCs w:val="22"/>
+        </w:rPr>
+        <w:t>indicate less enriched</w:t>
+      </w:r>
+      <w:r>
+        <w:rPr>
+          <w:rFonts w:ascii="Garamond" w:hAnsi="Garamond"/>
+          <w:sz w:val="22"/>
+          <w:szCs w:val="22"/>
+        </w:rPr>
+        <w:t>.</w:t>
+      </w:r>
+      <w:r>
+        <w:rPr>
+          <w:rFonts w:ascii="Garamond" w:hAnsi="Garamond"/>
+          <w:sz w:val="22"/>
+          <w:szCs w:val="22"/>
+        </w:rPr>
+        <w:t xml:space="preserve"> </w:t>
+      </w:r>
+      <w:r>
+        <w:rPr>
+          <w:rFonts w:ascii="Garamond" w:hAnsi="Garamond"/>
+          <w:sz w:val="22"/>
+          <w:szCs w:val="22"/>
+        </w:rPr>
+        <w:t xml:space="preserve"> </w:t>
+      </w:r>
+    </w:p>
+    <w:p>
+      <w:pPr>
+        <w:rPr>
+          <w:rFonts w:ascii="Garamond" w:hAnsi="Garamond"/>
+          <w:b/>
+          <w:bCs/>
+          <w:sz w:val="16"/>
+          <w:szCs w:val="16"/>
+        </w:rPr>
+      </w:pPr>
+    </w:p>
+    <w:p>
+      <w:pPr>
+        <w:rPr>
+          <w:rFonts w:ascii="Garamond" w:hAnsi="Garamond"/>
+          <w:b/>
+          <w:bCs/>
+          <w:sz w:val="16"/>
+          <w:szCs w:val="16"/>
+        </w:rPr>
+      </w:pPr>
+    </w:p>
+    <w:p>
+      <w:pPr>
+        <w:rPr>
+          <w:rFonts w:ascii="Garamond" w:hAnsi="Garamond"/>
+          <w:b/>
+          <w:bCs/>
+          <w:sz w:val="16"/>
+          <w:szCs w:val="16"/>
+        </w:rPr>
+      </w:pPr>
+      <w:r>
+        <w:rPr>
+          <w:rFonts w:ascii="Garamond" w:hAnsi="Garamond"/>
+          <w:b/>
+          <w:bCs/>
+          <w:noProof/>
           <w:sz w:val="16"/>
           <w:szCs w:val="16"/>
         </w:rPr>
@@ -245,7 +381,7 @@
                     <pic:cNvPicPr/>
                   </pic:nvPicPr>
                   <pic:blipFill>
-                    <a:blip r:embed="rId9"/>
+                    <a:blip r:embed="rId5"/>
                     <a:stretch>
                       <a:fillRect/>
                     </a:stretch>
@@ -279,8 +415,8 @@
           <w:rFonts w:ascii="Garamond" w:hAnsi="Garamond"/>
           <w:b/>
           <w:bCs/>
-          <w:sz w:val="16"/>
-          <w:szCs w:val="16"/>
+          <w:sz w:val="22"/>
+          <w:szCs w:val="22"/>
         </w:rPr>
         <w:t xml:space="preserve">Figure </w:t>
       </w:r>
@@ -289,8 +425,8 @@
           <w:rFonts w:ascii="Garamond" w:hAnsi="Garamond"/>
           <w:b/>
           <w:bCs/>
-          <w:sz w:val="16"/>
-          <w:szCs w:val="16"/>
+          <w:sz w:val="22"/>
+          <w:szCs w:val="22"/>
         </w:rPr>
         <w:t>2</w:t>
       </w:r>
@@ -299,8 +435,8 @@
           <w:rFonts w:ascii="Garamond" w:hAnsi="Garamond"/>
           <w:b/>
           <w:bCs/>
-          <w:sz w:val="16"/>
-          <w:szCs w:val="16"/>
+          <w:sz w:val="22"/>
+          <w:szCs w:val="22"/>
         </w:rPr>
         <w:t>:</w:t>
       </w:r>
@@ -310,116 +446,128 @@
           <w:sz w:val="16"/>
           <w:szCs w:val="16"/>
         </w:rPr>
-        <w:t xml:space="preserve"> Model Performance comparison among data </w:t>
-      </w:r>
-      <w:r>
-        <w:rPr>
-          <w:rFonts w:ascii="Garamond" w:hAnsi="Garamond"/>
-          <w:sz w:val="16"/>
-          <w:szCs w:val="16"/>
+        <w:t xml:space="preserve"> </w:t>
+      </w:r>
+      <w:r>
+        <w:rPr>
+          <w:rFonts w:ascii="Garamond" w:hAnsi="Garamond"/>
+          <w:sz w:val="22"/>
+          <w:szCs w:val="22"/>
+        </w:rPr>
+        <w:t xml:space="preserve">Model Performance comparison among data </w:t>
+      </w:r>
+      <w:r>
+        <w:rPr>
+          <w:rFonts w:ascii="Garamond" w:hAnsi="Garamond"/>
+          <w:sz w:val="22"/>
+          <w:szCs w:val="22"/>
         </w:rPr>
         <w:t xml:space="preserve">preprocessing steps </w:t>
       </w:r>
       <w:r>
         <w:rPr>
           <w:rFonts w:ascii="Garamond" w:hAnsi="Garamond"/>
-          <w:sz w:val="16"/>
-          <w:szCs w:val="16"/>
+          <w:sz w:val="22"/>
+          <w:szCs w:val="22"/>
         </w:rPr>
         <w:t xml:space="preserve">and model types. Accuracy indicates the proportion of each class correctly classified. F1-Score is the harmonic mean of precision and recall, providing a balanced performance measure across all watershed classes. Results compare </w:t>
       </w:r>
       <w:r>
         <w:rPr>
           <w:rFonts w:ascii="Garamond" w:hAnsi="Garamond"/>
-          <w:sz w:val="16"/>
-          <w:szCs w:val="16"/>
+          <w:sz w:val="22"/>
+          <w:szCs w:val="22"/>
         </w:rPr>
         <w:t>two</w:t>
       </w:r>
       <w:r>
         <w:rPr>
           <w:rFonts w:ascii="Garamond" w:hAnsi="Garamond"/>
-          <w:sz w:val="16"/>
-          <w:szCs w:val="16"/>
-        </w:rPr>
-        <w:t xml:space="preserve"> Sr87/86 </w:t>
-      </w:r>
-      <w:r>
-        <w:rPr>
-          <w:rFonts w:ascii="Garamond" w:hAnsi="Garamond"/>
-          <w:sz w:val="16"/>
-          <w:szCs w:val="16"/>
+          <w:sz w:val="22"/>
+          <w:szCs w:val="22"/>
+        </w:rPr>
+        <w:t xml:space="preserve"> </w:t>
+      </w:r>
+      <w:r>
+        <w:rPr>
+          <w:rFonts w:ascii="Cambria Math" w:hAnsi="Cambria Math" w:cs="Cambria Math"/>
+          <w:sz w:val="22"/>
+          <w:szCs w:val="22"/>
+        </w:rPr>
+        <w:t>⁸⁷</w:t>
+      </w:r>
+      <w:r>
+        <w:rPr>
+          <w:rFonts w:ascii="Garamond" w:hAnsi="Garamond"/>
+          <w:sz w:val="22"/>
+          <w:szCs w:val="22"/>
+        </w:rPr>
+        <w:t>Sr/</w:t>
+      </w:r>
+      <w:r>
+        <w:rPr>
+          <w:rFonts w:ascii="Cambria Math" w:hAnsi="Cambria Math" w:cs="Cambria Math"/>
+          <w:sz w:val="22"/>
+          <w:szCs w:val="22"/>
+        </w:rPr>
+        <w:t>⁸⁶</w:t>
+      </w:r>
+      <w:r>
+        <w:rPr>
+          <w:rFonts w:ascii="Garamond" w:hAnsi="Garamond"/>
+          <w:sz w:val="22"/>
+          <w:szCs w:val="22"/>
+        </w:rPr>
+        <w:t xml:space="preserve">Sr </w:t>
+      </w:r>
+      <w:r>
+        <w:rPr>
+          <w:rFonts w:ascii="Garamond" w:hAnsi="Garamond"/>
+          <w:sz w:val="22"/>
+          <w:szCs w:val="22"/>
         </w:rPr>
         <w:t xml:space="preserve">timeseries smoothing </w:t>
       </w:r>
       <w:r>
         <w:rPr>
           <w:rFonts w:ascii="Garamond" w:hAnsi="Garamond"/>
-          <w:sz w:val="16"/>
-          <w:szCs w:val="16"/>
+          <w:sz w:val="22"/>
+          <w:szCs w:val="22"/>
         </w:rPr>
         <w:t xml:space="preserve">methods (GAM, MA) </w:t>
       </w:r>
       <w:r>
         <w:rPr>
           <w:rFonts w:ascii="Garamond" w:hAnsi="Garamond"/>
-          <w:sz w:val="16"/>
-          <w:szCs w:val="16"/>
+          <w:sz w:val="22"/>
+          <w:szCs w:val="22"/>
         </w:rPr>
         <w:t>a</w:t>
       </w:r>
       <w:r>
         <w:rPr>
           <w:rFonts w:ascii="Garamond" w:hAnsi="Garamond"/>
-          <w:sz w:val="16"/>
-          <w:szCs w:val="16"/>
+          <w:sz w:val="22"/>
+          <w:szCs w:val="22"/>
         </w:rPr>
         <w:t xml:space="preserve">nd three machine learning algorithms (Random Forest, SVM, KNN) using either all test data (Total) or only overlapping isotope ranges (Overlapping). </w:t>
       </w:r>
       <w:r>
         <w:rPr>
           <w:rFonts w:ascii="Garamond" w:hAnsi="Garamond"/>
-          <w:sz w:val="16"/>
-          <w:szCs w:val="16"/>
-        </w:rPr>
-        <w:t>Darker green colors indicate higher scores.</w:t>
-      </w:r>
-    </w:p>
-    <w:p>
-      <w:pPr>
-        <w:rPr>
-          <w:rFonts w:ascii="Garamond" w:hAnsi="Garamond"/>
-          <w:sz w:val="16"/>
-          <w:szCs w:val="16"/>
-        </w:rPr>
-      </w:pPr>
-    </w:p>
-    <w:p>
-      <w:pPr>
-        <w:rPr>
-          <w:rFonts w:ascii="Garamond" w:hAnsi="Garamond"/>
-          <w:sz w:val="16"/>
-          <w:szCs w:val="16"/>
-        </w:rPr>
-      </w:pPr>
-    </w:p>
-    <w:p>
-      <w:pPr>
-        <w:rPr>
-          <w:rFonts w:ascii="Garamond" w:hAnsi="Garamond"/>
-          <w:sz w:val="16"/>
-          <w:szCs w:val="16"/>
-        </w:rPr>
-      </w:pPr>
-    </w:p>
-    <w:p>
-      <w:pPr>
-        <w:rPr>
-          <w:rFonts w:ascii="Garamond" w:hAnsi="Garamond"/>
-          <w:sz w:val="16"/>
-          <w:szCs w:val="16"/>
-        </w:rPr>
-      </w:pPr>
+          <w:sz w:val="22"/>
+          <w:szCs w:val="22"/>
+        </w:rPr>
+        <w:t>Darker green colors indicate higher scores</w:t>
+      </w:r>
+      <w:r>
+        <w:rPr>
+          <w:rFonts w:ascii="Garamond" w:hAnsi="Garamond"/>
+          <w:sz w:val="16"/>
+          <w:szCs w:val="16"/>
+        </w:rPr>
+        <w:t>.</w:t>
+      </w:r>
     </w:p>
     <w:p>
       <w:pPr>
@@ -446,8 +594,8 @@
           <w:szCs w:val="16"/>
         </w:rPr>
         <w:drawing>
-          <wp:inline distT="0" distB="0" distL="0" distR="0" wp14:anchorId="16679699" wp14:editId="06016901">
-            <wp:extent cx="5429250" cy="2714625"/>
+          <wp:inline distT="0" distB="0" distL="0" distR="0" wp14:anchorId="16679699" wp14:editId="668105C7">
+            <wp:extent cx="5962810" cy="2981405"/>
             <wp:effectExtent l="0" t="0" r="6350" b="3175"/>
             <wp:docPr id="1789130704" name="Picture 6"/>
             <wp:cNvGraphicFramePr>
@@ -461,7 +609,7 @@
                     <pic:cNvPicPr/>
                   </pic:nvPicPr>
                   <pic:blipFill>
-                    <a:blip r:embed="rId10"/>
+                    <a:blip r:embed="rId6"/>
                     <a:stretch>
                       <a:fillRect/>
                     </a:stretch>
@@ -469,7 +617,7 @@
                   <pic:spPr>
                     <a:xfrm>
                       <a:off x="0" y="0"/>
-                      <a:ext cx="5429250" cy="2714625"/>
+                      <a:ext cx="5988578" cy="2994289"/>
                     </a:xfrm>
                     <a:prstGeom prst="rect">
                       <a:avLst/>
@@ -494,103 +642,102 @@
       <w:pPr>
         <w:rPr>
           <w:rFonts w:ascii="Garamond" w:hAnsi="Garamond"/>
-          <w:sz w:val="16"/>
-          <w:szCs w:val="16"/>
-        </w:rPr>
-      </w:pPr>
-      <w:r>
-        <w:rPr>
-          <w:rFonts w:ascii="Garamond" w:hAnsi="Garamond"/>
-          <w:sz w:val="16"/>
-          <w:szCs w:val="16"/>
-        </w:rPr>
-        <w:t xml:space="preserve">Figure 3: </w:t>
-      </w:r>
-      <w:r>
-        <w:rPr>
-          <w:rFonts w:ascii="Garamond" w:hAnsi="Garamond"/>
-          <w:sz w:val="16"/>
-          <w:szCs w:val="16"/>
-        </w:rPr>
-        <w:t>Confusion matrix from the highest p</w:t>
-      </w:r>
-      <w:r>
-        <w:rPr>
-          <w:rFonts w:ascii="Garamond" w:hAnsi="Garamond"/>
-          <w:sz w:val="16"/>
-          <w:szCs w:val="16"/>
-        </w:rPr>
-        <w:t>er</w:t>
-      </w:r>
-      <w:r>
-        <w:rPr>
-          <w:rFonts w:ascii="Garamond" w:hAnsi="Garamond"/>
-          <w:sz w:val="16"/>
-          <w:szCs w:val="16"/>
-        </w:rPr>
-        <w:t xml:space="preserve">forming model (Random Forest on GAM Smoothed data) for both total </w:t>
-      </w:r>
-      <w:proofErr w:type="gramStart"/>
-      <w:r>
-        <w:rPr>
-          <w:rFonts w:ascii="Garamond" w:hAnsi="Garamond"/>
-          <w:sz w:val="16"/>
-          <w:szCs w:val="16"/>
-        </w:rPr>
-        <w:t>test</w:t>
-      </w:r>
-      <w:proofErr w:type="gramEnd"/>
-      <w:r>
-        <w:rPr>
-          <w:rFonts w:ascii="Garamond" w:hAnsi="Garamond"/>
-          <w:sz w:val="16"/>
-          <w:szCs w:val="16"/>
-        </w:rPr>
-        <w:t xml:space="preserve"> set and overlapping subset. Boxes along the horizontal axis indicate correctly classified individuals</w:t>
-      </w:r>
-      <w:r>
-        <w:rPr>
-          <w:rFonts w:ascii="Garamond" w:hAnsi="Garamond"/>
-          <w:sz w:val="16"/>
-          <w:szCs w:val="16"/>
-        </w:rPr>
-        <w:t xml:space="preserve"> (red). Vertical axis labels are the actual watershed labels whereas horizontal labels are the predicted class from the model. Percentage</w:t>
-      </w:r>
-      <w:r>
-        <w:rPr>
-          <w:rFonts w:ascii="Garamond" w:hAnsi="Garamond"/>
-          <w:sz w:val="16"/>
-          <w:szCs w:val="16"/>
-        </w:rPr>
-        <w:t xml:space="preserve"> labels</w:t>
-      </w:r>
-      <w:r>
-        <w:rPr>
-          <w:rFonts w:ascii="Garamond" w:hAnsi="Garamond"/>
-          <w:sz w:val="16"/>
-          <w:szCs w:val="16"/>
-        </w:rPr>
-        <w:t xml:space="preserve"> are the percent of the actual class identified as the predicted class. </w:t>
-      </w:r>
-      <w:r>
-        <w:rPr>
-          <w:rFonts w:ascii="Garamond" w:hAnsi="Garamond"/>
-          <w:sz w:val="16"/>
-          <w:szCs w:val="16"/>
-        </w:rPr>
-        <w:t xml:space="preserve">  </w:t>
-      </w:r>
-    </w:p>
-    <w:p>
-      <w:pPr>
+          <w:sz w:val="22"/>
+          <w:szCs w:val="22"/>
+        </w:rPr>
+      </w:pPr>
+      <w:r>
         <w:rPr>
           <w:rFonts w:ascii="Garamond" w:hAnsi="Garamond"/>
           <w:b/>
           <w:bCs/>
-          <w:sz w:val="16"/>
-          <w:szCs w:val="16"/>
-        </w:rPr>
-      </w:pPr>
+          <w:sz w:val="22"/>
+          <w:szCs w:val="22"/>
+        </w:rPr>
+        <w:t>Figure 3:</w:t>
+      </w:r>
+      <w:r>
+        <w:rPr>
+          <w:rFonts w:ascii="Garamond" w:hAnsi="Garamond"/>
+          <w:sz w:val="22"/>
+          <w:szCs w:val="22"/>
+        </w:rPr>
+        <w:t xml:space="preserve"> </w:t>
+      </w:r>
+      <w:r>
+        <w:rPr>
+          <w:rFonts w:ascii="Garamond" w:hAnsi="Garamond"/>
+          <w:sz w:val="22"/>
+          <w:szCs w:val="22"/>
+        </w:rPr>
+        <w:t>Confusion matrix from the highest p</w:t>
+      </w:r>
+      <w:r>
+        <w:rPr>
+          <w:rFonts w:ascii="Garamond" w:hAnsi="Garamond"/>
+          <w:sz w:val="22"/>
+          <w:szCs w:val="22"/>
+        </w:rPr>
+        <w:t>er</w:t>
+      </w:r>
+      <w:r>
+        <w:rPr>
+          <w:rFonts w:ascii="Garamond" w:hAnsi="Garamond"/>
+          <w:sz w:val="22"/>
+          <w:szCs w:val="22"/>
+        </w:rPr>
+        <w:t xml:space="preserve">forming model (Random Forest on GAM Smoothed data) for both total </w:t>
+      </w:r>
+      <w:proofErr w:type="gramStart"/>
+      <w:r>
+        <w:rPr>
+          <w:rFonts w:ascii="Garamond" w:hAnsi="Garamond"/>
+          <w:sz w:val="22"/>
+          <w:szCs w:val="22"/>
+        </w:rPr>
+        <w:t>test</w:t>
+      </w:r>
+      <w:proofErr w:type="gramEnd"/>
+      <w:r>
+        <w:rPr>
+          <w:rFonts w:ascii="Garamond" w:hAnsi="Garamond"/>
+          <w:sz w:val="22"/>
+          <w:szCs w:val="22"/>
+        </w:rPr>
+        <w:t xml:space="preserve"> set and overlapping subset. Boxes along the horizontal axis indicate correctly classified individuals</w:t>
+      </w:r>
+      <w:r>
+        <w:rPr>
+          <w:rFonts w:ascii="Garamond" w:hAnsi="Garamond"/>
+          <w:sz w:val="22"/>
+          <w:szCs w:val="22"/>
+        </w:rPr>
+        <w:t xml:space="preserve"> (red). Vertical axis labels are the actual watershed labels whereas horizontal labels are the predicted class from the model. Percentage</w:t>
+      </w:r>
+      <w:r>
+        <w:rPr>
+          <w:rFonts w:ascii="Garamond" w:hAnsi="Garamond"/>
+          <w:sz w:val="22"/>
+          <w:szCs w:val="22"/>
+        </w:rPr>
+        <w:t>s indicate</w:t>
+      </w:r>
+      <w:r>
+        <w:rPr>
+          <w:rFonts w:ascii="Garamond" w:hAnsi="Garamond"/>
+          <w:sz w:val="22"/>
+          <w:szCs w:val="22"/>
+        </w:rPr>
+        <w:t xml:space="preserve"> the percent of the actual class identified as the predicted class. </w:t>
+      </w:r>
+      <w:r>
+        <w:rPr>
+          <w:rFonts w:ascii="Garamond" w:hAnsi="Garamond"/>
+          <w:sz w:val="22"/>
+          <w:szCs w:val="22"/>
+        </w:rPr>
+        <w:t xml:space="preserve">  </w:t>
+      </w:r>
     </w:p>
     <w:p>
       <w:pPr>
@@ -602,6 +749,17 @@
           <w:szCs w:val="16"/>
         </w:rPr>
       </w:pPr>
+    </w:p>
+    <w:p>
+      <w:pPr>
+        <w:rPr>
+          <w:rFonts w:ascii="Garamond" w:hAnsi="Garamond"/>
+          <w:b/>
+          <w:bCs/>
+          <w:sz w:val="16"/>
+          <w:szCs w:val="16"/>
+        </w:rPr>
+      </w:pPr>
       <w:r>
         <w:rPr>
           <w:rFonts w:ascii="Garamond" w:hAnsi="Garamond"/>
@@ -611,16 +769,16 @@
         </w:rPr>
         <w:lastRenderedPageBreak/>
         <w:drawing>
-          <wp:anchor distT="0" distB="0" distL="114300" distR="114300" simplePos="0" relativeHeight="251658240" behindDoc="0" locked="0" layoutInCell="1" allowOverlap="1" wp14:anchorId="4608D8C9" wp14:editId="158ECFD3">
+          <wp:anchor distT="0" distB="0" distL="114300" distR="114300" simplePos="0" relativeHeight="251658240" behindDoc="0" locked="0" layoutInCell="1" allowOverlap="1" wp14:anchorId="4608D8C9" wp14:editId="1B8CF4B2">
             <wp:simplePos x="0" y="0"/>
             <wp:positionH relativeFrom="column">
-              <wp:posOffset>-225425</wp:posOffset>
+              <wp:posOffset>-222885</wp:posOffset>
             </wp:positionH>
             <wp:positionV relativeFrom="paragraph">
-              <wp:posOffset>267335</wp:posOffset>
+              <wp:posOffset>268605</wp:posOffset>
             </wp:positionV>
-            <wp:extent cx="4324350" cy="3603625"/>
-            <wp:effectExtent l="0" t="0" r="6350" b="3175"/>
+            <wp:extent cx="5962650" cy="4968875"/>
+            <wp:effectExtent l="0" t="0" r="6350" b="0"/>
             <wp:wrapSquare wrapText="bothSides"/>
             <wp:docPr id="2003545803" name="Picture 1" descr="A diagram of a diagram&#10;&#10;AI-generated content may be incorrect."/>
             <wp:cNvGraphicFramePr>
@@ -634,7 +792,7 @@
                     <pic:cNvPicPr/>
                   </pic:nvPicPr>
                   <pic:blipFill>
-                    <a:blip r:embed="rId11" cstate="print">
+                    <a:blip r:embed="rId7" cstate="print">
                       <a:extLst>
                         <a:ext uri="{28A0092B-C50C-407E-A947-70E740481C1C}">
                           <a14:useLocalDpi xmlns:a14="http://schemas.microsoft.com/office/drawing/2010/main" val="0"/>
@@ -648,7 +806,7 @@
                   <pic:spPr>
                     <a:xfrm>
                       <a:off x="0" y="0"/>
-                      <a:ext cx="4324350" cy="3603625"/>
+                      <a:ext cx="5962650" cy="4968875"/>
                     </a:xfrm>
                     <a:prstGeom prst="rect">
                       <a:avLst/>
@@ -671,8 +829,8 @@
       <w:pPr>
         <w:rPr>
           <w:rFonts w:ascii="Garamond" w:hAnsi="Garamond"/>
-          <w:sz w:val="16"/>
-          <w:szCs w:val="16"/>
+          <w:sz w:val="22"/>
+          <w:szCs w:val="22"/>
         </w:rPr>
       </w:pPr>
       <w:r>
@@ -680,8 +838,8 @@
           <w:rFonts w:ascii="Garamond" w:hAnsi="Garamond"/>
           <w:b/>
           <w:bCs/>
-          <w:sz w:val="16"/>
-          <w:szCs w:val="16"/>
+          <w:sz w:val="22"/>
+          <w:szCs w:val="22"/>
         </w:rPr>
         <w:t xml:space="preserve">Figure </w:t>
       </w:r>
@@ -690,8 +848,8 @@
           <w:rFonts w:ascii="Garamond" w:hAnsi="Garamond"/>
           <w:b/>
           <w:bCs/>
-          <w:sz w:val="16"/>
-          <w:szCs w:val="16"/>
+          <w:sz w:val="22"/>
+          <w:szCs w:val="22"/>
         </w:rPr>
         <w:t>4</w:t>
       </w:r>
@@ -700,98 +858,75 @@
           <w:rFonts w:ascii="Garamond" w:hAnsi="Garamond"/>
           <w:b/>
           <w:bCs/>
-          <w:sz w:val="16"/>
-          <w:szCs w:val="16"/>
+          <w:sz w:val="22"/>
+          <w:szCs w:val="22"/>
         </w:rPr>
         <w:t>:</w:t>
       </w:r>
       <w:r>
         <w:rPr>
           <w:rFonts w:ascii="Garamond" w:hAnsi="Garamond"/>
-          <w:sz w:val="16"/>
-          <w:szCs w:val="16"/>
+          <w:sz w:val="22"/>
+          <w:szCs w:val="22"/>
         </w:rPr>
         <w:t xml:space="preserve"> Principal Component analysis of </w:t>
       </w:r>
       <w:r>
         <w:rPr>
           <w:rFonts w:ascii="Garamond" w:hAnsi="Garamond"/>
-          <w:sz w:val="16"/>
-          <w:szCs w:val="16"/>
-        </w:rPr>
-        <w:t>gam smoothed timeseries data (n = 2,531). Significant clustering is evident for all three watersheds, but with overlap between all watersheds. Yukon (Blue points) contain a much larger range of values</w:t>
-      </w:r>
-      <w:r>
-        <w:rPr>
-          <w:rFonts w:ascii="Garamond" w:hAnsi="Garamond"/>
-          <w:sz w:val="16"/>
-          <w:szCs w:val="16"/>
-        </w:rPr>
-        <w:t xml:space="preserve">, indicative of the large range in natal Sr87/86 values in the basin. Kuskokwim (Red points) overlap between both Nushagak and Yukon fish, likely due to its position in the region between both watersheds. </w:t>
-      </w:r>
-    </w:p>
-    <w:p>
-      <w:pPr>
-        <w:rPr>
-          <w:rFonts w:ascii="Garamond" w:hAnsi="Garamond"/>
-          <w:sz w:val="16"/>
-          <w:szCs w:val="16"/>
-        </w:rPr>
-      </w:pPr>
-    </w:p>
-    <w:p>
-      <w:pPr>
-        <w:rPr>
-          <w:rFonts w:ascii="Garamond" w:hAnsi="Garamond"/>
-          <w:sz w:val="16"/>
-          <w:szCs w:val="16"/>
-        </w:rPr>
-      </w:pPr>
-    </w:p>
-    <w:p>
-      <w:pPr>
-        <w:rPr>
-          <w:rFonts w:ascii="Garamond" w:hAnsi="Garamond"/>
-          <w:sz w:val="16"/>
-          <w:szCs w:val="16"/>
-        </w:rPr>
-      </w:pPr>
-    </w:p>
-    <w:p>
-      <w:pPr>
-        <w:rPr>
-          <w:rFonts w:ascii="Garamond" w:hAnsi="Garamond"/>
-          <w:sz w:val="16"/>
-          <w:szCs w:val="16"/>
-        </w:rPr>
-      </w:pPr>
-    </w:p>
-    <w:p>
-      <w:pPr>
-        <w:rPr>
-          <w:rFonts w:ascii="Garamond" w:hAnsi="Garamond"/>
-          <w:sz w:val="16"/>
-          <w:szCs w:val="16"/>
-        </w:rPr>
-      </w:pPr>
-    </w:p>
-    <w:p>
-      <w:pPr>
-        <w:rPr>
-          <w:rFonts w:ascii="Garamond" w:hAnsi="Garamond"/>
-          <w:sz w:val="16"/>
-          <w:szCs w:val="16"/>
-        </w:rPr>
-      </w:pPr>
-    </w:p>
-    <w:p>
-      <w:pPr>
-        <w:rPr>
-          <w:rFonts w:ascii="Garamond" w:hAnsi="Garamond"/>
-          <w:sz w:val="16"/>
-          <w:szCs w:val="16"/>
-        </w:rPr>
-      </w:pPr>
+          <w:sz w:val="22"/>
+          <w:szCs w:val="22"/>
+        </w:rPr>
+        <w:t>gam smoothed timeseries data (n = 2,531). Significant clustering is evident, but with overlap between all watersheds. Yukon (Blue points) contain a much larger range of values</w:t>
+      </w:r>
+      <w:r>
+        <w:rPr>
+          <w:rFonts w:ascii="Garamond" w:hAnsi="Garamond"/>
+          <w:sz w:val="22"/>
+          <w:szCs w:val="22"/>
+        </w:rPr>
+        <w:t xml:space="preserve">, indicative of the large range in natal </w:t>
+      </w:r>
+      <w:r>
+        <w:rPr>
+          <w:rFonts w:ascii="Cambria Math" w:hAnsi="Cambria Math" w:cs="Cambria Math"/>
+          <w:sz w:val="22"/>
+          <w:szCs w:val="22"/>
+        </w:rPr>
+        <w:t>⁸⁷</w:t>
+      </w:r>
+      <w:r>
+        <w:rPr>
+          <w:rFonts w:ascii="Garamond" w:hAnsi="Garamond"/>
+          <w:sz w:val="22"/>
+          <w:szCs w:val="22"/>
+        </w:rPr>
+        <w:t>Sr/</w:t>
+      </w:r>
+      <w:r>
+        <w:rPr>
+          <w:rFonts w:ascii="Cambria Math" w:hAnsi="Cambria Math" w:cs="Cambria Math"/>
+          <w:sz w:val="22"/>
+          <w:szCs w:val="22"/>
+        </w:rPr>
+        <w:t>⁸⁶</w:t>
+      </w:r>
+      <w:r>
+        <w:rPr>
+          <w:rFonts w:ascii="Garamond" w:hAnsi="Garamond"/>
+          <w:sz w:val="22"/>
+          <w:szCs w:val="22"/>
+        </w:rPr>
+        <w:t xml:space="preserve">Sr </w:t>
+      </w:r>
+      <w:r>
+        <w:rPr>
+          <w:rFonts w:ascii="Garamond" w:hAnsi="Garamond"/>
+          <w:sz w:val="22"/>
+          <w:szCs w:val="22"/>
+        </w:rPr>
+        <w:t xml:space="preserve">values in the basin. Kuskokwim (Red points) overlap between both Nushagak and Yukon fish, likely due to its position in the region between both watersheds. </w:t>
+      </w:r>
     </w:p>
     <w:p>
       <w:pPr>
@@ -891,9 +1026,9 @@
         </w:rPr>
         <w:lastRenderedPageBreak/>
         <w:drawing>
-          <wp:inline distT="0" distB="0" distL="0" distR="0" wp14:anchorId="554AA946" wp14:editId="2CB59143">
-            <wp:extent cx="5943600" cy="3035300"/>
-            <wp:effectExtent l="0" t="0" r="0" b="0"/>
+          <wp:inline distT="0" distB="0" distL="0" distR="0" wp14:anchorId="6BCD3F3F" wp14:editId="7EB9A63C">
+            <wp:extent cx="6409834" cy="3273398"/>
+            <wp:effectExtent l="0" t="0" r="3810" b="3810"/>
             <wp:docPr id="219536095" name="Picture 2" descr="A group of graphs showing different types of data&#10;&#10;AI-generated content may be incorrect."/>
             <wp:cNvGraphicFramePr>
               <a:graphicFrameLocks xmlns:a="http://schemas.openxmlformats.org/drawingml/2006/main" noChangeAspect="1"/>
@@ -906,7 +1041,7 @@
                     <pic:cNvPicPr/>
                   </pic:nvPicPr>
                   <pic:blipFill>
-                    <a:blip r:embed="rId12" cstate="print">
+                    <a:blip r:embed="rId8" cstate="print">
                       <a:extLst>
                         <a:ext uri="{28A0092B-C50C-407E-A947-70E740481C1C}">
                           <a14:useLocalDpi xmlns:a14="http://schemas.microsoft.com/office/drawing/2010/main" val="0"/>
@@ -920,7 +1055,7 @@
                   <pic:spPr>
                     <a:xfrm>
                       <a:off x="0" y="0"/>
-                      <a:ext cx="5943600" cy="3035300"/>
+                      <a:ext cx="6438129" cy="3287848"/>
                     </a:xfrm>
                     <a:prstGeom prst="rect">
                       <a:avLst/>
@@ -941,13 +1076,22 @@
           <w:szCs w:val="16"/>
         </w:rPr>
       </w:pPr>
+    </w:p>
+    <w:p>
+      <w:pPr>
+        <w:rPr>
+          <w:rFonts w:ascii="Garamond" w:hAnsi="Garamond"/>
+          <w:sz w:val="22"/>
+          <w:szCs w:val="22"/>
+        </w:rPr>
+      </w:pPr>
       <w:r>
         <w:rPr>
           <w:rFonts w:ascii="Garamond" w:hAnsi="Garamond"/>
           <w:b/>
           <w:bCs/>
-          <w:sz w:val="16"/>
-          <w:szCs w:val="16"/>
+          <w:sz w:val="22"/>
+          <w:szCs w:val="22"/>
         </w:rPr>
         <w:t xml:space="preserve">Figure </w:t>
       </w:r>
@@ -956,8 +1100,8 @@
           <w:rFonts w:ascii="Garamond" w:hAnsi="Garamond"/>
           <w:b/>
           <w:bCs/>
-          <w:sz w:val="16"/>
-          <w:szCs w:val="16"/>
+          <w:sz w:val="22"/>
+          <w:szCs w:val="22"/>
         </w:rPr>
         <w:t>5</w:t>
       </w:r>
@@ -966,8 +1110,8 @@
           <w:rFonts w:ascii="Garamond" w:hAnsi="Garamond"/>
           <w:b/>
           <w:bCs/>
-          <w:sz w:val="16"/>
-          <w:szCs w:val="16"/>
+          <w:sz w:val="22"/>
+          <w:szCs w:val="22"/>
         </w:rPr>
         <w:t>:</w:t>
       </w:r>
@@ -976,178 +1120,246 @@
           <w:rFonts w:ascii="Garamond" w:hAnsi="Garamond"/>
           <w:b/>
           <w:bCs/>
-          <w:sz w:val="16"/>
-          <w:szCs w:val="16"/>
+          <w:sz w:val="22"/>
+          <w:szCs w:val="22"/>
         </w:rPr>
         <w:t xml:space="preserve"> </w:t>
       </w:r>
       <w:r>
         <w:rPr>
           <w:rFonts w:ascii="Garamond" w:hAnsi="Garamond"/>
-          <w:sz w:val="16"/>
-          <w:szCs w:val="16"/>
+          <w:sz w:val="22"/>
+          <w:szCs w:val="22"/>
         </w:rPr>
         <w:t>A)</w:t>
       </w:r>
       <w:r>
         <w:rPr>
           <w:rFonts w:ascii="Garamond" w:hAnsi="Garamond"/>
-          <w:sz w:val="16"/>
-          <w:szCs w:val="16"/>
-        </w:rPr>
-        <w:t xml:space="preserve"> Principal component analysis of all samples with a natal origin Sr8786 of 0.708- 0.</w:t>
-      </w:r>
-      <w:r>
-        <w:rPr>
-          <w:rFonts w:ascii="Garamond" w:hAnsi="Garamond"/>
-          <w:sz w:val="16"/>
-          <w:szCs w:val="16"/>
+          <w:sz w:val="22"/>
+          <w:szCs w:val="22"/>
+        </w:rPr>
+        <w:t xml:space="preserve"> Principal component analysis of all samples with a natal origin </w:t>
+      </w:r>
+      <w:r>
+        <w:rPr>
+          <w:rFonts w:ascii="Cambria Math" w:hAnsi="Cambria Math" w:cs="Cambria Math"/>
+          <w:sz w:val="22"/>
+          <w:szCs w:val="22"/>
+        </w:rPr>
+        <w:t>⁸⁷</w:t>
+      </w:r>
+      <w:r>
+        <w:rPr>
+          <w:rFonts w:ascii="Garamond" w:hAnsi="Garamond"/>
+          <w:sz w:val="22"/>
+          <w:szCs w:val="22"/>
+        </w:rPr>
+        <w:t>Sr/</w:t>
+      </w:r>
+      <w:r>
+        <w:rPr>
+          <w:rFonts w:ascii="Cambria Math" w:hAnsi="Cambria Math" w:cs="Cambria Math"/>
+          <w:sz w:val="22"/>
+          <w:szCs w:val="22"/>
+        </w:rPr>
+        <w:t>⁸⁶</w:t>
+      </w:r>
+      <w:r>
+        <w:rPr>
+          <w:rFonts w:ascii="Garamond" w:hAnsi="Garamond"/>
+          <w:sz w:val="22"/>
+          <w:szCs w:val="22"/>
+        </w:rPr>
+        <w:t>Sr</w:t>
+      </w:r>
+      <w:r>
+        <w:rPr>
+          <w:rFonts w:ascii="Garamond" w:hAnsi="Garamond"/>
+          <w:sz w:val="22"/>
+          <w:szCs w:val="22"/>
+        </w:rPr>
+        <w:t xml:space="preserve"> of 0.708</w:t>
+      </w:r>
+      <w:r>
+        <w:rPr>
+          <w:rFonts w:ascii="Garamond" w:hAnsi="Garamond"/>
+          <w:sz w:val="22"/>
+          <w:szCs w:val="22"/>
+        </w:rPr>
+        <w:t xml:space="preserve">0 </w:t>
+      </w:r>
+      <w:r>
+        <w:rPr>
+          <w:rFonts w:ascii="Garamond" w:hAnsi="Garamond"/>
+          <w:sz w:val="22"/>
+          <w:szCs w:val="22"/>
+        </w:rPr>
+        <w:t>- 0.</w:t>
+      </w:r>
+      <w:r>
+        <w:rPr>
+          <w:rFonts w:ascii="Garamond" w:hAnsi="Garamond"/>
+          <w:sz w:val="22"/>
+          <w:szCs w:val="22"/>
         </w:rPr>
         <w:t xml:space="preserve">7085. Clustering among watersheds is evident between principal </w:t>
       </w:r>
+      <w:commentRangeStart w:id="0"/>
       <w:commentRangeStart w:id="1"/>
-      <w:commentRangeStart w:id="2"/>
-      <w:r>
-        <w:rPr>
-          <w:rFonts w:ascii="Garamond" w:hAnsi="Garamond"/>
-          <w:sz w:val="16"/>
-          <w:szCs w:val="16"/>
+      <w:r>
+        <w:rPr>
+          <w:rFonts w:ascii="Garamond" w:hAnsi="Garamond"/>
+          <w:sz w:val="22"/>
+          <w:szCs w:val="22"/>
         </w:rPr>
         <w:t>components</w:t>
       </w:r>
+      <w:commentRangeEnd w:id="0"/>
+      <w:r>
+        <w:rPr>
+          <w:rStyle w:val="CommentReference"/>
+          <w:rFonts w:ascii="Garamond" w:hAnsi="Garamond"/>
+          <w:sz w:val="22"/>
+          <w:szCs w:val="22"/>
+        </w:rPr>
+        <w:commentReference w:id="0"/>
+      </w:r>
       <w:commentRangeEnd w:id="1"/>
       <w:r>
         <w:rPr>
           <w:rStyle w:val="CommentReference"/>
+          <w:rFonts w:ascii="Garamond" w:hAnsi="Garamond"/>
+          <w:sz w:val="22"/>
+          <w:szCs w:val="22"/>
         </w:rPr>
         <w:commentReference w:id="1"/>
       </w:r>
-      <w:commentRangeEnd w:id="2"/>
-      <w:r>
-        <w:rPr>
-          <w:rStyle w:val="CommentReference"/>
-        </w:rPr>
-        <w:commentReference w:id="2"/>
-      </w:r>
-      <w:r>
-        <w:rPr>
-          <w:rFonts w:ascii="Garamond" w:hAnsi="Garamond"/>
-          <w:sz w:val="16"/>
-          <w:szCs w:val="16"/>
+      <w:r>
+        <w:rPr>
+          <w:rFonts w:ascii="Garamond" w:hAnsi="Garamond"/>
+          <w:sz w:val="22"/>
+          <w:szCs w:val="22"/>
         </w:rPr>
         <w:t xml:space="preserve"> 1 and 2 (</w:t>
       </w:r>
       <w:r>
         <w:rPr>
           <w:rFonts w:ascii="Garamond" w:hAnsi="Garamond"/>
-          <w:sz w:val="16"/>
-          <w:szCs w:val="16"/>
+          <w:sz w:val="22"/>
+          <w:szCs w:val="22"/>
         </w:rPr>
         <w:t>68.39</w:t>
       </w:r>
       <w:r>
         <w:rPr>
           <w:rFonts w:ascii="Garamond" w:hAnsi="Garamond"/>
-          <w:sz w:val="16"/>
-          <w:szCs w:val="16"/>
+          <w:sz w:val="22"/>
+          <w:szCs w:val="22"/>
         </w:rPr>
         <w:t>% of variance), as well as between principal components 2 and 3 (</w:t>
       </w:r>
       <w:r>
         <w:rPr>
           <w:rFonts w:ascii="Garamond" w:hAnsi="Garamond"/>
-          <w:sz w:val="16"/>
-          <w:szCs w:val="16"/>
+          <w:sz w:val="22"/>
+          <w:szCs w:val="22"/>
         </w:rPr>
         <w:t>31.16%</w:t>
       </w:r>
       <w:r>
         <w:rPr>
           <w:rFonts w:ascii="Garamond" w:hAnsi="Garamond"/>
-          <w:sz w:val="16"/>
-          <w:szCs w:val="16"/>
+          <w:sz w:val="22"/>
+          <w:szCs w:val="22"/>
         </w:rPr>
         <w:t xml:space="preserve"> </w:t>
       </w:r>
       <w:r>
         <w:rPr>
           <w:rFonts w:ascii="Garamond" w:hAnsi="Garamond"/>
-          <w:sz w:val="16"/>
-          <w:szCs w:val="16"/>
+          <w:sz w:val="22"/>
+          <w:szCs w:val="22"/>
         </w:rPr>
         <w:t xml:space="preserve">of </w:t>
       </w:r>
       <w:r>
         <w:rPr>
           <w:rFonts w:ascii="Garamond" w:hAnsi="Garamond"/>
-          <w:sz w:val="16"/>
-          <w:szCs w:val="16"/>
+          <w:sz w:val="22"/>
+          <w:szCs w:val="22"/>
         </w:rPr>
         <w:t xml:space="preserve">variance). There is </w:t>
       </w:r>
       <w:r>
         <w:rPr>
           <w:rFonts w:ascii="Garamond" w:hAnsi="Garamond"/>
-          <w:sz w:val="16"/>
-          <w:szCs w:val="16"/>
+          <w:sz w:val="22"/>
+          <w:szCs w:val="22"/>
         </w:rPr>
         <w:t>s</w:t>
       </w:r>
       <w:r>
         <w:rPr>
           <w:rFonts w:ascii="Garamond" w:hAnsi="Garamond"/>
-          <w:sz w:val="16"/>
-          <w:szCs w:val="16"/>
+          <w:sz w:val="22"/>
+          <w:szCs w:val="22"/>
         </w:rPr>
         <w:t>ome overlap between all three watersheds in both cases. B) Sample otolith LA timeseries colored by the absolute value of the PCA loadings at associated</w:t>
       </w:r>
       <w:r>
         <w:rPr>
           <w:rFonts w:ascii="Garamond" w:hAnsi="Garamond"/>
-          <w:sz w:val="16"/>
-          <w:szCs w:val="16"/>
+          <w:sz w:val="22"/>
+          <w:szCs w:val="22"/>
         </w:rPr>
         <w:t xml:space="preserve"> timeseries</w:t>
       </w:r>
       <w:r>
         <w:rPr>
           <w:rFonts w:ascii="Garamond" w:hAnsi="Garamond"/>
-          <w:sz w:val="16"/>
-          <w:szCs w:val="16"/>
+          <w:sz w:val="22"/>
+          <w:szCs w:val="22"/>
         </w:rPr>
         <w:t xml:space="preserve"> indices. PC1 (top row) shows high loading on the middle section of the timeseries after the natal origin region. PC2 is driven by the region of the timeseries towards the marine entry</w:t>
       </w:r>
       <w:r>
         <w:rPr>
           <w:rFonts w:ascii="Garamond" w:hAnsi="Garamond"/>
-          <w:sz w:val="16"/>
-          <w:szCs w:val="16"/>
+          <w:sz w:val="22"/>
+          <w:szCs w:val="22"/>
         </w:rPr>
         <w:t xml:space="preserve">, likely the result of mainstem migration to the ocean. </w:t>
       </w:r>
       <w:r>
         <w:rPr>
           <w:rFonts w:ascii="Garamond" w:hAnsi="Garamond"/>
-          <w:sz w:val="16"/>
-          <w:szCs w:val="16"/>
-        </w:rPr>
-        <w:t>PC3 is driven by the very beginning of the timeseries, which is the region associated with the natal origin.</w:t>
-      </w:r>
-      <w:r>
-        <w:rPr>
-          <w:rFonts w:ascii="Garamond" w:hAnsi="Garamond"/>
-          <w:b/>
-          <w:bCs/>
-          <w:sz w:val="16"/>
-          <w:szCs w:val="16"/>
-        </w:rPr>
-        <w:t xml:space="preserve"> </w:t>
-      </w:r>
-      <w:r>
-        <w:rPr>
-          <w:rFonts w:ascii="Garamond" w:hAnsi="Garamond"/>
-          <w:sz w:val="16"/>
-          <w:szCs w:val="16"/>
+          <w:sz w:val="22"/>
+          <w:szCs w:val="22"/>
+        </w:rPr>
+        <w:t xml:space="preserve">Separation along </w:t>
+      </w:r>
+      <w:r>
+        <w:rPr>
+          <w:rFonts w:ascii="Garamond" w:hAnsi="Garamond"/>
+          <w:sz w:val="22"/>
+          <w:szCs w:val="22"/>
+        </w:rPr>
+        <w:t xml:space="preserve">PC3 is driven by the very beginning of the timeseries, which is the region associated with the natal origin. </w:t>
+      </w:r>
+      <w:r>
+        <w:rPr>
+          <w:rFonts w:ascii="Garamond" w:hAnsi="Garamond"/>
+          <w:sz w:val="22"/>
+          <w:szCs w:val="22"/>
+        </w:rPr>
+        <w:t xml:space="preserve">Notably, </w:t>
+      </w:r>
+      <w:r>
+        <w:rPr>
+          <w:rFonts w:ascii="Garamond" w:hAnsi="Garamond"/>
+          <w:sz w:val="22"/>
+          <w:szCs w:val="22"/>
         </w:rPr>
         <w:t>Yukon individuals from the CWAK region contain a less pronounces mainstem signal as compared to their counterpart from the upper or middle Yukon genetic groups.</w:t>
       </w:r>
@@ -1239,9 +1451,9 @@
         </w:rPr>
         <w:lastRenderedPageBreak/>
         <w:drawing>
-          <wp:inline distT="0" distB="0" distL="0" distR="0" wp14:anchorId="2F467EF6" wp14:editId="50F178E6">
-            <wp:extent cx="6310860" cy="3155430"/>
-            <wp:effectExtent l="0" t="0" r="1270" b="0"/>
+          <wp:inline distT="0" distB="0" distL="0" distR="0" wp14:anchorId="2F467EF6" wp14:editId="715EE988">
+            <wp:extent cx="6415719" cy="3207860"/>
+            <wp:effectExtent l="0" t="0" r="0" b="5715"/>
             <wp:docPr id="1963404633" name="Picture 4" descr="A graph of a number of data&#10;&#10;AI-generated content may be incorrect."/>
             <wp:cNvGraphicFramePr>
               <a:graphicFrameLocks xmlns:a="http://schemas.openxmlformats.org/drawingml/2006/main" noChangeAspect="1"/>
@@ -1268,7 +1480,7 @@
                   <pic:spPr>
                     <a:xfrm>
                       <a:off x="0" y="0"/>
-                      <a:ext cx="6328522" cy="3164261"/>
+                      <a:ext cx="6502262" cy="3251131"/>
                     </a:xfrm>
                     <a:prstGeom prst="rect">
                       <a:avLst/>
@@ -1285,29 +1497,83 @@
       <w:pPr>
         <w:rPr>
           <w:rFonts w:ascii="Garamond" w:hAnsi="Garamond"/>
+          <w:sz w:val="22"/>
+          <w:szCs w:val="22"/>
+        </w:rPr>
+      </w:pPr>
+      <w:r>
+        <w:rPr>
+          <w:rFonts w:ascii="Garamond" w:hAnsi="Garamond"/>
           <w:b/>
           <w:bCs/>
-          <w:sz w:val="16"/>
-          <w:szCs w:val="16"/>
-        </w:rPr>
-      </w:pPr>
-      <w:r>
-        <w:rPr>
-          <w:rFonts w:ascii="Garamond" w:hAnsi="Garamond"/>
-          <w:b/>
-          <w:bCs/>
-          <w:sz w:val="16"/>
-          <w:szCs w:val="16"/>
+          <w:sz w:val="22"/>
+          <w:szCs w:val="22"/>
         </w:rPr>
         <w:t xml:space="preserve">Figure 6: </w:t>
       </w:r>
       <w:r>
         <w:rPr>
           <w:rFonts w:ascii="Garamond" w:hAnsi="Garamond"/>
-          <w:sz w:val="16"/>
-          <w:szCs w:val="16"/>
-        </w:rPr>
-        <w:t xml:space="preserve">Classification accuracy with an imposed probability threshold (60-90%). Grey dashed lines represent the overall accuracy above the threshold at each point. Colored lines illustrate the class-specific probability at that threshold </w:t>
+          <w:sz w:val="22"/>
+          <w:szCs w:val="22"/>
+        </w:rPr>
+        <w:t xml:space="preserve">Classification accuracy with an imposed probability threshold (60-90%). </w:t>
+      </w:r>
+      <w:r>
+        <w:rPr>
+          <w:rFonts w:ascii="Garamond" w:hAnsi="Garamond"/>
+          <w:sz w:val="22"/>
+          <w:szCs w:val="22"/>
+        </w:rPr>
+        <w:t>Points</w:t>
+      </w:r>
+      <w:r>
+        <w:rPr>
+          <w:rFonts w:ascii="Garamond" w:hAnsi="Garamond"/>
+          <w:sz w:val="22"/>
+          <w:szCs w:val="22"/>
+        </w:rPr>
+        <w:t xml:space="preserve"> </w:t>
+      </w:r>
+      <w:r>
+        <w:rPr>
+          <w:rFonts w:ascii="Garamond" w:hAnsi="Garamond"/>
+          <w:sz w:val="22"/>
+          <w:szCs w:val="22"/>
+        </w:rPr>
+        <w:t xml:space="preserve">indicate the percentage of correctly </w:t>
+      </w:r>
+      <w:r>
+        <w:rPr>
+          <w:rFonts w:ascii="Garamond" w:hAnsi="Garamond"/>
+          <w:sz w:val="22"/>
+          <w:szCs w:val="22"/>
+        </w:rPr>
+        <w:t xml:space="preserve">classified individuals with a calibrated probability value above the given threshold value. </w:t>
+      </w:r>
+      <w:r>
+        <w:rPr>
+          <w:rFonts w:ascii="Garamond" w:hAnsi="Garamond"/>
+          <w:sz w:val="22"/>
+          <w:szCs w:val="22"/>
+        </w:rPr>
+        <w:t>Grey dashed lines represent the overall accuracy</w:t>
+      </w:r>
+      <w:r>
+        <w:rPr>
+          <w:rFonts w:ascii="Garamond" w:hAnsi="Garamond"/>
+          <w:sz w:val="22"/>
+          <w:szCs w:val="22"/>
+        </w:rPr>
+        <w:t>, whereas c</w:t>
+      </w:r>
+      <w:r>
+        <w:rPr>
+          <w:rFonts w:ascii="Garamond" w:hAnsi="Garamond"/>
+          <w:sz w:val="22"/>
+          <w:szCs w:val="22"/>
+        </w:rPr>
+        <w:t xml:space="preserve">olored lines illustrate the class-specific probability at that threshold </w:t>
       </w:r>
     </w:p>
     <w:sectPr>
@@ -1322,8 +1588,11 @@
 
 <file path=word/comments.xml><?xml version="1.0" encoding="utf-8"?>
 <w:comments xmlns:wpc="http://schemas.microsoft.com/office/word/2010/wordprocessingCanvas" xmlns:cx="http://schemas.microsoft.com/office/drawing/2014/chartex" xmlns:cx1="http://schemas.microsoft.com/office/drawing/2015/9/8/chartex" xmlns:cx2="http://schemas.microsoft.com/office/drawing/2015/10/21/chartex" xmlns:cx3="http://schemas.microsoft.com/office/drawing/2016/5/9/chartex" xmlns:cx4="http://schemas.microsoft.com/office/drawing/2016/5/10/chartex" xmlns:cx5="http://schemas.microsoft.com/office/drawing/2016/5/11/chartex" xmlns:cx6="http://schemas.microsoft.com/office/drawing/2016/5/12/chartex" xmlns:cx7="http://schemas.microsoft.com/office/drawing/2016/5/13/chartex" xmlns:cx8="http://schemas.microsoft.com/office/drawing/2016/5/14/chartex" xmlns:mc="http://schemas.openxmlformats.org/markup-compatibility/2006" xmlns:aink="http://schemas.microsoft.com/office/drawing/2016/ink" xmlns:am3d="http://schemas.microsoft.com/office/drawing/2017/model3d" xmlns:o="urn:schemas-microsoft-com:office:office" xmlns:oel="http://schemas.microsoft.com/office/2019/extlst" xmlns:r="http://schemas.openxmlformats.org/officeDocument/2006/relationships" xmlns:m="http://schemas.openxmlformats.org/officeDocument/2006/math" xmlns:v="urn:schemas-microsoft-com:vml" xmlns:wp14="http://schemas.microsoft.com/office/word/2010/wordprocessingDrawing" xmlns:wp="http://schemas.openxmlformats.org/drawingml/2006/wordprocessingDrawing" xmlns:w10="urn:schemas-microsoft-com:office:word" xmlns:w="http://schemas.openxmlformats.org/wordprocessingml/2006/main" xmlns:w14="http://schemas.microsoft.com/office/word/2010/wordml" xmlns:w15="http://schemas.microsoft.com/office/word/2012/wordml" xmlns:w16cex="http://schemas.microsoft.com/office/word/2018/wordml/cex" xmlns:w16cid="http://schemas.microsoft.com/office/word/2016/wordml/cid" xmlns:w16="http://schemas.microsoft.com/office/word/2018/wordml" xmlns:w16du="http://schemas.microsoft.com/office/word/2023/wordml/word16du" xmlns:w16sdtdh="http://schemas.microsoft.com/office/word/2020/wordml/sdtdatahash" xmlns:w16sdtfl="http://schemas.microsoft.com/office/word/2024/wordml/sdtformatlock" xmlns:w16se="http://schemas.microsoft.com/office/word/2015/wordml/symex" xmlns:wpg="http://schemas.microsoft.com/office/word/2010/wordprocessingGroup" xmlns:wpi="http://schemas.microsoft.com/office/word/2010/wordprocessingInk" xmlns:wne="http://schemas.microsoft.com/office/word/2006/wordml" xmlns:wps="http://schemas.microsoft.com/office/word/2010/wordprocessingShape" mc:Ignorable="w14 w15 w16se w16cid w16 w16cex w16sdtdh w16sdtfl w16du wp14">
-  <w:comment w:id="0" w:author="Benjamin J. Makhlouf" w:date="2025-09-07T14:23:00Z" w:initials="b">
-    <w:p>
+  <w:comment w:id="0" w:author="Daniel Schindler" w:date="2025-10-06T11:10:00Z" w:initials="DS">
+    <w:p>
+      <w:pPr>
+        <w:pStyle w:val="CommentText"/>
+      </w:pPr>
       <w:r>
         <w:rPr>
           <w:rStyle w:val="CommentReference"/>
@@ -1331,31 +1600,11 @@
         <w:annotationRef/>
       </w:r>
       <w:r>
-        <w:rPr>
-          <w:sz w:val="20"/>
-          <w:szCs w:val="20"/>
-        </w:rPr>
-        <w:t xml:space="preserve">Working on these. I'll change the color scheme of the isoscape and find a way to show the CWAK geographic region. </w:t>
+        <w:t>This is a cool result which is not particularly well highlighted in the Discussion. Might want to think about how to highlight these results more.</w:t>
       </w:r>
     </w:p>
   </w:comment>
   <w:comment w:id="1" w:author="Daniel Schindler" w:date="2025-10-06T11:10:00Z" w:initials="DS">
-    <w:p>
-      <w:pPr>
-        <w:pStyle w:val="CommentText"/>
-      </w:pPr>
-      <w:r>
-        <w:rPr>
-          <w:rStyle w:val="CommentReference"/>
-        </w:rPr>
-        <w:annotationRef/>
-      </w:r>
-      <w:r>
-        <w:t>This is a cool result which is not particularly well highlighted in the Discussion. Might want to think about how to highlight these results more.</w:t>
-      </w:r>
-    </w:p>
-  </w:comment>
-  <w:comment w:id="2" w:author="Daniel Schindler" w:date="2025-10-06T11:10:00Z" w:initials="DS">
     <w:p>
       <w:pPr>
         <w:pStyle w:val="CommentText"/>
@@ -1376,7 +1625,6 @@
 
 <file path=word/commentsExtended.xml><?xml version="1.0" encoding="utf-8"?>
 <w15:commentsEx xmlns:wpc="http://schemas.microsoft.com/office/word/2010/wordprocessingCanvas" xmlns:cx="http://schemas.microsoft.com/office/drawing/2014/chartex" xmlns:cx1="http://schemas.microsoft.com/office/drawing/2015/9/8/chartex" xmlns:cx2="http://schemas.microsoft.com/office/drawing/2015/10/21/chartex" xmlns:cx3="http://schemas.microsoft.com/office/drawing/2016/5/9/chartex" xmlns:cx4="http://schemas.microsoft.com/office/drawing/2016/5/10/chartex" xmlns:cx5="http://schemas.microsoft.com/office/drawing/2016/5/11/chartex" xmlns:cx6="http://schemas.microsoft.com/office/drawing/2016/5/12/chartex" xmlns:cx7="http://schemas.microsoft.com/office/drawing/2016/5/13/chartex" xmlns:cx8="http://schemas.microsoft.com/office/drawing/2016/5/14/chartex" xmlns:mc="http://schemas.openxmlformats.org/markup-compatibility/2006" xmlns:aink="http://schemas.microsoft.com/office/drawing/2016/ink" xmlns:am3d="http://schemas.microsoft.com/office/drawing/2017/model3d" xmlns:o="urn:schemas-microsoft-com:office:office" xmlns:oel="http://schemas.microsoft.com/office/2019/extlst" xmlns:r="http://schemas.openxmlformats.org/officeDocument/2006/relationships" xmlns:m="http://schemas.openxmlformats.org/officeDocument/2006/math" xmlns:v="urn:schemas-microsoft-com:vml" xmlns:wp14="http://schemas.microsoft.com/office/word/2010/wordprocessingDrawing" xmlns:wp="http://schemas.openxmlformats.org/drawingml/2006/wordprocessingDrawing" xmlns:w10="urn:schemas-microsoft-com:office:word" xmlns:w="http://schemas.openxmlformats.org/wordprocessingml/2006/main" xmlns:w14="http://schemas.microsoft.com/office/word/2010/wordml" xmlns:w15="http://schemas.microsoft.com/office/word/2012/wordml" xmlns:w16cex="http://schemas.microsoft.com/office/word/2018/wordml/cex" xmlns:w16cid="http://schemas.microsoft.com/office/word/2016/wordml/cid" xmlns:w16="http://schemas.microsoft.com/office/word/2018/wordml" xmlns:w16du="http://schemas.microsoft.com/office/word/2023/wordml/word16du" xmlns:w16sdtdh="http://schemas.microsoft.com/office/word/2020/wordml/sdtdatahash" xmlns:w16sdtfl="http://schemas.microsoft.com/office/word/2024/wordml/sdtformatlock" xmlns:w16se="http://schemas.microsoft.com/office/word/2015/wordml/symex" xmlns:wpg="http://schemas.microsoft.com/office/word/2010/wordprocessingGroup" xmlns:wpi="http://schemas.microsoft.com/office/word/2010/wordprocessingInk" xmlns:wne="http://schemas.microsoft.com/office/word/2006/wordml" xmlns:wps="http://schemas.microsoft.com/office/word/2010/wordprocessingShape" mc:Ignorable="w14 w15 w16se w16cid w16 w16cex w16sdtdh w16sdtfl w16du wp14">
-  <w15:commentEx w15:paraId="215C4347" w15:done="1"/>
   <w15:commentEx w15:paraId="0DD29C92" w15:done="0"/>
   <w15:commentEx w15:paraId="40117E77" w15:paraIdParent="0DD29C92" w15:done="0"/>
 </w15:commentsEx>
@@ -1384,7 +1632,6 @@
 
 <file path=word/commentsExtensible.xml><?xml version="1.0" encoding="utf-8"?>
 <w16cex:commentsExtensible xmlns:wpc="http://schemas.microsoft.com/office/word/2010/wordprocessingCanvas" xmlns:cx="http://schemas.microsoft.com/office/drawing/2014/chartex" xmlns:cx1="http://schemas.microsoft.com/office/drawing/2015/9/8/chartex" xmlns:cx2="http://schemas.microsoft.com/office/drawing/2015/10/21/chartex" xmlns:cx3="http://schemas.microsoft.com/office/drawing/2016/5/9/chartex" xmlns:cx4="http://schemas.microsoft.com/office/drawing/2016/5/10/chartex" xmlns:cx5="http://schemas.microsoft.com/office/drawing/2016/5/11/chartex" xmlns:cx6="http://schemas.microsoft.com/office/drawing/2016/5/12/chartex" xmlns:cx7="http://schemas.microsoft.com/office/drawing/2016/5/13/chartex" xmlns:cx8="http://schemas.microsoft.com/office/drawing/2016/5/14/chartex" xmlns:cr="http://schemas.microsoft.com/office/comments/2020/reactions" xmlns:mc="http://schemas.openxmlformats.org/markup-compatibility/2006" xmlns:aink="http://schemas.microsoft.com/office/drawing/2016/ink" xmlns:am3d="http://schemas.microsoft.com/office/drawing/2017/model3d" xmlns:o="urn:schemas-microsoft-com:office:office" xmlns:oel="http://schemas.microsoft.com/office/2019/extlst" xmlns:r="http://schemas.openxmlformats.org/officeDocument/2006/relationships" xmlns:m="http://schemas.openxmlformats.org/officeDocument/2006/math" xmlns:v="urn:schemas-microsoft-com:vml" xmlns:wp14="http://schemas.microsoft.com/office/word/2010/wordprocessingDrawing" xmlns:wp="http://schemas.openxmlformats.org/drawingml/2006/wordprocessingDrawing" xmlns:w10="urn:schemas-microsoft-com:office:word" xmlns:w="http://schemas.openxmlformats.org/wordprocessingml/2006/main" xmlns:w14="http://schemas.microsoft.com/office/word/2010/wordml" xmlns:w15="http://schemas.microsoft.com/office/word/2012/wordml" xmlns:w16cex="http://schemas.microsoft.com/office/word/2018/wordml/cex" xmlns:w16cid="http://schemas.microsoft.com/office/word/2016/wordml/cid" xmlns:w16="http://schemas.microsoft.com/office/word/2018/wordml" xmlns:w16du="http://schemas.microsoft.com/office/word/2023/wordml/word16du" xmlns:w16sdtdh="http://schemas.microsoft.com/office/word/2020/wordml/sdtdatahash" xmlns:w16sdtfl="http://schemas.microsoft.com/office/word/2024/wordml/sdtformatlock" xmlns:w16se="http://schemas.microsoft.com/office/word/2015/wordml/symex" xmlns:wpg="http://schemas.microsoft.com/office/word/2010/wordprocessingGroup" xmlns:wpi="http://schemas.microsoft.com/office/word/2010/wordprocessingInk" xmlns:wne="http://schemas.microsoft.com/office/word/2006/wordml" xmlns:wps="http://schemas.microsoft.com/office/word/2010/wordprocessingShape" mc:Ignorable="w14 w15 w16se w16cid w16 w16cex w16sdtdh w16sdtfl cr w16du wp14">
-  <w16cex:commentExtensible w16cex:durableId="282C9BDF" w16cex:dateUtc="2025-09-07T21:23:00Z"/>
   <w16cex:commentExtensible w16cex:durableId="11D61FD6" w16cex:dateUtc="2025-10-06T18:10:00Z"/>
   <w16cex:commentExtensible w16cex:durableId="7531CF4E" w16cex:dateUtc="2025-10-06T18:10:00Z"/>
 </w16cex:commentsExtensible>
@@ -1392,7 +1639,6 @@
 
 <file path=word/commentsIds.xml><?xml version="1.0" encoding="utf-8"?>
 <w16cid:commentsIds xmlns:wpc="http://schemas.microsoft.com/office/word/2010/wordprocessingCanvas" xmlns:cx="http://schemas.microsoft.com/office/drawing/2014/chartex" xmlns:cx1="http://schemas.microsoft.com/office/drawing/2015/9/8/chartex" xmlns:cx2="http://schemas.microsoft.com/office/drawing/2015/10/21/chartex" xmlns:cx3="http://schemas.microsoft.com/office/drawing/2016/5/9/chartex" xmlns:cx4="http://schemas.microsoft.com/office/drawing/2016/5/10/chartex" xmlns:cx5="http://schemas.microsoft.com/office/drawing/2016/5/11/chartex" xmlns:cx6="http://schemas.microsoft.com/office/drawing/2016/5/12/chartex" xmlns:cx7="http://schemas.microsoft.com/office/drawing/2016/5/13/chartex" xmlns:cx8="http://schemas.microsoft.com/office/drawing/2016/5/14/chartex" xmlns:mc="http://schemas.openxmlformats.org/markup-compatibility/2006" xmlns:aink="http://schemas.microsoft.com/office/drawing/2016/ink" xmlns:am3d="http://schemas.microsoft.com/office/drawing/2017/model3d" xmlns:o="urn:schemas-microsoft-com:office:office" xmlns:oel="http://schemas.microsoft.com/office/2019/extlst" xmlns:r="http://schemas.openxmlformats.org/officeDocument/2006/relationships" xmlns:m="http://schemas.openxmlformats.org/officeDocument/2006/math" xmlns:v="urn:schemas-microsoft-com:vml" xmlns:wp14="http://schemas.microsoft.com/office/word/2010/wordprocessingDrawing" xmlns:wp="http://schemas.openxmlformats.org/drawingml/2006/wordprocessingDrawing" xmlns:w10="urn:schemas-microsoft-com:office:word" xmlns:w="http://schemas.openxmlformats.org/wordprocessingml/2006/main" xmlns:w14="http://schemas.microsoft.com/office/word/2010/wordml" xmlns:w15="http://schemas.microsoft.com/office/word/2012/wordml" xmlns:w16cex="http://schemas.microsoft.com/office/word/2018/wordml/cex" xmlns:w16cid="http://schemas.microsoft.com/office/word/2016/wordml/cid" xmlns:w16="http://schemas.microsoft.com/office/word/2018/wordml" xmlns:w16du="http://schemas.microsoft.com/office/word/2023/wordml/word16du" xmlns:w16sdtdh="http://schemas.microsoft.com/office/word/2020/wordml/sdtdatahash" xmlns:w16sdtfl="http://schemas.microsoft.com/office/word/2024/wordml/sdtformatlock" xmlns:w16se="http://schemas.microsoft.com/office/word/2015/wordml/symex" xmlns:wpg="http://schemas.microsoft.com/office/word/2010/wordprocessingGroup" xmlns:wpi="http://schemas.microsoft.com/office/word/2010/wordprocessingInk" xmlns:wne="http://schemas.microsoft.com/office/word/2006/wordml" xmlns:wps="http://schemas.microsoft.com/office/word/2010/wordprocessingShape" mc:Ignorable="w14 w15 w16se w16cid w16 w16cex w16sdtdh w16sdtfl w16du wp14">
-  <w16cid:commentId w16cid:paraId="215C4347" w16cid:durableId="282C9BDF"/>
   <w16cid:commentId w16cid:paraId="0DD29C92" w16cid:durableId="11D61FD6"/>
   <w16cid:commentId w16cid:paraId="40117E77" w16cid:durableId="7531CF4E"/>
 </w16cid:commentsIds>
@@ -1400,9 +1646,6 @@
 
 <file path=word/people.xml><?xml version="1.0" encoding="utf-8"?>
 <w15:people xmlns:wpc="http://schemas.microsoft.com/office/word/2010/wordprocessingCanvas" xmlns:cx="http://schemas.microsoft.com/office/drawing/2014/chartex" xmlns:cx1="http://schemas.microsoft.com/office/drawing/2015/9/8/chartex" xmlns:cx2="http://schemas.microsoft.com/office/drawing/2015/10/21/chartex" xmlns:cx3="http://schemas.microsoft.com/office/drawing/2016/5/9/chartex" xmlns:cx4="http://schemas.microsoft.com/office/drawing/2016/5/10/chartex" xmlns:cx5="http://schemas.microsoft.com/office/drawing/2016/5/11/chartex" xmlns:cx6="http://schemas.microsoft.com/office/drawing/2016/5/12/chartex" xmlns:cx7="http://schemas.microsoft.com/office/drawing/2016/5/13/chartex" xmlns:cx8="http://schemas.microsoft.com/office/drawing/2016/5/14/chartex" xmlns:mc="http://schemas.openxmlformats.org/markup-compatibility/2006" xmlns:aink="http://schemas.microsoft.com/office/drawing/2016/ink" xmlns:am3d="http://schemas.microsoft.com/office/drawing/2017/model3d" xmlns:o="urn:schemas-microsoft-com:office:office" xmlns:oel="http://schemas.microsoft.com/office/2019/extlst" xmlns:r="http://schemas.openxmlformats.org/officeDocument/2006/relationships" xmlns:m="http://schemas.openxmlformats.org/officeDocument/2006/math" xmlns:v="urn:schemas-microsoft-com:vml" xmlns:wp14="http://schemas.microsoft.com/office/word/2010/wordprocessingDrawing" xmlns:wp="http://schemas.openxmlformats.org/drawingml/2006/wordprocessingDrawing" xmlns:w10="urn:schemas-microsoft-com:office:word" xmlns:w="http://schemas.openxmlformats.org/wordprocessingml/2006/main" xmlns:w14="http://schemas.microsoft.com/office/word/2010/wordml" xmlns:w15="http://schemas.microsoft.com/office/word/2012/wordml" xmlns:w16cex="http://schemas.microsoft.com/office/word/2018/wordml/cex" xmlns:w16cid="http://schemas.microsoft.com/office/word/2016/wordml/cid" xmlns:w16="http://schemas.microsoft.com/office/word/2018/wordml" xmlns:w16du="http://schemas.microsoft.com/office/word/2023/wordml/word16du" xmlns:w16sdtdh="http://schemas.microsoft.com/office/word/2020/wordml/sdtdatahash" xmlns:w16sdtfl="http://schemas.microsoft.com/office/word/2024/wordml/sdtformatlock" xmlns:w16se="http://schemas.microsoft.com/office/word/2015/wordml/symex" xmlns:wpg="http://schemas.microsoft.com/office/word/2010/wordprocessingGroup" xmlns:wpi="http://schemas.microsoft.com/office/word/2010/wordprocessingInk" xmlns:wne="http://schemas.microsoft.com/office/word/2006/wordml" xmlns:wps="http://schemas.microsoft.com/office/word/2010/wordprocessingShape" mc:Ignorable="w14 w15 w16se w16cid w16 w16cex w16sdtdh w16sdtfl w16du wp14">
-  <w15:person w15:author="Benjamin J. Makhlouf">
-    <w15:presenceInfo w15:providerId="AD" w15:userId="S::bmak29@uw.edu::e2d819b1-db99-41fc-888c-ad60b4d561ad"/>
-  </w15:person>
   <w15:person w15:author="Daniel Schindler">
     <w15:presenceInfo w15:providerId="AD" w15:userId="S::deschind@uw.edu::638f7977-a89c-40df-b85e-dc804ddb30d9"/>
   </w15:person>

</xml_diff>

<commit_message>
added two panel figures as one
</commit_message>
<xml_diff>
--- a/Docs/FIGURES Machine learning applied to otolith timeseries data to discriminate river of origin for Western Alaska Salmon.docx
+++ b/Docs/FIGURES Machine learning applied to otolith timeseries data to discriminate river of origin for Western Alaska Salmon.docx
@@ -1026,10 +1026,10 @@
         </w:rPr>
         <w:lastRenderedPageBreak/>
         <w:drawing>
-          <wp:inline distT="0" distB="0" distL="0" distR="0" wp14:anchorId="6BCD3F3F" wp14:editId="7EB9A63C">
-            <wp:extent cx="6409834" cy="3273398"/>
-            <wp:effectExtent l="0" t="0" r="3810" b="3810"/>
-            <wp:docPr id="219536095" name="Picture 2" descr="A group of graphs showing different types of data&#10;&#10;AI-generated content may be incorrect."/>
+          <wp:inline distT="0" distB="0" distL="0" distR="0" wp14:anchorId="741AD416" wp14:editId="6E9D9EA4">
+            <wp:extent cx="6290068" cy="3235084"/>
+            <wp:effectExtent l="0" t="0" r="0" b="3810"/>
+            <wp:docPr id="988652365" name="Picture 1" descr="A graph of different colored lines&#10;&#10;AI-generated content may be incorrect."/>
             <wp:cNvGraphicFramePr>
               <a:graphicFrameLocks xmlns:a="http://schemas.openxmlformats.org/drawingml/2006/main" noChangeAspect="1"/>
             </wp:cNvGraphicFramePr>
@@ -1037,7 +1037,7 @@
               <a:graphicData uri="http://schemas.openxmlformats.org/drawingml/2006/picture">
                 <pic:pic xmlns:pic="http://schemas.openxmlformats.org/drawingml/2006/picture">
                   <pic:nvPicPr>
-                    <pic:cNvPr id="219536095" name="Picture 2" descr="A group of graphs showing different types of data&#10;&#10;AI-generated content may be incorrect."/>
+                    <pic:cNvPr id="988652365" name="Picture 1" descr="A graph of different colored lines&#10;&#10;AI-generated content may be incorrect."/>
                     <pic:cNvPicPr/>
                   </pic:nvPicPr>
                   <pic:blipFill>
@@ -1055,7 +1055,7 @@
                   <pic:spPr>
                     <a:xfrm>
                       <a:off x="0" y="0"/>
-                      <a:ext cx="6438129" cy="3287848"/>
+                      <a:ext cx="6305638" cy="3243092"/>
                     </a:xfrm>
                     <a:prstGeom prst="rect">
                       <a:avLst/>
@@ -1451,9 +1451,9 @@
         </w:rPr>
         <w:lastRenderedPageBreak/>
         <w:drawing>
-          <wp:inline distT="0" distB="0" distL="0" distR="0" wp14:anchorId="2F467EF6" wp14:editId="715EE988">
-            <wp:extent cx="6415719" cy="3207860"/>
-            <wp:effectExtent l="0" t="0" r="0" b="5715"/>
+          <wp:inline distT="0" distB="0" distL="0" distR="0" wp14:anchorId="2F467EF6" wp14:editId="66C4ACFB">
+            <wp:extent cx="6221186" cy="3110593"/>
+            <wp:effectExtent l="0" t="0" r="1905" b="1270"/>
             <wp:docPr id="1963404633" name="Picture 4" descr="A graph of a number of data&#10;&#10;AI-generated content may be incorrect."/>
             <wp:cNvGraphicFramePr>
               <a:graphicFrameLocks xmlns:a="http://schemas.openxmlformats.org/drawingml/2006/main" noChangeAspect="1"/>
@@ -1480,7 +1480,7 @@
                   <pic:spPr>
                     <a:xfrm>
                       <a:off x="0" y="0"/>
-                      <a:ext cx="6502262" cy="3251131"/>
+                      <a:ext cx="6381193" cy="3190596"/>
                     </a:xfrm>
                     <a:prstGeom prst="rect">
                       <a:avLst/>
@@ -1625,8 +1625,8 @@
 
 <file path=word/commentsExtended.xml><?xml version="1.0" encoding="utf-8"?>
 <w15:commentsEx xmlns:wpc="http://schemas.microsoft.com/office/word/2010/wordprocessingCanvas" xmlns:cx="http://schemas.microsoft.com/office/drawing/2014/chartex" xmlns:cx1="http://schemas.microsoft.com/office/drawing/2015/9/8/chartex" xmlns:cx2="http://schemas.microsoft.com/office/drawing/2015/10/21/chartex" xmlns:cx3="http://schemas.microsoft.com/office/drawing/2016/5/9/chartex" xmlns:cx4="http://schemas.microsoft.com/office/drawing/2016/5/10/chartex" xmlns:cx5="http://schemas.microsoft.com/office/drawing/2016/5/11/chartex" xmlns:cx6="http://schemas.microsoft.com/office/drawing/2016/5/12/chartex" xmlns:cx7="http://schemas.microsoft.com/office/drawing/2016/5/13/chartex" xmlns:cx8="http://schemas.microsoft.com/office/drawing/2016/5/14/chartex" xmlns:mc="http://schemas.openxmlformats.org/markup-compatibility/2006" xmlns:aink="http://schemas.microsoft.com/office/drawing/2016/ink" xmlns:am3d="http://schemas.microsoft.com/office/drawing/2017/model3d" xmlns:o="urn:schemas-microsoft-com:office:office" xmlns:oel="http://schemas.microsoft.com/office/2019/extlst" xmlns:r="http://schemas.openxmlformats.org/officeDocument/2006/relationships" xmlns:m="http://schemas.openxmlformats.org/officeDocument/2006/math" xmlns:v="urn:schemas-microsoft-com:vml" xmlns:wp14="http://schemas.microsoft.com/office/word/2010/wordprocessingDrawing" xmlns:wp="http://schemas.openxmlformats.org/drawingml/2006/wordprocessingDrawing" xmlns:w10="urn:schemas-microsoft-com:office:word" xmlns:w="http://schemas.openxmlformats.org/wordprocessingml/2006/main" xmlns:w14="http://schemas.microsoft.com/office/word/2010/wordml" xmlns:w15="http://schemas.microsoft.com/office/word/2012/wordml" xmlns:w16cex="http://schemas.microsoft.com/office/word/2018/wordml/cex" xmlns:w16cid="http://schemas.microsoft.com/office/word/2016/wordml/cid" xmlns:w16="http://schemas.microsoft.com/office/word/2018/wordml" xmlns:w16du="http://schemas.microsoft.com/office/word/2023/wordml/word16du" xmlns:w16sdtdh="http://schemas.microsoft.com/office/word/2020/wordml/sdtdatahash" xmlns:w16sdtfl="http://schemas.microsoft.com/office/word/2024/wordml/sdtformatlock" xmlns:w16se="http://schemas.microsoft.com/office/word/2015/wordml/symex" xmlns:wpg="http://schemas.microsoft.com/office/word/2010/wordprocessingGroup" xmlns:wpi="http://schemas.microsoft.com/office/word/2010/wordprocessingInk" xmlns:wne="http://schemas.microsoft.com/office/word/2006/wordml" xmlns:wps="http://schemas.microsoft.com/office/word/2010/wordprocessingShape" mc:Ignorable="w14 w15 w16se w16cid w16 w16cex w16sdtdh w16sdtfl w16du wp14">
-  <w15:commentEx w15:paraId="0DD29C92" w15:done="0"/>
-  <w15:commentEx w15:paraId="40117E77" w15:paraIdParent="0DD29C92" w15:done="0"/>
+  <w15:commentEx w15:paraId="0DD29C92" w15:done="1"/>
+  <w15:commentEx w15:paraId="40117E77" w15:paraIdParent="0DD29C92" w15:done="1"/>
 </w15:commentsEx>
 </file>
 

</xml_diff>

<commit_message>
changed one figure but having a hard time
</commit_message>
<xml_diff>
--- a/Docs/FIGURES Machine learning applied to otolith timeseries data to discriminate river of origin for Western Alaska Salmon.docx
+++ b/Docs/FIGURES Machine learning applied to otolith timeseries data to discriminate river of origin for Western Alaska Salmon.docx
@@ -366,10 +366,10 @@
           <w:szCs w:val="16"/>
         </w:rPr>
         <w:drawing>
-          <wp:inline distT="0" distB="0" distL="0" distR="0" wp14:anchorId="0EE2AE9C" wp14:editId="060AFD3D">
-            <wp:extent cx="5943600" cy="2054225"/>
-            <wp:effectExtent l="0" t="0" r="0" b="3175"/>
-            <wp:docPr id="887724946" name="Picture 1" descr="A close-up of a graph&#10;&#10;AI-generated content may be incorrect."/>
+          <wp:inline distT="0" distB="0" distL="0" distR="0" wp14:anchorId="4C091346" wp14:editId="5625ABAC">
+            <wp:extent cx="6271170" cy="1881351"/>
+            <wp:effectExtent l="0" t="0" r="3175" b="0"/>
+            <wp:docPr id="1142849649" name="Picture 2"/>
             <wp:cNvGraphicFramePr>
               <a:graphicFrameLocks xmlns:a="http://schemas.openxmlformats.org/drawingml/2006/main" noChangeAspect="1"/>
             </wp:cNvGraphicFramePr>
@@ -377,7 +377,7 @@
               <a:graphicData uri="http://schemas.openxmlformats.org/drawingml/2006/picture">
                 <pic:pic xmlns:pic="http://schemas.openxmlformats.org/drawingml/2006/picture">
                   <pic:nvPicPr>
-                    <pic:cNvPr id="887724946" name="Picture 1" descr="A close-up of a graph&#10;&#10;AI-generated content may be incorrect."/>
+                    <pic:cNvPr id="1142849649" name="Picture 1142849649"/>
                     <pic:cNvPicPr/>
                   </pic:nvPicPr>
                   <pic:blipFill>
@@ -389,7 +389,7 @@
                   <pic:spPr>
                     <a:xfrm>
                       <a:off x="0" y="0"/>
-                      <a:ext cx="5943600" cy="2054225"/>
+                      <a:ext cx="6306882" cy="1892065"/>
                     </a:xfrm>
                     <a:prstGeom prst="rect">
                       <a:avLst/>
@@ -568,6 +568,33 @@
         </w:rPr>
         <w:t>.</w:t>
       </w:r>
+    </w:p>
+    <w:p>
+      <w:pPr>
+        <w:rPr>
+          <w:rFonts w:ascii="Garamond" w:hAnsi="Garamond"/>
+          <w:sz w:val="16"/>
+          <w:szCs w:val="16"/>
+        </w:rPr>
+      </w:pPr>
+    </w:p>
+    <w:p>
+      <w:pPr>
+        <w:rPr>
+          <w:rFonts w:ascii="Garamond" w:hAnsi="Garamond"/>
+          <w:sz w:val="16"/>
+          <w:szCs w:val="16"/>
+        </w:rPr>
+      </w:pPr>
+    </w:p>
+    <w:p>
+      <w:pPr>
+        <w:rPr>
+          <w:rFonts w:ascii="Garamond" w:hAnsi="Garamond"/>
+          <w:sz w:val="16"/>
+          <w:szCs w:val="16"/>
+        </w:rPr>
+      </w:pPr>
     </w:p>
     <w:p>
       <w:pPr>
@@ -767,7 +794,6 @@
           <w:sz w:val="16"/>
           <w:szCs w:val="16"/>
         </w:rPr>
-        <w:lastRenderedPageBreak/>
         <w:drawing>
           <wp:anchor distT="0" distB="0" distL="114300" distR="114300" simplePos="0" relativeHeight="251658240" behindDoc="0" locked="0" layoutInCell="1" allowOverlap="1" wp14:anchorId="4608D8C9" wp14:editId="1B8CF4B2">
             <wp:simplePos x="0" y="0"/>
@@ -1024,7 +1050,6 @@
           <w:sz w:val="16"/>
           <w:szCs w:val="16"/>
         </w:rPr>
-        <w:lastRenderedPageBreak/>
         <w:drawing>
           <wp:inline distT="0" distB="0" distL="0" distR="0" wp14:anchorId="741AD416" wp14:editId="6E9D9EA4">
             <wp:extent cx="6290068" cy="3235084"/>

</xml_diff>

<commit_message>
updated figures to be RESTRICTED not OVERLAPPING
</commit_message>
<xml_diff>
--- a/Docs/FIGURES Machine learning applied to otolith timeseries data to discriminate river of origin for Western Alaska Salmon.docx
+++ b/Docs/FIGURES Machine learning applied to otolith timeseries data to discriminate river of origin for Western Alaska Salmon.docx
@@ -595,24 +595,6 @@
           <w:szCs w:val="16"/>
         </w:rPr>
       </w:pPr>
-    </w:p>
-    <w:p>
-      <w:pPr>
-        <w:rPr>
-          <w:rFonts w:ascii="Garamond" w:hAnsi="Garamond"/>
-          <w:sz w:val="16"/>
-          <w:szCs w:val="16"/>
-        </w:rPr>
-      </w:pPr>
-    </w:p>
-    <w:p>
-      <w:pPr>
-        <w:rPr>
-          <w:rFonts w:ascii="Garamond" w:hAnsi="Garamond"/>
-          <w:sz w:val="16"/>
-          <w:szCs w:val="16"/>
-        </w:rPr>
-      </w:pPr>
       <w:r>
         <w:rPr>
           <w:rFonts w:ascii="Garamond" w:hAnsi="Garamond"/>
@@ -621,10 +603,10 @@
           <w:szCs w:val="16"/>
         </w:rPr>
         <w:drawing>
-          <wp:inline distT="0" distB="0" distL="0" distR="0" wp14:anchorId="16679699" wp14:editId="668105C7">
-            <wp:extent cx="5962810" cy="2981405"/>
-            <wp:effectExtent l="0" t="0" r="6350" b="3175"/>
-            <wp:docPr id="1789130704" name="Picture 6"/>
+          <wp:inline distT="0" distB="0" distL="0" distR="0" wp14:anchorId="72C5C0DF" wp14:editId="4AF09611">
+            <wp:extent cx="5943600" cy="2971800"/>
+            <wp:effectExtent l="0" t="0" r="0" b="0"/>
+            <wp:docPr id="1378946754" name="Picture 1" descr="A graph showing a number of numbers and a number of different numbers&#10;&#10;AI-generated content may be incorrect."/>
             <wp:cNvGraphicFramePr>
               <a:graphicFrameLocks xmlns:a="http://schemas.openxmlformats.org/drawingml/2006/main" noChangeAspect="1"/>
             </wp:cNvGraphicFramePr>
@@ -632,11 +614,17 @@
               <a:graphicData uri="http://schemas.openxmlformats.org/drawingml/2006/picture">
                 <pic:pic xmlns:pic="http://schemas.openxmlformats.org/drawingml/2006/picture">
                   <pic:nvPicPr>
-                    <pic:cNvPr id="1789130704" name="Picture 1789130704"/>
+                    <pic:cNvPr id="1378946754" name="Picture 1" descr="A graph showing a number of numbers and a number of different numbers&#10;&#10;AI-generated content may be incorrect."/>
                     <pic:cNvPicPr/>
                   </pic:nvPicPr>
                   <pic:blipFill>
-                    <a:blip r:embed="rId6"/>
+                    <a:blip r:embed="rId6" cstate="print">
+                      <a:extLst>
+                        <a:ext uri="{28A0092B-C50C-407E-A947-70E740481C1C}">
+                          <a14:useLocalDpi xmlns:a14="http://schemas.microsoft.com/office/drawing/2010/main" val="0"/>
+                        </a:ext>
+                      </a:extLst>
+                    </a:blip>
                     <a:stretch>
                       <a:fillRect/>
                     </a:stretch>
@@ -644,7 +632,7 @@
                   <pic:spPr>
                     <a:xfrm>
                       <a:off x="0" y="0"/>
-                      <a:ext cx="5988578" cy="2994289"/>
+                      <a:ext cx="5943600" cy="2971800"/>
                     </a:xfrm>
                     <a:prstGeom prst="rect">
                       <a:avLst/>
@@ -787,6 +775,17 @@
           <w:szCs w:val="16"/>
         </w:rPr>
       </w:pPr>
+    </w:p>
+    <w:p>
+      <w:pPr>
+        <w:rPr>
+          <w:rFonts w:ascii="Garamond" w:hAnsi="Garamond"/>
+          <w:b/>
+          <w:bCs/>
+          <w:sz w:val="16"/>
+          <w:szCs w:val="16"/>
+        </w:rPr>
+      </w:pPr>
       <w:r>
         <w:rPr>
           <w:rFonts w:ascii="Garamond" w:hAnsi="Garamond"/>
@@ -794,6 +793,7 @@
           <w:sz w:val="16"/>
           <w:szCs w:val="16"/>
         </w:rPr>
+        <w:lastRenderedPageBreak/>
         <w:drawing>
           <wp:anchor distT="0" distB="0" distL="114300" distR="114300" simplePos="0" relativeHeight="251658240" behindDoc="0" locked="0" layoutInCell="1" allowOverlap="1" wp14:anchorId="4608D8C9" wp14:editId="1B8CF4B2">
             <wp:simplePos x="0" y="0"/>
@@ -980,69 +980,6 @@
           <w:szCs w:val="16"/>
         </w:rPr>
       </w:pPr>
-    </w:p>
-    <w:p>
-      <w:pPr>
-        <w:rPr>
-          <w:rFonts w:ascii="Garamond" w:hAnsi="Garamond"/>
-          <w:sz w:val="16"/>
-          <w:szCs w:val="16"/>
-        </w:rPr>
-      </w:pPr>
-    </w:p>
-    <w:p>
-      <w:pPr>
-        <w:rPr>
-          <w:rFonts w:ascii="Garamond" w:hAnsi="Garamond"/>
-          <w:sz w:val="16"/>
-          <w:szCs w:val="16"/>
-        </w:rPr>
-      </w:pPr>
-    </w:p>
-    <w:p>
-      <w:pPr>
-        <w:rPr>
-          <w:rFonts w:ascii="Garamond" w:hAnsi="Garamond"/>
-          <w:sz w:val="16"/>
-          <w:szCs w:val="16"/>
-        </w:rPr>
-      </w:pPr>
-    </w:p>
-    <w:p>
-      <w:pPr>
-        <w:rPr>
-          <w:rFonts w:ascii="Garamond" w:hAnsi="Garamond"/>
-          <w:sz w:val="16"/>
-          <w:szCs w:val="16"/>
-        </w:rPr>
-      </w:pPr>
-    </w:p>
-    <w:p>
-      <w:pPr>
-        <w:rPr>
-          <w:rFonts w:ascii="Garamond" w:hAnsi="Garamond"/>
-          <w:sz w:val="16"/>
-          <w:szCs w:val="16"/>
-        </w:rPr>
-      </w:pPr>
-    </w:p>
-    <w:p>
-      <w:pPr>
-        <w:rPr>
-          <w:rFonts w:ascii="Garamond" w:hAnsi="Garamond"/>
-          <w:sz w:val="16"/>
-          <w:szCs w:val="16"/>
-        </w:rPr>
-      </w:pPr>
-    </w:p>
-    <w:p>
-      <w:pPr>
-        <w:rPr>
-          <w:rFonts w:ascii="Garamond" w:hAnsi="Garamond"/>
-          <w:sz w:val="16"/>
-          <w:szCs w:val="16"/>
-        </w:rPr>
-      </w:pPr>
       <w:r>
         <w:rPr>
           <w:rFonts w:ascii="Garamond" w:hAnsi="Garamond"/>
@@ -1050,6 +987,7 @@
           <w:sz w:val="16"/>
           <w:szCs w:val="16"/>
         </w:rPr>
+        <w:lastRenderedPageBreak/>
         <w:drawing>
           <wp:inline distT="0" distB="0" distL="0" distR="0" wp14:anchorId="741AD416" wp14:editId="6E9D9EA4">
             <wp:extent cx="6290068" cy="3235084"/>
@@ -1476,10 +1414,10 @@
         </w:rPr>
         <w:lastRenderedPageBreak/>
         <w:drawing>
-          <wp:inline distT="0" distB="0" distL="0" distR="0" wp14:anchorId="2F467EF6" wp14:editId="66C4ACFB">
-            <wp:extent cx="6221186" cy="3110593"/>
-            <wp:effectExtent l="0" t="0" r="1905" b="1270"/>
-            <wp:docPr id="1963404633" name="Picture 4" descr="A graph of a number of data&#10;&#10;AI-generated content may be incorrect."/>
+          <wp:inline distT="0" distB="0" distL="0" distR="0" wp14:anchorId="735C320F" wp14:editId="301F0BE4">
+            <wp:extent cx="6310648" cy="3155324"/>
+            <wp:effectExtent l="0" t="0" r="1270" b="0"/>
+            <wp:docPr id="975453772" name="Picture 2" descr="A graph of different colored lines&#10;&#10;AI-generated content may be incorrect."/>
             <wp:cNvGraphicFramePr>
               <a:graphicFrameLocks xmlns:a="http://schemas.openxmlformats.org/drawingml/2006/main" noChangeAspect="1"/>
             </wp:cNvGraphicFramePr>
@@ -1487,7 +1425,7 @@
               <a:graphicData uri="http://schemas.openxmlformats.org/drawingml/2006/picture">
                 <pic:pic xmlns:pic="http://schemas.openxmlformats.org/drawingml/2006/picture">
                   <pic:nvPicPr>
-                    <pic:cNvPr id="1963404633" name="Picture 4" descr="A graph of a number of data&#10;&#10;AI-generated content may be incorrect."/>
+                    <pic:cNvPr id="975453772" name="Picture 2" descr="A graph of different colored lines&#10;&#10;AI-generated content may be incorrect."/>
                     <pic:cNvPicPr/>
                   </pic:nvPicPr>
                   <pic:blipFill>
@@ -1505,7 +1443,7 @@
                   <pic:spPr>
                     <a:xfrm>
                       <a:off x="0" y="0"/>
-                      <a:ext cx="6381193" cy="3190596"/>
+                      <a:ext cx="6325280" cy="3162640"/>
                     </a:xfrm>
                     <a:prstGeom prst="rect">
                       <a:avLst/>

</xml_diff>

<commit_message>
updated the correct Figures version
</commit_message>
<xml_diff>
--- a/Docs/FIGURES Machine learning applied to otolith timeseries data to discriminate river of origin for Western Alaska Salmon.docx
+++ b/Docs/FIGURES Machine learning applied to otolith timeseries data to discriminate river of origin for Western Alaska Salmon.docx
@@ -8,6 +8,14 @@
           <w:rStyle w:val="CommentReference"/>
         </w:rPr>
       </w:pPr>
+      <w:commentRangeStart w:id="0"/>
+      <w:commentRangeEnd w:id="0"/>
+      <w:r>
+        <w:rPr>
+          <w:rStyle w:val="CommentReference"/>
+        </w:rPr>
+        <w:commentReference w:id="0"/>
+      </w:r>
       <w:r>
         <w:rPr>
           <w:noProof/>
@@ -30,7 +38,7 @@
                     <pic:cNvPicPr/>
                   </pic:nvPicPr>
                   <pic:blipFill>
-                    <a:blip r:embed="rId4" cstate="print">
+                    <a:blip r:embed="rId9" cstate="print">
                       <a:extLst>
                         <a:ext uri="{28A0092B-C50C-407E-A947-70E740481C1C}">
                           <a14:useLocalDpi xmlns:a14="http://schemas.microsoft.com/office/drawing/2010/main" val="0"/>
@@ -98,7 +106,122 @@
           <w:sz w:val="22"/>
           <w:szCs w:val="22"/>
         </w:rPr>
-        <w:t xml:space="preserve"> Three major river systems in Western Alaska, the Yukon (Blue), Kuskokwim (Red), and </w:t>
+        <w:t xml:space="preserve"> Three major river systems in Western Alaska, the Yukon (Blue), Kuskokwim (Red), and Nushagak (Green)</w:t>
+      </w:r>
+      <w:r>
+        <w:rPr>
+          <w:rFonts w:ascii="Garamond" w:hAnsi="Garamond"/>
+          <w:sz w:val="22"/>
+          <w:szCs w:val="22"/>
+        </w:rPr>
+        <w:t xml:space="preserve"> watersheds</w:t>
+      </w:r>
+      <w:r>
+        <w:rPr>
+          <w:rFonts w:ascii="Garamond" w:hAnsi="Garamond"/>
+          <w:sz w:val="22"/>
+          <w:szCs w:val="22"/>
+        </w:rPr>
+        <w:t xml:space="preserve">. </w:t>
+      </w:r>
+      <w:r>
+        <w:rPr>
+          <w:rFonts w:ascii="Garamond" w:hAnsi="Garamond"/>
+          <w:sz w:val="22"/>
+          <w:szCs w:val="22"/>
+        </w:rPr>
+        <w:t xml:space="preserve">Black circles </w:t>
+      </w:r>
+      <w:r>
+        <w:rPr>
+          <w:rFonts w:ascii="Garamond" w:hAnsi="Garamond"/>
+          <w:sz w:val="22"/>
+          <w:szCs w:val="22"/>
+        </w:rPr>
+        <w:t xml:space="preserve">indicate sampling locations for </w:t>
+      </w:r>
+      <w:r>
+        <w:rPr>
+          <w:rFonts w:ascii="Garamond" w:hAnsi="Garamond"/>
+          <w:sz w:val="22"/>
+          <w:szCs w:val="22"/>
+        </w:rPr>
+        <w:t xml:space="preserve">otolith collection (and genetic collection in the Yukon) </w:t>
+      </w:r>
+      <w:r>
+        <w:rPr>
+          <w:rFonts w:ascii="Garamond" w:hAnsi="Garamond"/>
+          <w:sz w:val="22"/>
+          <w:szCs w:val="22"/>
+        </w:rPr>
+        <w:t xml:space="preserve">on each river. </w:t>
+      </w:r>
+    </w:p>
+    <w:p>
+      <w:pPr>
+        <w:rPr>
+          <w:rFonts w:ascii="Garamond" w:hAnsi="Garamond"/>
+          <w:sz w:val="22"/>
+          <w:szCs w:val="22"/>
+        </w:rPr>
+      </w:pPr>
+      <w:r>
+        <w:rPr>
+          <w:rFonts w:ascii="Garamond" w:hAnsi="Garamond"/>
+          <w:b/>
+          <w:bCs/>
+          <w:sz w:val="22"/>
+          <w:szCs w:val="22"/>
+        </w:rPr>
+        <w:t>B)</w:t>
+      </w:r>
+      <w:r>
+        <w:rPr>
+          <w:rFonts w:ascii="Garamond" w:hAnsi="Garamond"/>
+          <w:sz w:val="22"/>
+          <w:szCs w:val="22"/>
+        </w:rPr>
+        <w:t xml:space="preserve"> </w:t>
+      </w:r>
+      <w:r>
+        <w:rPr>
+          <w:rFonts w:ascii="Cambria Math" w:hAnsi="Cambria Math" w:cs="Cambria Math"/>
+          <w:sz w:val="22"/>
+          <w:szCs w:val="22"/>
+        </w:rPr>
+        <w:t>⁸⁷</w:t>
+      </w:r>
+      <w:r>
+        <w:rPr>
+          <w:rFonts w:ascii="Garamond" w:hAnsi="Garamond"/>
+          <w:sz w:val="22"/>
+          <w:szCs w:val="22"/>
+        </w:rPr>
+        <w:t>Sr/</w:t>
+      </w:r>
+      <w:r>
+        <w:rPr>
+          <w:rFonts w:ascii="Cambria Math" w:hAnsi="Cambria Math" w:cs="Cambria Math"/>
+          <w:sz w:val="22"/>
+          <w:szCs w:val="22"/>
+        </w:rPr>
+        <w:t>⁸⁶</w:t>
+      </w:r>
+      <w:r>
+        <w:rPr>
+          <w:rFonts w:ascii="Garamond" w:hAnsi="Garamond"/>
+          <w:sz w:val="22"/>
+          <w:szCs w:val="22"/>
+        </w:rPr>
+        <w:t>Sr</w:t>
+      </w:r>
+      <w:r>
+        <w:rPr>
+          <w:rFonts w:ascii="Garamond" w:hAnsi="Garamond"/>
+          <w:sz w:val="22"/>
+          <w:szCs w:val="22"/>
+        </w:rPr>
+        <w:t xml:space="preserve"> </w:t>
       </w:r>
       <w:proofErr w:type="spellStart"/>
       <w:r>
@@ -107,7 +230,7 @@
           <w:sz w:val="22"/>
           <w:szCs w:val="22"/>
         </w:rPr>
-        <w:t>Nushagak</w:t>
+        <w:t>Isoscape</w:t>
       </w:r>
       <w:proofErr w:type="spellEnd"/>
       <w:r>
@@ -116,114 +239,87 @@
           <w:sz w:val="22"/>
           <w:szCs w:val="22"/>
         </w:rPr>
-        <w:t xml:space="preserve"> (Green)</w:t>
-      </w:r>
-      <w:r>
-        <w:rPr>
-          <w:rFonts w:ascii="Garamond" w:hAnsi="Garamond"/>
-          <w:sz w:val="22"/>
-          <w:szCs w:val="22"/>
-        </w:rPr>
-        <w:t xml:space="preserve"> watersheds</w:t>
-      </w:r>
-      <w:r>
-        <w:rPr>
-          <w:rFonts w:ascii="Garamond" w:hAnsi="Garamond"/>
-          <w:sz w:val="22"/>
-          <w:szCs w:val="22"/>
-        </w:rPr>
-        <w:t xml:space="preserve">. </w:t>
-      </w:r>
-      <w:r>
-        <w:rPr>
-          <w:rFonts w:ascii="Garamond" w:hAnsi="Garamond"/>
-          <w:sz w:val="22"/>
-          <w:szCs w:val="22"/>
-        </w:rPr>
-        <w:t xml:space="preserve">Black circles </w:t>
-      </w:r>
-      <w:r>
-        <w:rPr>
-          <w:rFonts w:ascii="Garamond" w:hAnsi="Garamond"/>
-          <w:sz w:val="22"/>
-          <w:szCs w:val="22"/>
-        </w:rPr>
-        <w:t xml:space="preserve">indicate sampling locations for </w:t>
-      </w:r>
-      <w:r>
-        <w:rPr>
-          <w:rFonts w:ascii="Garamond" w:hAnsi="Garamond"/>
-          <w:sz w:val="22"/>
-          <w:szCs w:val="22"/>
-        </w:rPr>
-        <w:t xml:space="preserve">otolith collection (and genetic collection in the Yukon) </w:t>
-      </w:r>
-      <w:r>
-        <w:rPr>
-          <w:rFonts w:ascii="Garamond" w:hAnsi="Garamond"/>
-          <w:sz w:val="22"/>
-          <w:szCs w:val="22"/>
-        </w:rPr>
-        <w:t xml:space="preserve">on each river. </w:t>
-      </w:r>
-    </w:p>
-    <w:p>
-      <w:pPr>
-        <w:rPr>
-          <w:rFonts w:ascii="Garamond" w:hAnsi="Garamond"/>
-          <w:sz w:val="22"/>
-          <w:szCs w:val="22"/>
-        </w:rPr>
-      </w:pPr>
-      <w:r>
-        <w:rPr>
-          <w:rFonts w:ascii="Garamond" w:hAnsi="Garamond"/>
-          <w:b/>
-          <w:bCs/>
-          <w:sz w:val="22"/>
-          <w:szCs w:val="22"/>
-        </w:rPr>
-        <w:t>B)</w:t>
-      </w:r>
-      <w:r>
-        <w:rPr>
-          <w:rFonts w:ascii="Garamond" w:hAnsi="Garamond"/>
-          <w:sz w:val="22"/>
-          <w:szCs w:val="22"/>
-        </w:rPr>
         <w:t xml:space="preserve"> </w:t>
       </w:r>
-      <w:r>
-        <w:rPr>
-          <w:rFonts w:ascii="Cambria Math" w:hAnsi="Cambria Math" w:cs="Cambria Math"/>
-          <w:sz w:val="22"/>
-          <w:szCs w:val="22"/>
-        </w:rPr>
-        <w:t>⁸⁷</w:t>
-      </w:r>
-      <w:r>
-        <w:rPr>
-          <w:rFonts w:ascii="Garamond" w:hAnsi="Garamond"/>
-          <w:sz w:val="22"/>
-          <w:szCs w:val="22"/>
-        </w:rPr>
-        <w:t>Sr/</w:t>
-      </w:r>
-      <w:r>
-        <w:rPr>
-          <w:rFonts w:ascii="Cambria Math" w:hAnsi="Cambria Math" w:cs="Cambria Math"/>
-          <w:sz w:val="22"/>
-          <w:szCs w:val="22"/>
-        </w:rPr>
-        <w:t>⁸⁶</w:t>
-      </w:r>
-      <w:r>
-        <w:rPr>
-          <w:rFonts w:ascii="Garamond" w:hAnsi="Garamond"/>
-          <w:sz w:val="22"/>
-          <w:szCs w:val="22"/>
-        </w:rPr>
-        <w:t>Sr</w:t>
+      <w:commentRangeStart w:id="1"/>
+      <w:r>
+        <w:rPr>
+          <w:rFonts w:ascii="Garamond" w:hAnsi="Garamond"/>
+          <w:sz w:val="22"/>
+          <w:szCs w:val="22"/>
+        </w:rPr>
+        <w:t>of</w:t>
+      </w:r>
+      <w:commentRangeEnd w:id="1"/>
+      <w:r>
+        <w:rPr>
+          <w:rStyle w:val="CommentReference"/>
+        </w:rPr>
+        <w:commentReference w:id="1"/>
+      </w:r>
+      <w:r>
+        <w:rPr>
+          <w:rFonts w:ascii="Garamond" w:hAnsi="Garamond"/>
+          <w:sz w:val="22"/>
+          <w:szCs w:val="22"/>
+        </w:rPr>
+        <w:t xml:space="preserve"> all three river-basins. </w:t>
+      </w:r>
+      <w:r>
+        <w:rPr>
+          <w:rFonts w:ascii="Garamond" w:hAnsi="Garamond"/>
+          <w:sz w:val="22"/>
+          <w:szCs w:val="22"/>
+        </w:rPr>
+        <w:t>Values range from 0.702 to 0.740, with d</w:t>
+      </w:r>
+      <w:r>
+        <w:rPr>
+          <w:rFonts w:ascii="Garamond" w:hAnsi="Garamond"/>
+          <w:sz w:val="22"/>
+          <w:szCs w:val="22"/>
+        </w:rPr>
+        <w:t xml:space="preserve">arker </w:t>
+      </w:r>
+      <w:r>
+        <w:rPr>
+          <w:rFonts w:ascii="Garamond" w:hAnsi="Garamond"/>
+          <w:sz w:val="22"/>
+          <w:szCs w:val="22"/>
+        </w:rPr>
+        <w:t>c</w:t>
+      </w:r>
+      <w:r>
+        <w:rPr>
+          <w:rFonts w:ascii="Garamond" w:hAnsi="Garamond"/>
+          <w:sz w:val="22"/>
+          <w:szCs w:val="22"/>
+        </w:rPr>
+        <w:t xml:space="preserve">olors indicate more enriched values whereas lighter </w:t>
+      </w:r>
+      <w:r>
+        <w:rPr>
+          <w:rFonts w:ascii="Garamond" w:hAnsi="Garamond"/>
+          <w:sz w:val="22"/>
+          <w:szCs w:val="22"/>
+        </w:rPr>
+        <w:t xml:space="preserve">colors </w:t>
+      </w:r>
+      <w:r>
+        <w:rPr>
+          <w:rFonts w:ascii="Garamond" w:hAnsi="Garamond"/>
+          <w:sz w:val="22"/>
+          <w:szCs w:val="22"/>
+        </w:rPr>
+        <w:t>indicate less enriched</w:t>
+      </w:r>
+      <w:r>
+        <w:rPr>
+          <w:rFonts w:ascii="Garamond" w:hAnsi="Garamond"/>
+          <w:sz w:val="22"/>
+          <w:szCs w:val="22"/>
+        </w:rPr>
+        <w:t>.</w:t>
       </w:r>
       <w:r>
         <w:rPr>
@@ -233,80 +329,6 @@
         </w:rPr>
         <w:t xml:space="preserve"> </w:t>
       </w:r>
-      <w:proofErr w:type="spellStart"/>
-      <w:r>
-        <w:rPr>
-          <w:rFonts w:ascii="Garamond" w:hAnsi="Garamond"/>
-          <w:sz w:val="22"/>
-          <w:szCs w:val="22"/>
-        </w:rPr>
-        <w:t>Isoscape</w:t>
-      </w:r>
-      <w:proofErr w:type="spellEnd"/>
-      <w:r>
-        <w:rPr>
-          <w:rFonts w:ascii="Garamond" w:hAnsi="Garamond"/>
-          <w:sz w:val="22"/>
-          <w:szCs w:val="22"/>
-        </w:rPr>
-        <w:t xml:space="preserve"> of all three river-basins. </w:t>
-      </w:r>
-      <w:r>
-        <w:rPr>
-          <w:rFonts w:ascii="Garamond" w:hAnsi="Garamond"/>
-          <w:sz w:val="22"/>
-          <w:szCs w:val="22"/>
-        </w:rPr>
-        <w:t>Values range from 0.702 to 0.740, with d</w:t>
-      </w:r>
-      <w:r>
-        <w:rPr>
-          <w:rFonts w:ascii="Garamond" w:hAnsi="Garamond"/>
-          <w:sz w:val="22"/>
-          <w:szCs w:val="22"/>
-        </w:rPr>
-        <w:t xml:space="preserve">arker </w:t>
-      </w:r>
-      <w:r>
-        <w:rPr>
-          <w:rFonts w:ascii="Garamond" w:hAnsi="Garamond"/>
-          <w:sz w:val="22"/>
-          <w:szCs w:val="22"/>
-        </w:rPr>
-        <w:t>c</w:t>
-      </w:r>
-      <w:r>
-        <w:rPr>
-          <w:rFonts w:ascii="Garamond" w:hAnsi="Garamond"/>
-          <w:sz w:val="22"/>
-          <w:szCs w:val="22"/>
-        </w:rPr>
-        <w:t xml:space="preserve">olors indicate more enriched values whereas lighter </w:t>
-      </w:r>
-      <w:r>
-        <w:rPr>
-          <w:rFonts w:ascii="Garamond" w:hAnsi="Garamond"/>
-          <w:sz w:val="22"/>
-          <w:szCs w:val="22"/>
-        </w:rPr>
-        <w:t xml:space="preserve">colors </w:t>
-      </w:r>
-      <w:r>
-        <w:rPr>
-          <w:rFonts w:ascii="Garamond" w:hAnsi="Garamond"/>
-          <w:sz w:val="22"/>
-          <w:szCs w:val="22"/>
-        </w:rPr>
-        <w:t>indicate less enriched</w:t>
-      </w:r>
-      <w:r>
-        <w:rPr>
-          <w:rFonts w:ascii="Garamond" w:hAnsi="Garamond"/>
-          <w:sz w:val="22"/>
-          <w:szCs w:val="22"/>
-        </w:rPr>
-        <w:t>.</w:t>
-      </w:r>
       <w:r>
         <w:rPr>
           <w:rFonts w:ascii="Garamond" w:hAnsi="Garamond"/>
@@ -315,23 +337,6 @@
         </w:rPr>
         <w:t xml:space="preserve"> </w:t>
       </w:r>
-      <w:r>
-        <w:rPr>
-          <w:rFonts w:ascii="Garamond" w:hAnsi="Garamond"/>
-          <w:sz w:val="22"/>
-          <w:szCs w:val="22"/>
-        </w:rPr>
-        <w:t xml:space="preserve"> </w:t>
-      </w:r>
-    </w:p>
-    <w:p>
-      <w:pPr>
-        <w:rPr>
-          <w:rFonts w:ascii="Garamond" w:hAnsi="Garamond"/>
-          <w:sz w:val="22"/>
-          <w:szCs w:val="22"/>
-        </w:rPr>
-      </w:pPr>
     </w:p>
     <w:p>
       <w:pPr>
@@ -343,496 +348,33 @@
           <w:szCs w:val="16"/>
         </w:rPr>
       </w:pPr>
-      <w:r>
-        <w:rPr>
-          <w:rFonts w:ascii="Garamond" w:hAnsi="Garamond"/>
-          <w:b/>
-          <w:bCs/>
+    </w:p>
+    <w:p>
+      <w:pPr>
+        <w:rPr>
+          <w:rFonts w:ascii="Garamond" w:hAnsi="Garamond"/>
+          <w:b/>
+          <w:bCs/>
+          <w:sz w:val="16"/>
+          <w:szCs w:val="16"/>
+        </w:rPr>
+      </w:pPr>
+      <w:r>
+        <w:rPr>
+          <w:rFonts w:ascii="Garamond" w:hAnsi="Garamond"/>
           <w:noProof/>
           <w:sz w:val="16"/>
           <w:szCs w:val="16"/>
         </w:rPr>
         <w:lastRenderedPageBreak/>
         <w:drawing>
-          <wp:inline distT="0" distB="0" distL="0" distR="0" wp14:anchorId="4C091346" wp14:editId="3688B0A1">
-            <wp:extent cx="5853545" cy="1756064"/>
-            <wp:effectExtent l="0" t="0" r="1270" b="0"/>
-            <wp:docPr id="1142849649" name="Picture 2"/>
-            <wp:cNvGraphicFramePr>
-              <a:graphicFrameLocks xmlns:a="http://schemas.openxmlformats.org/drawingml/2006/main" noChangeAspect="1"/>
-            </wp:cNvGraphicFramePr>
-            <a:graphic xmlns:a="http://schemas.openxmlformats.org/drawingml/2006/main">
-              <a:graphicData uri="http://schemas.openxmlformats.org/drawingml/2006/picture">
-                <pic:pic xmlns:pic="http://schemas.openxmlformats.org/drawingml/2006/picture">
-                  <pic:nvPicPr>
-                    <pic:cNvPr id="1142849649" name="Picture 1142849649"/>
-                    <pic:cNvPicPr/>
-                  </pic:nvPicPr>
-                  <pic:blipFill>
-                    <a:blip r:embed="rId5"/>
-                    <a:stretch>
-                      <a:fillRect/>
-                    </a:stretch>
-                  </pic:blipFill>
-                  <pic:spPr>
-                    <a:xfrm>
-                      <a:off x="0" y="0"/>
-                      <a:ext cx="5927400" cy="1778221"/>
-                    </a:xfrm>
-                    <a:prstGeom prst="rect">
-                      <a:avLst/>
-                    </a:prstGeom>
-                  </pic:spPr>
-                </pic:pic>
-              </a:graphicData>
-            </a:graphic>
-          </wp:inline>
-        </w:drawing>
-      </w:r>
-    </w:p>
-    <w:p>
-      <w:pPr>
-        <w:rPr>
-          <w:rFonts w:ascii="Garamond" w:hAnsi="Garamond"/>
-          <w:sz w:val="16"/>
-          <w:szCs w:val="16"/>
-        </w:rPr>
-      </w:pPr>
-      <w:r>
-        <w:rPr>
-          <w:rFonts w:ascii="Garamond" w:hAnsi="Garamond"/>
-          <w:b/>
-          <w:bCs/>
-          <w:sz w:val="22"/>
-          <w:szCs w:val="22"/>
-        </w:rPr>
-        <w:t xml:space="preserve">Figure </w:t>
-      </w:r>
-      <w:r>
-        <w:rPr>
-          <w:rFonts w:ascii="Garamond" w:hAnsi="Garamond"/>
-          <w:b/>
-          <w:bCs/>
-          <w:sz w:val="22"/>
-          <w:szCs w:val="22"/>
-        </w:rPr>
-        <w:t>2</w:t>
-      </w:r>
-      <w:r>
-        <w:rPr>
-          <w:rFonts w:ascii="Garamond" w:hAnsi="Garamond"/>
-          <w:b/>
-          <w:bCs/>
-          <w:sz w:val="22"/>
-          <w:szCs w:val="22"/>
-        </w:rPr>
-        <w:t>:</w:t>
-      </w:r>
-      <w:r>
-        <w:rPr>
-          <w:rFonts w:ascii="Garamond" w:hAnsi="Garamond"/>
-          <w:sz w:val="16"/>
-          <w:szCs w:val="16"/>
-        </w:rPr>
-        <w:t xml:space="preserve"> </w:t>
-      </w:r>
-      <w:r>
-        <w:rPr>
-          <w:rFonts w:ascii="Garamond" w:hAnsi="Garamond"/>
-          <w:sz w:val="22"/>
-          <w:szCs w:val="22"/>
-        </w:rPr>
-        <w:t xml:space="preserve">Model Performance comparison among data </w:t>
-      </w:r>
-      <w:r>
-        <w:rPr>
-          <w:rFonts w:ascii="Garamond" w:hAnsi="Garamond"/>
-          <w:sz w:val="22"/>
-          <w:szCs w:val="22"/>
-        </w:rPr>
-        <w:t xml:space="preserve">preprocessing steps </w:t>
-      </w:r>
-      <w:r>
-        <w:rPr>
-          <w:rFonts w:ascii="Garamond" w:hAnsi="Garamond"/>
-          <w:sz w:val="22"/>
-          <w:szCs w:val="22"/>
-        </w:rPr>
-        <w:t xml:space="preserve">and model types. Accuracy indicates the proportion of each class correctly classified. F1-Score is the harmonic mean of precision and recall, providing a balanced performance measure across all watershed classes. Results compare </w:t>
-      </w:r>
-      <w:r>
-        <w:rPr>
-          <w:rFonts w:ascii="Garamond" w:hAnsi="Garamond"/>
-          <w:sz w:val="22"/>
-          <w:szCs w:val="22"/>
-        </w:rPr>
-        <w:t>two</w:t>
-      </w:r>
-      <w:r>
-        <w:rPr>
-          <w:rFonts w:ascii="Garamond" w:hAnsi="Garamond"/>
-          <w:sz w:val="22"/>
-          <w:szCs w:val="22"/>
-        </w:rPr>
-        <w:t xml:space="preserve"> </w:t>
-      </w:r>
-      <w:r>
-        <w:rPr>
-          <w:rFonts w:ascii="Cambria Math" w:hAnsi="Cambria Math" w:cs="Cambria Math"/>
-          <w:sz w:val="22"/>
-          <w:szCs w:val="22"/>
-        </w:rPr>
-        <w:t>⁸⁷</w:t>
-      </w:r>
-      <w:r>
-        <w:rPr>
-          <w:rFonts w:ascii="Garamond" w:hAnsi="Garamond"/>
-          <w:sz w:val="22"/>
-          <w:szCs w:val="22"/>
-        </w:rPr>
-        <w:t>Sr/</w:t>
-      </w:r>
-      <w:r>
-        <w:rPr>
-          <w:rFonts w:ascii="Cambria Math" w:hAnsi="Cambria Math" w:cs="Cambria Math"/>
-          <w:sz w:val="22"/>
-          <w:szCs w:val="22"/>
-        </w:rPr>
-        <w:t>⁸⁶</w:t>
-      </w:r>
-      <w:r>
-        <w:rPr>
-          <w:rFonts w:ascii="Garamond" w:hAnsi="Garamond"/>
-          <w:sz w:val="22"/>
-          <w:szCs w:val="22"/>
-        </w:rPr>
-        <w:t xml:space="preserve">Sr </w:t>
-      </w:r>
-      <w:r>
-        <w:rPr>
-          <w:rFonts w:ascii="Garamond" w:hAnsi="Garamond"/>
-          <w:sz w:val="22"/>
-          <w:szCs w:val="22"/>
-        </w:rPr>
-        <w:t xml:space="preserve">timeseries smoothing </w:t>
-      </w:r>
-      <w:r>
-        <w:rPr>
-          <w:rFonts w:ascii="Garamond" w:hAnsi="Garamond"/>
-          <w:sz w:val="22"/>
-          <w:szCs w:val="22"/>
-        </w:rPr>
-        <w:t xml:space="preserve">methods (GAM, MA) </w:t>
-      </w:r>
-      <w:r>
-        <w:rPr>
-          <w:rFonts w:ascii="Garamond" w:hAnsi="Garamond"/>
-          <w:sz w:val="22"/>
-          <w:szCs w:val="22"/>
-        </w:rPr>
-        <w:t>a</w:t>
-      </w:r>
-      <w:r>
-        <w:rPr>
-          <w:rFonts w:ascii="Garamond" w:hAnsi="Garamond"/>
-          <w:sz w:val="22"/>
-          <w:szCs w:val="22"/>
-        </w:rPr>
-        <w:t xml:space="preserve">nd three machine learning algorithms (Random Forest, SVM, KNN) using either all test data (Total) or only overlapping isotope ranges (Overlapping). </w:t>
-      </w:r>
-      <w:r>
-        <w:rPr>
-          <w:rFonts w:ascii="Garamond" w:hAnsi="Garamond"/>
-          <w:sz w:val="22"/>
-          <w:szCs w:val="22"/>
-        </w:rPr>
-        <w:t>Darker green colors indicate higher scores</w:t>
-      </w:r>
-      <w:r>
-        <w:rPr>
-          <w:rFonts w:ascii="Garamond" w:hAnsi="Garamond"/>
-          <w:sz w:val="16"/>
-          <w:szCs w:val="16"/>
-        </w:rPr>
-        <w:t>.</w:t>
-      </w:r>
-    </w:p>
-    <w:p>
-      <w:pPr>
-        <w:rPr>
-          <w:rFonts w:ascii="Garamond" w:hAnsi="Garamond"/>
-          <w:sz w:val="16"/>
-          <w:szCs w:val="16"/>
-        </w:rPr>
-      </w:pPr>
-    </w:p>
-    <w:p>
-      <w:pPr>
-        <w:rPr>
-          <w:rFonts w:ascii="Garamond" w:hAnsi="Garamond"/>
-          <w:sz w:val="16"/>
-          <w:szCs w:val="16"/>
-        </w:rPr>
-      </w:pPr>
-    </w:p>
-    <w:p>
-      <w:pPr>
-        <w:rPr>
-          <w:rFonts w:ascii="Garamond" w:hAnsi="Garamond"/>
-          <w:sz w:val="16"/>
-          <w:szCs w:val="16"/>
-        </w:rPr>
-      </w:pPr>
-    </w:p>
-    <w:p>
-      <w:pPr>
-        <w:rPr>
-          <w:rFonts w:ascii="Garamond" w:hAnsi="Garamond"/>
-          <w:sz w:val="16"/>
-          <w:szCs w:val="16"/>
-        </w:rPr>
-      </w:pPr>
-    </w:p>
-    <w:p>
-      <w:pPr>
-        <w:rPr>
-          <w:rFonts w:ascii="Garamond" w:hAnsi="Garamond"/>
-          <w:sz w:val="16"/>
-          <w:szCs w:val="16"/>
-        </w:rPr>
-      </w:pPr>
-    </w:p>
-    <w:p>
-      <w:pPr>
-        <w:rPr>
-          <w:rFonts w:ascii="Garamond" w:hAnsi="Garamond"/>
-          <w:sz w:val="16"/>
-          <w:szCs w:val="16"/>
-        </w:rPr>
-      </w:pPr>
-    </w:p>
-    <w:p>
-      <w:pPr>
-        <w:rPr>
-          <w:rFonts w:ascii="Garamond" w:hAnsi="Garamond"/>
-          <w:sz w:val="16"/>
-          <w:szCs w:val="16"/>
-        </w:rPr>
-      </w:pPr>
-    </w:p>
-    <w:p>
-      <w:pPr>
-        <w:rPr>
-          <w:rFonts w:ascii="Garamond" w:hAnsi="Garamond"/>
-          <w:sz w:val="16"/>
-          <w:szCs w:val="16"/>
-        </w:rPr>
-      </w:pPr>
-    </w:p>
-    <w:p>
-      <w:pPr>
-        <w:rPr>
-          <w:rFonts w:ascii="Garamond" w:hAnsi="Garamond"/>
-          <w:sz w:val="16"/>
-          <w:szCs w:val="16"/>
-        </w:rPr>
-      </w:pPr>
-    </w:p>
-    <w:p>
-      <w:pPr>
-        <w:rPr>
-          <w:rFonts w:ascii="Garamond" w:hAnsi="Garamond"/>
-          <w:sz w:val="16"/>
-          <w:szCs w:val="16"/>
-        </w:rPr>
-      </w:pPr>
-    </w:p>
-    <w:p>
-      <w:pPr>
-        <w:rPr>
-          <w:rFonts w:ascii="Garamond" w:hAnsi="Garamond"/>
-          <w:sz w:val="16"/>
-          <w:szCs w:val="16"/>
-        </w:rPr>
-      </w:pPr>
-      <w:r>
-        <w:rPr>
-          <w:rFonts w:ascii="Garamond" w:hAnsi="Garamond"/>
-          <w:noProof/>
-          <w:sz w:val="16"/>
-          <w:szCs w:val="16"/>
-        </w:rPr>
-        <w:lastRenderedPageBreak/>
-        <w:drawing>
-          <wp:inline distT="0" distB="0" distL="0" distR="0" wp14:anchorId="1A613EDD" wp14:editId="0E19D02F">
-            <wp:extent cx="5943600" cy="2971800"/>
-            <wp:effectExtent l="0" t="0" r="0" b="0"/>
-            <wp:docPr id="1288068750" name="Picture 1"/>
-            <wp:cNvGraphicFramePr>
-              <a:graphicFrameLocks xmlns:a="http://schemas.openxmlformats.org/drawingml/2006/main" noChangeAspect="1"/>
-            </wp:cNvGraphicFramePr>
-            <a:graphic xmlns:a="http://schemas.openxmlformats.org/drawingml/2006/main">
-              <a:graphicData uri="http://schemas.openxmlformats.org/drawingml/2006/picture">
-                <pic:pic xmlns:pic="http://schemas.openxmlformats.org/drawingml/2006/picture">
-                  <pic:nvPicPr>
-                    <pic:cNvPr id="1288068750" name="Picture 1288068750"/>
-                    <pic:cNvPicPr/>
-                  </pic:nvPicPr>
-                  <pic:blipFill>
-                    <a:blip r:embed="rId6"/>
-                    <a:stretch>
-                      <a:fillRect/>
-                    </a:stretch>
-                  </pic:blipFill>
-                  <pic:spPr>
-                    <a:xfrm>
-                      <a:off x="0" y="0"/>
-                      <a:ext cx="5943600" cy="2971800"/>
-                    </a:xfrm>
-                    <a:prstGeom prst="rect">
-                      <a:avLst/>
-                    </a:prstGeom>
-                  </pic:spPr>
-                </pic:pic>
-              </a:graphicData>
-            </a:graphic>
-          </wp:inline>
-        </w:drawing>
-      </w:r>
-      <w:r>
-        <w:rPr>
-          <w:rFonts w:ascii="Garamond" w:hAnsi="Garamond"/>
-          <w:sz w:val="16"/>
-          <w:szCs w:val="16"/>
-        </w:rPr>
-        <w:t xml:space="preserve"> </w:t>
-      </w:r>
-    </w:p>
-    <w:p>
-      <w:pPr>
-        <w:rPr>
-          <w:rFonts w:ascii="Garamond" w:hAnsi="Garamond"/>
-          <w:sz w:val="22"/>
-          <w:szCs w:val="22"/>
-        </w:rPr>
-      </w:pPr>
-      <w:r>
-        <w:rPr>
-          <w:rFonts w:ascii="Garamond" w:hAnsi="Garamond"/>
-          <w:b/>
-          <w:bCs/>
-          <w:sz w:val="22"/>
-          <w:szCs w:val="22"/>
-        </w:rPr>
-        <w:t>Figure 3:</w:t>
-      </w:r>
-      <w:r>
-        <w:rPr>
-          <w:rFonts w:ascii="Garamond" w:hAnsi="Garamond"/>
-          <w:sz w:val="22"/>
-          <w:szCs w:val="22"/>
-        </w:rPr>
-        <w:t xml:space="preserve"> </w:t>
-      </w:r>
-      <w:r>
-        <w:rPr>
-          <w:rFonts w:ascii="Garamond" w:hAnsi="Garamond"/>
-          <w:sz w:val="22"/>
-          <w:szCs w:val="22"/>
-        </w:rPr>
-        <w:t>Confusion matrix from the highest p</w:t>
-      </w:r>
-      <w:r>
-        <w:rPr>
-          <w:rFonts w:ascii="Garamond" w:hAnsi="Garamond"/>
-          <w:sz w:val="22"/>
-          <w:szCs w:val="22"/>
-        </w:rPr>
-        <w:t>er</w:t>
-      </w:r>
-      <w:r>
-        <w:rPr>
-          <w:rFonts w:ascii="Garamond" w:hAnsi="Garamond"/>
-          <w:sz w:val="22"/>
-          <w:szCs w:val="22"/>
-        </w:rPr>
-        <w:t xml:space="preserve">forming model (Random Forest on GAM Smoothed data) for both total </w:t>
-      </w:r>
-      <w:proofErr w:type="gramStart"/>
-      <w:r>
-        <w:rPr>
-          <w:rFonts w:ascii="Garamond" w:hAnsi="Garamond"/>
-          <w:sz w:val="22"/>
-          <w:szCs w:val="22"/>
-        </w:rPr>
-        <w:t>test</w:t>
-      </w:r>
-      <w:proofErr w:type="gramEnd"/>
-      <w:r>
-        <w:rPr>
-          <w:rFonts w:ascii="Garamond" w:hAnsi="Garamond"/>
-          <w:sz w:val="22"/>
-          <w:szCs w:val="22"/>
-        </w:rPr>
-        <w:t xml:space="preserve"> set and overlapping subset. Boxes along the horizontal axis indicate correctly classified individuals</w:t>
-      </w:r>
-      <w:r>
-        <w:rPr>
-          <w:rFonts w:ascii="Garamond" w:hAnsi="Garamond"/>
-          <w:sz w:val="22"/>
-          <w:szCs w:val="22"/>
-        </w:rPr>
-        <w:t xml:space="preserve"> (red). Vertical axis labels are the actual watershed labels whereas horizontal labels are the predicted class from the model. Percentage</w:t>
-      </w:r>
-      <w:r>
-        <w:rPr>
-          <w:rFonts w:ascii="Garamond" w:hAnsi="Garamond"/>
-          <w:sz w:val="22"/>
-          <w:szCs w:val="22"/>
-        </w:rPr>
-        <w:t>s indicate</w:t>
-      </w:r>
-      <w:r>
-        <w:rPr>
-          <w:rFonts w:ascii="Garamond" w:hAnsi="Garamond"/>
-          <w:sz w:val="22"/>
-          <w:szCs w:val="22"/>
-        </w:rPr>
-        <w:t xml:space="preserve"> the percent of the actual class identified as the predicted class. </w:t>
-      </w:r>
-      <w:r>
-        <w:rPr>
-          <w:rFonts w:ascii="Garamond" w:hAnsi="Garamond"/>
-          <w:sz w:val="22"/>
-          <w:szCs w:val="22"/>
-        </w:rPr>
-        <w:t xml:space="preserve">  </w:t>
-      </w:r>
-    </w:p>
-    <w:p>
-      <w:pPr>
-        <w:rPr>
-          <w:rFonts w:ascii="Garamond" w:hAnsi="Garamond"/>
-          <w:sz w:val="22"/>
-          <w:szCs w:val="22"/>
-        </w:rPr>
-      </w:pPr>
-      <w:r>
-        <w:rPr>
-          <w:rFonts w:ascii="Garamond" w:hAnsi="Garamond"/>
-          <w:noProof/>
-          <w:sz w:val="16"/>
-          <w:szCs w:val="16"/>
-        </w:rPr>
-        <w:lastRenderedPageBreak/>
-        <w:drawing>
-          <wp:anchor distT="0" distB="0" distL="114300" distR="114300" simplePos="0" relativeHeight="251658240" behindDoc="0" locked="0" layoutInCell="1" allowOverlap="1" wp14:anchorId="4608D8C9" wp14:editId="1B8CF4B2">
+          <wp:anchor distT="0" distB="0" distL="114300" distR="114300" simplePos="0" relativeHeight="251658240" behindDoc="0" locked="0" layoutInCell="1" allowOverlap="1" wp14:anchorId="4608D8C9" wp14:editId="4163B2FD">
             <wp:simplePos x="0" y="0"/>
             <wp:positionH relativeFrom="column">
-              <wp:posOffset>-222885</wp:posOffset>
+              <wp:posOffset>-80645</wp:posOffset>
             </wp:positionH>
             <wp:positionV relativeFrom="paragraph">
-              <wp:posOffset>268605</wp:posOffset>
+              <wp:posOffset>0</wp:posOffset>
             </wp:positionV>
             <wp:extent cx="5962650" cy="4968875"/>
             <wp:effectExtent l="0" t="0" r="6350" b="0"/>
@@ -849,7 +391,7 @@
                     <pic:cNvPicPr/>
                   </pic:nvPicPr>
                   <pic:blipFill>
-                    <a:blip r:embed="rId7" cstate="print">
+                    <a:blip r:embed="rId10" cstate="print">
                       <a:extLst>
                         <a:ext uri="{28A0092B-C50C-407E-A947-70E740481C1C}">
                           <a14:useLocalDpi xmlns:a14="http://schemas.microsoft.com/office/drawing/2010/main" val="0"/>
@@ -886,109 +428,90 @@
       <w:pPr>
         <w:rPr>
           <w:rFonts w:ascii="Garamond" w:hAnsi="Garamond"/>
-          <w:sz w:val="22"/>
-          <w:szCs w:val="22"/>
-        </w:rPr>
-      </w:pPr>
-      <w:r>
-        <w:rPr>
-          <w:rFonts w:ascii="Garamond" w:hAnsi="Garamond"/>
-          <w:b/>
-          <w:bCs/>
-          <w:sz w:val="22"/>
-          <w:szCs w:val="22"/>
-        </w:rPr>
-        <w:t xml:space="preserve">Figure </w:t>
-      </w:r>
-      <w:r>
-        <w:rPr>
-          <w:rFonts w:ascii="Garamond" w:hAnsi="Garamond"/>
-          <w:b/>
-          <w:bCs/>
-          <w:sz w:val="22"/>
-          <w:szCs w:val="22"/>
-        </w:rPr>
-        <w:t>4</w:t>
-      </w:r>
-      <w:r>
-        <w:rPr>
-          <w:rFonts w:ascii="Garamond" w:hAnsi="Garamond"/>
-          <w:b/>
-          <w:bCs/>
-          <w:sz w:val="22"/>
-          <w:szCs w:val="22"/>
-        </w:rPr>
-        <w:t>:</w:t>
-      </w:r>
-      <w:r>
-        <w:rPr>
-          <w:rFonts w:ascii="Garamond" w:hAnsi="Garamond"/>
-          <w:sz w:val="22"/>
-          <w:szCs w:val="22"/>
-        </w:rPr>
-        <w:t xml:space="preserve"> Principal Component analysis of </w:t>
-      </w:r>
-      <w:r>
-        <w:rPr>
-          <w:rFonts w:ascii="Garamond" w:hAnsi="Garamond"/>
-          <w:sz w:val="22"/>
-          <w:szCs w:val="22"/>
-        </w:rPr>
-        <w:t>gam smoothed timeseries data (n = 2,531). Significant clustering is evident, but with overlap between all watersheds. Yukon (Blue points) contain a much larger range of values</w:t>
-      </w:r>
-      <w:r>
-        <w:rPr>
-          <w:rFonts w:ascii="Garamond" w:hAnsi="Garamond"/>
-          <w:sz w:val="22"/>
-          <w:szCs w:val="22"/>
-        </w:rPr>
-        <w:t xml:space="preserve">, indicative of the large range in natal </w:t>
+        </w:rPr>
+      </w:pPr>
+      <w:r>
+        <w:rPr>
+          <w:rFonts w:ascii="Garamond" w:hAnsi="Garamond"/>
+          <w:b/>
+          <w:bCs/>
+        </w:rPr>
+        <w:t>Figure 2:</w:t>
+      </w:r>
+      <w:r>
+        <w:rPr>
+          <w:rFonts w:ascii="Garamond" w:hAnsi="Garamond"/>
+        </w:rPr>
+        <w:t xml:space="preserve"> Principal Component analysis of GAM smoothed timeseries data (n = 2,</w:t>
+      </w:r>
+      <w:commentRangeStart w:id="2"/>
+      <w:r>
+        <w:rPr>
+          <w:rFonts w:ascii="Garamond" w:hAnsi="Garamond"/>
+        </w:rPr>
+        <w:t xml:space="preserve">531 </w:t>
+      </w:r>
+      <w:commentRangeEnd w:id="2"/>
+      <w:r>
+        <w:rPr>
+          <w:rStyle w:val="CommentReference"/>
+          <w:rFonts w:ascii="Garamond" w:hAnsi="Garamond"/>
+          <w:sz w:val="24"/>
+          <w:szCs w:val="24"/>
+        </w:rPr>
+        <w:commentReference w:id="2"/>
+      </w:r>
+      <w:r>
+        <w:rPr>
+          <w:rFonts w:ascii="Garamond" w:hAnsi="Garamond"/>
+        </w:rPr>
+        <w:t xml:space="preserve">otoliths). Significant clustering is evident, but with overlap between all watersheds. Yukon (Blue points) contain a much larger range of values, indicative of the large range in natal </w:t>
       </w:r>
       <w:r>
         <w:rPr>
           <w:rFonts w:ascii="Cambria Math" w:hAnsi="Cambria Math" w:cs="Cambria Math"/>
-          <w:sz w:val="22"/>
-          <w:szCs w:val="22"/>
         </w:rPr>
         <w:t>⁸⁷</w:t>
       </w:r>
       <w:r>
         <w:rPr>
           <w:rFonts w:ascii="Garamond" w:hAnsi="Garamond"/>
-          <w:sz w:val="22"/>
-          <w:szCs w:val="22"/>
         </w:rPr>
         <w:t>Sr/</w:t>
       </w:r>
       <w:r>
         <w:rPr>
           <w:rFonts w:ascii="Cambria Math" w:hAnsi="Cambria Math" w:cs="Cambria Math"/>
-          <w:sz w:val="22"/>
-          <w:szCs w:val="22"/>
         </w:rPr>
         <w:t>⁸⁶</w:t>
       </w:r>
       <w:r>
         <w:rPr>
           <w:rFonts w:ascii="Garamond" w:hAnsi="Garamond"/>
-          <w:sz w:val="22"/>
-          <w:szCs w:val="22"/>
-        </w:rPr>
-        <w:t xml:space="preserve">Sr </w:t>
-      </w:r>
-      <w:r>
-        <w:rPr>
-          <w:rFonts w:ascii="Garamond" w:hAnsi="Garamond"/>
-          <w:sz w:val="22"/>
-          <w:szCs w:val="22"/>
-        </w:rPr>
-        <w:t xml:space="preserve">values in the basin. Kuskokwim (Red points) overlap between both Nushagak and Yukon fish, likely due to its position in the region between both watersheds. </w:t>
-      </w:r>
-    </w:p>
-    <w:p>
-      <w:pPr>
-        <w:rPr>
-          <w:rFonts w:ascii="Garamond" w:hAnsi="Garamond"/>
+        </w:rPr>
+        <w:t xml:space="preserve">Sr values in the basin. Kuskokwim (Red points) overlap between both </w:t>
+      </w:r>
+      <w:proofErr w:type="spellStart"/>
+      <w:r>
+        <w:rPr>
+          <w:rFonts w:ascii="Garamond" w:hAnsi="Garamond"/>
+        </w:rPr>
+        <w:t>Nushagak</w:t>
+      </w:r>
+      <w:proofErr w:type="spellEnd"/>
+      <w:r>
+        <w:rPr>
+          <w:rFonts w:ascii="Garamond" w:hAnsi="Garamond"/>
+        </w:rPr>
+        <w:t xml:space="preserve"> and Yukon fish, likely due to its position in the region between both watersheds. </w:t>
+      </w:r>
+    </w:p>
+    <w:p>
+      <w:pPr>
+        <w:rPr>
+          <w:rFonts w:ascii="Garamond" w:hAnsi="Garamond"/>
+          <w:b/>
+          <w:bCs/>
           <w:sz w:val="16"/>
           <w:szCs w:val="16"/>
         </w:rPr>
@@ -998,15 +521,8 @@
       <w:pPr>
         <w:rPr>
           <w:rFonts w:ascii="Garamond" w:hAnsi="Garamond"/>
-          <w:sz w:val="16"/>
-          <w:szCs w:val="16"/>
-        </w:rPr>
-      </w:pPr>
-    </w:p>
-    <w:p>
-      <w:pPr>
-        <w:rPr>
-          <w:rFonts w:ascii="Garamond" w:hAnsi="Garamond"/>
+          <w:b/>
+          <w:bCs/>
           <w:sz w:val="16"/>
           <w:szCs w:val="16"/>
         </w:rPr>
@@ -1020,10 +536,10 @@
         </w:rPr>
         <w:lastRenderedPageBreak/>
         <w:drawing>
-          <wp:inline distT="0" distB="0" distL="0" distR="0" wp14:anchorId="741AD416" wp14:editId="6E9D9EA4">
-            <wp:extent cx="6290068" cy="3235084"/>
-            <wp:effectExtent l="0" t="0" r="0" b="3810"/>
-            <wp:docPr id="988652365" name="Picture 1" descr="A graph of different colored lines&#10;&#10;AI-generated content may be incorrect."/>
+          <wp:inline distT="0" distB="0" distL="0" distR="0" wp14:anchorId="2872C2BB" wp14:editId="5A83A858">
+            <wp:extent cx="5943600" cy="3034665"/>
+            <wp:effectExtent l="0" t="0" r="0" b="635"/>
+            <wp:docPr id="1067725208" name="Picture 2" descr="A group of graphs showing different types of data&#10;&#10;AI-generated content may be incorrect."/>
             <wp:cNvGraphicFramePr>
               <a:graphicFrameLocks xmlns:a="http://schemas.openxmlformats.org/drawingml/2006/main" noChangeAspect="1"/>
             </wp:cNvGraphicFramePr>
@@ -1031,11 +547,11 @@
               <a:graphicData uri="http://schemas.openxmlformats.org/drawingml/2006/picture">
                 <pic:pic xmlns:pic="http://schemas.openxmlformats.org/drawingml/2006/picture">
                   <pic:nvPicPr>
-                    <pic:cNvPr id="988652365" name="Picture 1" descr="A graph of different colored lines&#10;&#10;AI-generated content may be incorrect."/>
+                    <pic:cNvPr id="219536095" name="Picture 2" descr="A group of graphs showing different types of data&#10;&#10;AI-generated content may be incorrect."/>
                     <pic:cNvPicPr/>
                   </pic:nvPicPr>
                   <pic:blipFill>
-                    <a:blip r:embed="rId8" cstate="print">
+                    <a:blip r:embed="rId11" cstate="print">
                       <a:extLst>
                         <a:ext uri="{28A0092B-C50C-407E-A947-70E740481C1C}">
                           <a14:useLocalDpi xmlns:a14="http://schemas.microsoft.com/office/drawing/2010/main" val="0"/>
@@ -1049,7 +565,7 @@
                   <pic:spPr>
                     <a:xfrm>
                       <a:off x="0" y="0"/>
-                      <a:ext cx="6305638" cy="3243092"/>
+                      <a:ext cx="5943600" cy="3034665"/>
                     </a:xfrm>
                     <a:prstGeom prst="rect">
                       <a:avLst/>
@@ -1066,26 +582,13 @@
       <w:pPr>
         <w:rPr>
           <w:rFonts w:ascii="Garamond" w:hAnsi="Garamond"/>
-          <w:sz w:val="16"/>
-          <w:szCs w:val="16"/>
-        </w:rPr>
-      </w:pPr>
-    </w:p>
-    <w:p>
-      <w:pPr>
-        <w:rPr>
-          <w:rFonts w:ascii="Garamond" w:hAnsi="Garamond"/>
-          <w:sz w:val="22"/>
-          <w:szCs w:val="22"/>
-        </w:rPr>
-      </w:pPr>
-      <w:r>
-        <w:rPr>
-          <w:rFonts w:ascii="Garamond" w:hAnsi="Garamond"/>
-          <w:b/>
-          <w:bCs/>
-          <w:sz w:val="22"/>
-          <w:szCs w:val="22"/>
+        </w:rPr>
+      </w:pPr>
+      <w:r>
+        <w:rPr>
+          <w:rFonts w:ascii="Garamond" w:hAnsi="Garamond"/>
+          <w:b/>
+          <w:bCs/>
         </w:rPr>
         <w:t xml:space="preserve">Figure </w:t>
       </w:r>
@@ -1094,268 +597,103 @@
           <w:rFonts w:ascii="Garamond" w:hAnsi="Garamond"/>
           <w:b/>
           <w:bCs/>
-          <w:sz w:val="22"/>
-          <w:szCs w:val="22"/>
-        </w:rPr>
-        <w:t>5</w:t>
-      </w:r>
-      <w:r>
-        <w:rPr>
-          <w:rFonts w:ascii="Garamond" w:hAnsi="Garamond"/>
-          <w:b/>
-          <w:bCs/>
-          <w:sz w:val="22"/>
-          <w:szCs w:val="22"/>
-        </w:rPr>
-        <w:t>:</w:t>
-      </w:r>
-      <w:r>
-        <w:rPr>
-          <w:rFonts w:ascii="Garamond" w:hAnsi="Garamond"/>
-          <w:b/>
-          <w:bCs/>
-          <w:sz w:val="22"/>
-          <w:szCs w:val="22"/>
-        </w:rPr>
-        <w:t xml:space="preserve"> </w:t>
-      </w:r>
-      <w:r>
-        <w:rPr>
-          <w:rFonts w:ascii="Garamond" w:hAnsi="Garamond"/>
-          <w:sz w:val="22"/>
-          <w:szCs w:val="22"/>
-        </w:rPr>
-        <w:t>A)</w:t>
-      </w:r>
-      <w:r>
-        <w:rPr>
-          <w:rFonts w:ascii="Garamond" w:hAnsi="Garamond"/>
-          <w:sz w:val="22"/>
-          <w:szCs w:val="22"/>
-        </w:rPr>
-        <w:t xml:space="preserve"> Principal component analysis of all samples with a natal origin </w:t>
+        </w:rPr>
+        <w:t>3</w:t>
+      </w:r>
+      <w:r>
+        <w:rPr>
+          <w:rFonts w:ascii="Garamond" w:hAnsi="Garamond"/>
+          <w:b/>
+          <w:bCs/>
+        </w:rPr>
+        <w:t xml:space="preserve">: </w:t>
+      </w:r>
+      <w:r>
+        <w:rPr>
+          <w:rFonts w:ascii="Garamond" w:hAnsi="Garamond"/>
+        </w:rPr>
+        <w:t xml:space="preserve">A) Principal component analysis of all samples with a natal origin </w:t>
       </w:r>
       <w:r>
         <w:rPr>
           <w:rFonts w:ascii="Cambria Math" w:hAnsi="Cambria Math" w:cs="Cambria Math"/>
-          <w:sz w:val="22"/>
-          <w:szCs w:val="22"/>
         </w:rPr>
         <w:t>⁸⁷</w:t>
       </w:r>
       <w:r>
         <w:rPr>
           <w:rFonts w:ascii="Garamond" w:hAnsi="Garamond"/>
-          <w:sz w:val="22"/>
-          <w:szCs w:val="22"/>
         </w:rPr>
         <w:t>Sr/</w:t>
       </w:r>
       <w:r>
         <w:rPr>
           <w:rFonts w:ascii="Cambria Math" w:hAnsi="Cambria Math" w:cs="Cambria Math"/>
-          <w:sz w:val="22"/>
-          <w:szCs w:val="22"/>
         </w:rPr>
         <w:t>⁸⁶</w:t>
       </w:r>
       <w:r>
         <w:rPr>
           <w:rFonts w:ascii="Garamond" w:hAnsi="Garamond"/>
-          <w:sz w:val="22"/>
-          <w:szCs w:val="22"/>
-        </w:rPr>
-        <w:t>Sr</w:t>
-      </w:r>
-      <w:r>
-        <w:rPr>
-          <w:rFonts w:ascii="Garamond" w:hAnsi="Garamond"/>
-          <w:sz w:val="22"/>
-          <w:szCs w:val="22"/>
-        </w:rPr>
-        <w:t xml:space="preserve"> of 0.708</w:t>
-      </w:r>
-      <w:r>
-        <w:rPr>
-          <w:rFonts w:ascii="Garamond" w:hAnsi="Garamond"/>
-          <w:sz w:val="22"/>
-          <w:szCs w:val="22"/>
-        </w:rPr>
-        <w:t xml:space="preserve">0 </w:t>
-      </w:r>
-      <w:r>
-        <w:rPr>
-          <w:rFonts w:ascii="Garamond" w:hAnsi="Garamond"/>
-          <w:sz w:val="22"/>
-          <w:szCs w:val="22"/>
-        </w:rPr>
-        <w:t>- 0.</w:t>
-      </w:r>
-      <w:r>
-        <w:rPr>
-          <w:rFonts w:ascii="Garamond" w:hAnsi="Garamond"/>
-          <w:sz w:val="22"/>
-          <w:szCs w:val="22"/>
-        </w:rPr>
-        <w:t xml:space="preserve">7085. Clustering among watersheds is evident between principal </w:t>
-      </w:r>
-      <w:commentRangeStart w:id="0"/>
-      <w:commentRangeStart w:id="1"/>
-      <w:r>
-        <w:rPr>
-          <w:rFonts w:ascii="Garamond" w:hAnsi="Garamond"/>
-          <w:sz w:val="22"/>
-          <w:szCs w:val="22"/>
+        </w:rPr>
+        <w:t xml:space="preserve">Sr of 0.7080 - 0.7085. Clustering among watersheds is evident between principal </w:t>
+      </w:r>
+      <w:commentRangeStart w:id="3"/>
+      <w:commentRangeStart w:id="4"/>
+      <w:r>
+        <w:rPr>
+          <w:rFonts w:ascii="Garamond" w:hAnsi="Garamond"/>
         </w:rPr>
         <w:t>components</w:t>
       </w:r>
-      <w:commentRangeEnd w:id="0"/>
+      <w:commentRangeEnd w:id="3"/>
       <w:r>
         <w:rPr>
           <w:rStyle w:val="CommentReference"/>
           <w:rFonts w:ascii="Garamond" w:hAnsi="Garamond"/>
-          <w:sz w:val="22"/>
-          <w:szCs w:val="22"/>
-        </w:rPr>
-        <w:commentReference w:id="0"/>
-      </w:r>
-      <w:commentRangeEnd w:id="1"/>
+          <w:sz w:val="24"/>
+          <w:szCs w:val="24"/>
+        </w:rPr>
+        <w:commentReference w:id="3"/>
+      </w:r>
+      <w:commentRangeEnd w:id="4"/>
       <w:r>
         <w:rPr>
           <w:rStyle w:val="CommentReference"/>
           <w:rFonts w:ascii="Garamond" w:hAnsi="Garamond"/>
-          <w:sz w:val="22"/>
-          <w:szCs w:val="22"/>
-        </w:rPr>
-        <w:commentReference w:id="1"/>
-      </w:r>
-      <w:r>
-        <w:rPr>
-          <w:rFonts w:ascii="Garamond" w:hAnsi="Garamond"/>
-          <w:sz w:val="22"/>
-          <w:szCs w:val="22"/>
-        </w:rPr>
-        <w:t xml:space="preserve"> 1 and 2 (</w:t>
-      </w:r>
-      <w:r>
-        <w:rPr>
-          <w:rFonts w:ascii="Garamond" w:hAnsi="Garamond"/>
-          <w:sz w:val="22"/>
-          <w:szCs w:val="22"/>
-        </w:rPr>
-        <w:t>68.39</w:t>
-      </w:r>
-      <w:r>
-        <w:rPr>
-          <w:rFonts w:ascii="Garamond" w:hAnsi="Garamond"/>
-          <w:sz w:val="22"/>
-          <w:szCs w:val="22"/>
-        </w:rPr>
-        <w:t>% of variance), as well as between principal components 2 and 3 (</w:t>
-      </w:r>
-      <w:r>
-        <w:rPr>
-          <w:rFonts w:ascii="Garamond" w:hAnsi="Garamond"/>
-          <w:sz w:val="22"/>
-          <w:szCs w:val="22"/>
-        </w:rPr>
-        <w:t>31.16%</w:t>
-      </w:r>
-      <w:r>
-        <w:rPr>
-          <w:rFonts w:ascii="Garamond" w:hAnsi="Garamond"/>
-          <w:sz w:val="22"/>
-          <w:szCs w:val="22"/>
-        </w:rPr>
-        <w:t xml:space="preserve"> </w:t>
-      </w:r>
-      <w:r>
-        <w:rPr>
-          <w:rFonts w:ascii="Garamond" w:hAnsi="Garamond"/>
-          <w:sz w:val="22"/>
-          <w:szCs w:val="22"/>
-        </w:rPr>
-        <w:t xml:space="preserve">of </w:t>
-      </w:r>
-      <w:r>
-        <w:rPr>
-          <w:rFonts w:ascii="Garamond" w:hAnsi="Garamond"/>
-          <w:sz w:val="22"/>
-          <w:szCs w:val="22"/>
-        </w:rPr>
-        <w:t xml:space="preserve">variance). There is </w:t>
-      </w:r>
-      <w:r>
-        <w:rPr>
-          <w:rFonts w:ascii="Garamond" w:hAnsi="Garamond"/>
-          <w:sz w:val="22"/>
-          <w:szCs w:val="22"/>
-        </w:rPr>
-        <w:t>s</w:t>
-      </w:r>
-      <w:r>
-        <w:rPr>
-          <w:rFonts w:ascii="Garamond" w:hAnsi="Garamond"/>
-          <w:sz w:val="22"/>
-          <w:szCs w:val="22"/>
-        </w:rPr>
-        <w:t>ome overlap between all three watersheds in both cases. B) Sample otolith LA timeseries colored by the absolute value of the PCA loadings at associated</w:t>
-      </w:r>
-      <w:r>
-        <w:rPr>
-          <w:rFonts w:ascii="Garamond" w:hAnsi="Garamond"/>
-          <w:sz w:val="22"/>
-          <w:szCs w:val="22"/>
-        </w:rPr>
-        <w:t xml:space="preserve"> timeseries</w:t>
-      </w:r>
-      <w:r>
-        <w:rPr>
-          <w:rFonts w:ascii="Garamond" w:hAnsi="Garamond"/>
-          <w:sz w:val="22"/>
-          <w:szCs w:val="22"/>
-        </w:rPr>
-        <w:t xml:space="preserve"> indices. PC1 (top row) shows high loading on the middle section of the timeseries after the natal origin region. PC2 is driven by the region of the timeseries towards the marine entry</w:t>
-      </w:r>
-      <w:r>
-        <w:rPr>
-          <w:rFonts w:ascii="Garamond" w:hAnsi="Garamond"/>
-          <w:sz w:val="22"/>
-          <w:szCs w:val="22"/>
-        </w:rPr>
-        <w:t xml:space="preserve">, likely the result of mainstem migration to the ocean. </w:t>
-      </w:r>
-      <w:r>
-        <w:rPr>
-          <w:rFonts w:ascii="Garamond" w:hAnsi="Garamond"/>
-          <w:sz w:val="22"/>
-          <w:szCs w:val="22"/>
-        </w:rPr>
-        <w:t xml:space="preserve">Separation along </w:t>
-      </w:r>
-      <w:r>
-        <w:rPr>
-          <w:rFonts w:ascii="Garamond" w:hAnsi="Garamond"/>
-          <w:sz w:val="22"/>
-          <w:szCs w:val="22"/>
-        </w:rPr>
-        <w:t xml:space="preserve">PC3 is driven by the very beginning of the timeseries, which is the region associated with the natal origin. </w:t>
-      </w:r>
-      <w:r>
-        <w:rPr>
-          <w:rFonts w:ascii="Garamond" w:hAnsi="Garamond"/>
-          <w:sz w:val="22"/>
-          <w:szCs w:val="22"/>
-        </w:rPr>
-        <w:t xml:space="preserve">Notably, </w:t>
-      </w:r>
-      <w:r>
-        <w:rPr>
-          <w:rFonts w:ascii="Garamond" w:hAnsi="Garamond"/>
-          <w:sz w:val="22"/>
-          <w:szCs w:val="22"/>
-        </w:rPr>
-        <w:t>Yukon individuals from the CWAK region contain a less pronounces mainstem signal as compared to their counterpart from the upper or middle Yukon genetic groups.</w:t>
+          <w:sz w:val="24"/>
+          <w:szCs w:val="24"/>
+        </w:rPr>
+        <w:commentReference w:id="4"/>
+      </w:r>
+      <w:r>
+        <w:rPr>
+          <w:rFonts w:ascii="Garamond" w:hAnsi="Garamond"/>
+        </w:rPr>
+        <w:t xml:space="preserve"> 1 and 2 (68.39% of variance), as well as between principal components 2 and 3 (31.16% of variance). There is some overlap between all three watersheds in both cases. B) </w:t>
+      </w:r>
+      <w:commentRangeStart w:id="5"/>
+      <w:r>
+        <w:rPr>
+          <w:rFonts w:ascii="Garamond" w:hAnsi="Garamond"/>
+        </w:rPr>
+        <w:t xml:space="preserve">Sample </w:t>
+      </w:r>
+      <w:commentRangeEnd w:id="5"/>
+      <w:r>
+        <w:rPr>
+          <w:rStyle w:val="CommentReference"/>
+          <w:rFonts w:ascii="Garamond" w:hAnsi="Garamond"/>
+          <w:sz w:val="24"/>
+          <w:szCs w:val="24"/>
+        </w:rPr>
+        <w:commentReference w:id="5"/>
+      </w:r>
+      <w:r>
+        <w:rPr>
+          <w:rFonts w:ascii="Garamond" w:hAnsi="Garamond"/>
+        </w:rPr>
+        <w:t>otolith LA timeseries colored by the absolute value of the PCA loadings at associated timeseries indices. PC1 (top row) shows high loading on the middle section of the timeseries after the natal origin region. PC2 is driven by the region of the timeseries towards the marine entry, likely the result of mainstem migration to the ocean. Separation along PC3 is driven by the very beginning of the timeseries, which is the region associated with the natal origin. Notably, Yukon individuals from the CWAK region contain a less pronounces mainstem signal as compared to their counterpart from the upper or middle Yukon genetic groups.</w:t>
       </w:r>
     </w:p>
     <w:p>
@@ -1445,10 +783,10 @@
         </w:rPr>
         <w:lastRenderedPageBreak/>
         <w:drawing>
-          <wp:inline distT="0" distB="0" distL="0" distR="0" wp14:anchorId="735C320F" wp14:editId="301F0BE4">
-            <wp:extent cx="6310648" cy="3155324"/>
-            <wp:effectExtent l="0" t="0" r="1270" b="0"/>
-            <wp:docPr id="975453772" name="Picture 2" descr="A graph of different colored lines&#10;&#10;AI-generated content may be incorrect."/>
+          <wp:inline distT="0" distB="0" distL="0" distR="0" wp14:anchorId="0EE2AE9C" wp14:editId="060AFD3D">
+            <wp:extent cx="5943600" cy="2054225"/>
+            <wp:effectExtent l="0" t="0" r="0" b="3175"/>
+            <wp:docPr id="887724946" name="Picture 1" descr="A close-up of a graph&#10;&#10;AI-generated content may be incorrect."/>
             <wp:cNvGraphicFramePr>
               <a:graphicFrameLocks xmlns:a="http://schemas.openxmlformats.org/drawingml/2006/main" noChangeAspect="1"/>
             </wp:cNvGraphicFramePr>
@@ -1456,11 +794,495 @@
               <a:graphicData uri="http://schemas.openxmlformats.org/drawingml/2006/picture">
                 <pic:pic xmlns:pic="http://schemas.openxmlformats.org/drawingml/2006/picture">
                   <pic:nvPicPr>
-                    <pic:cNvPr id="975453772" name="Picture 2" descr="A graph of different colored lines&#10;&#10;AI-generated content may be incorrect."/>
+                    <pic:cNvPr id="887724946" name="Picture 1" descr="A close-up of a graph&#10;&#10;AI-generated content may be incorrect."/>
                     <pic:cNvPicPr/>
                   </pic:nvPicPr>
                   <pic:blipFill>
-                    <a:blip r:embed="rId13" cstate="print">
+                    <a:blip r:embed="rId12"/>
+                    <a:stretch>
+                      <a:fillRect/>
+                    </a:stretch>
+                  </pic:blipFill>
+                  <pic:spPr>
+                    <a:xfrm>
+                      <a:off x="0" y="0"/>
+                      <a:ext cx="5943600" cy="2054225"/>
+                    </a:xfrm>
+                    <a:prstGeom prst="rect">
+                      <a:avLst/>
+                    </a:prstGeom>
+                  </pic:spPr>
+                </pic:pic>
+              </a:graphicData>
+            </a:graphic>
+          </wp:inline>
+        </w:drawing>
+      </w:r>
+    </w:p>
+    <w:p>
+      <w:pPr>
+        <w:rPr>
+          <w:rFonts w:ascii="Garamond" w:hAnsi="Garamond"/>
+          <w:sz w:val="16"/>
+          <w:szCs w:val="16"/>
+        </w:rPr>
+      </w:pPr>
+      <w:r>
+        <w:rPr>
+          <w:rFonts w:ascii="Garamond" w:hAnsi="Garamond"/>
+          <w:b/>
+          <w:bCs/>
+          <w:sz w:val="22"/>
+          <w:szCs w:val="22"/>
+        </w:rPr>
+        <w:t xml:space="preserve">Figure </w:t>
+      </w:r>
+      <w:r>
+        <w:rPr>
+          <w:rFonts w:ascii="Garamond" w:hAnsi="Garamond"/>
+          <w:b/>
+          <w:bCs/>
+          <w:sz w:val="22"/>
+          <w:szCs w:val="22"/>
+        </w:rPr>
+        <w:t>4</w:t>
+      </w:r>
+      <w:r>
+        <w:rPr>
+          <w:rFonts w:ascii="Garamond" w:hAnsi="Garamond"/>
+          <w:b/>
+          <w:bCs/>
+          <w:sz w:val="22"/>
+          <w:szCs w:val="22"/>
+        </w:rPr>
+        <w:t>:</w:t>
+      </w:r>
+      <w:r>
+        <w:rPr>
+          <w:rFonts w:ascii="Garamond" w:hAnsi="Garamond"/>
+          <w:sz w:val="16"/>
+          <w:szCs w:val="16"/>
+        </w:rPr>
+        <w:t xml:space="preserve"> </w:t>
+      </w:r>
+      <w:r>
+        <w:rPr>
+          <w:rFonts w:ascii="Garamond" w:hAnsi="Garamond"/>
+          <w:sz w:val="22"/>
+          <w:szCs w:val="22"/>
+        </w:rPr>
+        <w:t xml:space="preserve">Model Performance comparison among data </w:t>
+      </w:r>
+      <w:r>
+        <w:rPr>
+          <w:rFonts w:ascii="Garamond" w:hAnsi="Garamond"/>
+          <w:sz w:val="22"/>
+          <w:szCs w:val="22"/>
+        </w:rPr>
+        <w:t xml:space="preserve">preprocessing steps </w:t>
+      </w:r>
+      <w:r>
+        <w:rPr>
+          <w:rFonts w:ascii="Garamond" w:hAnsi="Garamond"/>
+          <w:sz w:val="22"/>
+          <w:szCs w:val="22"/>
+        </w:rPr>
+        <w:t xml:space="preserve">and model types. Accuracy indicates the proportion of each class correctly classified. F1-Score is the harmonic mean of precision and recall, providing a balanced performance measure across all watershed classes. Results compare </w:t>
+      </w:r>
+      <w:r>
+        <w:rPr>
+          <w:rFonts w:ascii="Garamond" w:hAnsi="Garamond"/>
+          <w:sz w:val="22"/>
+          <w:szCs w:val="22"/>
+        </w:rPr>
+        <w:t>two</w:t>
+      </w:r>
+      <w:r>
+        <w:rPr>
+          <w:rFonts w:ascii="Garamond" w:hAnsi="Garamond"/>
+          <w:sz w:val="22"/>
+          <w:szCs w:val="22"/>
+        </w:rPr>
+        <w:t xml:space="preserve"> </w:t>
+      </w:r>
+      <w:r>
+        <w:rPr>
+          <w:rFonts w:ascii="Cambria Math" w:hAnsi="Cambria Math" w:cs="Cambria Math"/>
+          <w:sz w:val="22"/>
+          <w:szCs w:val="22"/>
+        </w:rPr>
+        <w:t>⁸⁷</w:t>
+      </w:r>
+      <w:r>
+        <w:rPr>
+          <w:rFonts w:ascii="Garamond" w:hAnsi="Garamond"/>
+          <w:sz w:val="22"/>
+          <w:szCs w:val="22"/>
+        </w:rPr>
+        <w:t>Sr/</w:t>
+      </w:r>
+      <w:r>
+        <w:rPr>
+          <w:rFonts w:ascii="Cambria Math" w:hAnsi="Cambria Math" w:cs="Cambria Math"/>
+          <w:sz w:val="22"/>
+          <w:szCs w:val="22"/>
+        </w:rPr>
+        <w:t>⁸⁶</w:t>
+      </w:r>
+      <w:r>
+        <w:rPr>
+          <w:rFonts w:ascii="Garamond" w:hAnsi="Garamond"/>
+          <w:sz w:val="22"/>
+          <w:szCs w:val="22"/>
+        </w:rPr>
+        <w:t xml:space="preserve">Sr </w:t>
+      </w:r>
+      <w:r>
+        <w:rPr>
+          <w:rFonts w:ascii="Garamond" w:hAnsi="Garamond"/>
+          <w:sz w:val="22"/>
+          <w:szCs w:val="22"/>
+        </w:rPr>
+        <w:t xml:space="preserve">timeseries smoothing </w:t>
+      </w:r>
+      <w:r>
+        <w:rPr>
+          <w:rFonts w:ascii="Garamond" w:hAnsi="Garamond"/>
+          <w:sz w:val="22"/>
+          <w:szCs w:val="22"/>
+        </w:rPr>
+        <w:t xml:space="preserve">methods (GAM, MA) </w:t>
+      </w:r>
+      <w:r>
+        <w:rPr>
+          <w:rFonts w:ascii="Garamond" w:hAnsi="Garamond"/>
+          <w:sz w:val="22"/>
+          <w:szCs w:val="22"/>
+        </w:rPr>
+        <w:t>a</w:t>
+      </w:r>
+      <w:r>
+        <w:rPr>
+          <w:rFonts w:ascii="Garamond" w:hAnsi="Garamond"/>
+          <w:sz w:val="22"/>
+          <w:szCs w:val="22"/>
+        </w:rPr>
+        <w:t xml:space="preserve">nd three machine learning algorithms (Random Forest, SVM, KNN) using either all test data (Total) or only overlapping isotope ranges (Overlapping). </w:t>
+      </w:r>
+      <w:r>
+        <w:rPr>
+          <w:rFonts w:ascii="Garamond" w:hAnsi="Garamond"/>
+          <w:sz w:val="22"/>
+          <w:szCs w:val="22"/>
+        </w:rPr>
+        <w:t>Darker green colors indicate higher scores</w:t>
+      </w:r>
+      <w:r>
+        <w:rPr>
+          <w:rFonts w:ascii="Garamond" w:hAnsi="Garamond"/>
+          <w:sz w:val="16"/>
+          <w:szCs w:val="16"/>
+        </w:rPr>
+        <w:t>.</w:t>
+      </w:r>
+    </w:p>
+    <w:p>
+      <w:pPr>
+        <w:rPr>
+          <w:rFonts w:ascii="Garamond" w:hAnsi="Garamond"/>
+          <w:sz w:val="16"/>
+          <w:szCs w:val="16"/>
+        </w:rPr>
+      </w:pPr>
+    </w:p>
+    <w:p>
+      <w:pPr>
+        <w:rPr>
+          <w:rFonts w:ascii="Garamond" w:hAnsi="Garamond"/>
+          <w:sz w:val="16"/>
+          <w:szCs w:val="16"/>
+        </w:rPr>
+      </w:pPr>
+      <w:r>
+        <w:rPr>
+          <w:rFonts w:ascii="Garamond" w:hAnsi="Garamond"/>
+          <w:noProof/>
+          <w:sz w:val="16"/>
+          <w:szCs w:val="16"/>
+        </w:rPr>
+        <w:drawing>
+          <wp:inline distT="0" distB="0" distL="0" distR="0" wp14:anchorId="16679699" wp14:editId="668105C7">
+            <wp:extent cx="5962810" cy="2981405"/>
+            <wp:effectExtent l="0" t="0" r="6350" b="3175"/>
+            <wp:docPr id="1789130704" name="Picture 6"/>
+            <wp:cNvGraphicFramePr>
+              <a:graphicFrameLocks xmlns:a="http://schemas.openxmlformats.org/drawingml/2006/main" noChangeAspect="1"/>
+            </wp:cNvGraphicFramePr>
+            <a:graphic xmlns:a="http://schemas.openxmlformats.org/drawingml/2006/main">
+              <a:graphicData uri="http://schemas.openxmlformats.org/drawingml/2006/picture">
+                <pic:pic xmlns:pic="http://schemas.openxmlformats.org/drawingml/2006/picture">
+                  <pic:nvPicPr>
+                    <pic:cNvPr id="1789130704" name="Picture 1789130704"/>
+                    <pic:cNvPicPr/>
+                  </pic:nvPicPr>
+                  <pic:blipFill>
+                    <a:blip r:embed="rId13"/>
+                    <a:stretch>
+                      <a:fillRect/>
+                    </a:stretch>
+                  </pic:blipFill>
+                  <pic:spPr>
+                    <a:xfrm>
+                      <a:off x="0" y="0"/>
+                      <a:ext cx="5988578" cy="2994289"/>
+                    </a:xfrm>
+                    <a:prstGeom prst="rect">
+                      <a:avLst/>
+                    </a:prstGeom>
+                  </pic:spPr>
+                </pic:pic>
+              </a:graphicData>
+            </a:graphic>
+          </wp:inline>
+        </w:drawing>
+      </w:r>
+      <w:r>
+        <w:rPr>
+          <w:rFonts w:ascii="Garamond" w:hAnsi="Garamond"/>
+          <w:sz w:val="16"/>
+          <w:szCs w:val="16"/>
+        </w:rPr>
+        <w:t xml:space="preserve"> </w:t>
+      </w:r>
+    </w:p>
+    <w:p>
+      <w:pPr>
+        <w:rPr>
+          <w:rFonts w:ascii="Garamond" w:hAnsi="Garamond"/>
+          <w:sz w:val="22"/>
+          <w:szCs w:val="22"/>
+        </w:rPr>
+      </w:pPr>
+      <w:r>
+        <w:rPr>
+          <w:rFonts w:ascii="Garamond" w:hAnsi="Garamond"/>
+          <w:b/>
+          <w:bCs/>
+          <w:sz w:val="22"/>
+          <w:szCs w:val="22"/>
+        </w:rPr>
+        <w:t xml:space="preserve">Figure </w:t>
+      </w:r>
+      <w:r>
+        <w:rPr>
+          <w:rFonts w:ascii="Garamond" w:hAnsi="Garamond"/>
+          <w:b/>
+          <w:bCs/>
+          <w:sz w:val="22"/>
+          <w:szCs w:val="22"/>
+        </w:rPr>
+        <w:t>5</w:t>
+      </w:r>
+      <w:r>
+        <w:rPr>
+          <w:rFonts w:ascii="Garamond" w:hAnsi="Garamond"/>
+          <w:b/>
+          <w:bCs/>
+          <w:sz w:val="22"/>
+          <w:szCs w:val="22"/>
+        </w:rPr>
+        <w:t>:</w:t>
+      </w:r>
+      <w:r>
+        <w:rPr>
+          <w:rFonts w:ascii="Garamond" w:hAnsi="Garamond"/>
+          <w:sz w:val="22"/>
+          <w:szCs w:val="22"/>
+        </w:rPr>
+        <w:t xml:space="preserve"> </w:t>
+      </w:r>
+      <w:commentRangeStart w:id="6"/>
+      <w:r>
+        <w:rPr>
+          <w:rFonts w:ascii="Garamond" w:hAnsi="Garamond"/>
+          <w:sz w:val="22"/>
+          <w:szCs w:val="22"/>
+        </w:rPr>
+        <w:t>Confusion</w:t>
+      </w:r>
+      <w:commentRangeEnd w:id="6"/>
+      <w:r>
+        <w:rPr>
+          <w:rStyle w:val="CommentReference"/>
+        </w:rPr>
+        <w:commentReference w:id="6"/>
+      </w:r>
+      <w:r>
+        <w:rPr>
+          <w:rFonts w:ascii="Garamond" w:hAnsi="Garamond"/>
+          <w:sz w:val="22"/>
+          <w:szCs w:val="22"/>
+        </w:rPr>
+        <w:t xml:space="preserve"> matrix from the highest p</w:t>
+      </w:r>
+      <w:r>
+        <w:rPr>
+          <w:rFonts w:ascii="Garamond" w:hAnsi="Garamond"/>
+          <w:sz w:val="22"/>
+          <w:szCs w:val="22"/>
+        </w:rPr>
+        <w:t>er</w:t>
+      </w:r>
+      <w:r>
+        <w:rPr>
+          <w:rFonts w:ascii="Garamond" w:hAnsi="Garamond"/>
+          <w:sz w:val="22"/>
+          <w:szCs w:val="22"/>
+        </w:rPr>
+        <w:t xml:space="preserve">forming model (Random Forest on GAM Smoothed data) for both total </w:t>
+      </w:r>
+      <w:proofErr w:type="gramStart"/>
+      <w:r>
+        <w:rPr>
+          <w:rFonts w:ascii="Garamond" w:hAnsi="Garamond"/>
+          <w:sz w:val="22"/>
+          <w:szCs w:val="22"/>
+        </w:rPr>
+        <w:t>test</w:t>
+      </w:r>
+      <w:proofErr w:type="gramEnd"/>
+      <w:r>
+        <w:rPr>
+          <w:rFonts w:ascii="Garamond" w:hAnsi="Garamond"/>
+          <w:sz w:val="22"/>
+          <w:szCs w:val="22"/>
+        </w:rPr>
+        <w:t xml:space="preserve"> set and overlapping subset. Boxes along the horizontal axis indicate correctly classified individuals</w:t>
+      </w:r>
+      <w:r>
+        <w:rPr>
+          <w:rFonts w:ascii="Garamond" w:hAnsi="Garamond"/>
+          <w:sz w:val="22"/>
+          <w:szCs w:val="22"/>
+        </w:rPr>
+        <w:t xml:space="preserve"> (red). Vertical axis labels are the actual watershed labels whereas horizontal labels are the predicted class from the model. Percentage</w:t>
+      </w:r>
+      <w:r>
+        <w:rPr>
+          <w:rFonts w:ascii="Garamond" w:hAnsi="Garamond"/>
+          <w:sz w:val="22"/>
+          <w:szCs w:val="22"/>
+        </w:rPr>
+        <w:t>s indicate</w:t>
+      </w:r>
+      <w:r>
+        <w:rPr>
+          <w:rFonts w:ascii="Garamond" w:hAnsi="Garamond"/>
+          <w:sz w:val="22"/>
+          <w:szCs w:val="22"/>
+        </w:rPr>
+        <w:t xml:space="preserve"> the percent of the actual class identified as the predicted class. </w:t>
+      </w:r>
+      <w:r>
+        <w:rPr>
+          <w:rFonts w:ascii="Garamond" w:hAnsi="Garamond"/>
+          <w:sz w:val="22"/>
+          <w:szCs w:val="22"/>
+        </w:rPr>
+        <w:t xml:space="preserve">  </w:t>
+      </w:r>
+    </w:p>
+    <w:p>
+      <w:pPr>
+        <w:rPr>
+          <w:rFonts w:ascii="Garamond" w:hAnsi="Garamond"/>
+          <w:b/>
+          <w:bCs/>
+          <w:sz w:val="16"/>
+          <w:szCs w:val="16"/>
+        </w:rPr>
+      </w:pPr>
+    </w:p>
+    <w:p>
+      <w:pPr>
+        <w:rPr>
+          <w:rFonts w:ascii="Garamond" w:hAnsi="Garamond"/>
+          <w:b/>
+          <w:bCs/>
+          <w:sz w:val="16"/>
+          <w:szCs w:val="16"/>
+        </w:rPr>
+      </w:pPr>
+    </w:p>
+    <w:p>
+      <w:pPr>
+        <w:rPr>
+          <w:rFonts w:ascii="Garamond" w:hAnsi="Garamond"/>
+          <w:b/>
+          <w:bCs/>
+          <w:sz w:val="16"/>
+          <w:szCs w:val="16"/>
+        </w:rPr>
+      </w:pPr>
+    </w:p>
+    <w:p>
+      <w:pPr>
+        <w:rPr>
+          <w:rFonts w:ascii="Garamond" w:hAnsi="Garamond"/>
+          <w:b/>
+          <w:bCs/>
+          <w:sz w:val="16"/>
+          <w:szCs w:val="16"/>
+        </w:rPr>
+      </w:pPr>
+    </w:p>
+    <w:p>
+      <w:pPr>
+        <w:rPr>
+          <w:rFonts w:ascii="Garamond" w:hAnsi="Garamond"/>
+          <w:b/>
+          <w:bCs/>
+          <w:sz w:val="16"/>
+          <w:szCs w:val="16"/>
+        </w:rPr>
+      </w:pPr>
+    </w:p>
+    <w:p>
+      <w:pPr>
+        <w:rPr>
+          <w:rFonts w:ascii="Garamond" w:hAnsi="Garamond"/>
+          <w:b/>
+          <w:bCs/>
+          <w:sz w:val="16"/>
+          <w:szCs w:val="16"/>
+        </w:rPr>
+      </w:pPr>
+      <w:r>
+        <w:rPr>
+          <w:rFonts w:ascii="Garamond" w:hAnsi="Garamond"/>
+          <w:b/>
+          <w:bCs/>
+          <w:noProof/>
+          <w:sz w:val="16"/>
+          <w:szCs w:val="16"/>
+        </w:rPr>
+        <w:drawing>
+          <wp:inline distT="0" distB="0" distL="0" distR="0" wp14:anchorId="2F467EF6" wp14:editId="715EE988">
+            <wp:extent cx="6415719" cy="3207860"/>
+            <wp:effectExtent l="0" t="0" r="0" b="5715"/>
+            <wp:docPr id="1963404633" name="Picture 4" descr="A graph of a number of data&#10;&#10;AI-generated content may be incorrect."/>
+            <wp:cNvGraphicFramePr>
+              <a:graphicFrameLocks xmlns:a="http://schemas.openxmlformats.org/drawingml/2006/main" noChangeAspect="1"/>
+            </wp:cNvGraphicFramePr>
+            <a:graphic xmlns:a="http://schemas.openxmlformats.org/drawingml/2006/main">
+              <a:graphicData uri="http://schemas.openxmlformats.org/drawingml/2006/picture">
+                <pic:pic xmlns:pic="http://schemas.openxmlformats.org/drawingml/2006/picture">
+                  <pic:nvPicPr>
+                    <pic:cNvPr id="1963404633" name="Picture 4" descr="A graph of a number of data&#10;&#10;AI-generated content may be incorrect."/>
+                    <pic:cNvPicPr/>
+                  </pic:nvPicPr>
+                  <pic:blipFill>
+                    <a:blip r:embed="rId14" cstate="print">
                       <a:extLst>
                         <a:ext uri="{28A0092B-C50C-407E-A947-70E740481C1C}">
                           <a14:useLocalDpi xmlns:a14="http://schemas.microsoft.com/office/drawing/2010/main" val="0"/>
@@ -1474,7 +1296,7 @@
                   <pic:spPr>
                     <a:xfrm>
                       <a:off x="0" y="0"/>
-                      <a:ext cx="6325280" cy="3162640"/>
+                      <a:ext cx="6502262" cy="3251131"/>
                     </a:xfrm>
                     <a:prstGeom prst="rect">
                       <a:avLst/>
@@ -1511,7 +1333,39 @@
           <w:sz w:val="22"/>
           <w:szCs w:val="22"/>
         </w:rPr>
-        <w:t xml:space="preserve">Classification accuracy with an imposed probability threshold (60-90%). </w:t>
+        <w:t xml:space="preserve">Classification accuracy </w:t>
+      </w:r>
+      <w:r>
+        <w:rPr>
+          <w:rFonts w:ascii="Garamond" w:hAnsi="Garamond"/>
+          <w:sz w:val="22"/>
+          <w:szCs w:val="22"/>
+        </w:rPr>
+        <w:t>with different</w:t>
+      </w:r>
+      <w:r>
+        <w:rPr>
+          <w:rFonts w:ascii="Garamond" w:hAnsi="Garamond"/>
+          <w:sz w:val="22"/>
+          <w:szCs w:val="22"/>
+        </w:rPr>
+        <w:t xml:space="preserve"> probability threshold</w:t>
+      </w:r>
+      <w:r>
+        <w:rPr>
+          <w:rFonts w:ascii="Garamond" w:hAnsi="Garamond"/>
+          <w:sz w:val="22"/>
+          <w:szCs w:val="22"/>
+        </w:rPr>
+        <w:t>s</w:t>
+      </w:r>
+      <w:r>
+        <w:rPr>
+          <w:rFonts w:ascii="Garamond" w:hAnsi="Garamond"/>
+          <w:sz w:val="22"/>
+          <w:szCs w:val="22"/>
+        </w:rPr>
+        <w:t xml:space="preserve"> (60-90%). </w:t>
       </w:r>
       <w:r>
         <w:rPr>
@@ -1582,7 +1436,7 @@
 
 <file path=word/comments.xml><?xml version="1.0" encoding="utf-8"?>
 <w:comments xmlns:wpc="http://schemas.microsoft.com/office/word/2010/wordprocessingCanvas" xmlns:cx="http://schemas.microsoft.com/office/drawing/2014/chartex" xmlns:cx1="http://schemas.microsoft.com/office/drawing/2015/9/8/chartex" xmlns:cx2="http://schemas.microsoft.com/office/drawing/2015/10/21/chartex" xmlns:cx3="http://schemas.microsoft.com/office/drawing/2016/5/9/chartex" xmlns:cx4="http://schemas.microsoft.com/office/drawing/2016/5/10/chartex" xmlns:cx5="http://schemas.microsoft.com/office/drawing/2016/5/11/chartex" xmlns:cx6="http://schemas.microsoft.com/office/drawing/2016/5/12/chartex" xmlns:cx7="http://schemas.microsoft.com/office/drawing/2016/5/13/chartex" xmlns:cx8="http://schemas.microsoft.com/office/drawing/2016/5/14/chartex" xmlns:mc="http://schemas.openxmlformats.org/markup-compatibility/2006" xmlns:aink="http://schemas.microsoft.com/office/drawing/2016/ink" xmlns:am3d="http://schemas.microsoft.com/office/drawing/2017/model3d" xmlns:o="urn:schemas-microsoft-com:office:office" xmlns:oel="http://schemas.microsoft.com/office/2019/extlst" xmlns:r="http://schemas.openxmlformats.org/officeDocument/2006/relationships" xmlns:m="http://schemas.openxmlformats.org/officeDocument/2006/math" xmlns:v="urn:schemas-microsoft-com:vml" xmlns:wp14="http://schemas.microsoft.com/office/word/2010/wordprocessingDrawing" xmlns:wp="http://schemas.openxmlformats.org/drawingml/2006/wordprocessingDrawing" xmlns:w10="urn:schemas-microsoft-com:office:word" xmlns:w="http://schemas.openxmlformats.org/wordprocessingml/2006/main" xmlns:w14="http://schemas.microsoft.com/office/word/2010/wordml" xmlns:w15="http://schemas.microsoft.com/office/word/2012/wordml" xmlns:w16cex="http://schemas.microsoft.com/office/word/2018/wordml/cex" xmlns:w16cid="http://schemas.microsoft.com/office/word/2016/wordml/cid" xmlns:w16="http://schemas.microsoft.com/office/word/2018/wordml" xmlns:w16du="http://schemas.microsoft.com/office/word/2023/wordml/word16du" xmlns:w16sdtdh="http://schemas.microsoft.com/office/word/2020/wordml/sdtdatahash" xmlns:w16sdtfl="http://schemas.microsoft.com/office/word/2024/wordml/sdtformatlock" xmlns:w16se="http://schemas.microsoft.com/office/word/2015/wordml/symex" xmlns:wpg="http://schemas.microsoft.com/office/word/2010/wordprocessingGroup" xmlns:wpi="http://schemas.microsoft.com/office/word/2010/wordprocessingInk" xmlns:wne="http://schemas.microsoft.com/office/word/2006/wordml" xmlns:wps="http://schemas.microsoft.com/office/word/2010/wordprocessingShape" mc:Ignorable="w14 w15 w16se w16cid w16 w16cex w16sdtdh w16sdtfl w16du wp14">
-  <w:comment w:id="0" w:author="Daniel Schindler" w:date="2025-10-06T11:10:00Z" w:initials="DS">
+  <w:comment w:id="0" w:author="Daniel Schindler" w:date="2025-10-25T09:30:00Z" w:initials="DS">
     <w:p>
       <w:pPr>
         <w:pStyle w:val="CommentText"/>
@@ -1594,11 +1448,59 @@
         <w:annotationRef/>
       </w:r>
       <w:r>
+        <w:t>Beautiful figure!</w:t>
+      </w:r>
+    </w:p>
+  </w:comment>
+  <w:comment w:id="1" w:author="Daniel Schindler" w:date="2025-10-25T09:43:00Z" w:initials="DS">
+    <w:p>
+      <w:pPr>
+        <w:pStyle w:val="CommentText"/>
+      </w:pPr>
+      <w:r>
+        <w:rPr>
+          <w:rStyle w:val="CommentReference"/>
+        </w:rPr>
+        <w:annotationRef/>
+      </w:r>
+      <w:r>
+        <w:t>Double check the locations of sample sites on the map. Bethel is farther upstream than the dot shows. Also the LYTF is farther upstream as well.</w:t>
+      </w:r>
+    </w:p>
+  </w:comment>
+  <w:comment w:id="2" w:author="Daniel Schindler" w:date="2025-10-25T09:39:00Z" w:initials="DS">
+    <w:p>
+      <w:pPr>
+        <w:pStyle w:val="CommentText"/>
+      </w:pPr>
+      <w:r>
+        <w:rPr>
+          <w:rStyle w:val="CommentReference"/>
+        </w:rPr>
+        <w:annotationRef/>
+      </w:r>
+      <w:r>
+        <w:t>But what is a data point on this figure? Don’t you have hundreds of data points on each sample?</w:t>
+      </w:r>
+    </w:p>
+  </w:comment>
+  <w:comment w:id="3" w:author="Daniel Schindler" w:date="2025-10-06T11:10:00Z" w:initials="DS">
+    <w:p>
+      <w:pPr>
+        <w:pStyle w:val="CommentText"/>
+      </w:pPr>
+      <w:r>
+        <w:rPr>
+          <w:rStyle w:val="CommentReference"/>
+        </w:rPr>
+        <w:annotationRef/>
+      </w:r>
+      <w:r>
         <w:t>This is a cool result which is not particularly well highlighted in the Discussion. Might want to think about how to highlight these results more.</w:t>
       </w:r>
     </w:p>
   </w:comment>
-  <w:comment w:id="1" w:author="Daniel Schindler" w:date="2025-10-06T11:10:00Z" w:initials="DS">
+  <w:comment w:id="4" w:author="Daniel Schindler" w:date="2025-10-06T11:10:00Z" w:initials="DS">
     <w:p>
       <w:pPr>
         <w:pStyle w:val="CommentText"/>
@@ -1611,6 +1513,38 @@
       </w:r>
       <w:r>
         <w:t>Fonts are very small</w:t>
+      </w:r>
+    </w:p>
+  </w:comment>
+  <w:comment w:id="5" w:author="Daniel Schindler" w:date="2025-10-25T09:42:00Z" w:initials="DS">
+    <w:p>
+      <w:pPr>
+        <w:pStyle w:val="CommentText"/>
+      </w:pPr>
+      <w:r>
+        <w:rPr>
+          <w:rStyle w:val="CommentReference"/>
+        </w:rPr>
+        <w:annotationRef/>
+      </w:r>
+      <w:r>
+        <w:t>I think you should sneak in a subtitle on the B panels that says something like ‘loading on PC1, PC2, etc)</w:t>
+      </w:r>
+    </w:p>
+  </w:comment>
+  <w:comment w:id="6" w:author="Daniel Schindler" w:date="2025-10-25T09:36:00Z" w:initials="DS">
+    <w:p>
+      <w:pPr>
+        <w:pStyle w:val="CommentText"/>
+      </w:pPr>
+      <w:r>
+        <w:rPr>
+          <w:rStyle w:val="CommentReference"/>
+        </w:rPr>
+        <w:annotationRef/>
+      </w:r>
+      <w:r>
+        <w:t>So the numbers are the number of fish in each box from the test sample set? Not sure what the numbers are...</w:t>
       </w:r>
     </w:p>
   </w:comment>
@@ -1619,22 +1553,37 @@
 
 <file path=word/commentsExtended.xml><?xml version="1.0" encoding="utf-8"?>
 <w15:commentsEx xmlns:wpc="http://schemas.microsoft.com/office/word/2010/wordprocessingCanvas" xmlns:cx="http://schemas.microsoft.com/office/drawing/2014/chartex" xmlns:cx1="http://schemas.microsoft.com/office/drawing/2015/9/8/chartex" xmlns:cx2="http://schemas.microsoft.com/office/drawing/2015/10/21/chartex" xmlns:cx3="http://schemas.microsoft.com/office/drawing/2016/5/9/chartex" xmlns:cx4="http://schemas.microsoft.com/office/drawing/2016/5/10/chartex" xmlns:cx5="http://schemas.microsoft.com/office/drawing/2016/5/11/chartex" xmlns:cx6="http://schemas.microsoft.com/office/drawing/2016/5/12/chartex" xmlns:cx7="http://schemas.microsoft.com/office/drawing/2016/5/13/chartex" xmlns:cx8="http://schemas.microsoft.com/office/drawing/2016/5/14/chartex" xmlns:mc="http://schemas.openxmlformats.org/markup-compatibility/2006" xmlns:aink="http://schemas.microsoft.com/office/drawing/2016/ink" xmlns:am3d="http://schemas.microsoft.com/office/drawing/2017/model3d" xmlns:o="urn:schemas-microsoft-com:office:office" xmlns:oel="http://schemas.microsoft.com/office/2019/extlst" xmlns:r="http://schemas.openxmlformats.org/officeDocument/2006/relationships" xmlns:m="http://schemas.openxmlformats.org/officeDocument/2006/math" xmlns:v="urn:schemas-microsoft-com:vml" xmlns:wp14="http://schemas.microsoft.com/office/word/2010/wordprocessingDrawing" xmlns:wp="http://schemas.openxmlformats.org/drawingml/2006/wordprocessingDrawing" xmlns:w10="urn:schemas-microsoft-com:office:word" xmlns:w="http://schemas.openxmlformats.org/wordprocessingml/2006/main" xmlns:w14="http://schemas.microsoft.com/office/word/2010/wordml" xmlns:w15="http://schemas.microsoft.com/office/word/2012/wordml" xmlns:w16cex="http://schemas.microsoft.com/office/word/2018/wordml/cex" xmlns:w16cid="http://schemas.microsoft.com/office/word/2016/wordml/cid" xmlns:w16="http://schemas.microsoft.com/office/word/2018/wordml" xmlns:w16du="http://schemas.microsoft.com/office/word/2023/wordml/word16du" xmlns:w16sdtdh="http://schemas.microsoft.com/office/word/2020/wordml/sdtdatahash" xmlns:w16sdtfl="http://schemas.microsoft.com/office/word/2024/wordml/sdtformatlock" xmlns:w16se="http://schemas.microsoft.com/office/word/2015/wordml/symex" xmlns:wpg="http://schemas.microsoft.com/office/word/2010/wordprocessingGroup" xmlns:wpi="http://schemas.microsoft.com/office/word/2010/wordprocessingInk" xmlns:wne="http://schemas.microsoft.com/office/word/2006/wordml" xmlns:wps="http://schemas.microsoft.com/office/word/2010/wordprocessingShape" mc:Ignorable="w14 w15 w16se w16cid w16 w16cex w16sdtdh w16sdtfl w16du wp14">
-  <w15:commentEx w15:paraId="0DD29C92" w15:done="1"/>
-  <w15:commentEx w15:paraId="40117E77" w15:paraIdParent="0DD29C92" w15:done="1"/>
+  <w15:commentEx w15:paraId="0D283BE3" w15:done="1"/>
+  <w15:commentEx w15:paraId="4EB50266" w15:done="0"/>
+  <w15:commentEx w15:paraId="3D39DE71" w15:done="0"/>
+  <w15:commentEx w15:paraId="07703636" w15:done="0"/>
+  <w15:commentEx w15:paraId="76DC7C46" w15:paraIdParent="07703636" w15:done="0"/>
+  <w15:commentEx w15:paraId="03986E4A" w15:done="0"/>
+  <w15:commentEx w15:paraId="41505919" w15:done="0"/>
 </w15:commentsEx>
 </file>
 
 <file path=word/commentsExtensible.xml><?xml version="1.0" encoding="utf-8"?>
 <w16cex:commentsExtensible xmlns:wpc="http://schemas.microsoft.com/office/word/2010/wordprocessingCanvas" xmlns:cx="http://schemas.microsoft.com/office/drawing/2014/chartex" xmlns:cx1="http://schemas.microsoft.com/office/drawing/2015/9/8/chartex" xmlns:cx2="http://schemas.microsoft.com/office/drawing/2015/10/21/chartex" xmlns:cx3="http://schemas.microsoft.com/office/drawing/2016/5/9/chartex" xmlns:cx4="http://schemas.microsoft.com/office/drawing/2016/5/10/chartex" xmlns:cx5="http://schemas.microsoft.com/office/drawing/2016/5/11/chartex" xmlns:cx6="http://schemas.microsoft.com/office/drawing/2016/5/12/chartex" xmlns:cx7="http://schemas.microsoft.com/office/drawing/2016/5/13/chartex" xmlns:cx8="http://schemas.microsoft.com/office/drawing/2016/5/14/chartex" xmlns:cr="http://schemas.microsoft.com/office/comments/2020/reactions" xmlns:mc="http://schemas.openxmlformats.org/markup-compatibility/2006" xmlns:aink="http://schemas.microsoft.com/office/drawing/2016/ink" xmlns:am3d="http://schemas.microsoft.com/office/drawing/2017/model3d" xmlns:o="urn:schemas-microsoft-com:office:office" xmlns:oel="http://schemas.microsoft.com/office/2019/extlst" xmlns:r="http://schemas.openxmlformats.org/officeDocument/2006/relationships" xmlns:m="http://schemas.openxmlformats.org/officeDocument/2006/math" xmlns:v="urn:schemas-microsoft-com:vml" xmlns:wp14="http://schemas.microsoft.com/office/word/2010/wordprocessingDrawing" xmlns:wp="http://schemas.openxmlformats.org/drawingml/2006/wordprocessingDrawing" xmlns:w10="urn:schemas-microsoft-com:office:word" xmlns:w="http://schemas.openxmlformats.org/wordprocessingml/2006/main" xmlns:w14="http://schemas.microsoft.com/office/word/2010/wordml" xmlns:w15="http://schemas.microsoft.com/office/word/2012/wordml" xmlns:w16cex="http://schemas.microsoft.com/office/word/2018/wordml/cex" xmlns:w16cid="http://schemas.microsoft.com/office/word/2016/wordml/cid" xmlns:w16="http://schemas.microsoft.com/office/word/2018/wordml" xmlns:w16du="http://schemas.microsoft.com/office/word/2023/wordml/word16du" xmlns:w16sdtdh="http://schemas.microsoft.com/office/word/2020/wordml/sdtdatahash" xmlns:w16sdtfl="http://schemas.microsoft.com/office/word/2024/wordml/sdtformatlock" xmlns:w16se="http://schemas.microsoft.com/office/word/2015/wordml/symex" xmlns:wpg="http://schemas.microsoft.com/office/word/2010/wordprocessingGroup" xmlns:wpi="http://schemas.microsoft.com/office/word/2010/wordprocessingInk" xmlns:wne="http://schemas.microsoft.com/office/word/2006/wordml" xmlns:wps="http://schemas.microsoft.com/office/word/2010/wordprocessingShape" mc:Ignorable="w14 w15 w16se w16cid w16 w16cex w16sdtdh w16sdtfl cr w16du wp14">
+  <w16cex:commentExtensible w16cex:durableId="097BE8A5" w16cex:dateUtc="2025-10-25T16:30:00Z"/>
+  <w16cex:commentExtensible w16cex:durableId="415B9344" w16cex:dateUtc="2025-10-25T16:43:00Z"/>
+  <w16cex:commentExtensible w16cex:durableId="6DA82EFB" w16cex:dateUtc="2025-10-25T16:39:00Z"/>
   <w16cex:commentExtensible w16cex:durableId="11D61FD6" w16cex:dateUtc="2025-10-06T18:10:00Z"/>
   <w16cex:commentExtensible w16cex:durableId="7531CF4E" w16cex:dateUtc="2025-10-06T18:10:00Z"/>
+  <w16cex:commentExtensible w16cex:durableId="13446255" w16cex:dateUtc="2025-10-25T16:42:00Z"/>
+  <w16cex:commentExtensible w16cex:durableId="6CEAFE59" w16cex:dateUtc="2025-10-25T16:36:00Z"/>
 </w16cex:commentsExtensible>
 </file>
 
 <file path=word/commentsIds.xml><?xml version="1.0" encoding="utf-8"?>
 <w16cid:commentsIds xmlns:wpc="http://schemas.microsoft.com/office/word/2010/wordprocessingCanvas" xmlns:cx="http://schemas.microsoft.com/office/drawing/2014/chartex" xmlns:cx1="http://schemas.microsoft.com/office/drawing/2015/9/8/chartex" xmlns:cx2="http://schemas.microsoft.com/office/drawing/2015/10/21/chartex" xmlns:cx3="http://schemas.microsoft.com/office/drawing/2016/5/9/chartex" xmlns:cx4="http://schemas.microsoft.com/office/drawing/2016/5/10/chartex" xmlns:cx5="http://schemas.microsoft.com/office/drawing/2016/5/11/chartex" xmlns:cx6="http://schemas.microsoft.com/office/drawing/2016/5/12/chartex" xmlns:cx7="http://schemas.microsoft.com/office/drawing/2016/5/13/chartex" xmlns:cx8="http://schemas.microsoft.com/office/drawing/2016/5/14/chartex" xmlns:mc="http://schemas.openxmlformats.org/markup-compatibility/2006" xmlns:aink="http://schemas.microsoft.com/office/drawing/2016/ink" xmlns:am3d="http://schemas.microsoft.com/office/drawing/2017/model3d" xmlns:o="urn:schemas-microsoft-com:office:office" xmlns:oel="http://schemas.microsoft.com/office/2019/extlst" xmlns:r="http://schemas.openxmlformats.org/officeDocument/2006/relationships" xmlns:m="http://schemas.openxmlformats.org/officeDocument/2006/math" xmlns:v="urn:schemas-microsoft-com:vml" xmlns:wp14="http://schemas.microsoft.com/office/word/2010/wordprocessingDrawing" xmlns:wp="http://schemas.openxmlformats.org/drawingml/2006/wordprocessingDrawing" xmlns:w10="urn:schemas-microsoft-com:office:word" xmlns:w="http://schemas.openxmlformats.org/wordprocessingml/2006/main" xmlns:w14="http://schemas.microsoft.com/office/word/2010/wordml" xmlns:w15="http://schemas.microsoft.com/office/word/2012/wordml" xmlns:w16cex="http://schemas.microsoft.com/office/word/2018/wordml/cex" xmlns:w16cid="http://schemas.microsoft.com/office/word/2016/wordml/cid" xmlns:w16="http://schemas.microsoft.com/office/word/2018/wordml" xmlns:w16du="http://schemas.microsoft.com/office/word/2023/wordml/word16du" xmlns:w16sdtdh="http://schemas.microsoft.com/office/word/2020/wordml/sdtdatahash" xmlns:w16sdtfl="http://schemas.microsoft.com/office/word/2024/wordml/sdtformatlock" xmlns:w16se="http://schemas.microsoft.com/office/word/2015/wordml/symex" xmlns:wpg="http://schemas.microsoft.com/office/word/2010/wordprocessingGroup" xmlns:wpi="http://schemas.microsoft.com/office/word/2010/wordprocessingInk" xmlns:wne="http://schemas.microsoft.com/office/word/2006/wordml" xmlns:wps="http://schemas.microsoft.com/office/word/2010/wordprocessingShape" mc:Ignorable="w14 w15 w16se w16cid w16 w16cex w16sdtdh w16sdtfl w16du wp14">
-  <w16cid:commentId w16cid:paraId="0DD29C92" w16cid:durableId="11D61FD6"/>
-  <w16cid:commentId w16cid:paraId="40117E77" w16cid:durableId="7531CF4E"/>
+  <w16cid:commentId w16cid:paraId="0D283BE3" w16cid:durableId="097BE8A5"/>
+  <w16cid:commentId w16cid:paraId="4EB50266" w16cid:durableId="415B9344"/>
+  <w16cid:commentId w16cid:paraId="3D39DE71" w16cid:durableId="6DA82EFB"/>
+  <w16cid:commentId w16cid:paraId="07703636" w16cid:durableId="11D61FD6"/>
+  <w16cid:commentId w16cid:paraId="76DC7C46" w16cid:durableId="7531CF4E"/>
+  <w16cid:commentId w16cid:paraId="03986E4A" w16cid:durableId="13446255"/>
+  <w16cid:commentId w16cid:paraId="41505919" w16cid:durableId="6CEAFE59"/>
 </w16cid:commentsIds>
 </file>
 
@@ -2629,6 +2578,16 @@
       <w:szCs w:val="20"/>
     </w:rPr>
   </w:style>
+  <w:style w:type="paragraph" w:styleId="Revision">
+    <w:name w:val="Revision"/>
+    <w:hidden/>
+    <w:uiPriority w:val="99"/>
+    <w:semiHidden/>
+    <w:rsid w:val="00E26B48"/>
+    <w:pPr>
+      <w:spacing w:after="0" w:line="240" w:lineRule="auto"/>
+    </w:pPr>
+  </w:style>
 </w:styles>
 </file>
 
@@ -2925,4 +2884,16 @@
     </a:ext>
   </a:extLst>
 </a:theme>
+</file>
+
+<file path=customXml/item1.xml><?xml version="1.0" encoding="utf-8"?>
+<b:Sources xmlns:b="http://schemas.openxmlformats.org/officeDocument/2006/bibliography" xmlns="http://schemas.openxmlformats.org/officeDocument/2006/bibliography" SelectedStyle="\APASixthEditionOfficeOnline.xsl" StyleName="APA" Version="6"/>
+</file>
+
+<file path=customXml/itemProps1.xml><?xml version="1.0" encoding="utf-8"?>
+<ds:datastoreItem xmlns:ds="http://schemas.openxmlformats.org/officeDocument/2006/customXml" ds:itemID="{AD7D3BED-D094-4596-84F7-59360C3814AE}">
+  <ds:schemaRefs>
+    <ds:schemaRef ds:uri="http://schemas.openxmlformats.org/officeDocument/2006/bibliography"/>
+  </ds:schemaRefs>
+</ds:datastoreItem>
 </file>
</xml_diff>

<commit_message>
full go through of the manuscript
</commit_message>
<xml_diff>
--- a/Docs/FIGURES Machine learning applied to otolith timeseries data to discriminate river of origin for Western Alaska Salmon.docx
+++ b/Docs/FIGURES Machine learning applied to otolith timeseries data to discriminate river of origin for Western Alaska Salmon.docx
@@ -1011,10 +1011,10 @@
           <w:szCs w:val="16"/>
         </w:rPr>
         <w:drawing>
-          <wp:inline distT="0" distB="0" distL="0" distR="0" wp14:anchorId="16679699" wp14:editId="668105C7">
-            <wp:extent cx="5962810" cy="2981405"/>
-            <wp:effectExtent l="0" t="0" r="6350" b="3175"/>
-            <wp:docPr id="1789130704" name="Picture 6"/>
+          <wp:inline distT="0" distB="0" distL="0" distR="0" wp14:anchorId="1CE474F3" wp14:editId="7534852E">
+            <wp:extent cx="5943600" cy="2971800"/>
+            <wp:effectExtent l="0" t="0" r="0" b="0"/>
+            <wp:docPr id="2074281953" name="Picture 1"/>
             <wp:cNvGraphicFramePr>
               <a:graphicFrameLocks xmlns:a="http://schemas.openxmlformats.org/drawingml/2006/main" noChangeAspect="1"/>
             </wp:cNvGraphicFramePr>
@@ -1022,7 +1022,7 @@
               <a:graphicData uri="http://schemas.openxmlformats.org/drawingml/2006/picture">
                 <pic:pic xmlns:pic="http://schemas.openxmlformats.org/drawingml/2006/picture">
                   <pic:nvPicPr>
-                    <pic:cNvPr id="1789130704" name="Picture 1789130704"/>
+                    <pic:cNvPr id="2074281953" name="Picture 2074281953"/>
                     <pic:cNvPicPr/>
                   </pic:nvPicPr>
                   <pic:blipFill>
@@ -1034,7 +1034,7 @@
                   <pic:spPr>
                     <a:xfrm>
                       <a:off x="0" y="0"/>
-                      <a:ext cx="5988578" cy="2994289"/>
+                      <a:ext cx="5943600" cy="2971800"/>
                     </a:xfrm>
                     <a:prstGeom prst="rect">
                       <a:avLst/>

</xml_diff>

<commit_message>
added two panel figure
</commit_message>
<xml_diff>
--- a/Docs/FIGURES Machine learning applied to otolith timeseries data to discriminate river of origin for Western Alaska Salmon.docx
+++ b/Docs/FIGURES Machine learning applied to otolith timeseries data to discriminate river of origin for Western Alaska Salmon.docx
@@ -23,10 +23,10 @@
           <w:szCs w:val="16"/>
         </w:rPr>
         <w:drawing>
-          <wp:inline distT="0" distB="0" distL="0" distR="0" wp14:anchorId="0A90718B" wp14:editId="22C78535">
-            <wp:extent cx="4106948" cy="6347012"/>
-            <wp:effectExtent l="0" t="0" r="0" b="3175"/>
-            <wp:docPr id="1571264764" name="Picture 1" descr="A screenshot of a map&#10;&#10;AI-generated content may be incorrect."/>
+          <wp:inline distT="0" distB="0" distL="0" distR="0" wp14:anchorId="263843CA" wp14:editId="32DECF4E">
+            <wp:extent cx="4140485" cy="6398842"/>
+            <wp:effectExtent l="0" t="0" r="0" b="2540"/>
+            <wp:docPr id="956025252" name="Picture 1" descr="A map of the river&#10;&#10;AI-generated content may be incorrect."/>
             <wp:cNvGraphicFramePr>
               <a:graphicFrameLocks xmlns:a="http://schemas.openxmlformats.org/drawingml/2006/main" noChangeAspect="1"/>
             </wp:cNvGraphicFramePr>
@@ -34,7 +34,7 @@
               <a:graphicData uri="http://schemas.openxmlformats.org/drawingml/2006/picture">
                 <pic:pic xmlns:pic="http://schemas.openxmlformats.org/drawingml/2006/picture">
                   <pic:nvPicPr>
-                    <pic:cNvPr id="1571264764" name="Picture 1" descr="A screenshot of a map&#10;&#10;AI-generated content may be incorrect."/>
+                    <pic:cNvPr id="956025252" name="Picture 1" descr="A map of the river&#10;&#10;AI-generated content may be incorrect."/>
                     <pic:cNvPicPr/>
                   </pic:nvPicPr>
                   <pic:blipFill>
@@ -52,7 +52,7 @@
                   <pic:spPr>
                     <a:xfrm>
                       <a:off x="0" y="0"/>
-                      <a:ext cx="4120734" cy="6368318"/>
+                      <a:ext cx="4166999" cy="6439818"/>
                     </a:xfrm>
                     <a:prstGeom prst="rect">
                       <a:avLst/>

</xml_diff>

<commit_message>
added valentinas edits to figures
</commit_message>
<xml_diff>
--- a/Docs/FIGURES Machine learning applied to otolith timeseries data to discriminate river of origin for Western Alaska Salmon.docx
+++ b/Docs/FIGURES Machine learning applied to otolith timeseries data to discriminate river of origin for Western Alaska Salmon.docx
@@ -176,37 +176,20 @@
         <w:rPr>
           <w:rFonts w:ascii="Times New Roman" w:hAnsi="Times New Roman" w:cs="Times New Roman"/>
         </w:rPr>
-        <w:t>Isoscape</w:t>
+        <w:t>i</w:t>
+      </w:r>
+      <w:r>
+        <w:rPr>
+          <w:rFonts w:ascii="Times New Roman" w:hAnsi="Times New Roman" w:cs="Times New Roman"/>
+        </w:rPr>
+        <w:t>soscape</w:t>
       </w:r>
       <w:proofErr w:type="spellEnd"/>
       <w:r>
         <w:rPr>
           <w:rFonts w:ascii="Times New Roman" w:hAnsi="Times New Roman" w:cs="Times New Roman"/>
         </w:rPr>
-        <w:t xml:space="preserve"> </w:t>
-      </w:r>
-      <w:commentRangeStart w:id="1"/>
-      <w:r>
-        <w:rPr>
-          <w:rFonts w:ascii="Times New Roman" w:hAnsi="Times New Roman" w:cs="Times New Roman"/>
-        </w:rPr>
-        <w:t>of</w:t>
-      </w:r>
-      <w:commentRangeEnd w:id="1"/>
-      <w:r>
-        <w:rPr>
-          <w:rStyle w:val="CommentReference"/>
-          <w:rFonts w:ascii="Times New Roman" w:hAnsi="Times New Roman" w:cs="Times New Roman"/>
-          <w:sz w:val="24"/>
-          <w:szCs w:val="24"/>
-        </w:rPr>
-        <w:commentReference w:id="1"/>
-      </w:r>
-      <w:r>
-        <w:rPr>
-          <w:rFonts w:ascii="Times New Roman" w:hAnsi="Times New Roman" w:cs="Times New Roman"/>
-        </w:rPr>
-        <w:t xml:space="preserve"> all three river-basins. </w:t>
+        <w:t xml:space="preserve"> of all three river-basins. </w:t>
       </w:r>
       <w:r>
         <w:rPr>
@@ -361,21 +344,7 @@
         <w:rPr>
           <w:rFonts w:ascii="Times New Roman" w:hAnsi="Times New Roman" w:cs="Times New Roman"/>
         </w:rPr>
-        <w:t xml:space="preserve"> Principal Component analysis of GAM smoothed timeseries data (n = 2,531 otoliths). Significant clustering is evident, but with overlap between all watersheds. Yukon (Blue points) contain a much larger range of values, indicative of the large range in natal ⁸⁷Sr/⁸⁶Sr values in the basin. Kuskokwim (Red points) overlap between both </w:t>
-      </w:r>
-      <w:proofErr w:type="spellStart"/>
-      <w:r>
-        <w:rPr>
-          <w:rFonts w:ascii="Times New Roman" w:hAnsi="Times New Roman" w:cs="Times New Roman"/>
-        </w:rPr>
-        <w:t>Nushagak</w:t>
-      </w:r>
-      <w:proofErr w:type="spellEnd"/>
-      <w:r>
-        <w:rPr>
-          <w:rFonts w:ascii="Times New Roman" w:hAnsi="Times New Roman" w:cs="Times New Roman"/>
-        </w:rPr>
-        <w:t xml:space="preserve"> and Yukon fish, likely due to its position in the region between both watersheds. </w:t>
+        <w:t xml:space="preserve"> Principal Component analysis of GAM smoothed timeseries data (n = 2,531 otoliths). Significant clustering is evident, but with overlap between all watersheds. Yukon (Blue points) contain a much larger range of values, indicative of the large range in natal ⁸⁷Sr/⁸⁶Sr values in the basin. Kuskokwim (Red points) overlap between both Nushagak and Yukon fish, likely due to its position in the region between both watersheds. </w:t>
       </w:r>
     </w:p>
     <w:p>
@@ -452,6 +421,7 @@
           <w:rFonts w:ascii="Times New Roman" w:hAnsi="Times New Roman" w:cs="Times New Roman"/>
         </w:rPr>
       </w:pPr>
+      <w:commentRangeStart w:id="1"/>
       <w:r>
         <w:rPr>
           <w:rFonts w:ascii="Times New Roman" w:hAnsi="Times New Roman" w:cs="Times New Roman"/>
@@ -474,7 +444,22 @@
           <w:b/>
           <w:bCs/>
         </w:rPr>
-        <w:t xml:space="preserve">: </w:t>
+        <w:t>:</w:t>
+      </w:r>
+      <w:commentRangeEnd w:id="1"/>
+      <w:r>
+        <w:rPr>
+          <w:rStyle w:val="CommentReference"/>
+        </w:rPr>
+        <w:commentReference w:id="1"/>
+      </w:r>
+      <w:r>
+        <w:rPr>
+          <w:rFonts w:ascii="Times New Roman" w:hAnsi="Times New Roman" w:cs="Times New Roman"/>
+          <w:b/>
+          <w:bCs/>
+        </w:rPr>
+        <w:t xml:space="preserve"> </w:t>
       </w:r>
       <w:r>
         <w:rPr>
@@ -484,6 +469,7 @@
       </w:r>
       <w:commentRangeStart w:id="2"/>
       <w:commentRangeStart w:id="3"/>
+      <w:commentRangeStart w:id="4"/>
       <w:r>
         <w:rPr>
           <w:rFonts w:ascii="Times New Roman" w:hAnsi="Times New Roman" w:cs="Times New Roman"/>
@@ -510,20 +496,27 @@
         </w:rPr>
         <w:commentReference w:id="3"/>
       </w:r>
+      <w:commentRangeEnd w:id="4"/>
+      <w:r>
+        <w:rPr>
+          <w:rStyle w:val="CommentReference"/>
+        </w:rPr>
+        <w:commentReference w:id="4"/>
+      </w:r>
       <w:r>
         <w:rPr>
           <w:rFonts w:ascii="Times New Roman" w:hAnsi="Times New Roman" w:cs="Times New Roman"/>
         </w:rPr>
         <w:t xml:space="preserve"> 1 and 2 (68.39% of variance), as well as between principal components 2 and 3 (31.16% of variance). There is some overlap between all three watersheds in both cases. B) </w:t>
       </w:r>
-      <w:commentRangeStart w:id="4"/>
+      <w:commentRangeStart w:id="5"/>
       <w:r>
         <w:rPr>
           <w:rFonts w:ascii="Times New Roman" w:hAnsi="Times New Roman" w:cs="Times New Roman"/>
         </w:rPr>
         <w:t xml:space="preserve">Sample </w:t>
       </w:r>
-      <w:commentRangeEnd w:id="4"/>
+      <w:commentRangeEnd w:id="5"/>
       <w:r>
         <w:rPr>
           <w:rStyle w:val="CommentReference"/>
@@ -531,7 +524,7 @@
           <w:sz w:val="24"/>
           <w:szCs w:val="24"/>
         </w:rPr>
-        <w:commentReference w:id="4"/>
+        <w:commentReference w:id="5"/>
       </w:r>
       <w:r>
         <w:rPr>
@@ -669,6 +662,8 @@
           <w:rFonts w:ascii="Times New Roman" w:hAnsi="Times New Roman" w:cs="Times New Roman"/>
         </w:rPr>
       </w:pPr>
+      <w:commentRangeStart w:id="6"/>
+      <w:commentRangeStart w:id="7"/>
       <w:r>
         <w:rPr>
           <w:rFonts w:ascii="Times New Roman" w:hAnsi="Times New Roman" w:cs="Times New Roman"/>
@@ -693,11 +688,31 @@
         </w:rPr>
         <w:t>:</w:t>
       </w:r>
-      <w:r>
-        <w:rPr>
-          <w:rFonts w:ascii="Times New Roman" w:hAnsi="Times New Roman" w:cs="Times New Roman"/>
-        </w:rPr>
-        <w:t xml:space="preserve"> Model Performance comparison among data </w:t>
+      <w:commentRangeEnd w:id="6"/>
+      <w:r>
+        <w:rPr>
+          <w:rStyle w:val="CommentReference"/>
+        </w:rPr>
+        <w:commentReference w:id="6"/>
+      </w:r>
+      <w:r>
+        <w:rPr>
+          <w:rFonts w:ascii="Times New Roman" w:hAnsi="Times New Roman" w:cs="Times New Roman"/>
+        </w:rPr>
+        <w:t xml:space="preserve"> </w:t>
+      </w:r>
+      <w:commentRangeEnd w:id="7"/>
+      <w:r>
+        <w:rPr>
+          <w:rStyle w:val="CommentReference"/>
+        </w:rPr>
+        <w:commentReference w:id="7"/>
+      </w:r>
+      <w:r>
+        <w:rPr>
+          <w:rFonts w:ascii="Times New Roman" w:hAnsi="Times New Roman" w:cs="Times New Roman"/>
+        </w:rPr>
+        <w:t xml:space="preserve">Model Performance comparison among data </w:t>
       </w:r>
       <w:r>
         <w:rPr>
@@ -949,6 +964,7 @@
           <w:szCs w:val="22"/>
         </w:rPr>
       </w:pPr>
+      <w:commentRangeStart w:id="8"/>
       <w:r>
         <w:rPr>
           <w:rFonts w:ascii="Garamond" w:hAnsi="Garamond"/>
@@ -979,6 +995,13 @@
         </w:rPr>
         <w:t>:</w:t>
       </w:r>
+      <w:commentRangeEnd w:id="8"/>
+      <w:r>
+        <w:rPr>
+          <w:rStyle w:val="CommentReference"/>
+        </w:rPr>
+        <w:commentReference w:id="8"/>
+      </w:r>
       <w:r>
         <w:rPr>
           <w:rFonts w:ascii="Garamond" w:hAnsi="Garamond"/>
@@ -987,21 +1010,13 @@
         </w:rPr>
         <w:t xml:space="preserve"> </w:t>
       </w:r>
-      <w:commentRangeStart w:id="5"/>
       <w:r>
         <w:rPr>
           <w:rFonts w:ascii="Garamond" w:hAnsi="Garamond"/>
           <w:sz w:val="22"/>
           <w:szCs w:val="22"/>
         </w:rPr>
-        <w:t>Confusion</w:t>
-      </w:r>
-      <w:commentRangeEnd w:id="5"/>
-      <w:r>
-        <w:rPr>
-          <w:rStyle w:val="CommentReference"/>
-        </w:rPr>
-        <w:commentReference w:id="5"/>
+        <w:t>Confusion matrix from the highest p</w:t>
       </w:r>
       <w:r>
         <w:rPr>
@@ -1009,7 +1024,7 @@
           <w:sz w:val="22"/>
           <w:szCs w:val="22"/>
         </w:rPr>
-        <w:t xml:space="preserve"> matrix from the highest p</w:t>
+        <w:t>er</w:t>
       </w:r>
       <w:r>
         <w:rPr>
@@ -1017,33 +1032,7 @@
           <w:sz w:val="22"/>
           <w:szCs w:val="22"/>
         </w:rPr>
-        <w:t>er</w:t>
-      </w:r>
-      <w:r>
-        <w:rPr>
-          <w:rFonts w:ascii="Garamond" w:hAnsi="Garamond"/>
-          <w:sz w:val="22"/>
-          <w:szCs w:val="22"/>
-        </w:rPr>
-        <w:t xml:space="preserve">forming model (Random Forest on GAM Smoothed data) for both total </w:t>
-      </w:r>
-      <w:proofErr w:type="gramStart"/>
-      <w:r>
-        <w:rPr>
-          <w:rFonts w:ascii="Garamond" w:hAnsi="Garamond"/>
-          <w:sz w:val="22"/>
-          <w:szCs w:val="22"/>
-        </w:rPr>
-        <w:t>test</w:t>
-      </w:r>
-      <w:proofErr w:type="gramEnd"/>
-      <w:r>
-        <w:rPr>
-          <w:rFonts w:ascii="Garamond" w:hAnsi="Garamond"/>
-          <w:sz w:val="22"/>
-          <w:szCs w:val="22"/>
-        </w:rPr>
-        <w:t xml:space="preserve"> set and overlapping subset. Boxes along the horizontal axis indicate correctly classified individuals</w:t>
+        <w:t>forming model (Random Forest on GAM Smoothed data) for both total test set and overlapping subset. Boxes along the horizontal axis indicate correctly classified individuals</w:t>
       </w:r>
       <w:r>
         <w:rPr>
@@ -1204,6 +1193,7 @@
           <w:szCs w:val="22"/>
         </w:rPr>
       </w:pPr>
+      <w:commentRangeStart w:id="9"/>
       <w:r>
         <w:rPr>
           <w:rFonts w:ascii="Garamond" w:hAnsi="Garamond"/>
@@ -1212,7 +1202,24 @@
           <w:sz w:val="22"/>
           <w:szCs w:val="22"/>
         </w:rPr>
-        <w:t xml:space="preserve">Figure 6: </w:t>
+        <w:t>Figure 6:</w:t>
+      </w:r>
+      <w:commentRangeEnd w:id="9"/>
+      <w:r>
+        <w:rPr>
+          <w:rStyle w:val="CommentReference"/>
+        </w:rPr>
+        <w:commentReference w:id="9"/>
+      </w:r>
+      <w:r>
+        <w:rPr>
+          <w:rFonts w:ascii="Garamond" w:hAnsi="Garamond"/>
+          <w:b/>
+          <w:bCs/>
+          <w:sz w:val="22"/>
+          <w:szCs w:val="22"/>
+        </w:rPr>
+        <w:t xml:space="preserve"> </w:t>
       </w:r>
       <w:r>
         <w:rPr>
@@ -1339,11 +1346,8 @@
       </w:r>
     </w:p>
   </w:comment>
-  <w:comment w:id="1" w:author="Daniel Schindler" w:date="2025-10-25T09:43:00Z" w:initials="DS">
-    <w:p>
-      <w:pPr>
-        <w:pStyle w:val="CommentText"/>
-      </w:pPr>
+  <w:comment w:id="1" w:author="Valentina M. Staneva" w:date="2025-11-13T13:41:00Z" w:initials="VMS">
+    <w:p>
       <w:r>
         <w:rPr>
           <w:rStyle w:val="CommentReference"/>
@@ -1351,7 +1355,11 @@
         <w:annotationRef/>
       </w:r>
       <w:r>
-        <w:t>Double check the locations of sample sites on the map. Bethel is farther upstream than the dot shows. Also the LYTF is farther upstream as well.</w:t>
+        <w:rPr>
+          <w:sz w:val="20"/>
+          <w:szCs w:val="20"/>
+        </w:rPr>
+        <w:t xml:space="preserve">So (maybe due to the small font)  it took me a while to see/understand the title indicating the individual PCs. I read the absolute value as IPC and was wondering what was that :). So maybe somehow make the || different size than the PC. Or maybe put them on the right hand-side. </w:t>
       </w:r>
     </w:p>
   </w:comment>
@@ -1387,7 +1395,24 @@
       </w:r>
     </w:p>
   </w:comment>
-  <w:comment w:id="4" w:author="Daniel Schindler" w:date="2025-10-25T09:42:00Z" w:initials="DS">
+  <w:comment w:id="4" w:author="Valentina M. Staneva" w:date="2025-11-13T14:02:00Z" w:initials="VMS">
+    <w:p>
+      <w:r>
+        <w:rPr>
+          <w:rStyle w:val="CommentReference"/>
+        </w:rPr>
+        <w:annotationRef/>
+      </w:r>
+      <w:r>
+        <w:rPr>
+          <w:sz w:val="20"/>
+          <w:szCs w:val="20"/>
+        </w:rPr>
+        <w:t>This could be also added in the abstract to allude that even with unsupervised methods one can determine features useful for separation (even if not perfect). I guess feature importances from random forest might not be helpful here due to the correlation. But another interesting experiment to do could be to apply linear discriminant analysis (supervised PCA) and see what features come out (maybe not for this paper, but for your dissertation/future research)</w:t>
+      </w:r>
+    </w:p>
+  </w:comment>
+  <w:comment w:id="5" w:author="Daniel Schindler" w:date="2025-10-25T09:42:00Z" w:initials="DS">
     <w:p>
       <w:pPr>
         <w:pStyle w:val="CommentText"/>
@@ -1403,11 +1428,8 @@
       </w:r>
     </w:p>
   </w:comment>
-  <w:comment w:id="5" w:author="Daniel Schindler" w:date="2025-10-25T09:36:00Z" w:initials="DS">
-    <w:p>
-      <w:pPr>
-        <w:pStyle w:val="CommentText"/>
-      </w:pPr>
+  <w:comment w:id="6" w:author="Valentina M. Staneva" w:date="2025-11-13T14:06:00Z" w:initials="VMS">
+    <w:p>
       <w:r>
         <w:rPr>
           <w:rStyle w:val="CommentReference"/>
@@ -1415,7 +1437,63 @@
         <w:annotationRef/>
       </w:r>
       <w:r>
-        <w:t>So the numbers are the number of fish in each box from the test sample set? Not sure what the numbers are...</w:t>
+        <w:rPr>
+          <w:sz w:val="20"/>
+          <w:szCs w:val="20"/>
+        </w:rPr>
+        <w:t>looking at this result might hint that RF is overfitting so it did not perform well on the raw data (i.e. overfitted to the noise)</w:t>
+      </w:r>
+    </w:p>
+  </w:comment>
+  <w:comment w:id="7" w:author="Valentina M. Staneva" w:date="2025-11-13T14:13:00Z" w:initials="VMS">
+    <w:p>
+      <w:r>
+        <w:rPr>
+          <w:rStyle w:val="CommentReference"/>
+        </w:rPr>
+        <w:annotationRef/>
+      </w:r>
+      <w:r>
+        <w:rPr>
+          <w:sz w:val="20"/>
+          <w:szCs w:val="20"/>
+        </w:rPr>
+        <w:t>Since now the colors are more similar to each other (comparing to the previous contrastive colormap), you could box some of the results with certain results you are discussing (like the highest score) so people do not search for it among the numbers</w:t>
+      </w:r>
+    </w:p>
+    <w:p/>
+  </w:comment>
+  <w:comment w:id="8" w:author="Valentina M. Staneva" w:date="2025-11-13T14:34:00Z" w:initials="VMS">
+    <w:p>
+      <w:r>
+        <w:rPr>
+          <w:rStyle w:val="CommentReference"/>
+        </w:rPr>
+        <w:annotationRef/>
+      </w:r>
+      <w:r>
+        <w:rPr>
+          <w:sz w:val="20"/>
+          <w:szCs w:val="20"/>
+        </w:rPr>
+        <w:t>Looking at the not very big numbers of observations in each box, you may get some questions in the review about the significance in the difference in the results for the different methods, that could be due to properties of individual samples in the tesitng set. Maybe you can acknowledge that in the discussion, and reiterate that even if the difference is insignificant, that the methods provide some reasonable classification.</w:t>
+      </w:r>
+    </w:p>
+  </w:comment>
+  <w:comment w:id="9" w:author="Valentina M. Staneva" w:date="2025-11-13T20:02:00Z" w:initials="VMS">
+    <w:p>
+      <w:r>
+        <w:rPr>
+          <w:rStyle w:val="CommentReference"/>
+        </w:rPr>
+        <w:annotationRef/>
+      </w:r>
+      <w:r>
+        <w:rPr>
+          <w:sz w:val="20"/>
+          <w:szCs w:val="20"/>
+        </w:rPr>
+        <w:t>I have a questions about these plots: so for a fixed number, did you exclude all observations which had confidence less than this number in the calculation of the accuracy, or you simply called them non Kusko? You may want to elaborate more on these plots and what they mean as you increase the threshold in the result/discussion section. I think they can be confusing after hearing about the "calibration", although I know here the meaning of threshold is different than the confidence bin from the previous plots.</w:t>
       </w:r>
     </w:p>
   </w:comment>
@@ -1425,33 +1503,57 @@
 <file path=word/commentsExtended.xml><?xml version="1.0" encoding="utf-8"?>
 <w15:commentsEx xmlns:wpc="http://schemas.microsoft.com/office/word/2010/wordprocessingCanvas" xmlns:cx="http://schemas.microsoft.com/office/drawing/2014/chartex" xmlns:cx1="http://schemas.microsoft.com/office/drawing/2015/9/8/chartex" xmlns:cx2="http://schemas.microsoft.com/office/drawing/2015/10/21/chartex" xmlns:cx3="http://schemas.microsoft.com/office/drawing/2016/5/9/chartex" xmlns:cx4="http://schemas.microsoft.com/office/drawing/2016/5/10/chartex" xmlns:cx5="http://schemas.microsoft.com/office/drawing/2016/5/11/chartex" xmlns:cx6="http://schemas.microsoft.com/office/drawing/2016/5/12/chartex" xmlns:cx7="http://schemas.microsoft.com/office/drawing/2016/5/13/chartex" xmlns:cx8="http://schemas.microsoft.com/office/drawing/2016/5/14/chartex" xmlns:mc="http://schemas.openxmlformats.org/markup-compatibility/2006" xmlns:aink="http://schemas.microsoft.com/office/drawing/2016/ink" xmlns:am3d="http://schemas.microsoft.com/office/drawing/2017/model3d" xmlns:o="urn:schemas-microsoft-com:office:office" xmlns:oel="http://schemas.microsoft.com/office/2019/extlst" xmlns:r="http://schemas.openxmlformats.org/officeDocument/2006/relationships" xmlns:m="http://schemas.openxmlformats.org/officeDocument/2006/math" xmlns:v="urn:schemas-microsoft-com:vml" xmlns:wp14="http://schemas.microsoft.com/office/word/2010/wordprocessingDrawing" xmlns:wp="http://schemas.openxmlformats.org/drawingml/2006/wordprocessingDrawing" xmlns:w10="urn:schemas-microsoft-com:office:word" xmlns:w="http://schemas.openxmlformats.org/wordprocessingml/2006/main" xmlns:w14="http://schemas.microsoft.com/office/word/2010/wordml" xmlns:w15="http://schemas.microsoft.com/office/word/2012/wordml" xmlns:w16cex="http://schemas.microsoft.com/office/word/2018/wordml/cex" xmlns:w16cid="http://schemas.microsoft.com/office/word/2016/wordml/cid" xmlns:w16="http://schemas.microsoft.com/office/word/2018/wordml" xmlns:w16du="http://schemas.microsoft.com/office/word/2023/wordml/word16du" xmlns:w16sdtdh="http://schemas.microsoft.com/office/word/2020/wordml/sdtdatahash" xmlns:w16sdtfl="http://schemas.microsoft.com/office/word/2024/wordml/sdtformatlock" xmlns:w16se="http://schemas.microsoft.com/office/word/2015/wordml/symex" xmlns:wpg="http://schemas.microsoft.com/office/word/2010/wordprocessingGroup" xmlns:wpi="http://schemas.microsoft.com/office/word/2010/wordprocessingInk" xmlns:wne="http://schemas.microsoft.com/office/word/2006/wordml" xmlns:wps="http://schemas.microsoft.com/office/word/2010/wordprocessingShape" mc:Ignorable="w14 w15 w16se w16cid w16 w16cex w16sdtdh w16sdtfl w16du wp14">
   <w15:commentEx w15:paraId="0D283BE3" w15:done="1"/>
-  <w15:commentEx w15:paraId="4EB50266" w15:done="0"/>
+  <w15:commentEx w15:paraId="578CA5BB" w15:done="0"/>
   <w15:commentEx w15:paraId="07703636" w15:done="0"/>
   <w15:commentEx w15:paraId="76DC7C46" w15:paraIdParent="07703636" w15:done="0"/>
+  <w15:commentEx w15:paraId="42AB05EC" w15:paraIdParent="07703636" w15:done="0"/>
   <w15:commentEx w15:paraId="03986E4A" w15:done="0"/>
-  <w15:commentEx w15:paraId="41505919" w15:done="0"/>
+  <w15:commentEx w15:paraId="2FBBA388" w15:done="0"/>
+  <w15:commentEx w15:paraId="695AEC5C" w15:done="0"/>
+  <w15:commentEx w15:paraId="45CD33BE" w15:done="0"/>
+  <w15:commentEx w15:paraId="060130B1" w15:done="0"/>
 </w15:commentsEx>
 </file>
 
 <file path=word/commentsExtensible.xml><?xml version="1.0" encoding="utf-8"?>
 <w16cex:commentsExtensible xmlns:wpc="http://schemas.microsoft.com/office/word/2010/wordprocessingCanvas" xmlns:cx="http://schemas.microsoft.com/office/drawing/2014/chartex" xmlns:cx1="http://schemas.microsoft.com/office/drawing/2015/9/8/chartex" xmlns:cx2="http://schemas.microsoft.com/office/drawing/2015/10/21/chartex" xmlns:cx3="http://schemas.microsoft.com/office/drawing/2016/5/9/chartex" xmlns:cx4="http://schemas.microsoft.com/office/drawing/2016/5/10/chartex" xmlns:cx5="http://schemas.microsoft.com/office/drawing/2016/5/11/chartex" xmlns:cx6="http://schemas.microsoft.com/office/drawing/2016/5/12/chartex" xmlns:cx7="http://schemas.microsoft.com/office/drawing/2016/5/13/chartex" xmlns:cx8="http://schemas.microsoft.com/office/drawing/2016/5/14/chartex" xmlns:cr="http://schemas.microsoft.com/office/comments/2020/reactions" xmlns:mc="http://schemas.openxmlformats.org/markup-compatibility/2006" xmlns:aink="http://schemas.microsoft.com/office/drawing/2016/ink" xmlns:am3d="http://schemas.microsoft.com/office/drawing/2017/model3d" xmlns:o="urn:schemas-microsoft-com:office:office" xmlns:oel="http://schemas.microsoft.com/office/2019/extlst" xmlns:r="http://schemas.openxmlformats.org/officeDocument/2006/relationships" xmlns:m="http://schemas.openxmlformats.org/officeDocument/2006/math" xmlns:v="urn:schemas-microsoft-com:vml" xmlns:wp14="http://schemas.microsoft.com/office/word/2010/wordprocessingDrawing" xmlns:wp="http://schemas.openxmlformats.org/drawingml/2006/wordprocessingDrawing" xmlns:w10="urn:schemas-microsoft-com:office:word" xmlns:w="http://schemas.openxmlformats.org/wordprocessingml/2006/main" xmlns:w14="http://schemas.microsoft.com/office/word/2010/wordml" xmlns:w15="http://schemas.microsoft.com/office/word/2012/wordml" xmlns:w16cex="http://schemas.microsoft.com/office/word/2018/wordml/cex" xmlns:w16cid="http://schemas.microsoft.com/office/word/2016/wordml/cid" xmlns:w16="http://schemas.microsoft.com/office/word/2018/wordml" xmlns:w16du="http://schemas.microsoft.com/office/word/2023/wordml/word16du" xmlns:w16sdtdh="http://schemas.microsoft.com/office/word/2020/wordml/sdtdatahash" xmlns:w16sdtfl="http://schemas.microsoft.com/office/word/2024/wordml/sdtformatlock" xmlns:w16se="http://schemas.microsoft.com/office/word/2015/wordml/symex" xmlns:wpg="http://schemas.microsoft.com/office/word/2010/wordprocessingGroup" xmlns:wpi="http://schemas.microsoft.com/office/word/2010/wordprocessingInk" xmlns:wne="http://schemas.microsoft.com/office/word/2006/wordml" xmlns:wps="http://schemas.microsoft.com/office/word/2010/wordprocessingShape" mc:Ignorable="w14 w15 w16se w16cid w16 w16cex w16sdtdh w16sdtfl cr w16du wp14">
   <w16cex:commentExtensible w16cex:durableId="097BE8A5" w16cex:dateUtc="2025-10-25T16:30:00Z"/>
-  <w16cex:commentExtensible w16cex:durableId="415B9344" w16cex:dateUtc="2025-10-25T16:43:00Z"/>
+  <w16cex:commentExtensible w16cex:durableId="7CD93581" w16cex:dateUtc="2025-11-13T21:41:00Z"/>
   <w16cex:commentExtensible w16cex:durableId="11D61FD6" w16cex:dateUtc="2025-10-06T18:10:00Z"/>
   <w16cex:commentExtensible w16cex:durableId="7531CF4E" w16cex:dateUtc="2025-10-06T18:10:00Z"/>
+  <w16cex:commentExtensible w16cex:durableId="70CD702F" w16cex:dateUtc="2025-11-13T22:02:00Z">
+    <w16cex:extLst>
+      <w16:ext w16:uri="{CE6994B0-6A32-4C9F-8C6B-6E91EDA988CE}">
+        <cr:reactions xmlns:cr="http://schemas.microsoft.com/office/comments/2020/reactions">
+          <cr:reaction reactionType="1">
+            <cr:reactionInfo dateUtc="2025-11-14T16:21:22Z">
+              <cr:user userId="S::bmak29@uw.edu::e2d819b1-db99-41fc-888c-ad60b4d561ad" userProvider="AD" userName="bmak29"/>
+            </cr:reactionInfo>
+          </cr:reaction>
+        </cr:reactions>
+      </w16:ext>
+    </w16cex:extLst>
+  </w16cex:commentExtensible>
   <w16cex:commentExtensible w16cex:durableId="13446255" w16cex:dateUtc="2025-10-25T16:42:00Z"/>
-  <w16cex:commentExtensible w16cex:durableId="6CEAFE59" w16cex:dateUtc="2025-10-25T16:36:00Z"/>
+  <w16cex:commentExtensible w16cex:durableId="155D5F92" w16cex:dateUtc="2025-11-13T22:06:00Z"/>
+  <w16cex:commentExtensible w16cex:durableId="541D1368" w16cex:dateUtc="2025-11-13T22:13:00Z"/>
+  <w16cex:commentExtensible w16cex:durableId="0191B21D" w16cex:dateUtc="2025-11-13T22:34:00Z"/>
+  <w16cex:commentExtensible w16cex:durableId="2B5A5417" w16cex:dateUtc="2025-11-14T04:02:00Z"/>
 </w16cex:commentsExtensible>
 </file>
 
 <file path=word/commentsIds.xml><?xml version="1.0" encoding="utf-8"?>
 <w16cid:commentsIds xmlns:wpc="http://schemas.microsoft.com/office/word/2010/wordprocessingCanvas" xmlns:cx="http://schemas.microsoft.com/office/drawing/2014/chartex" xmlns:cx1="http://schemas.microsoft.com/office/drawing/2015/9/8/chartex" xmlns:cx2="http://schemas.microsoft.com/office/drawing/2015/10/21/chartex" xmlns:cx3="http://schemas.microsoft.com/office/drawing/2016/5/9/chartex" xmlns:cx4="http://schemas.microsoft.com/office/drawing/2016/5/10/chartex" xmlns:cx5="http://schemas.microsoft.com/office/drawing/2016/5/11/chartex" xmlns:cx6="http://schemas.microsoft.com/office/drawing/2016/5/12/chartex" xmlns:cx7="http://schemas.microsoft.com/office/drawing/2016/5/13/chartex" xmlns:cx8="http://schemas.microsoft.com/office/drawing/2016/5/14/chartex" xmlns:mc="http://schemas.openxmlformats.org/markup-compatibility/2006" xmlns:aink="http://schemas.microsoft.com/office/drawing/2016/ink" xmlns:am3d="http://schemas.microsoft.com/office/drawing/2017/model3d" xmlns:o="urn:schemas-microsoft-com:office:office" xmlns:oel="http://schemas.microsoft.com/office/2019/extlst" xmlns:r="http://schemas.openxmlformats.org/officeDocument/2006/relationships" xmlns:m="http://schemas.openxmlformats.org/officeDocument/2006/math" xmlns:v="urn:schemas-microsoft-com:vml" xmlns:wp14="http://schemas.microsoft.com/office/word/2010/wordprocessingDrawing" xmlns:wp="http://schemas.openxmlformats.org/drawingml/2006/wordprocessingDrawing" xmlns:w10="urn:schemas-microsoft-com:office:word" xmlns:w="http://schemas.openxmlformats.org/wordprocessingml/2006/main" xmlns:w14="http://schemas.microsoft.com/office/word/2010/wordml" xmlns:w15="http://schemas.microsoft.com/office/word/2012/wordml" xmlns:w16cex="http://schemas.microsoft.com/office/word/2018/wordml/cex" xmlns:w16cid="http://schemas.microsoft.com/office/word/2016/wordml/cid" xmlns:w16="http://schemas.microsoft.com/office/word/2018/wordml" xmlns:w16du="http://schemas.microsoft.com/office/word/2023/wordml/word16du" xmlns:w16sdtdh="http://schemas.microsoft.com/office/word/2020/wordml/sdtdatahash" xmlns:w16sdtfl="http://schemas.microsoft.com/office/word/2024/wordml/sdtformatlock" xmlns:w16se="http://schemas.microsoft.com/office/word/2015/wordml/symex" xmlns:wpg="http://schemas.microsoft.com/office/word/2010/wordprocessingGroup" xmlns:wpi="http://schemas.microsoft.com/office/word/2010/wordprocessingInk" xmlns:wne="http://schemas.microsoft.com/office/word/2006/wordml" xmlns:wps="http://schemas.microsoft.com/office/word/2010/wordprocessingShape" mc:Ignorable="w14 w15 w16se w16cid w16 w16cex w16sdtdh w16sdtfl w16du wp14">
   <w16cid:commentId w16cid:paraId="0D283BE3" w16cid:durableId="097BE8A5"/>
-  <w16cid:commentId w16cid:paraId="4EB50266" w16cid:durableId="415B9344"/>
+  <w16cid:commentId w16cid:paraId="578CA5BB" w16cid:durableId="7CD93581"/>
   <w16cid:commentId w16cid:paraId="07703636" w16cid:durableId="11D61FD6"/>
   <w16cid:commentId w16cid:paraId="76DC7C46" w16cid:durableId="7531CF4E"/>
+  <w16cid:commentId w16cid:paraId="42AB05EC" w16cid:durableId="70CD702F"/>
   <w16cid:commentId w16cid:paraId="03986E4A" w16cid:durableId="13446255"/>
-  <w16cid:commentId w16cid:paraId="41505919" w16cid:durableId="6CEAFE59"/>
+  <w16cid:commentId w16cid:paraId="2FBBA388" w16cid:durableId="155D5F92"/>
+  <w16cid:commentId w16cid:paraId="695AEC5C" w16cid:durableId="541D1368"/>
+  <w16cid:commentId w16cid:paraId="45CD33BE" w16cid:durableId="0191B21D"/>
+  <w16cid:commentId w16cid:paraId="060130B1" w16cid:durableId="2B5A5417"/>
 </w16cid:commentsIds>
 </file>
 
@@ -1459,6 +1561,9 @@
 <w15:people xmlns:wpc="http://schemas.microsoft.com/office/word/2010/wordprocessingCanvas" xmlns:cx="http://schemas.microsoft.com/office/drawing/2014/chartex" xmlns:cx1="http://schemas.microsoft.com/office/drawing/2015/9/8/chartex" xmlns:cx2="http://schemas.microsoft.com/office/drawing/2015/10/21/chartex" xmlns:cx3="http://schemas.microsoft.com/office/drawing/2016/5/9/chartex" xmlns:cx4="http://schemas.microsoft.com/office/drawing/2016/5/10/chartex" xmlns:cx5="http://schemas.microsoft.com/office/drawing/2016/5/11/chartex" xmlns:cx6="http://schemas.microsoft.com/office/drawing/2016/5/12/chartex" xmlns:cx7="http://schemas.microsoft.com/office/drawing/2016/5/13/chartex" xmlns:cx8="http://schemas.microsoft.com/office/drawing/2016/5/14/chartex" xmlns:mc="http://schemas.openxmlformats.org/markup-compatibility/2006" xmlns:aink="http://schemas.microsoft.com/office/drawing/2016/ink" xmlns:am3d="http://schemas.microsoft.com/office/drawing/2017/model3d" xmlns:o="urn:schemas-microsoft-com:office:office" xmlns:oel="http://schemas.microsoft.com/office/2019/extlst" xmlns:r="http://schemas.openxmlformats.org/officeDocument/2006/relationships" xmlns:m="http://schemas.openxmlformats.org/officeDocument/2006/math" xmlns:v="urn:schemas-microsoft-com:vml" xmlns:wp14="http://schemas.microsoft.com/office/word/2010/wordprocessingDrawing" xmlns:wp="http://schemas.openxmlformats.org/drawingml/2006/wordprocessingDrawing" xmlns:w10="urn:schemas-microsoft-com:office:word" xmlns:w="http://schemas.openxmlformats.org/wordprocessingml/2006/main" xmlns:w14="http://schemas.microsoft.com/office/word/2010/wordml" xmlns:w15="http://schemas.microsoft.com/office/word/2012/wordml" xmlns:w16cex="http://schemas.microsoft.com/office/word/2018/wordml/cex" xmlns:w16cid="http://schemas.microsoft.com/office/word/2016/wordml/cid" xmlns:w16="http://schemas.microsoft.com/office/word/2018/wordml" xmlns:w16du="http://schemas.microsoft.com/office/word/2023/wordml/word16du" xmlns:w16sdtdh="http://schemas.microsoft.com/office/word/2020/wordml/sdtdatahash" xmlns:w16sdtfl="http://schemas.microsoft.com/office/word/2024/wordml/sdtformatlock" xmlns:w16se="http://schemas.microsoft.com/office/word/2015/wordml/symex" xmlns:wpg="http://schemas.microsoft.com/office/word/2010/wordprocessingGroup" xmlns:wpi="http://schemas.microsoft.com/office/word/2010/wordprocessingInk" xmlns:wne="http://schemas.microsoft.com/office/word/2006/wordml" xmlns:wps="http://schemas.microsoft.com/office/word/2010/wordprocessingShape" mc:Ignorable="w14 w15 w16se w16cid w16 w16cex w16sdtdh w16sdtfl w16du wp14">
   <w15:person w15:author="Daniel Schindler">
     <w15:presenceInfo w15:providerId="AD" w15:userId="S::deschind@uw.edu::638f7977-a89c-40df-b85e-dc804ddb30d9"/>
+  </w15:person>
+  <w15:person w15:author="Valentina M. Staneva">
+    <w15:presenceInfo w15:providerId="AD" w15:userId="S::vms16@uw.edu::39002d1f-c79c-469f-9108-ea31440063df"/>
   </w15:person>
 </w15:people>
 </file>

</xml_diff>

<commit_message>
added comments from valentina
</commit_message>
<xml_diff>
--- a/Docs/FIGURES Machine learning applied to otolith timeseries data to discriminate river of origin for Western Alaska Salmon.docx
+++ b/Docs/FIGURES Machine learning applied to otolith timeseries data to discriminate river of origin for Western Alaska Salmon.docx
@@ -379,10 +379,10 @@
         </w:rPr>
         <w:lastRenderedPageBreak/>
         <w:drawing>
-          <wp:inline distT="0" distB="0" distL="0" distR="0" wp14:anchorId="48114E8B" wp14:editId="60F7FD01">
-            <wp:extent cx="5943600" cy="3056890"/>
-            <wp:effectExtent l="0" t="0" r="0" b="3810"/>
-            <wp:docPr id="905680717" name="Picture 2"/>
+          <wp:inline distT="0" distB="0" distL="0" distR="0" wp14:anchorId="64549A14" wp14:editId="511DBD46">
+            <wp:extent cx="5943600" cy="2931160"/>
+            <wp:effectExtent l="0" t="0" r="0" b="2540"/>
+            <wp:docPr id="1216485611" name="Picture 3" descr="A graph of a diagram&#10;&#10;AI-generated content may be incorrect."/>
             <wp:cNvGraphicFramePr>
               <a:graphicFrameLocks xmlns:a="http://schemas.openxmlformats.org/drawingml/2006/main" noChangeAspect="1"/>
             </wp:cNvGraphicFramePr>
@@ -390,11 +390,17 @@
               <a:graphicData uri="http://schemas.openxmlformats.org/drawingml/2006/picture">
                 <pic:pic xmlns:pic="http://schemas.openxmlformats.org/drawingml/2006/picture">
                   <pic:nvPicPr>
-                    <pic:cNvPr id="905680717" name="Picture 905680717"/>
+                    <pic:cNvPr id="1216485611" name="Picture 3" descr="A graph of a diagram&#10;&#10;AI-generated content may be incorrect."/>
                     <pic:cNvPicPr/>
                   </pic:nvPicPr>
                   <pic:blipFill>
-                    <a:blip r:embed="rId11"/>
+                    <a:blip r:embed="rId11" cstate="print">
+                      <a:extLst>
+                        <a:ext uri="{28A0092B-C50C-407E-A947-70E740481C1C}">
+                          <a14:useLocalDpi xmlns:a14="http://schemas.microsoft.com/office/drawing/2010/main" val="0"/>
+                        </a:ext>
+                      </a:extLst>
+                    </a:blip>
                     <a:stretch>
                       <a:fillRect/>
                     </a:stretch>
@@ -402,7 +408,7 @@
                   <pic:spPr>
                     <a:xfrm>
                       <a:off x="0" y="0"/>
-                      <a:ext cx="5943600" cy="3056890"/>
+                      <a:ext cx="5943600" cy="2931160"/>
                     </a:xfrm>
                     <a:prstGeom prst="rect">
                       <a:avLst/>
@@ -1503,7 +1509,7 @@
 <file path=word/commentsExtended.xml><?xml version="1.0" encoding="utf-8"?>
 <w15:commentsEx xmlns:wpc="http://schemas.microsoft.com/office/word/2010/wordprocessingCanvas" xmlns:cx="http://schemas.microsoft.com/office/drawing/2014/chartex" xmlns:cx1="http://schemas.microsoft.com/office/drawing/2015/9/8/chartex" xmlns:cx2="http://schemas.microsoft.com/office/drawing/2015/10/21/chartex" xmlns:cx3="http://schemas.microsoft.com/office/drawing/2016/5/9/chartex" xmlns:cx4="http://schemas.microsoft.com/office/drawing/2016/5/10/chartex" xmlns:cx5="http://schemas.microsoft.com/office/drawing/2016/5/11/chartex" xmlns:cx6="http://schemas.microsoft.com/office/drawing/2016/5/12/chartex" xmlns:cx7="http://schemas.microsoft.com/office/drawing/2016/5/13/chartex" xmlns:cx8="http://schemas.microsoft.com/office/drawing/2016/5/14/chartex" xmlns:mc="http://schemas.openxmlformats.org/markup-compatibility/2006" xmlns:aink="http://schemas.microsoft.com/office/drawing/2016/ink" xmlns:am3d="http://schemas.microsoft.com/office/drawing/2017/model3d" xmlns:o="urn:schemas-microsoft-com:office:office" xmlns:oel="http://schemas.microsoft.com/office/2019/extlst" xmlns:r="http://schemas.openxmlformats.org/officeDocument/2006/relationships" xmlns:m="http://schemas.openxmlformats.org/officeDocument/2006/math" xmlns:v="urn:schemas-microsoft-com:vml" xmlns:wp14="http://schemas.microsoft.com/office/word/2010/wordprocessingDrawing" xmlns:wp="http://schemas.openxmlformats.org/drawingml/2006/wordprocessingDrawing" xmlns:w10="urn:schemas-microsoft-com:office:word" xmlns:w="http://schemas.openxmlformats.org/wordprocessingml/2006/main" xmlns:w14="http://schemas.microsoft.com/office/word/2010/wordml" xmlns:w15="http://schemas.microsoft.com/office/word/2012/wordml" xmlns:w16cex="http://schemas.microsoft.com/office/word/2018/wordml/cex" xmlns:w16cid="http://schemas.microsoft.com/office/word/2016/wordml/cid" xmlns:w16="http://schemas.microsoft.com/office/word/2018/wordml" xmlns:w16du="http://schemas.microsoft.com/office/word/2023/wordml/word16du" xmlns:w16sdtdh="http://schemas.microsoft.com/office/word/2020/wordml/sdtdatahash" xmlns:w16sdtfl="http://schemas.microsoft.com/office/word/2024/wordml/sdtformatlock" xmlns:w16se="http://schemas.microsoft.com/office/word/2015/wordml/symex" xmlns:wpg="http://schemas.microsoft.com/office/word/2010/wordprocessingGroup" xmlns:wpi="http://schemas.microsoft.com/office/word/2010/wordprocessingInk" xmlns:wne="http://schemas.microsoft.com/office/word/2006/wordml" xmlns:wps="http://schemas.microsoft.com/office/word/2010/wordprocessingShape" mc:Ignorable="w14 w15 w16se w16cid w16 w16cex w16sdtdh w16sdtfl w16du wp14">
   <w15:commentEx w15:paraId="0D283BE3" w15:done="1"/>
-  <w15:commentEx w15:paraId="578CA5BB" w15:done="0"/>
+  <w15:commentEx w15:paraId="578CA5BB" w15:done="1"/>
   <w15:commentEx w15:paraId="07703636" w15:done="0"/>
   <w15:commentEx w15:paraId="76DC7C46" w15:paraIdParent="07703636" w15:done="0"/>
   <w15:commentEx w15:paraId="42AB05EC" w15:paraIdParent="07703636" w15:done="0"/>

</xml_diff>

<commit_message>
cleaned and added to submission
</commit_message>
<xml_diff>
--- a/Docs/FIGURES Machine learning applied to otolith timeseries data to discriminate river of origin for Western Alaska Salmon.docx
+++ b/Docs/FIGURES Machine learning applied to otolith timeseries data to discriminate river of origin for Western Alaska Salmon.docx
@@ -8,14 +8,6 @@
           <w:rStyle w:val="CommentReference"/>
         </w:rPr>
       </w:pPr>
-      <w:commentRangeStart w:id="0"/>
-      <w:commentRangeEnd w:id="0"/>
-      <w:r>
-        <w:rPr>
-          <w:rStyle w:val="CommentReference"/>
-        </w:rPr>
-        <w:commentReference w:id="0"/>
-      </w:r>
       <w:r>
         <w:rPr>
           <w:noProof/>
@@ -38,7 +30,7 @@
                     <pic:cNvPicPr/>
                   </pic:nvPicPr>
                   <pic:blipFill>
-                    <a:blip r:embed="rId9" cstate="print">
+                    <a:blip r:embed="rId5" cstate="print">
                       <a:extLst>
                         <a:ext uri="{28A0092B-C50C-407E-A947-70E740481C1C}">
                           <a14:useLocalDpi xmlns:a14="http://schemas.microsoft.com/office/drawing/2010/main" val="0"/>
@@ -293,7 +285,7 @@
                     <pic:cNvPicPr/>
                   </pic:nvPicPr>
                   <pic:blipFill>
-                    <a:blip r:embed="rId10" cstate="print">
+                    <a:blip r:embed="rId6" cstate="print">
                       <a:extLst>
                         <a:ext uri="{28A0092B-C50C-407E-A947-70E740481C1C}">
                           <a14:useLocalDpi xmlns:a14="http://schemas.microsoft.com/office/drawing/2010/main" val="0"/>
@@ -394,7 +386,7 @@
                     <pic:cNvPicPr/>
                   </pic:nvPicPr>
                   <pic:blipFill>
-                    <a:blip r:embed="rId11" cstate="print">
+                    <a:blip r:embed="rId7" cstate="print">
                       <a:extLst>
                         <a:ext uri="{28A0092B-C50C-407E-A947-70E740481C1C}">
                           <a14:useLocalDpi xmlns:a14="http://schemas.microsoft.com/office/drawing/2010/main" val="0"/>
@@ -427,7 +419,6 @@
           <w:rFonts w:ascii="Times New Roman" w:hAnsi="Times New Roman" w:cs="Times New Roman"/>
         </w:rPr>
       </w:pPr>
-      <w:commentRangeStart w:id="1"/>
       <w:r>
         <w:rPr>
           <w:rFonts w:ascii="Times New Roman" w:hAnsi="Times New Roman" w:cs="Times New Roman"/>
@@ -450,93 +441,13 @@
           <w:b/>
           <w:bCs/>
         </w:rPr>
-        <w:t>:</w:t>
-      </w:r>
-      <w:commentRangeEnd w:id="1"/>
-      <w:r>
-        <w:rPr>
-          <w:rStyle w:val="CommentReference"/>
-        </w:rPr>
-        <w:commentReference w:id="1"/>
-      </w:r>
-      <w:r>
-        <w:rPr>
-          <w:rFonts w:ascii="Times New Roman" w:hAnsi="Times New Roman" w:cs="Times New Roman"/>
-          <w:b/>
-          <w:bCs/>
-        </w:rPr>
-        <w:t xml:space="preserve"> </w:t>
-      </w:r>
-      <w:r>
-        <w:rPr>
-          <w:rFonts w:ascii="Times New Roman" w:hAnsi="Times New Roman" w:cs="Times New Roman"/>
-        </w:rPr>
-        <w:t xml:space="preserve">A) Principal component analysis of all samples with a natal origin ⁸⁷Sr/⁸⁶Sr of 0.7080 - 0.7085. Clustering among watersheds is evident between principal </w:t>
-      </w:r>
-      <w:commentRangeStart w:id="2"/>
-      <w:commentRangeStart w:id="3"/>
-      <w:commentRangeStart w:id="4"/>
-      <w:r>
-        <w:rPr>
-          <w:rFonts w:ascii="Times New Roman" w:hAnsi="Times New Roman" w:cs="Times New Roman"/>
-        </w:rPr>
-        <w:t>components</w:t>
-      </w:r>
-      <w:commentRangeEnd w:id="2"/>
-      <w:r>
-        <w:rPr>
-          <w:rStyle w:val="CommentReference"/>
-          <w:rFonts w:ascii="Times New Roman" w:hAnsi="Times New Roman" w:cs="Times New Roman"/>
-          <w:sz w:val="24"/>
-          <w:szCs w:val="24"/>
-        </w:rPr>
-        <w:commentReference w:id="2"/>
-      </w:r>
-      <w:commentRangeEnd w:id="3"/>
-      <w:r>
-        <w:rPr>
-          <w:rStyle w:val="CommentReference"/>
-          <w:rFonts w:ascii="Times New Roman" w:hAnsi="Times New Roman" w:cs="Times New Roman"/>
-          <w:sz w:val="24"/>
-          <w:szCs w:val="24"/>
-        </w:rPr>
-        <w:commentReference w:id="3"/>
-      </w:r>
-      <w:commentRangeEnd w:id="4"/>
-      <w:r>
-        <w:rPr>
-          <w:rStyle w:val="CommentReference"/>
-        </w:rPr>
-        <w:commentReference w:id="4"/>
-      </w:r>
-      <w:r>
-        <w:rPr>
-          <w:rFonts w:ascii="Times New Roman" w:hAnsi="Times New Roman" w:cs="Times New Roman"/>
-        </w:rPr>
-        <w:t xml:space="preserve"> 1 and 2 (68.39% of variance), as well as between principal components 2 and 3 (31.16% of variance). There is some overlap between all three watersheds in both cases. B) </w:t>
-      </w:r>
-      <w:commentRangeStart w:id="5"/>
-      <w:r>
-        <w:rPr>
-          <w:rFonts w:ascii="Times New Roman" w:hAnsi="Times New Roman" w:cs="Times New Roman"/>
-        </w:rPr>
-        <w:t xml:space="preserve">Sample </w:t>
-      </w:r>
-      <w:commentRangeEnd w:id="5"/>
-      <w:r>
-        <w:rPr>
-          <w:rStyle w:val="CommentReference"/>
-          <w:rFonts w:ascii="Times New Roman" w:hAnsi="Times New Roman" w:cs="Times New Roman"/>
-          <w:sz w:val="24"/>
-          <w:szCs w:val="24"/>
-        </w:rPr>
-        <w:commentReference w:id="5"/>
-      </w:r>
-      <w:r>
-        <w:rPr>
-          <w:rFonts w:ascii="Times New Roman" w:hAnsi="Times New Roman" w:cs="Times New Roman"/>
-        </w:rPr>
-        <w:t>otolith LA timeseries colored by the absolute value of the PCA loadings at associated timeseries indices. PC1 (top row) shows high loading on the middle section of the timeseries after the natal origin region. PC2 is driven by the region of the timeseries towards the marine entry, likely the result of mainstem migration to the ocean. Separation along PC3 is driven by the very beginning of the timeseries, which is the region associated with the natal origin. Notably, Yukon individuals from the CWAK region contain a less pronounces mainstem signal as compared to their counterpart from the upper or middle Yukon genetic groups.</w:t>
+        <w:t xml:space="preserve">: </w:t>
+      </w:r>
+      <w:r>
+        <w:rPr>
+          <w:rFonts w:ascii="Times New Roman" w:hAnsi="Times New Roman" w:cs="Times New Roman"/>
+        </w:rPr>
+        <w:t>A) Principal component analysis of all samples with a natal origin ⁸⁷Sr/⁸⁶Sr of 0.7080 - 0.7085. Clustering among watersheds is evident between principal components 1 and 2 (68.39% of variance), as well as between principal components 2 and 3 (31.16% of variance). There is some overlap between all three watersheds in both cases. B) Sample otolith LA timeseries colored by the absolute value of the PCA loadings at associated timeseries indices. PC1 (top row) shows high loading on the middle section of the timeseries after the natal origin region. PC2 is driven by the region of the timeseries towards the marine entry, likely the result of mainstem migration to the ocean. Separation along PC3 is driven by the very beginning of the timeseries, which is the region associated with the natal origin. Notably, Yukon individuals from the CWAK region contain a less pronounces mainstem signal as compared to their counterpart from the upper or middle Yukon genetic groups.</w:t>
       </w:r>
     </w:p>
     <w:p>
@@ -641,7 +552,7 @@
                     <pic:cNvPicPr/>
                   </pic:nvPicPr>
                   <pic:blipFill>
-                    <a:blip r:embed="rId12"/>
+                    <a:blip r:embed="rId8"/>
                     <a:stretch>
                       <a:fillRect/>
                     </a:stretch>
@@ -668,8 +579,6 @@
           <w:rFonts w:ascii="Times New Roman" w:hAnsi="Times New Roman" w:cs="Times New Roman"/>
         </w:rPr>
       </w:pPr>
-      <w:commentRangeStart w:id="6"/>
-      <w:commentRangeStart w:id="7"/>
       <w:r>
         <w:rPr>
           <w:rFonts w:ascii="Times New Roman" w:hAnsi="Times New Roman" w:cs="Times New Roman"/>
@@ -694,31 +603,11 @@
         </w:rPr>
         <w:t>:</w:t>
       </w:r>
-      <w:commentRangeEnd w:id="6"/>
-      <w:r>
-        <w:rPr>
-          <w:rStyle w:val="CommentReference"/>
-        </w:rPr>
-        <w:commentReference w:id="6"/>
-      </w:r>
-      <w:r>
-        <w:rPr>
-          <w:rFonts w:ascii="Times New Roman" w:hAnsi="Times New Roman" w:cs="Times New Roman"/>
-        </w:rPr>
-        <w:t xml:space="preserve"> </w:t>
-      </w:r>
-      <w:commentRangeEnd w:id="7"/>
-      <w:r>
-        <w:rPr>
-          <w:rStyle w:val="CommentReference"/>
-        </w:rPr>
-        <w:commentReference w:id="7"/>
-      </w:r>
-      <w:r>
-        <w:rPr>
-          <w:rFonts w:ascii="Times New Roman" w:hAnsi="Times New Roman" w:cs="Times New Roman"/>
-        </w:rPr>
-        <w:t xml:space="preserve">Model Performance comparison among data </w:t>
+      <w:r>
+        <w:rPr>
+          <w:rFonts w:ascii="Times New Roman" w:hAnsi="Times New Roman" w:cs="Times New Roman"/>
+        </w:rPr>
+        <w:t xml:space="preserve"> Model Performance comparison among data </w:t>
       </w:r>
       <w:r>
         <w:rPr>
@@ -933,7 +822,7 @@
                     <pic:cNvPicPr/>
                   </pic:nvPicPr>
                   <pic:blipFill>
-                    <a:blip r:embed="rId13"/>
+                    <a:blip r:embed="rId9"/>
                     <a:stretch>
                       <a:fillRect/>
                     </a:stretch>
@@ -970,7 +859,6 @@
           <w:szCs w:val="22"/>
         </w:rPr>
       </w:pPr>
-      <w:commentRangeStart w:id="8"/>
       <w:r>
         <w:rPr>
           <w:rFonts w:ascii="Garamond" w:hAnsi="Garamond"/>
@@ -1000,13 +888,6 @@
           <w:szCs w:val="22"/>
         </w:rPr>
         <w:t>:</w:t>
-      </w:r>
-      <w:commentRangeEnd w:id="8"/>
-      <w:r>
-        <w:rPr>
-          <w:rStyle w:val="CommentReference"/>
-        </w:rPr>
-        <w:commentReference w:id="8"/>
       </w:r>
       <w:r>
         <w:rPr>
@@ -1164,7 +1045,7 @@
                     <pic:cNvPicPr/>
                   </pic:nvPicPr>
                   <pic:blipFill>
-                    <a:blip r:embed="rId14" cstate="print">
+                    <a:blip r:embed="rId10" cstate="print">
                       <a:extLst>
                         <a:ext uri="{28A0092B-C50C-407E-A947-70E740481C1C}">
                           <a14:useLocalDpi xmlns:a14="http://schemas.microsoft.com/office/drawing/2010/main" val="0"/>
@@ -1199,7 +1080,6 @@
           <w:szCs w:val="22"/>
         </w:rPr>
       </w:pPr>
-      <w:commentRangeStart w:id="9"/>
       <w:r>
         <w:rPr>
           <w:rFonts w:ascii="Garamond" w:hAnsi="Garamond"/>
@@ -1208,24 +1088,7 @@
           <w:sz w:val="22"/>
           <w:szCs w:val="22"/>
         </w:rPr>
-        <w:t>Figure 6:</w:t>
-      </w:r>
-      <w:commentRangeEnd w:id="9"/>
-      <w:r>
-        <w:rPr>
-          <w:rStyle w:val="CommentReference"/>
-        </w:rPr>
-        <w:commentReference w:id="9"/>
-      </w:r>
-      <w:r>
-        <w:rPr>
-          <w:rFonts w:ascii="Garamond" w:hAnsi="Garamond"/>
-          <w:b/>
-          <w:bCs/>
-          <w:sz w:val="22"/>
-          <w:szCs w:val="22"/>
-        </w:rPr>
-        <w:t xml:space="preserve"> </w:t>
+        <w:t xml:space="preserve">Figure 6: </w:t>
       </w:r>
       <w:r>
         <w:rPr>
@@ -1332,246 +1195,6 @@
     </w:sectPr>
   </w:body>
 </w:document>
-</file>
-
-<file path=word/comments.xml><?xml version="1.0" encoding="utf-8"?>
-<w:comments xmlns:wpc="http://schemas.microsoft.com/office/word/2010/wordprocessingCanvas" xmlns:cx="http://schemas.microsoft.com/office/drawing/2014/chartex" xmlns:cx1="http://schemas.microsoft.com/office/drawing/2015/9/8/chartex" xmlns:cx2="http://schemas.microsoft.com/office/drawing/2015/10/21/chartex" xmlns:cx3="http://schemas.microsoft.com/office/drawing/2016/5/9/chartex" xmlns:cx4="http://schemas.microsoft.com/office/drawing/2016/5/10/chartex" xmlns:cx5="http://schemas.microsoft.com/office/drawing/2016/5/11/chartex" xmlns:cx6="http://schemas.microsoft.com/office/drawing/2016/5/12/chartex" xmlns:cx7="http://schemas.microsoft.com/office/drawing/2016/5/13/chartex" xmlns:cx8="http://schemas.microsoft.com/office/drawing/2016/5/14/chartex" xmlns:mc="http://schemas.openxmlformats.org/markup-compatibility/2006" xmlns:aink="http://schemas.microsoft.com/office/drawing/2016/ink" xmlns:am3d="http://schemas.microsoft.com/office/drawing/2017/model3d" xmlns:o="urn:schemas-microsoft-com:office:office" xmlns:oel="http://schemas.microsoft.com/office/2019/extlst" xmlns:r="http://schemas.openxmlformats.org/officeDocument/2006/relationships" xmlns:m="http://schemas.openxmlformats.org/officeDocument/2006/math" xmlns:v="urn:schemas-microsoft-com:vml" xmlns:wp14="http://schemas.microsoft.com/office/word/2010/wordprocessingDrawing" xmlns:wp="http://schemas.openxmlformats.org/drawingml/2006/wordprocessingDrawing" xmlns:w10="urn:schemas-microsoft-com:office:word" xmlns:w="http://schemas.openxmlformats.org/wordprocessingml/2006/main" xmlns:w14="http://schemas.microsoft.com/office/word/2010/wordml" xmlns:w15="http://schemas.microsoft.com/office/word/2012/wordml" xmlns:w16cex="http://schemas.microsoft.com/office/word/2018/wordml/cex" xmlns:w16cid="http://schemas.microsoft.com/office/word/2016/wordml/cid" xmlns:w16="http://schemas.microsoft.com/office/word/2018/wordml" xmlns:w16du="http://schemas.microsoft.com/office/word/2023/wordml/word16du" xmlns:w16sdtdh="http://schemas.microsoft.com/office/word/2020/wordml/sdtdatahash" xmlns:w16sdtfl="http://schemas.microsoft.com/office/word/2024/wordml/sdtformatlock" xmlns:w16se="http://schemas.microsoft.com/office/word/2015/wordml/symex" xmlns:wpg="http://schemas.microsoft.com/office/word/2010/wordprocessingGroup" xmlns:wpi="http://schemas.microsoft.com/office/word/2010/wordprocessingInk" xmlns:wne="http://schemas.microsoft.com/office/word/2006/wordml" xmlns:wps="http://schemas.microsoft.com/office/word/2010/wordprocessingShape" mc:Ignorable="w14 w15 w16se w16cid w16 w16cex w16sdtdh w16sdtfl w16du wp14">
-  <w:comment w:id="0" w:author="Daniel Schindler" w:date="2025-10-25T09:30:00Z" w:initials="DS">
-    <w:p>
-      <w:pPr>
-        <w:pStyle w:val="CommentText"/>
-      </w:pPr>
-      <w:r>
-        <w:rPr>
-          <w:rStyle w:val="CommentReference"/>
-        </w:rPr>
-        <w:annotationRef/>
-      </w:r>
-      <w:r>
-        <w:t>Beautiful figure!</w:t>
-      </w:r>
-    </w:p>
-  </w:comment>
-  <w:comment w:id="1" w:author="Valentina M. Staneva" w:date="2025-11-13T13:41:00Z" w:initials="VMS">
-    <w:p>
-      <w:r>
-        <w:rPr>
-          <w:rStyle w:val="CommentReference"/>
-        </w:rPr>
-        <w:annotationRef/>
-      </w:r>
-      <w:r>
-        <w:rPr>
-          <w:sz w:val="20"/>
-          <w:szCs w:val="20"/>
-        </w:rPr>
-        <w:t xml:space="preserve">So (maybe due to the small font)  it took me a while to see/understand the title indicating the individual PCs. I read the absolute value as IPC and was wondering what was that :). So maybe somehow make the || different size than the PC. Or maybe put them on the right hand-side. </w:t>
-      </w:r>
-    </w:p>
-  </w:comment>
-  <w:comment w:id="2" w:author="Daniel Schindler" w:date="2025-10-06T11:10:00Z" w:initials="DS">
-    <w:p>
-      <w:pPr>
-        <w:pStyle w:val="CommentText"/>
-      </w:pPr>
-      <w:r>
-        <w:rPr>
-          <w:rStyle w:val="CommentReference"/>
-        </w:rPr>
-        <w:annotationRef/>
-      </w:r>
-      <w:r>
-        <w:t>This is a cool result which is not particularly well highlighted in the Discussion. Might want to think about how to highlight these results more.</w:t>
-      </w:r>
-    </w:p>
-  </w:comment>
-  <w:comment w:id="3" w:author="Daniel Schindler" w:date="2025-10-06T11:10:00Z" w:initials="DS">
-    <w:p>
-      <w:pPr>
-        <w:pStyle w:val="CommentText"/>
-      </w:pPr>
-      <w:r>
-        <w:rPr>
-          <w:rStyle w:val="CommentReference"/>
-        </w:rPr>
-        <w:annotationRef/>
-      </w:r>
-      <w:r>
-        <w:t>Fonts are very small</w:t>
-      </w:r>
-    </w:p>
-  </w:comment>
-  <w:comment w:id="4" w:author="Valentina M. Staneva" w:date="2025-11-13T14:02:00Z" w:initials="VMS">
-    <w:p>
-      <w:r>
-        <w:rPr>
-          <w:rStyle w:val="CommentReference"/>
-        </w:rPr>
-        <w:annotationRef/>
-      </w:r>
-      <w:r>
-        <w:rPr>
-          <w:sz w:val="20"/>
-          <w:szCs w:val="20"/>
-        </w:rPr>
-        <w:t>This could be also added in the abstract to allude that even with unsupervised methods one can determine features useful for separation (even if not perfect). I guess feature importances from random forest might not be helpful here due to the correlation. But another interesting experiment to do could be to apply linear discriminant analysis (supervised PCA) and see what features come out (maybe not for this paper, but for your dissertation/future research)</w:t>
-      </w:r>
-    </w:p>
-  </w:comment>
-  <w:comment w:id="5" w:author="Daniel Schindler" w:date="2025-10-25T09:42:00Z" w:initials="DS">
-    <w:p>
-      <w:pPr>
-        <w:pStyle w:val="CommentText"/>
-      </w:pPr>
-      <w:r>
-        <w:rPr>
-          <w:rStyle w:val="CommentReference"/>
-        </w:rPr>
-        <w:annotationRef/>
-      </w:r>
-      <w:r>
-        <w:t>I think you should sneak in a subtitle on the B panels that says something like ‘loading on PC1, PC2, etc)</w:t>
-      </w:r>
-    </w:p>
-  </w:comment>
-  <w:comment w:id="6" w:author="Valentina M. Staneva" w:date="2025-11-13T14:06:00Z" w:initials="VMS">
-    <w:p>
-      <w:r>
-        <w:rPr>
-          <w:rStyle w:val="CommentReference"/>
-        </w:rPr>
-        <w:annotationRef/>
-      </w:r>
-      <w:r>
-        <w:rPr>
-          <w:sz w:val="20"/>
-          <w:szCs w:val="20"/>
-        </w:rPr>
-        <w:t>looking at this result might hint that RF is overfitting so it did not perform well on the raw data (i.e. overfitted to the noise)</w:t>
-      </w:r>
-    </w:p>
-  </w:comment>
-  <w:comment w:id="7" w:author="Valentina M. Staneva" w:date="2025-11-13T14:13:00Z" w:initials="VMS">
-    <w:p>
-      <w:r>
-        <w:rPr>
-          <w:rStyle w:val="CommentReference"/>
-        </w:rPr>
-        <w:annotationRef/>
-      </w:r>
-      <w:r>
-        <w:rPr>
-          <w:sz w:val="20"/>
-          <w:szCs w:val="20"/>
-        </w:rPr>
-        <w:t>Since now the colors are more similar to each other (comparing to the previous contrastive colormap), you could box some of the results with certain results you are discussing (like the highest score) so people do not search for it among the numbers</w:t>
-      </w:r>
-    </w:p>
-    <w:p/>
-  </w:comment>
-  <w:comment w:id="8" w:author="Valentina M. Staneva" w:date="2025-11-13T14:34:00Z" w:initials="VMS">
-    <w:p>
-      <w:r>
-        <w:rPr>
-          <w:rStyle w:val="CommentReference"/>
-        </w:rPr>
-        <w:annotationRef/>
-      </w:r>
-      <w:r>
-        <w:rPr>
-          <w:sz w:val="20"/>
-          <w:szCs w:val="20"/>
-        </w:rPr>
-        <w:t>Looking at the not very big numbers of observations in each box, you may get some questions in the review about the significance in the difference in the results for the different methods, that could be due to properties of individual samples in the tesitng set. Maybe you can acknowledge that in the discussion, and reiterate that even if the difference is insignificant, that the methods provide some reasonable classification.</w:t>
-      </w:r>
-    </w:p>
-  </w:comment>
-  <w:comment w:id="9" w:author="Valentina M. Staneva" w:date="2025-11-13T20:02:00Z" w:initials="VMS">
-    <w:p>
-      <w:r>
-        <w:rPr>
-          <w:rStyle w:val="CommentReference"/>
-        </w:rPr>
-        <w:annotationRef/>
-      </w:r>
-      <w:r>
-        <w:rPr>
-          <w:sz w:val="20"/>
-          <w:szCs w:val="20"/>
-        </w:rPr>
-        <w:t>I have a questions about these plots: so for a fixed number, did you exclude all observations which had confidence less than this number in the calculation of the accuracy, or you simply called them non Kusko? You may want to elaborate more on these plots and what they mean as you increase the threshold in the result/discussion section. I think they can be confusing after hearing about the "calibration", although I know here the meaning of threshold is different than the confidence bin from the previous plots.</w:t>
-      </w:r>
-    </w:p>
-  </w:comment>
-</w:comments>
-</file>
-
-<file path=word/commentsExtended.xml><?xml version="1.0" encoding="utf-8"?>
-<w15:commentsEx xmlns:wpc="http://schemas.microsoft.com/office/word/2010/wordprocessingCanvas" xmlns:cx="http://schemas.microsoft.com/office/drawing/2014/chartex" xmlns:cx1="http://schemas.microsoft.com/office/drawing/2015/9/8/chartex" xmlns:cx2="http://schemas.microsoft.com/office/drawing/2015/10/21/chartex" xmlns:cx3="http://schemas.microsoft.com/office/drawing/2016/5/9/chartex" xmlns:cx4="http://schemas.microsoft.com/office/drawing/2016/5/10/chartex" xmlns:cx5="http://schemas.microsoft.com/office/drawing/2016/5/11/chartex" xmlns:cx6="http://schemas.microsoft.com/office/drawing/2016/5/12/chartex" xmlns:cx7="http://schemas.microsoft.com/office/drawing/2016/5/13/chartex" xmlns:cx8="http://schemas.microsoft.com/office/drawing/2016/5/14/chartex" xmlns:mc="http://schemas.openxmlformats.org/markup-compatibility/2006" xmlns:aink="http://schemas.microsoft.com/office/drawing/2016/ink" xmlns:am3d="http://schemas.microsoft.com/office/drawing/2017/model3d" xmlns:o="urn:schemas-microsoft-com:office:office" xmlns:oel="http://schemas.microsoft.com/office/2019/extlst" xmlns:r="http://schemas.openxmlformats.org/officeDocument/2006/relationships" xmlns:m="http://schemas.openxmlformats.org/officeDocument/2006/math" xmlns:v="urn:schemas-microsoft-com:vml" xmlns:wp14="http://schemas.microsoft.com/office/word/2010/wordprocessingDrawing" xmlns:wp="http://schemas.openxmlformats.org/drawingml/2006/wordprocessingDrawing" xmlns:w10="urn:schemas-microsoft-com:office:word" xmlns:w="http://schemas.openxmlformats.org/wordprocessingml/2006/main" xmlns:w14="http://schemas.microsoft.com/office/word/2010/wordml" xmlns:w15="http://schemas.microsoft.com/office/word/2012/wordml" xmlns:w16cex="http://schemas.microsoft.com/office/word/2018/wordml/cex" xmlns:w16cid="http://schemas.microsoft.com/office/word/2016/wordml/cid" xmlns:w16="http://schemas.microsoft.com/office/word/2018/wordml" xmlns:w16du="http://schemas.microsoft.com/office/word/2023/wordml/word16du" xmlns:w16sdtdh="http://schemas.microsoft.com/office/word/2020/wordml/sdtdatahash" xmlns:w16sdtfl="http://schemas.microsoft.com/office/word/2024/wordml/sdtformatlock" xmlns:w16se="http://schemas.microsoft.com/office/word/2015/wordml/symex" xmlns:wpg="http://schemas.microsoft.com/office/word/2010/wordprocessingGroup" xmlns:wpi="http://schemas.microsoft.com/office/word/2010/wordprocessingInk" xmlns:wne="http://schemas.microsoft.com/office/word/2006/wordml" xmlns:wps="http://schemas.microsoft.com/office/word/2010/wordprocessingShape" mc:Ignorable="w14 w15 w16se w16cid w16 w16cex w16sdtdh w16sdtfl w16du wp14">
-  <w15:commentEx w15:paraId="0D283BE3" w15:done="1"/>
-  <w15:commentEx w15:paraId="578CA5BB" w15:done="1"/>
-  <w15:commentEx w15:paraId="07703636" w15:done="0"/>
-  <w15:commentEx w15:paraId="76DC7C46" w15:paraIdParent="07703636" w15:done="0"/>
-  <w15:commentEx w15:paraId="42AB05EC" w15:paraIdParent="07703636" w15:done="0"/>
-  <w15:commentEx w15:paraId="03986E4A" w15:done="0"/>
-  <w15:commentEx w15:paraId="2FBBA388" w15:done="0"/>
-  <w15:commentEx w15:paraId="695AEC5C" w15:done="0"/>
-  <w15:commentEx w15:paraId="45CD33BE" w15:done="1"/>
-  <w15:commentEx w15:paraId="060130B1" w15:done="1"/>
-</w15:commentsEx>
-</file>
-
-<file path=word/commentsExtensible.xml><?xml version="1.0" encoding="utf-8"?>
-<w16cex:commentsExtensible xmlns:wpc="http://schemas.microsoft.com/office/word/2010/wordprocessingCanvas" xmlns:cx="http://schemas.microsoft.com/office/drawing/2014/chartex" xmlns:cx1="http://schemas.microsoft.com/office/drawing/2015/9/8/chartex" xmlns:cx2="http://schemas.microsoft.com/office/drawing/2015/10/21/chartex" xmlns:cx3="http://schemas.microsoft.com/office/drawing/2016/5/9/chartex" xmlns:cx4="http://schemas.microsoft.com/office/drawing/2016/5/10/chartex" xmlns:cx5="http://schemas.microsoft.com/office/drawing/2016/5/11/chartex" xmlns:cx6="http://schemas.microsoft.com/office/drawing/2016/5/12/chartex" xmlns:cx7="http://schemas.microsoft.com/office/drawing/2016/5/13/chartex" xmlns:cx8="http://schemas.microsoft.com/office/drawing/2016/5/14/chartex" xmlns:cr="http://schemas.microsoft.com/office/comments/2020/reactions" xmlns:mc="http://schemas.openxmlformats.org/markup-compatibility/2006" xmlns:aink="http://schemas.microsoft.com/office/drawing/2016/ink" xmlns:am3d="http://schemas.microsoft.com/office/drawing/2017/model3d" xmlns:o="urn:schemas-microsoft-com:office:office" xmlns:oel="http://schemas.microsoft.com/office/2019/extlst" xmlns:r="http://schemas.openxmlformats.org/officeDocument/2006/relationships" xmlns:m="http://schemas.openxmlformats.org/officeDocument/2006/math" xmlns:v="urn:schemas-microsoft-com:vml" xmlns:wp14="http://schemas.microsoft.com/office/word/2010/wordprocessingDrawing" xmlns:wp="http://schemas.openxmlformats.org/drawingml/2006/wordprocessingDrawing" xmlns:w10="urn:schemas-microsoft-com:office:word" xmlns:w="http://schemas.openxmlformats.org/wordprocessingml/2006/main" xmlns:w14="http://schemas.microsoft.com/office/word/2010/wordml" xmlns:w15="http://schemas.microsoft.com/office/word/2012/wordml" xmlns:w16cex="http://schemas.microsoft.com/office/word/2018/wordml/cex" xmlns:w16cid="http://schemas.microsoft.com/office/word/2016/wordml/cid" xmlns:w16="http://schemas.microsoft.com/office/word/2018/wordml" xmlns:w16du="http://schemas.microsoft.com/office/word/2023/wordml/word16du" xmlns:w16sdtdh="http://schemas.microsoft.com/office/word/2020/wordml/sdtdatahash" xmlns:w16sdtfl="http://schemas.microsoft.com/office/word/2024/wordml/sdtformatlock" xmlns:w16se="http://schemas.microsoft.com/office/word/2015/wordml/symex" xmlns:wpg="http://schemas.microsoft.com/office/word/2010/wordprocessingGroup" xmlns:wpi="http://schemas.microsoft.com/office/word/2010/wordprocessingInk" xmlns:wne="http://schemas.microsoft.com/office/word/2006/wordml" xmlns:wps="http://schemas.microsoft.com/office/word/2010/wordprocessingShape" mc:Ignorable="w14 w15 w16se w16cid w16 w16cex w16sdtdh w16sdtfl cr w16du wp14">
-  <w16cex:commentExtensible w16cex:durableId="097BE8A5" w16cex:dateUtc="2025-10-25T16:30:00Z"/>
-  <w16cex:commentExtensible w16cex:durableId="7CD93581" w16cex:dateUtc="2025-11-13T21:41:00Z"/>
-  <w16cex:commentExtensible w16cex:durableId="11D61FD6" w16cex:dateUtc="2025-10-06T18:10:00Z"/>
-  <w16cex:commentExtensible w16cex:durableId="7531CF4E" w16cex:dateUtc="2025-10-06T18:10:00Z"/>
-  <w16cex:commentExtensible w16cex:durableId="70CD702F" w16cex:dateUtc="2025-11-13T22:02:00Z">
-    <w16cex:extLst>
-      <w16:ext w16:uri="{CE6994B0-6A32-4C9F-8C6B-6E91EDA988CE}">
-        <cr:reactions xmlns:cr="http://schemas.microsoft.com/office/comments/2020/reactions">
-          <cr:reaction reactionType="1">
-            <cr:reactionInfo dateUtc="2025-11-14T16:21:22Z">
-              <cr:user userId="S::bmak29@uw.edu::e2d819b1-db99-41fc-888c-ad60b4d561ad" userProvider="AD" userName="bmak29"/>
-            </cr:reactionInfo>
-          </cr:reaction>
-        </cr:reactions>
-      </w16:ext>
-    </w16cex:extLst>
-  </w16cex:commentExtensible>
-  <w16cex:commentExtensible w16cex:durableId="13446255" w16cex:dateUtc="2025-10-25T16:42:00Z"/>
-  <w16cex:commentExtensible w16cex:durableId="155D5F92" w16cex:dateUtc="2025-11-13T22:06:00Z"/>
-  <w16cex:commentExtensible w16cex:durableId="541D1368" w16cex:dateUtc="2025-11-13T22:13:00Z"/>
-  <w16cex:commentExtensible w16cex:durableId="0191B21D" w16cex:dateUtc="2025-11-13T22:34:00Z"/>
-  <w16cex:commentExtensible w16cex:durableId="2B5A5417" w16cex:dateUtc="2025-11-14T04:02:00Z"/>
-</w16cex:commentsExtensible>
-</file>
-
-<file path=word/commentsIds.xml><?xml version="1.0" encoding="utf-8"?>
-<w16cid:commentsIds xmlns:wpc="http://schemas.microsoft.com/office/word/2010/wordprocessingCanvas" xmlns:cx="http://schemas.microsoft.com/office/drawing/2014/chartex" xmlns:cx1="http://schemas.microsoft.com/office/drawing/2015/9/8/chartex" xmlns:cx2="http://schemas.microsoft.com/office/drawing/2015/10/21/chartex" xmlns:cx3="http://schemas.microsoft.com/office/drawing/2016/5/9/chartex" xmlns:cx4="http://schemas.microsoft.com/office/drawing/2016/5/10/chartex" xmlns:cx5="http://schemas.microsoft.com/office/drawing/2016/5/11/chartex" xmlns:cx6="http://schemas.microsoft.com/office/drawing/2016/5/12/chartex" xmlns:cx7="http://schemas.microsoft.com/office/drawing/2016/5/13/chartex" xmlns:cx8="http://schemas.microsoft.com/office/drawing/2016/5/14/chartex" xmlns:mc="http://schemas.openxmlformats.org/markup-compatibility/2006" xmlns:aink="http://schemas.microsoft.com/office/drawing/2016/ink" xmlns:am3d="http://schemas.microsoft.com/office/drawing/2017/model3d" xmlns:o="urn:schemas-microsoft-com:office:office" xmlns:oel="http://schemas.microsoft.com/office/2019/extlst" xmlns:r="http://schemas.openxmlformats.org/officeDocument/2006/relationships" xmlns:m="http://schemas.openxmlformats.org/officeDocument/2006/math" xmlns:v="urn:schemas-microsoft-com:vml" xmlns:wp14="http://schemas.microsoft.com/office/word/2010/wordprocessingDrawing" xmlns:wp="http://schemas.openxmlformats.org/drawingml/2006/wordprocessingDrawing" xmlns:w10="urn:schemas-microsoft-com:office:word" xmlns:w="http://schemas.openxmlformats.org/wordprocessingml/2006/main" xmlns:w14="http://schemas.microsoft.com/office/word/2010/wordml" xmlns:w15="http://schemas.microsoft.com/office/word/2012/wordml" xmlns:w16cex="http://schemas.microsoft.com/office/word/2018/wordml/cex" xmlns:w16cid="http://schemas.microsoft.com/office/word/2016/wordml/cid" xmlns:w16="http://schemas.microsoft.com/office/word/2018/wordml" xmlns:w16du="http://schemas.microsoft.com/office/word/2023/wordml/word16du" xmlns:w16sdtdh="http://schemas.microsoft.com/office/word/2020/wordml/sdtdatahash" xmlns:w16sdtfl="http://schemas.microsoft.com/office/word/2024/wordml/sdtformatlock" xmlns:w16se="http://schemas.microsoft.com/office/word/2015/wordml/symex" xmlns:wpg="http://schemas.microsoft.com/office/word/2010/wordprocessingGroup" xmlns:wpi="http://schemas.microsoft.com/office/word/2010/wordprocessingInk" xmlns:wne="http://schemas.microsoft.com/office/word/2006/wordml" xmlns:wps="http://schemas.microsoft.com/office/word/2010/wordprocessingShape" mc:Ignorable="w14 w15 w16se w16cid w16 w16cex w16sdtdh w16sdtfl w16du wp14">
-  <w16cid:commentId w16cid:paraId="0D283BE3" w16cid:durableId="097BE8A5"/>
-  <w16cid:commentId w16cid:paraId="578CA5BB" w16cid:durableId="7CD93581"/>
-  <w16cid:commentId w16cid:paraId="07703636" w16cid:durableId="11D61FD6"/>
-  <w16cid:commentId w16cid:paraId="76DC7C46" w16cid:durableId="7531CF4E"/>
-  <w16cid:commentId w16cid:paraId="42AB05EC" w16cid:durableId="70CD702F"/>
-  <w16cid:commentId w16cid:paraId="03986E4A" w16cid:durableId="13446255"/>
-  <w16cid:commentId w16cid:paraId="2FBBA388" w16cid:durableId="155D5F92"/>
-  <w16cid:commentId w16cid:paraId="695AEC5C" w16cid:durableId="541D1368"/>
-  <w16cid:commentId w16cid:paraId="45CD33BE" w16cid:durableId="0191B21D"/>
-  <w16cid:commentId w16cid:paraId="060130B1" w16cid:durableId="2B5A5417"/>
-</w16cid:commentsIds>
-</file>
-
-<file path=word/people.xml><?xml version="1.0" encoding="utf-8"?>
-<w15:people xmlns:wpc="http://schemas.microsoft.com/office/word/2010/wordprocessingCanvas" xmlns:cx="http://schemas.microsoft.com/office/drawing/2014/chartex" xmlns:cx1="http://schemas.microsoft.com/office/drawing/2015/9/8/chartex" xmlns:cx2="http://schemas.microsoft.com/office/drawing/2015/10/21/chartex" xmlns:cx3="http://schemas.microsoft.com/office/drawing/2016/5/9/chartex" xmlns:cx4="http://schemas.microsoft.com/office/drawing/2016/5/10/chartex" xmlns:cx5="http://schemas.microsoft.com/office/drawing/2016/5/11/chartex" xmlns:cx6="http://schemas.microsoft.com/office/drawing/2016/5/12/chartex" xmlns:cx7="http://schemas.microsoft.com/office/drawing/2016/5/13/chartex" xmlns:cx8="http://schemas.microsoft.com/office/drawing/2016/5/14/chartex" xmlns:mc="http://schemas.openxmlformats.org/markup-compatibility/2006" xmlns:aink="http://schemas.microsoft.com/office/drawing/2016/ink" xmlns:am3d="http://schemas.microsoft.com/office/drawing/2017/model3d" xmlns:o="urn:schemas-microsoft-com:office:office" xmlns:oel="http://schemas.microsoft.com/office/2019/extlst" xmlns:r="http://schemas.openxmlformats.org/officeDocument/2006/relationships" xmlns:m="http://schemas.openxmlformats.org/officeDocument/2006/math" xmlns:v="urn:schemas-microsoft-com:vml" xmlns:wp14="http://schemas.microsoft.com/office/word/2010/wordprocessingDrawing" xmlns:wp="http://schemas.openxmlformats.org/drawingml/2006/wordprocessingDrawing" xmlns:w10="urn:schemas-microsoft-com:office:word" xmlns:w="http://schemas.openxmlformats.org/wordprocessingml/2006/main" xmlns:w14="http://schemas.microsoft.com/office/word/2010/wordml" xmlns:w15="http://schemas.microsoft.com/office/word/2012/wordml" xmlns:w16cex="http://schemas.microsoft.com/office/word/2018/wordml/cex" xmlns:w16cid="http://schemas.microsoft.com/office/word/2016/wordml/cid" xmlns:w16="http://schemas.microsoft.com/office/word/2018/wordml" xmlns:w16du="http://schemas.microsoft.com/office/word/2023/wordml/word16du" xmlns:w16sdtdh="http://schemas.microsoft.com/office/word/2020/wordml/sdtdatahash" xmlns:w16sdtfl="http://schemas.microsoft.com/office/word/2024/wordml/sdtformatlock" xmlns:w16se="http://schemas.microsoft.com/office/word/2015/wordml/symex" xmlns:wpg="http://schemas.microsoft.com/office/word/2010/wordprocessingGroup" xmlns:wpi="http://schemas.microsoft.com/office/word/2010/wordprocessingInk" xmlns:wne="http://schemas.microsoft.com/office/word/2006/wordml" xmlns:wps="http://schemas.microsoft.com/office/word/2010/wordprocessingShape" mc:Ignorable="w14 w15 w16se w16cid w16 w16cex w16sdtdh w16sdtfl w16du wp14">
-  <w15:person w15:author="Daniel Schindler">
-    <w15:presenceInfo w15:providerId="AD" w15:userId="S::deschind@uw.edu::638f7977-a89c-40df-b85e-dc804ddb30d9"/>
-  </w15:person>
-  <w15:person w15:author="Valentina M. Staneva">
-    <w15:presenceInfo w15:providerId="AD" w15:userId="S::vms16@uw.edu::39002d1f-c79c-469f-9108-ea31440063df"/>
-  </w15:person>
-</w15:people>
 </file>
 
 <file path=word/styles.xml><?xml version="1.0" encoding="utf-8"?>

</xml_diff>